<commit_message>
Correct reconciliation figures, add three-way check, extend Power BI
Reconciliation (Exercise 1):
- Add net = gross - fee check and quantify fee overcharge
- Classify start-of-period settlements as prior-period timing, not
  unrecognised; bridge still reconciles to 0.00
- Independent pandas re-implementation agrees with SQL and dbt on all
  317 rows and all 13 categories; agreement chart added

dbt: mart_recon_bridge, stg_ingest_runs; 66/66 pass.

Power BI: data embedded (no folder path), reconciliation and ingestion
pages added: 11 tables, 20 measures, 4 pages.

Submission document and READMEs updated to the corrected figures.

Co-Authored-By: Claude Opus 5.5 <noreply@anthropic.com>
Claude-Session: https://claude.ai/code/session_01GpY9vtVnSw1tgz3K4xTp8Q
</commit_message>
<xml_diff>
--- a/candidate-assessment/JSB_Candidate_Submission.docx
+++ b/candidate-assessment/JSB_Candidate_Submission.docx
@@ -129,6 +129,8 @@
     <w:p>
       <w:pPr>
         <w:pStyle w:val="Heading2"/>
+        <w:keepNext/>
+        <w:keepLines/>
         <w:spacing w:after="150" w:before="300"/>
       </w:pPr>
       <w:r>
@@ -215,6 +217,8 @@
     <w:p>
       <w:pPr>
         <w:pStyle w:val="Heading2"/>
+        <w:keepNext/>
+        <w:keepLines/>
         <w:spacing w:after="150" w:before="300"/>
       </w:pPr>
       <w:r>
@@ -226,7 +230,7 @@
         <w:spacing w:after="160"/>
       </w:pPr>
       <w:r>
-        <w:t xml:space="preserve">Both source files were loaded as-is into MySQL. Matching between internal_deposits.gateway_ref and gateway_settlement.merchant_ref uses a normalised reference (upper-case, letters and digits only) because the gateway sends the same reference with different punctuation and case ("GW-000102", "GW000102", "gw-000196", and leading/trailing spaces) — a raw string-equality join would have misclassified four genuinely-clean matches as breaks.</w:t>
+        <w:t xml:space="preserve">Both source files were loaded as-is into MySQL. Matching between internal_deposits.gateway_ref and gateway_settlement.merchant_ref uses a normalised reference (upper-case, letters and digits only), because the gateway returns six of our references with different punctuation, case or spacing ("GW_000020", "GW000102", "gw-000196 ", " GW-000267 " and others). An exact-match join would misclassify those six clean matches as breaks.</w:t>
       </w:r>
     </w:p>
     <w:p>
@@ -234,12 +238,14 @@
         <w:spacing w:after="160"/>
       </w:pPr>
       <w:r>
-        <w:t xml:space="preserve">Every internal SUCCESS deposit and every gateway settlement row is categorised into one of eleven types — a genuine break, a timing difference, a business event (reversal), or not a problem at all — using the SQL logic in exercise1-reconciliation/sql/03_reconciliation.sql, later ported into a dbt model (fct_recon_exceptions) so it can run on a schedule with tests attached.</w:t>
+        <w:t xml:space="preserve">Every internal SUCCESS deposit and every gateway settlement row is either a clean match or one of twelve exception types: a genuine break, a timing difference, a business event (reversal), or not a problem at all. The rules live in exercise1-reconciliation/sql/03_reconciliation.sql and are ported into a dbt model (fct_recon_exceptions) so they run on a schedule with tests attached. The checks follow the brief's contract: fee = 2% of gross + R1.00, and net = gross − fee.</w:t>
       </w:r>
     </w:p>
     <w:p>
       <w:pPr>
         <w:pStyle w:val="Heading2"/>
+        <w:keepNext/>
+        <w:keepLines/>
         <w:spacing w:after="150" w:before="300"/>
       </w:pPr>
       <w:r>
@@ -251,7 +257,59 @@
         <w:spacing w:after="160"/>
       </w:pPr>
       <w:r>
-        <w:t xml:space="preserve">294 of 306 gateway-recognised settlements (96%) match our records exactly — amount and fee both correct. The remaining differences are fully categorised below; nothing is left unexplained.</w:t>
+        <w:t xml:space="preserve">274 of the 306 settlement rows (90%) match exactly on reference, amount, fee and net. Three more differ by under a cent. The other 29 are categorised below, and the bridge from our total to the gateway's reconciles with R0.00 unexplained.</w:t>
+      </w:r>
+    </w:p>
+    <w:p>
+      <w:pPr>
+        <w:pStyle w:val="ListParagraph"/>
+        <w:numPr>
+          <w:ilvl w:val="0"/>
+          <w:numId w:val="2"/>
+        </w:numPr>
+        <w:spacing w:after="80"/>
+      </w:pPr>
+      <w:r>
+        <w:t xml:space="preserve">Act this week: R3,150. R250 is owed to two players whose deposits we marked FAILED although the gateway settled them. R2,900 is settlements for four references we have no record of.</w:t>
+      </w:r>
+    </w:p>
+    <w:p>
+      <w:pPr>
+        <w:pStyle w:val="ListParagraph"/>
+        <w:numPr>
+          <w:ilvl w:val="0"/>
+          <w:numId w:val="2"/>
+        </w:numPr>
+        <w:spacing w:after="80"/>
+      </w:pPr>
+      <w:r>
+        <w:t xml:space="preserve">The gateway owes us R7.75: R3.75 of fees above the contract rate, and R4.00 short-paid on two settlements where net ≠ gross − fee.</w:t>
+      </w:r>
+    </w:p>
+    <w:p>
+      <w:pPr>
+        <w:pStyle w:val="ListParagraph"/>
+        <w:numPr>
+          <w:ilvl w:val="0"/>
+          <w:numId w:val="2"/>
+        </w:numPr>
+        <w:spacing w:after="80"/>
+      </w:pPr>
+      <w:r>
+        <w:t xml:space="preserve">R950 of gross-amount differences suggest three players were under-credited (a fourth, R50, runs the other way). All four go to the gateway as disputes.</w:t>
+      </w:r>
+    </w:p>
+    <w:p>
+      <w:pPr>
+        <w:pStyle w:val="ListParagraph"/>
+        <w:numPr>
+          <w:ilvl w:val="0"/>
+          <w:numId w:val="2"/>
+        </w:numPr>
+        <w:spacing w:after="80"/>
+      </w:pPr>
+      <w:r>
+        <w:t xml:space="preserve">Timing, not problems: R3,650 of deposits from the week's last minutes settle next week, and R2,600 settled in the week's first six minutes, almost certainly last week's deposits.</w:t>
       </w:r>
     </w:p>
     <w:p>
@@ -262,7 +320,7 @@
       <w:r>
         <w:drawing>
           <wp:inline distT="0" distB="0" distL="0" distR="0">
-            <wp:extent cx="4762500" cy="1847850"/>
+            <wp:extent cx="4953000" cy="2066925"/>
             <wp:effectExtent t="0" r="0" b="0" l="0"/>
             <wp:docPr id="1" name="" descr="" title=""/>
             <wp:cNvGraphicFramePr>
@@ -287,7 +345,7 @@
                   <pic:spPr bwMode="auto">
                     <a:xfrm>
                       <a:off x="0" y="0"/>
-                      <a:ext cx="4762500" cy="1847850"/>
+                      <a:ext cx="4953000" cy="2066925"/>
                     </a:xfrm>
                     <a:prstGeom prst="rect">
                       <a:avLst/>
@@ -313,12 +371,14 @@
           <w:sz w:val="20"/>
           <w:szCs w:val="20"/>
         </w:rPr>
-        <w:t xml:space="preserve">Actual output of sql/03_reconciliation.sql against MySQL 8.0 — category breakdown and the bridge.</w:t>
+        <w:t xml:space="preserve">Actual output of sql/03_reconciliation.sql against MySQL 8.0, and of the independent row-by-row check.</w:t>
       </w:r>
     </w:p>
     <w:p>
       <w:pPr>
         <w:pStyle w:val="Heading2"/>
+        <w:keepNext/>
+        <w:keepLines/>
         <w:spacing w:after="150" w:before="300"/>
       </w:pPr>
       <w:r>
@@ -327,7 +387,7 @@
     </w:p>
     <w:tbl>
       <w:tblPr>
-        <w:tblW w:type="dxa" w:w="7360"/>
+        <w:tblW w:type="dxa" w:w="8060"/>
         <w:tblBorders>
           <w:top w:val="single" w:color="auto" w:sz="4"/>
           <w:left w:val="single" w:color="auto" w:sz="4"/>
@@ -338,10 +398,10 @@
         </w:tblBorders>
       </w:tblPr>
       <w:tblGrid>
-        <w:gridCol w:w="3400"/>
-        <w:gridCol w:w="1800"/>
-        <w:gridCol w:w="900"/>
-        <w:gridCol w:w="1260"/>
+        <w:gridCol w:w="3700"/>
+        <w:gridCol w:w="1900"/>
+        <w:gridCol w:w="700"/>
+        <w:gridCol w:w="1760"/>
       </w:tblGrid>
       <w:tr>
         <w:trPr>
@@ -349,7 +409,7 @@
         </w:trPr>
         <w:tc>
           <w:tcPr>
-            <w:tcW w:type="dxa" w:w="3400"/>
+            <w:tcW w:type="dxa" w:w="3700"/>
             <w:shd w:fill="1F3864" w:val="clear"/>
             <w:tcMar>
               <w:top w:type="dxa" w:w="60"/>
@@ -377,7 +437,7 @@
         </w:tc>
         <w:tc>
           <w:tcPr>
-            <w:tcW w:type="dxa" w:w="1800"/>
+            <w:tcW w:type="dxa" w:w="1900"/>
             <w:shd w:fill="1F3864" w:val="clear"/>
             <w:tcMar>
               <w:top w:type="dxa" w:w="60"/>
@@ -405,7 +465,7 @@
         </w:tc>
         <w:tc>
           <w:tcPr>
-            <w:tcW w:type="dxa" w:w="900"/>
+            <w:tcW w:type="dxa" w:w="700"/>
             <w:shd w:fill="1F3864" w:val="clear"/>
             <w:tcMar>
               <w:top w:type="dxa" w:w="60"/>
@@ -433,7 +493,7 @@
         </w:tc>
         <w:tc>
           <w:tcPr>
-            <w:tcW w:type="dxa" w:w="1260"/>
+            <w:tcW w:type="dxa" w:w="1760"/>
             <w:shd w:fill="1F3864" w:val="clear"/>
             <w:tcMar>
               <w:top w:type="dxa" w:w="60"/>
@@ -466,7 +526,7 @@
         </w:trPr>
         <w:tc>
           <w:tcPr>
-            <w:tcW w:type="dxa" w:w="3400"/>
+            <w:tcW w:type="dxa" w:w="3700"/>
             <w:tcMar>
               <w:top w:type="dxa" w:w="60"/>
               <w:left w:type="dxa" w:w="100"/>
@@ -492,7 +552,7 @@
         </w:tc>
         <w:tc>
           <w:tcPr>
-            <w:tcW w:type="dxa" w:w="1800"/>
+            <w:tcW w:type="dxa" w:w="1900"/>
             <w:tcMar>
               <w:top w:type="dxa" w:w="60"/>
               <w:left w:type="dxa" w:w="100"/>
@@ -518,7 +578,7 @@
         </w:tc>
         <w:tc>
           <w:tcPr>
-            <w:tcW w:type="dxa" w:w="900"/>
+            <w:tcW w:type="dxa" w:w="700"/>
             <w:tcMar>
               <w:top w:type="dxa" w:w="60"/>
               <w:left w:type="dxa" w:w="100"/>
@@ -544,7 +604,7 @@
         </w:tc>
         <w:tc>
           <w:tcPr>
-            <w:tcW w:type="dxa" w:w="1260"/>
+            <w:tcW w:type="dxa" w:w="1760"/>
             <w:tcMar>
               <w:top w:type="dxa" w:w="60"/>
               <w:left w:type="dxa" w:w="100"/>
@@ -575,7 +635,7 @@
         </w:trPr>
         <w:tc>
           <w:tcPr>
-            <w:tcW w:type="dxa" w:w="3400"/>
+            <w:tcW w:type="dxa" w:w="3700"/>
             <w:shd w:fill="EEF3F8" w:val="clear"/>
             <w:tcMar>
               <w:top w:type="dxa" w:w="60"/>
@@ -602,7 +662,7 @@
         </w:tc>
         <w:tc>
           <w:tcPr>
-            <w:tcW w:type="dxa" w:w="1800"/>
+            <w:tcW w:type="dxa" w:w="1900"/>
             <w:shd w:fill="EEF3F8" w:val="clear"/>
             <w:tcMar>
               <w:top w:type="dxa" w:w="60"/>
@@ -629,7 +689,7 @@
         </w:tc>
         <w:tc>
           <w:tcPr>
-            <w:tcW w:type="dxa" w:w="900"/>
+            <w:tcW w:type="dxa" w:w="700"/>
             <w:shd w:fill="EEF3F8" w:val="clear"/>
             <w:tcMar>
               <w:top w:type="dxa" w:w="60"/>
@@ -650,13 +710,13 @@
                 <w:sz w:val="19"/>
                 <w:szCs w:val="19"/>
               </w:rPr>
-              <w:t xml:space="preserve">7</w:t>
-            </w:r>
-          </w:p>
-        </w:tc>
-        <w:tc>
-          <w:tcPr>
-            <w:tcW w:type="dxa" w:w="1260"/>
+              <w:t xml:space="preserve">4</w:t>
+            </w:r>
+          </w:p>
+        </w:tc>
+        <w:tc>
+          <w:tcPr>
+            <w:tcW w:type="dxa" w:w="1760"/>
             <w:shd w:fill="EEF3F8" w:val="clear"/>
             <w:tcMar>
               <w:top w:type="dxa" w:w="60"/>
@@ -677,7 +737,7 @@
                 <w:sz w:val="19"/>
                 <w:szCs w:val="19"/>
               </w:rPr>
-              <w:t xml:space="preserve">5,500.00</w:t>
+              <w:t xml:space="preserve">2,900.00</w:t>
             </w:r>
           </w:p>
         </w:tc>
@@ -688,33 +748,33 @@
         </w:trPr>
         <w:tc>
           <w:tcPr>
-            <w:tcW w:type="dxa" w:w="3400"/>
-            <w:tcMar>
-              <w:top w:type="dxa" w:w="60"/>
-              <w:left w:type="dxa" w:w="100"/>
-              <w:bottom w:type="dxa" w:w="60"/>
-              <w:right w:type="dxa" w:w="100"/>
-            </w:tcMar>
-            <w:vAlign w:val="center"/>
-          </w:tcPr>
-          <w:p>
-            <w:pPr>
-              <w:jc w:val="left"/>
-            </w:pPr>
-            <w:r>
-              <w:rPr>
-                <w:b w:val="false"/>
-                <w:bCs w:val="false"/>
-                <w:sz w:val="19"/>
-                <w:szCs w:val="19"/>
-              </w:rPr>
-              <w:t xml:space="preserve">Duplicate gateway settlement</w:t>
-            </w:r>
-          </w:p>
-        </w:tc>
-        <w:tc>
-          <w:tcPr>
-            <w:tcW w:type="dxa" w:w="1800"/>
+            <w:tcW w:type="dxa" w:w="3700"/>
+            <w:tcMar>
+              <w:top w:type="dxa" w:w="60"/>
+              <w:left w:type="dxa" w:w="100"/>
+              <w:bottom w:type="dxa" w:w="60"/>
+              <w:right w:type="dxa" w:w="100"/>
+            </w:tcMar>
+            <w:vAlign w:val="center"/>
+          </w:tcPr>
+          <w:p>
+            <w:pPr>
+              <w:jc w:val="left"/>
+            </w:pPr>
+            <w:r>
+              <w:rPr>
+                <w:b w:val="false"/>
+                <w:bCs w:val="false"/>
+                <w:sz w:val="19"/>
+                <w:szCs w:val="19"/>
+              </w:rPr>
+              <w:t xml:space="preserve">Net amount is not gross minus fee</w:t>
+            </w:r>
+          </w:p>
+        </w:tc>
+        <w:tc>
+          <w:tcPr>
+            <w:tcW w:type="dxa" w:w="1900"/>
             <w:tcMar>
               <w:top w:type="dxa" w:w="60"/>
               <w:left w:type="dxa" w:w="100"/>
@@ -740,53 +800,53 @@
         </w:tc>
         <w:tc>
           <w:tcPr>
-            <w:tcW w:type="dxa" w:w="900"/>
-            <w:tcMar>
-              <w:top w:type="dxa" w:w="60"/>
-              <w:left w:type="dxa" w:w="100"/>
-              <w:bottom w:type="dxa" w:w="60"/>
-              <w:right w:type="dxa" w:w="100"/>
-            </w:tcMar>
-            <w:vAlign w:val="center"/>
-          </w:tcPr>
-          <w:p>
-            <w:pPr>
-              <w:jc w:val="left"/>
-            </w:pPr>
-            <w:r>
-              <w:rPr>
-                <w:b w:val="false"/>
-                <w:bCs w:val="false"/>
-                <w:sz w:val="19"/>
-                <w:szCs w:val="19"/>
-              </w:rPr>
-              <w:t xml:space="preserve">4</w:t>
-            </w:r>
-          </w:p>
-        </w:tc>
-        <w:tc>
-          <w:tcPr>
-            <w:tcW w:type="dxa" w:w="1260"/>
-            <w:tcMar>
-              <w:top w:type="dxa" w:w="60"/>
-              <w:left w:type="dxa" w:w="100"/>
-              <w:bottom w:type="dxa" w:w="60"/>
-              <w:right w:type="dxa" w:w="100"/>
-            </w:tcMar>
-            <w:vAlign w:val="center"/>
-          </w:tcPr>
-          <w:p>
-            <w:pPr>
-              <w:jc w:val="left"/>
-            </w:pPr>
-            <w:r>
-              <w:rPr>
-                <w:b w:val="false"/>
-                <w:bCs w:val="false"/>
-                <w:sz w:val="19"/>
-                <w:szCs w:val="19"/>
-              </w:rPr>
-              <w:t xml:space="preserve">0.00*</w:t>
+            <w:tcW w:type="dxa" w:w="700"/>
+            <w:tcMar>
+              <w:top w:type="dxa" w:w="60"/>
+              <w:left w:type="dxa" w:w="100"/>
+              <w:bottom w:type="dxa" w:w="60"/>
+              <w:right w:type="dxa" w:w="100"/>
+            </w:tcMar>
+            <w:vAlign w:val="center"/>
+          </w:tcPr>
+          <w:p>
+            <w:pPr>
+              <w:jc w:val="left"/>
+            </w:pPr>
+            <w:r>
+              <w:rPr>
+                <w:b w:val="false"/>
+                <w:bCs w:val="false"/>
+                <w:sz w:val="19"/>
+                <w:szCs w:val="19"/>
+              </w:rPr>
+              <w:t xml:space="preserve">2</w:t>
+            </w:r>
+          </w:p>
+        </w:tc>
+        <w:tc>
+          <w:tcPr>
+            <w:tcW w:type="dxa" w:w="1760"/>
+            <w:tcMar>
+              <w:top w:type="dxa" w:w="60"/>
+              <w:left w:type="dxa" w:w="100"/>
+              <w:bottom w:type="dxa" w:w="60"/>
+              <w:right w:type="dxa" w:w="100"/>
+            </w:tcMar>
+            <w:vAlign w:val="center"/>
+          </w:tcPr>
+          <w:p>
+            <w:pPr>
+              <w:jc w:val="left"/>
+            </w:pPr>
+            <w:r>
+              <w:rPr>
+                <w:b w:val="false"/>
+                <w:bCs w:val="false"/>
+                <w:sz w:val="19"/>
+                <w:szCs w:val="19"/>
+              </w:rPr>
+              <w:t xml:space="preserve">4.00 short-paid</w:t>
             </w:r>
           </w:p>
         </w:tc>
@@ -797,7 +857,7 @@
         </w:trPr>
         <w:tc>
           <w:tcPr>
-            <w:tcW w:type="dxa" w:w="3400"/>
+            <w:tcW w:type="dxa" w:w="3700"/>
             <w:shd w:fill="EEF3F8" w:val="clear"/>
             <w:tcMar>
               <w:top w:type="dxa" w:w="60"/>
@@ -818,13 +878,13 @@
                 <w:sz w:val="19"/>
                 <w:szCs w:val="19"/>
               </w:rPr>
-              <w:t xml:space="preserve">Duplicate internal deposit</w:t>
-            </w:r>
-          </w:p>
-        </w:tc>
-        <w:tc>
-          <w:tcPr>
-            <w:tcW w:type="dxa" w:w="1800"/>
+              <w:t xml:space="preserve">Settled fee differs from contract</w:t>
+            </w:r>
+          </w:p>
+        </w:tc>
+        <w:tc>
+          <w:tcPr>
+            <w:tcW w:type="dxa" w:w="1900"/>
             <w:shd w:fill="EEF3F8" w:val="clear"/>
             <w:tcMar>
               <w:top w:type="dxa" w:w="60"/>
@@ -845,13 +905,13 @@
                 <w:sz w:val="19"/>
                 <w:szCs w:val="19"/>
               </w:rPr>
-              <w:t xml:space="preserve">Break — dedupe</w:t>
-            </w:r>
-          </w:p>
-        </w:tc>
-        <w:tc>
-          <w:tcPr>
-            <w:tcW w:type="dxa" w:w="900"/>
+              <w:t xml:space="preserve">Break — dispute</w:t>
+            </w:r>
+          </w:p>
+        </w:tc>
+        <w:tc>
+          <w:tcPr>
+            <w:tcW w:type="dxa" w:w="700"/>
             <w:shd w:fill="EEF3F8" w:val="clear"/>
             <w:tcMar>
               <w:top w:type="dxa" w:w="60"/>
@@ -872,13 +932,13 @@
                 <w:sz w:val="19"/>
                 <w:szCs w:val="19"/>
               </w:rPr>
-              <w:t xml:space="preserve">6</w:t>
-            </w:r>
-          </w:p>
-        </w:tc>
-        <w:tc>
-          <w:tcPr>
-            <w:tcW w:type="dxa" w:w="1260"/>
+              <w:t xml:space="preserve">4</w:t>
+            </w:r>
+          </w:p>
+        </w:tc>
+        <w:tc>
+          <w:tcPr>
+            <w:tcW w:type="dxa" w:w="1760"/>
             <w:shd w:fill="EEF3F8" w:val="clear"/>
             <w:tcMar>
               <w:top w:type="dxa" w:w="60"/>
@@ -899,7 +959,7 @@
                 <w:sz w:val="19"/>
                 <w:szCs w:val="19"/>
               </w:rPr>
-              <w:t xml:space="preserve">0.00*</w:t>
+              <w:t xml:space="preserve">3.75 overcharged</w:t>
             </w:r>
           </w:p>
         </w:tc>
@@ -910,7 +970,7 @@
         </w:trPr>
         <w:tc>
           <w:tcPr>
-            <w:tcW w:type="dxa" w:w="3400"/>
+            <w:tcW w:type="dxa" w:w="3700"/>
             <w:tcMar>
               <w:top w:type="dxa" w:w="60"/>
               <w:left w:type="dxa" w:w="100"/>
@@ -936,7 +996,7 @@
         </w:tc>
         <w:tc>
           <w:tcPr>
-            <w:tcW w:type="dxa" w:w="1800"/>
+            <w:tcW w:type="dxa" w:w="1900"/>
             <w:tcMar>
               <w:top w:type="dxa" w:w="60"/>
               <w:left w:type="dxa" w:w="100"/>
@@ -962,7 +1022,7 @@
         </w:tc>
         <w:tc>
           <w:tcPr>
-            <w:tcW w:type="dxa" w:w="900"/>
+            <w:tcW w:type="dxa" w:w="700"/>
             <w:tcMar>
               <w:top w:type="dxa" w:w="60"/>
               <w:left w:type="dxa" w:w="100"/>
@@ -988,27 +1048,27 @@
         </w:tc>
         <w:tc>
           <w:tcPr>
-            <w:tcW w:type="dxa" w:w="1260"/>
-            <w:tcMar>
-              <w:top w:type="dxa" w:w="60"/>
-              <w:left w:type="dxa" w:w="100"/>
-              <w:bottom w:type="dxa" w:w="60"/>
-              <w:right w:type="dxa" w:w="100"/>
-            </w:tcMar>
-            <w:vAlign w:val="center"/>
-          </w:tcPr>
-          <w:p>
-            <w:pPr>
-              <w:jc w:val="left"/>
-            </w:pPr>
-            <w:r>
-              <w:rPr>
-                <w:b w:val="false"/>
-                <w:bCs w:val="false"/>
-                <w:sz w:val="19"/>
-                <w:szCs w:val="19"/>
-              </w:rPr>
-              <w:t xml:space="preserve">-900.00</w:t>
+            <w:tcW w:type="dxa" w:w="1760"/>
+            <w:tcMar>
+              <w:top w:type="dxa" w:w="60"/>
+              <w:left w:type="dxa" w:w="100"/>
+              <w:bottom w:type="dxa" w:w="60"/>
+              <w:right w:type="dxa" w:w="100"/>
+            </w:tcMar>
+            <w:vAlign w:val="center"/>
+          </w:tcPr>
+          <w:p>
+            <w:pPr>
+              <w:jc w:val="left"/>
+            </w:pPr>
+            <w:r>
+              <w:rPr>
+                <w:b w:val="false"/>
+                <w:bCs w:val="false"/>
+                <w:sz w:val="19"/>
+                <w:szCs w:val="19"/>
+              </w:rPr>
+              <w:t xml:space="preserve">-900.00 (net)</w:t>
             </w:r>
           </w:p>
         </w:tc>
@@ -1019,7 +1079,7 @@
         </w:trPr>
         <w:tc>
           <w:tcPr>
-            <w:tcW w:type="dxa" w:w="3400"/>
+            <w:tcW w:type="dxa" w:w="3700"/>
             <w:shd w:fill="EEF3F8" w:val="clear"/>
             <w:tcMar>
               <w:top w:type="dxa" w:w="60"/>
@@ -1040,13 +1100,13 @@
                 <w:sz w:val="19"/>
                 <w:szCs w:val="19"/>
               </w:rPr>
-              <w:t xml:space="preserve">Settled fee differs from contract</w:t>
-            </w:r>
-          </w:p>
-        </w:tc>
-        <w:tc>
-          <w:tcPr>
-            <w:tcW w:type="dxa" w:w="1800"/>
+              <w:t xml:space="preserve">Duplicate gateway settlement</w:t>
+            </w:r>
+          </w:p>
+        </w:tc>
+        <w:tc>
+          <w:tcPr>
+            <w:tcW w:type="dxa" w:w="1900"/>
             <w:shd w:fill="EEF3F8" w:val="clear"/>
             <w:tcMar>
               <w:top w:type="dxa" w:w="60"/>
@@ -1073,7 +1133,7 @@
         </w:tc>
         <w:tc>
           <w:tcPr>
-            <w:tcW w:type="dxa" w:w="900"/>
+            <w:tcW w:type="dxa" w:w="700"/>
             <w:shd w:fill="EEF3F8" w:val="clear"/>
             <w:tcMar>
               <w:top w:type="dxa" w:w="60"/>
@@ -1100,7 +1160,7 @@
         </w:tc>
         <w:tc>
           <w:tcPr>
-            <w:tcW w:type="dxa" w:w="1260"/>
+            <w:tcW w:type="dxa" w:w="1760"/>
             <w:shd w:fill="EEF3F8" w:val="clear"/>
             <w:tcMar>
               <w:top w:type="dxa" w:w="60"/>
@@ -1132,105 +1192,105 @@
         </w:trPr>
         <w:tc>
           <w:tcPr>
-            <w:tcW w:type="dxa" w:w="3400"/>
-            <w:tcMar>
-              <w:top w:type="dxa" w:w="60"/>
-              <w:left w:type="dxa" w:w="100"/>
-              <w:bottom w:type="dxa" w:w="60"/>
-              <w:right w:type="dxa" w:w="100"/>
-            </w:tcMar>
-            <w:vAlign w:val="center"/>
-          </w:tcPr>
-          <w:p>
-            <w:pPr>
-              <w:jc w:val="left"/>
-            </w:pPr>
-            <w:r>
-              <w:rPr>
-                <w:b w:val="false"/>
-                <w:bCs w:val="false"/>
-                <w:sz w:val="19"/>
-                <w:szCs w:val="19"/>
-              </w:rPr>
-              <w:t xml:space="preserve">Reversal / chargeback</w:t>
-            </w:r>
-          </w:p>
-        </w:tc>
-        <w:tc>
-          <w:tcPr>
-            <w:tcW w:type="dxa" w:w="1800"/>
-            <w:tcMar>
-              <w:top w:type="dxa" w:w="60"/>
-              <w:left w:type="dxa" w:w="100"/>
-              <w:bottom w:type="dxa" w:w="60"/>
-              <w:right w:type="dxa" w:w="100"/>
-            </w:tcMar>
-            <w:vAlign w:val="center"/>
-          </w:tcPr>
-          <w:p>
-            <w:pPr>
-              <w:jc w:val="left"/>
-            </w:pPr>
-            <w:r>
-              <w:rPr>
-                <w:b w:val="false"/>
-                <w:bCs w:val="false"/>
-                <w:sz w:val="19"/>
-                <w:szCs w:val="19"/>
-              </w:rPr>
-              <w:t xml:space="preserve">Business event</w:t>
-            </w:r>
-          </w:p>
-        </w:tc>
-        <w:tc>
-          <w:tcPr>
-            <w:tcW w:type="dxa" w:w="900"/>
-            <w:tcMar>
-              <w:top w:type="dxa" w:w="60"/>
-              <w:left w:type="dxa" w:w="100"/>
-              <w:bottom w:type="dxa" w:w="60"/>
-              <w:right w:type="dxa" w:w="100"/>
-            </w:tcMar>
-            <w:vAlign w:val="center"/>
-          </w:tcPr>
-          <w:p>
-            <w:pPr>
-              <w:jc w:val="left"/>
-            </w:pPr>
-            <w:r>
-              <w:rPr>
-                <w:b w:val="false"/>
-                <w:bCs w:val="false"/>
-                <w:sz w:val="19"/>
-                <w:szCs w:val="19"/>
-              </w:rPr>
-              <w:t xml:space="preserve">3</w:t>
-            </w:r>
-          </w:p>
-        </w:tc>
-        <w:tc>
-          <w:tcPr>
-            <w:tcW w:type="dxa" w:w="1260"/>
-            <w:tcMar>
-              <w:top w:type="dxa" w:w="60"/>
-              <w:left w:type="dxa" w:w="100"/>
-              <w:bottom w:type="dxa" w:w="60"/>
-              <w:right w:type="dxa" w:w="100"/>
-            </w:tcMar>
-            <w:vAlign w:val="center"/>
-          </w:tcPr>
-          <w:p>
-            <w:pPr>
-              <w:jc w:val="left"/>
-            </w:pPr>
-            <w:r>
-              <w:rPr>
-                <w:b w:val="false"/>
-                <w:bCs w:val="false"/>
-                <w:sz w:val="19"/>
-                <w:szCs w:val="19"/>
-              </w:rPr>
-              <w:t xml:space="preserve">850.00</w:t>
+            <w:tcW w:type="dxa" w:w="3700"/>
+            <w:tcMar>
+              <w:top w:type="dxa" w:w="60"/>
+              <w:left w:type="dxa" w:w="100"/>
+              <w:bottom w:type="dxa" w:w="60"/>
+              <w:right w:type="dxa" w:w="100"/>
+            </w:tcMar>
+            <w:vAlign w:val="center"/>
+          </w:tcPr>
+          <w:p>
+            <w:pPr>
+              <w:jc w:val="left"/>
+            </w:pPr>
+            <w:r>
+              <w:rPr>
+                <w:b w:val="false"/>
+                <w:bCs w:val="false"/>
+                <w:sz w:val="19"/>
+                <w:szCs w:val="19"/>
+              </w:rPr>
+              <w:t xml:space="preserve">Duplicate internal deposit</w:t>
+            </w:r>
+          </w:p>
+        </w:tc>
+        <w:tc>
+          <w:tcPr>
+            <w:tcW w:type="dxa" w:w="1900"/>
+            <w:tcMar>
+              <w:top w:type="dxa" w:w="60"/>
+              <w:left w:type="dxa" w:w="100"/>
+              <w:bottom w:type="dxa" w:w="60"/>
+              <w:right w:type="dxa" w:w="100"/>
+            </w:tcMar>
+            <w:vAlign w:val="center"/>
+          </w:tcPr>
+          <w:p>
+            <w:pPr>
+              <w:jc w:val="left"/>
+            </w:pPr>
+            <w:r>
+              <w:rPr>
+                <w:b w:val="false"/>
+                <w:bCs w:val="false"/>
+                <w:sz w:val="19"/>
+                <w:szCs w:val="19"/>
+              </w:rPr>
+              <w:t xml:space="preserve">Break — dedupe</w:t>
+            </w:r>
+          </w:p>
+        </w:tc>
+        <w:tc>
+          <w:tcPr>
+            <w:tcW w:type="dxa" w:w="700"/>
+            <w:tcMar>
+              <w:top w:type="dxa" w:w="60"/>
+              <w:left w:type="dxa" w:w="100"/>
+              <w:bottom w:type="dxa" w:w="60"/>
+              <w:right w:type="dxa" w:w="100"/>
+            </w:tcMar>
+            <w:vAlign w:val="center"/>
+          </w:tcPr>
+          <w:p>
+            <w:pPr>
+              <w:jc w:val="left"/>
+            </w:pPr>
+            <w:r>
+              <w:rPr>
+                <w:b w:val="false"/>
+                <w:bCs w:val="false"/>
+                <w:sz w:val="19"/>
+                <w:szCs w:val="19"/>
+              </w:rPr>
+              <w:t xml:space="preserve">6</w:t>
+            </w:r>
+          </w:p>
+        </w:tc>
+        <w:tc>
+          <w:tcPr>
+            <w:tcW w:type="dxa" w:w="1760"/>
+            <w:tcMar>
+              <w:top w:type="dxa" w:w="60"/>
+              <w:left w:type="dxa" w:w="100"/>
+              <w:bottom w:type="dxa" w:w="60"/>
+              <w:right w:type="dxa" w:w="100"/>
+            </w:tcMar>
+            <w:vAlign w:val="center"/>
+          </w:tcPr>
+          <w:p>
+            <w:pPr>
+              <w:jc w:val="left"/>
+            </w:pPr>
+            <w:r>
+              <w:rPr>
+                <w:b w:val="false"/>
+                <w:bCs w:val="false"/>
+                <w:sz w:val="19"/>
+                <w:szCs w:val="19"/>
+              </w:rPr>
+              <w:t xml:space="preserve">0.00*</w:t>
             </w:r>
           </w:p>
         </w:tc>
@@ -1241,7 +1301,7 @@
         </w:trPr>
         <w:tc>
           <w:tcPr>
-            <w:tcW w:type="dxa" w:w="3400"/>
+            <w:tcW w:type="dxa" w:w="3700"/>
             <w:shd w:fill="EEF3F8" w:val="clear"/>
             <w:tcMar>
               <w:top w:type="dxa" w:w="60"/>
@@ -1262,13 +1322,13 @@
                 <w:sz w:val="19"/>
                 <w:szCs w:val="19"/>
               </w:rPr>
-              <w:t xml:space="preserve">Deposit SUCCESS, no settlement found</w:t>
-            </w:r>
-          </w:p>
-        </w:tc>
-        <w:tc>
-          <w:tcPr>
-            <w:tcW w:type="dxa" w:w="1800"/>
+              <w:t xml:space="preserve">Reversal / chargeback</w:t>
+            </w:r>
+          </w:p>
+        </w:tc>
+        <w:tc>
+          <w:tcPr>
+            <w:tcW w:type="dxa" w:w="1900"/>
             <w:shd w:fill="EEF3F8" w:val="clear"/>
             <w:tcMar>
               <w:top w:type="dxa" w:w="60"/>
@@ -1289,13 +1349,13 @@
                 <w:sz w:val="19"/>
                 <w:szCs w:val="19"/>
               </w:rPr>
-              <w:t xml:space="preserve">Timing / possible break</w:t>
-            </w:r>
-          </w:p>
-        </w:tc>
-        <w:tc>
-          <w:tcPr>
-            <w:tcW w:type="dxa" w:w="900"/>
+              <w:t xml:space="preserve">Business event</w:t>
+            </w:r>
+          </w:p>
+        </w:tc>
+        <w:tc>
+          <w:tcPr>
+            <w:tcW w:type="dxa" w:w="700"/>
             <w:shd w:fill="EEF3F8" w:val="clear"/>
             <w:tcMar>
               <w:top w:type="dxa" w:w="60"/>
@@ -1316,13 +1376,13 @@
                 <w:sz w:val="19"/>
                 <w:szCs w:val="19"/>
               </w:rPr>
-              <w:t xml:space="preserve">5</w:t>
-            </w:r>
-          </w:p>
-        </w:tc>
-        <w:tc>
-          <w:tcPr>
-            <w:tcW w:type="dxa" w:w="1260"/>
+              <w:t xml:space="preserve">3</w:t>
+            </w:r>
+          </w:p>
+        </w:tc>
+        <w:tc>
+          <w:tcPr>
+            <w:tcW w:type="dxa" w:w="1760"/>
             <w:shd w:fill="EEF3F8" w:val="clear"/>
             <w:tcMar>
               <w:top w:type="dxa" w:w="60"/>
@@ -1343,7 +1403,7 @@
                 <w:sz w:val="19"/>
                 <w:szCs w:val="19"/>
               </w:rPr>
-              <w:t xml:space="preserve">2,700.00</w:t>
+              <w:t xml:space="preserve">850.00</w:t>
             </w:r>
           </w:p>
         </w:tc>
@@ -1354,105 +1414,105 @@
         </w:trPr>
         <w:tc>
           <w:tcPr>
-            <w:tcW w:type="dxa" w:w="3400"/>
-            <w:tcMar>
-              <w:top w:type="dxa" w:w="60"/>
-              <w:left w:type="dxa" w:w="100"/>
-              <w:bottom w:type="dxa" w:w="60"/>
-              <w:right w:type="dxa" w:w="100"/>
-            </w:tcMar>
-            <w:vAlign w:val="center"/>
-          </w:tcPr>
-          <w:p>
-            <w:pPr>
-              <w:jc w:val="left"/>
-            </w:pPr>
-            <w:r>
-              <w:rPr>
-                <w:b w:val="false"/>
-                <w:bCs w:val="false"/>
-                <w:sz w:val="19"/>
-                <w:szCs w:val="19"/>
-              </w:rPr>
-              <w:t xml:space="preserve">Created near period cut-off</w:t>
-            </w:r>
-          </w:p>
-        </w:tc>
-        <w:tc>
-          <w:tcPr>
-            <w:tcW w:type="dxa" w:w="1800"/>
-            <w:tcMar>
-              <w:top w:type="dxa" w:w="60"/>
-              <w:left w:type="dxa" w:w="100"/>
-              <w:bottom w:type="dxa" w:w="60"/>
-              <w:right w:type="dxa" w:w="100"/>
-            </w:tcMar>
-            <w:vAlign w:val="center"/>
-          </w:tcPr>
-          <w:p>
-            <w:pPr>
-              <w:jc w:val="left"/>
-            </w:pPr>
-            <w:r>
-              <w:rPr>
-                <w:b w:val="false"/>
-                <w:bCs w:val="false"/>
-                <w:sz w:val="19"/>
-                <w:szCs w:val="19"/>
-              </w:rPr>
-              <w:t xml:space="preserve">Timing — not a problem</w:t>
-            </w:r>
-          </w:p>
-        </w:tc>
-        <w:tc>
-          <w:tcPr>
-            <w:tcW w:type="dxa" w:w="900"/>
-            <w:tcMar>
-              <w:top w:type="dxa" w:w="60"/>
-              <w:left w:type="dxa" w:w="100"/>
-              <w:bottom w:type="dxa" w:w="60"/>
-              <w:right w:type="dxa" w:w="100"/>
-            </w:tcMar>
-            <w:vAlign w:val="center"/>
-          </w:tcPr>
-          <w:p>
-            <w:pPr>
-              <w:jc w:val="left"/>
-            </w:pPr>
-            <w:r>
-              <w:rPr>
-                <w:b w:val="false"/>
-                <w:bCs w:val="false"/>
-                <w:sz w:val="19"/>
-                <w:szCs w:val="19"/>
-              </w:rPr>
-              <w:t xml:space="preserve">3</w:t>
-            </w:r>
-          </w:p>
-        </w:tc>
-        <w:tc>
-          <w:tcPr>
-            <w:tcW w:type="dxa" w:w="1260"/>
-            <w:tcMar>
-              <w:top w:type="dxa" w:w="60"/>
-              <w:left w:type="dxa" w:w="100"/>
-              <w:bottom w:type="dxa" w:w="60"/>
-              <w:right w:type="dxa" w:w="100"/>
-            </w:tcMar>
-            <w:vAlign w:val="center"/>
-          </w:tcPr>
-          <w:p>
-            <w:pPr>
-              <w:jc w:val="left"/>
-            </w:pPr>
-            <w:r>
-              <w:rPr>
-                <w:b w:val="false"/>
-                <w:bCs w:val="false"/>
-                <w:sz w:val="19"/>
-                <w:szCs w:val="19"/>
-              </w:rPr>
-              <w:t xml:space="preserve">3,650.00</w:t>
+            <w:tcW w:type="dxa" w:w="3700"/>
+            <w:tcMar>
+              <w:top w:type="dxa" w:w="60"/>
+              <w:left w:type="dxa" w:w="100"/>
+              <w:bottom w:type="dxa" w:w="60"/>
+              <w:right w:type="dxa" w:w="100"/>
+            </w:tcMar>
+            <w:vAlign w:val="center"/>
+          </w:tcPr>
+          <w:p>
+            <w:pPr>
+              <w:jc w:val="left"/>
+            </w:pPr>
+            <w:r>
+              <w:rPr>
+                <w:b w:val="false"/>
+                <w:bCs w:val="false"/>
+                <w:sz w:val="19"/>
+                <w:szCs w:val="19"/>
+              </w:rPr>
+              <w:t xml:space="preserve">Deposit SUCCESS, no settlement found</w:t>
+            </w:r>
+          </w:p>
+        </w:tc>
+        <w:tc>
+          <w:tcPr>
+            <w:tcW w:type="dxa" w:w="1900"/>
+            <w:tcMar>
+              <w:top w:type="dxa" w:w="60"/>
+              <w:left w:type="dxa" w:w="100"/>
+              <w:bottom w:type="dxa" w:w="60"/>
+              <w:right w:type="dxa" w:w="100"/>
+            </w:tcMar>
+            <w:vAlign w:val="center"/>
+          </w:tcPr>
+          <w:p>
+            <w:pPr>
+              <w:jc w:val="left"/>
+            </w:pPr>
+            <w:r>
+              <w:rPr>
+                <w:b w:val="false"/>
+                <w:bCs w:val="false"/>
+                <w:sz w:val="19"/>
+                <w:szCs w:val="19"/>
+              </w:rPr>
+              <w:t xml:space="preserve">Timing / possible break</w:t>
+            </w:r>
+          </w:p>
+        </w:tc>
+        <w:tc>
+          <w:tcPr>
+            <w:tcW w:type="dxa" w:w="700"/>
+            <w:tcMar>
+              <w:top w:type="dxa" w:w="60"/>
+              <w:left w:type="dxa" w:w="100"/>
+              <w:bottom w:type="dxa" w:w="60"/>
+              <w:right w:type="dxa" w:w="100"/>
+            </w:tcMar>
+            <w:vAlign w:val="center"/>
+          </w:tcPr>
+          <w:p>
+            <w:pPr>
+              <w:jc w:val="left"/>
+            </w:pPr>
+            <w:r>
+              <w:rPr>
+                <w:b w:val="false"/>
+                <w:bCs w:val="false"/>
+                <w:sz w:val="19"/>
+                <w:szCs w:val="19"/>
+              </w:rPr>
+              <w:t xml:space="preserve">5</w:t>
+            </w:r>
+          </w:p>
+        </w:tc>
+        <w:tc>
+          <w:tcPr>
+            <w:tcW w:type="dxa" w:w="1760"/>
+            <w:tcMar>
+              <w:top w:type="dxa" w:w="60"/>
+              <w:left w:type="dxa" w:w="100"/>
+              <w:bottom w:type="dxa" w:w="60"/>
+              <w:right w:type="dxa" w:w="100"/>
+            </w:tcMar>
+            <w:vAlign w:val="center"/>
+          </w:tcPr>
+          <w:p>
+            <w:pPr>
+              <w:jc w:val="left"/>
+            </w:pPr>
+            <w:r>
+              <w:rPr>
+                <w:b w:val="false"/>
+                <w:bCs w:val="false"/>
+                <w:sz w:val="19"/>
+                <w:szCs w:val="19"/>
+              </w:rPr>
+              <w:t xml:space="preserve">2,700.00</w:t>
             </w:r>
           </w:p>
         </w:tc>
@@ -1463,7 +1523,7 @@
         </w:trPr>
         <w:tc>
           <w:tcPr>
-            <w:tcW w:type="dxa" w:w="3400"/>
+            <w:tcW w:type="dxa" w:w="3700"/>
             <w:shd w:fill="EEF3F8" w:val="clear"/>
             <w:tcMar>
               <w:top w:type="dxa" w:w="60"/>
@@ -1484,13 +1544,235 @@
                 <w:sz w:val="19"/>
                 <w:szCs w:val="19"/>
               </w:rPr>
+              <w:t xml:space="preserve">Created in the last 15 min (settles next week)</w:t>
+            </w:r>
+          </w:p>
+        </w:tc>
+        <w:tc>
+          <w:tcPr>
+            <w:tcW w:type="dxa" w:w="1900"/>
+            <w:shd w:fill="EEF3F8" w:val="clear"/>
+            <w:tcMar>
+              <w:top w:type="dxa" w:w="60"/>
+              <w:left w:type="dxa" w:w="100"/>
+              <w:bottom w:type="dxa" w:w="60"/>
+              <w:right w:type="dxa" w:w="100"/>
+            </w:tcMar>
+            <w:vAlign w:val="center"/>
+          </w:tcPr>
+          <w:p>
+            <w:pPr>
+              <w:jc w:val="left"/>
+            </w:pPr>
+            <w:r>
+              <w:rPr>
+                <w:b w:val="false"/>
+                <w:bCs w:val="false"/>
+                <w:sz w:val="19"/>
+                <w:szCs w:val="19"/>
+              </w:rPr>
+              <w:t xml:space="preserve">Timing — not a problem</w:t>
+            </w:r>
+          </w:p>
+        </w:tc>
+        <w:tc>
+          <w:tcPr>
+            <w:tcW w:type="dxa" w:w="700"/>
+            <w:shd w:fill="EEF3F8" w:val="clear"/>
+            <w:tcMar>
+              <w:top w:type="dxa" w:w="60"/>
+              <w:left w:type="dxa" w:w="100"/>
+              <w:bottom w:type="dxa" w:w="60"/>
+              <w:right w:type="dxa" w:w="100"/>
+            </w:tcMar>
+            <w:vAlign w:val="center"/>
+          </w:tcPr>
+          <w:p>
+            <w:pPr>
+              <w:jc w:val="left"/>
+            </w:pPr>
+            <w:r>
+              <w:rPr>
+                <w:b w:val="false"/>
+                <w:bCs w:val="false"/>
+                <w:sz w:val="19"/>
+                <w:szCs w:val="19"/>
+              </w:rPr>
+              <w:t xml:space="preserve">3</w:t>
+            </w:r>
+          </w:p>
+        </w:tc>
+        <w:tc>
+          <w:tcPr>
+            <w:tcW w:type="dxa" w:w="1760"/>
+            <w:shd w:fill="EEF3F8" w:val="clear"/>
+            <w:tcMar>
+              <w:top w:type="dxa" w:w="60"/>
+              <w:left w:type="dxa" w:w="100"/>
+              <w:bottom w:type="dxa" w:w="60"/>
+              <w:right w:type="dxa" w:w="100"/>
+            </w:tcMar>
+            <w:vAlign w:val="center"/>
+          </w:tcPr>
+          <w:p>
+            <w:pPr>
+              <w:jc w:val="left"/>
+            </w:pPr>
+            <w:r>
+              <w:rPr>
+                <w:b w:val="false"/>
+                <w:bCs w:val="false"/>
+                <w:sz w:val="19"/>
+                <w:szCs w:val="19"/>
+              </w:rPr>
+              <w:t xml:space="preserve">3,650.00</w:t>
+            </w:r>
+          </w:p>
+        </w:tc>
+      </w:tr>
+      <w:tr>
+        <w:trPr>
+          <w:cantSplit/>
+        </w:trPr>
+        <w:tc>
+          <w:tcPr>
+            <w:tcW w:type="dxa" w:w="3700"/>
+            <w:tcMar>
+              <w:top w:type="dxa" w:w="60"/>
+              <w:left w:type="dxa" w:w="100"/>
+              <w:bottom w:type="dxa" w:w="60"/>
+              <w:right w:type="dxa" w:w="100"/>
+            </w:tcMar>
+            <w:vAlign w:val="center"/>
+          </w:tcPr>
+          <w:p>
+            <w:pPr>
+              <w:jc w:val="left"/>
+            </w:pPr>
+            <w:r>
+              <w:rPr>
+                <w:b w:val="false"/>
+                <w:bCs w:val="false"/>
+                <w:sz w:val="19"/>
+                <w:szCs w:val="19"/>
+              </w:rPr>
+              <w:t xml:space="preserve">Settled in the first 15 min (last week's deposits)</w:t>
+            </w:r>
+          </w:p>
+        </w:tc>
+        <w:tc>
+          <w:tcPr>
+            <w:tcW w:type="dxa" w:w="1900"/>
+            <w:tcMar>
+              <w:top w:type="dxa" w:w="60"/>
+              <w:left w:type="dxa" w:w="100"/>
+              <w:bottom w:type="dxa" w:w="60"/>
+              <w:right w:type="dxa" w:w="100"/>
+            </w:tcMar>
+            <w:vAlign w:val="center"/>
+          </w:tcPr>
+          <w:p>
+            <w:pPr>
+              <w:jc w:val="left"/>
+            </w:pPr>
+            <w:r>
+              <w:rPr>
+                <w:b w:val="false"/>
+                <w:bCs w:val="false"/>
+                <w:sz w:val="19"/>
+                <w:szCs w:val="19"/>
+              </w:rPr>
+              <w:t xml:space="preserve">Timing — not a problem</w:t>
+            </w:r>
+          </w:p>
+        </w:tc>
+        <w:tc>
+          <w:tcPr>
+            <w:tcW w:type="dxa" w:w="700"/>
+            <w:tcMar>
+              <w:top w:type="dxa" w:w="60"/>
+              <w:left w:type="dxa" w:w="100"/>
+              <w:bottom w:type="dxa" w:w="60"/>
+              <w:right w:type="dxa" w:w="100"/>
+            </w:tcMar>
+            <w:vAlign w:val="center"/>
+          </w:tcPr>
+          <w:p>
+            <w:pPr>
+              <w:jc w:val="left"/>
+            </w:pPr>
+            <w:r>
+              <w:rPr>
+                <w:b w:val="false"/>
+                <w:bCs w:val="false"/>
+                <w:sz w:val="19"/>
+                <w:szCs w:val="19"/>
+              </w:rPr>
+              <w:t xml:space="preserve">3</w:t>
+            </w:r>
+          </w:p>
+        </w:tc>
+        <w:tc>
+          <w:tcPr>
+            <w:tcW w:type="dxa" w:w="1760"/>
+            <w:tcMar>
+              <w:top w:type="dxa" w:w="60"/>
+              <w:left w:type="dxa" w:w="100"/>
+              <w:bottom w:type="dxa" w:w="60"/>
+              <w:right w:type="dxa" w:w="100"/>
+            </w:tcMar>
+            <w:vAlign w:val="center"/>
+          </w:tcPr>
+          <w:p>
+            <w:pPr>
+              <w:jc w:val="left"/>
+            </w:pPr>
+            <w:r>
+              <w:rPr>
+                <w:b w:val="false"/>
+                <w:bCs w:val="false"/>
+                <w:sz w:val="19"/>
+                <w:szCs w:val="19"/>
+              </w:rPr>
+              <w:t xml:space="preserve">2,600.00</w:t>
+            </w:r>
+          </w:p>
+        </w:tc>
+      </w:tr>
+      <w:tr>
+        <w:trPr>
+          <w:cantSplit/>
+        </w:trPr>
+        <w:tc>
+          <w:tcPr>
+            <w:tcW w:type="dxa" w:w="3700"/>
+            <w:shd w:fill="EEF3F8" w:val="clear"/>
+            <w:tcMar>
+              <w:top w:type="dxa" w:w="60"/>
+              <w:left w:type="dxa" w:w="100"/>
+              <w:bottom w:type="dxa" w:w="60"/>
+              <w:right w:type="dxa" w:w="100"/>
+            </w:tcMar>
+            <w:vAlign w:val="center"/>
+          </w:tcPr>
+          <w:p>
+            <w:pPr>
+              <w:jc w:val="left"/>
+            </w:pPr>
+            <w:r>
+              <w:rPr>
+                <w:b w:val="false"/>
+                <w:bCs w:val="false"/>
+                <w:sz w:val="19"/>
+                <w:szCs w:val="19"/>
+              </w:rPr>
               <w:t xml:space="preserve">Rounding ≤ 1 cent</w:t>
             </w:r>
           </w:p>
         </w:tc>
         <w:tc>
           <w:tcPr>
-            <w:tcW w:type="dxa" w:w="1800"/>
+            <w:tcW w:type="dxa" w:w="1900"/>
             <w:shd w:fill="EEF3F8" w:val="clear"/>
             <w:tcMar>
               <w:top w:type="dxa" w:w="60"/>
@@ -1517,7 +1799,7 @@
         </w:tc>
         <w:tc>
           <w:tcPr>
-            <w:tcW w:type="dxa" w:w="900"/>
+            <w:tcW w:type="dxa" w:w="700"/>
             <w:shd w:fill="EEF3F8" w:val="clear"/>
             <w:tcMar>
               <w:top w:type="dxa" w:w="60"/>
@@ -1544,7 +1826,7 @@
         </w:tc>
         <w:tc>
           <w:tcPr>
-            <w:tcW w:type="dxa" w:w="1260"/>
+            <w:tcW w:type="dxa" w:w="1760"/>
             <w:shd w:fill="EEF3F8" w:val="clear"/>
             <w:tcMar>
               <w:top w:type="dxa" w:w="60"/>
@@ -1583,12 +1865,14 @@
           <w:sz w:val="18"/>
           <w:szCs w:val="18"/>
         </w:rPr>
-        <w:t xml:space="preserve">* Impact shown at the deposit-vs-settlement level is 0 for these rows because the two amounts match; the real cost is the duplicate itself (double-credit risk, or a disputed double-settlement) — see the bridge, where each is accounted for separately.</w:t>
+        <w:t xml:space="preserve">* The deposit and settlement amounts match on these rows, so the row-level impact is 0. The real cost is the duplicate itself: a double-credit risk, or a disputed double settlement. The bridge accounts for each separately.</w:t>
       </w:r>
     </w:p>
     <w:p>
       <w:pPr>
         <w:pStyle w:val="Heading2"/>
+        <w:keepNext/>
+        <w:keepLines/>
         <w:spacing w:after="150" w:before="300"/>
       </w:pPr>
       <w:r>
@@ -1988,7 +2272,7 @@
                 <w:sz w:val="19"/>
                 <w:szCs w:val="19"/>
               </w:rPr>
-              <w:t xml:space="preserve">+ Settlements with no matching internal record</w:t>
+              <w:t xml:space="preserve">+ Settled in the first 15 minutes (last week's deposits)</w:t>
             </w:r>
           </w:p>
         </w:tc>
@@ -2015,7 +2299,7 @@
                 <w:sz w:val="19"/>
                 <w:szCs w:val="19"/>
               </w:rPr>
-              <w:t xml:space="preserve">5,500.00</w:t>
+              <w:t xml:space="preserve">2,600.00</w:t>
             </w:r>
           </w:p>
         </w:tc>
@@ -2046,7 +2330,7 @@
                 <w:sz w:val="19"/>
                 <w:szCs w:val="19"/>
               </w:rPr>
-              <w:t xml:space="preserve">+ Payments the gateway settled that we marked FAILED</w:t>
+              <w:t xml:space="preserve">+ Settlements with no matching internal record</w:t>
             </w:r>
           </w:p>
         </w:tc>
@@ -2072,7 +2356,7 @@
                 <w:sz w:val="19"/>
                 <w:szCs w:val="19"/>
               </w:rPr>
-              <w:t xml:space="preserve">250.00</w:t>
+              <w:t xml:space="preserve">2,900.00</w:t>
             </w:r>
           </w:p>
         </w:tc>
@@ -2104,7 +2388,7 @@
                 <w:sz w:val="19"/>
                 <w:szCs w:val="19"/>
               </w:rPr>
-              <w:t xml:space="preserve">+ Duplicate gateway settlement rows</w:t>
+              <w:t xml:space="preserve">+ Payments the gateway settled that we marked FAILED</w:t>
             </w:r>
           </w:p>
         </w:tc>
@@ -2131,7 +2415,7 @@
                 <w:sz w:val="19"/>
                 <w:szCs w:val="19"/>
               </w:rPr>
-              <w:t xml:space="preserve">1,550.00</w:t>
+              <w:t xml:space="preserve">250.00</w:t>
             </w:r>
           </w:p>
         </w:tc>
@@ -2162,7 +2446,7 @@
                 <w:sz w:val="19"/>
                 <w:szCs w:val="19"/>
               </w:rPr>
-              <w:t xml:space="preserve">+/− Gross amount disputes with the gateway</w:t>
+              <w:t xml:space="preserve">+ Duplicate gateway settlement rows</w:t>
             </w:r>
           </w:p>
         </w:tc>
@@ -2188,7 +2472,7 @@
                 <w:sz w:val="19"/>
                 <w:szCs w:val="19"/>
               </w:rPr>
-              <w:t xml:space="preserve">900.00</w:t>
+              <w:t xml:space="preserve">1,550.00</w:t>
             </w:r>
           </w:p>
         </w:tc>
@@ -2220,7 +2504,7 @@
                 <w:sz w:val="19"/>
                 <w:szCs w:val="19"/>
               </w:rPr>
-              <w:t xml:space="preserve">+/− Rounding (≤ 1 cent, immaterial)</w:t>
+              <w:t xml:space="preserve">+/− Gross amount differences with the gateway (net)</w:t>
             </w:r>
           </w:p>
         </w:tc>
@@ -2247,7 +2531,7 @@
                 <w:sz w:val="19"/>
                 <w:szCs w:val="19"/>
               </w:rPr>
-              <w:t xml:space="preserve">(0.03)</w:t>
+              <w:t xml:space="preserve">900.00</w:t>
             </w:r>
           </w:p>
         </w:tc>
@@ -2278,7 +2562,7 @@
                 <w:sz w:val="19"/>
                 <w:szCs w:val="19"/>
               </w:rPr>
-              <w:t xml:space="preserve">= Gateway SETTLED total</w:t>
+              <w:t xml:space="preserve">+/− Rounding (≤ 1 cent, immaterial)</w:t>
             </w:r>
           </w:p>
         </w:tc>
@@ -2304,7 +2588,7 @@
                 <w:sz w:val="19"/>
                 <w:szCs w:val="19"/>
               </w:rPr>
-              <w:t xml:space="preserve">217,979.97</w:t>
+              <w:t xml:space="preserve">(0.03)</w:t>
             </w:r>
           </w:p>
         </w:tc>
@@ -2336,7 +2620,7 @@
                 <w:sz w:val="19"/>
                 <w:szCs w:val="19"/>
               </w:rPr>
-              <w:t xml:space="preserve">Residual (unexplained)</w:t>
+              <w:t xml:space="preserve">= Gateway SETTLED total</w:t>
             </w:r>
           </w:p>
         </w:tc>
@@ -2363,6 +2647,63 @@
                 <w:sz w:val="19"/>
                 <w:szCs w:val="19"/>
               </w:rPr>
+              <w:t xml:space="preserve">217,979.97</w:t>
+            </w:r>
+          </w:p>
+        </w:tc>
+      </w:tr>
+      <w:tr>
+        <w:trPr>
+          <w:cantSplit/>
+        </w:trPr>
+        <w:tc>
+          <w:tcPr>
+            <w:tcW w:type="dxa" w:w="7360"/>
+            <w:tcMar>
+              <w:top w:type="dxa" w:w="60"/>
+              <w:left w:type="dxa" w:w="100"/>
+              <w:bottom w:type="dxa" w:w="60"/>
+              <w:right w:type="dxa" w:w="100"/>
+            </w:tcMar>
+            <w:vAlign w:val="center"/>
+          </w:tcPr>
+          <w:p>
+            <w:pPr>
+              <w:jc w:val="left"/>
+            </w:pPr>
+            <w:r>
+              <w:rPr>
+                <w:b w:val="false"/>
+                <w:bCs w:val="false"/>
+                <w:sz w:val="19"/>
+                <w:szCs w:val="19"/>
+              </w:rPr>
+              <w:t xml:space="preserve">Residual (unexplained)</w:t>
+            </w:r>
+          </w:p>
+        </w:tc>
+        <w:tc>
+          <w:tcPr>
+            <w:tcW w:type="dxa" w:w="2000"/>
+            <w:tcMar>
+              <w:top w:type="dxa" w:w="60"/>
+              <w:left w:type="dxa" w:w="100"/>
+              <w:bottom w:type="dxa" w:w="60"/>
+              <w:right w:type="dxa" w:w="100"/>
+            </w:tcMar>
+            <w:vAlign w:val="center"/>
+          </w:tcPr>
+          <w:p>
+            <w:pPr>
+              <w:jc w:val="left"/>
+            </w:pPr>
+            <w:r>
+              <w:rPr>
+                <w:b w:val="false"/>
+                <w:bCs w:val="false"/>
+                <w:sz w:val="19"/>
+                <w:szCs w:val="19"/>
+              </w:rPr>
               <w:t xml:space="preserve">0.00</w:t>
             </w:r>
           </w:p>
@@ -2379,78 +2720,18 @@
         <w:spacing w:after="160"/>
       </w:pPr>
       <w:r>
-        <w:t xml:space="preserve">This bridge is no longer just a spreadsheet exercise: it's enforced by a dbt singular test (assert_recon_bridge_reconciles) that fails the build if the residual ever moves off zero — see the dbt section below.</w:t>
+        <w:t xml:space="preserve">The bridge is on gross amounts, because that's what our deposits record. Fee and net-amount errors don't move gross, so they sit outside the bridge as their own exceptions. A dbt test (assert_recon_bridge_reconciles) fails the build if the residual ever moves off zero.</w:t>
       </w:r>
     </w:p>
     <w:p>
       <w:pPr>
         <w:pStyle w:val="Heading2"/>
+        <w:keepNext/>
+        <w:keepLines/>
         <w:spacing w:after="150" w:before="300"/>
       </w:pPr>
       <w:r>
-        <w:t xml:space="preserve">Automating this daily</w:t>
-      </w:r>
-    </w:p>
-    <w:p>
-      <w:pPr>
-        <w:pStyle w:val="ListParagraph"/>
-        <w:numPr>
-          <w:ilvl w:val="0"/>
-          <w:numId w:val="2"/>
-        </w:numPr>
-        <w:spacing w:after="80"/>
-      </w:pPr>
-      <w:r>
-        <w:t xml:space="preserve">Land both feeds daily as-is, never overwriting, and log control totals (row count, sum) per source before matching. A source-declared-vs-received mismatch is itself an alert.</w:t>
-      </w:r>
-    </w:p>
-    <w:p>
-      <w:pPr>
-        <w:pStyle w:val="ListParagraph"/>
-        <w:numPr>
-          <w:ilvl w:val="0"/>
-          <w:numId w:val="2"/>
-        </w:numPr>
-        <w:spacing w:after="80"/>
-      </w:pPr>
-      <w:r>
-        <w:t xml:space="preserve">Run the categorisation as a scheduled dbt model; persist history, never overwrite yesterday's result.</w:t>
-      </w:r>
-    </w:p>
-    <w:p>
-      <w:pPr>
-        <w:pStyle w:val="ListParagraph"/>
-        <w:numPr>
-          <w:ilvl w:val="0"/>
-          <w:numId w:val="2"/>
-        </w:numPr>
-        <w:spacing w:after="80"/>
-      </w:pPr>
-      <w:r>
-        <w:t xml:space="preserve">Alert tiers: page immediately on "wallet not credited" or "unrecognised settlement"; same-day on new duplicates or disputes above a materiality threshold; daily digest for reversals and timing items still within the cut-off window.</w:t>
-      </w:r>
-    </w:p>
-    <w:p>
-      <w:pPr>
-        <w:pStyle w:val="ListParagraph"/>
-        <w:numPr>
-          <w:ilvl w:val="0"/>
-          <w:numId w:val="2"/>
-        </w:numPr>
-        <w:spacing w:after="80"/>
-      </w:pPr>
-      <w:r>
-        <w:t xml:space="preserve">Ageing: unresolved after 3 days escalates to Finance management; unresolved after 7 days requires a signed-off write-off or credit note.</w:t>
-      </w:r>
-    </w:p>
-    <w:p>
-      <w:pPr>
-        <w:pStyle w:val="Heading1"/>
-        <w:pageBreakBefore/>
-        <w:spacing w:after="200" w:before="400"/>
-      </w:pPr>
-      <w:r>
-        <w:t xml:space="preserve">Exercise 2 — Incremental, Restartable API Ingestion</w:t>
+        <w:t xml:space="preserve">How the figures were checked</w:t>
       </w:r>
     </w:p>
     <w:p>
@@ -2458,92 +2739,7 @@
         <w:spacing w:after="160"/>
       </w:pPr>
       <w:r>
-        <w:rPr>
-          <w:i/>
-          <w:iCs/>
-          <w:color w:val="595959"/>
-          <w:sz w:val="20"/>
-          <w:szCs w:val="20"/>
-        </w:rPr>
-        <w:t xml:space="preserve">Tools used: Python 3 (standard library urllib only — no HTTP framework dependency), MySQL 8.0 for the checkpoint/ledger tables, Postman/Newman for exercising and documenting the API contract.</w:t>
-      </w:r>
-    </w:p>
-    <w:p>
-      <w:pPr>
-        <w:pStyle w:val="Heading2"/>
-        <w:spacing w:after="150" w:before="300"/>
-      </w:pPr>
-      <w:r>
-        <w:t xml:space="preserve">Design</w:t>
-      </w:r>
-    </w:p>
-    <w:p>
-      <w:pPr>
-        <w:pStyle w:val="ListParagraph"/>
-        <w:numPr>
-          <w:ilvl w:val="0"/>
-          <w:numId w:val="2"/>
-        </w:numPr>
-        <w:spacing w:after="80"/>
-      </w:pPr>
-      <w:r>
-        <w:t xml:space="preserve">Progress lives in MySQL (ingest_checkpoint), not memory or a local file, so any process on any host can resume it. Each run resumes from updated_since = last processed updated_at (inclusive), then paginates within the run via the server's cursor.</w:t>
-      </w:r>
-    </w:p>
-    <w:p>
-      <w:pPr>
-        <w:pStyle w:val="ListParagraph"/>
-        <w:numPr>
-          <w:ilvl w:val="0"/>
-          <w:numId w:val="2"/>
-        </w:numPr>
-        <w:spacing w:after="80"/>
-      </w:pPr>
-      <w:r>
-        <w:t xml:space="preserve">Every write is an upsert (INSERT … ON DUPLICATE KEY UPDATE) keyed on the provider's id — replaying a page is always safe. The data upsert, the reject-quarantine insert, the checkpoint update, and the run counters are committed together in one transaction per page.</w:t>
-      </w:r>
-    </w:p>
-    <w:p>
-      <w:pPr>
-        <w:pStyle w:val="ListParagraph"/>
-        <w:numPr>
-          <w:ilvl w:val="0"/>
-          <w:numId w:val="2"/>
-        </w:numPr>
-        <w:spacing w:after="80"/>
-      </w:pPr>
-      <w:r>
-        <w:t xml:space="preserve">429 (rate limited): sleep for Retry-After, retry the same request. 500 / network errors: exponential backoff. Bad records (unparseable amount, missing player_id): quarantined with the reason and the full raw JSON — never silently dropped.</w:t>
-      </w:r>
-    </w:p>
-    <w:p>
-      <w:pPr>
-        <w:pStyle w:val="ListParagraph"/>
-        <w:numPr>
-          <w:ilvl w:val="0"/>
-          <w:numId w:val="2"/>
-        </w:numPr>
-        <w:spacing w:after="80"/>
-      </w:pPr>
-      <w:r>
-        <w:t xml:space="preserve">Every run writes one row to ingest_runs: pages fetched, rows upserted/rejected, 429/500 counts, status. A run stuck RUNNING past one scheduling interval is the signal a stale-run monitor pages on.</w:t>
-      </w:r>
-    </w:p>
-    <w:p>
-      <w:pPr>
-        <w:pStyle w:val="Heading2"/>
-        <w:spacing w:after="150" w:before="300"/>
-      </w:pPr>
-      <w:r>
-        <w:t xml:space="preserve">Evidence: kill, restart, new activity</w:t>
-      </w:r>
-    </w:p>
-    <w:p>
-      <w:pPr>
-        <w:spacing w:after="160"/>
-      </w:pPr>
-      <w:r>
-        <w:t xml:space="preserve">The process was started with a small page size and an artificial pre-commit delay, then killed with SIGKILL mid-page — a hard crash, not a graceful shutdown.</w:t>
+        <w:t xml:space="preserve">The categorisation was implemented three times: the MySQL script, the dbt model, and separately written pandas code (sql/04_independent_check.py) that works per deposit and per settlement instead of through a join. All three agree on all 317 rows individually, and on every category's count and rand total.</w:t>
       </w:r>
     </w:p>
     <w:p>
@@ -2554,7 +2750,7 @@
       <w:r>
         <w:drawing>
           <wp:inline distT="0" distB="0" distL="0" distR="0">
-            <wp:extent cx="5334000" cy="4667250"/>
+            <wp:extent cx="4953000" cy="2857500"/>
             <wp:effectExtent t="0" r="0" b="0" l="0"/>
             <wp:docPr id="2" name="" descr="" title=""/>
             <wp:cNvGraphicFramePr>
@@ -2579,7 +2775,7 @@
                   <pic:spPr bwMode="auto">
                     <a:xfrm>
                       <a:off x="0" y="0"/>
-                      <a:ext cx="5334000" cy="4667250"/>
+                      <a:ext cx="4953000" cy="2857500"/>
                     </a:xfrm>
                     <a:prstGeom prst="rect">
                       <a:avLst/>
@@ -2605,7 +2801,7 @@
           <w:sz w:val="20"/>
           <w:szCs w:val="20"/>
         </w:rPr>
-        <w:t xml:space="preserve">Actual terminal output: kill mid-page → restart → complete → simulate new provider activity → rerun.</w:t>
+        <w:t xml:space="preserve">Three implementations, identical results in every category (sql/05_agreement_chart.py).</w:t>
       </w:r>
     </w:p>
     <w:p>
@@ -2613,16 +2809,84 @@
         <w:spacing w:after="160"/>
       </w:pPr>
       <w:r>
-        <w:t xml:space="preserve">Result: 50 rows committed before the kill (exactly page 1 — page 2 never landed), the run left visibly RUNNING (the stale-run signal), and a clean restart resumed correctly with zero duplicates and zero missing rows. After simulating new activity (POST /admin/advance), a rerun correctly picked up 40 changed records and 25 new ones — including a live 429 that was retried automatically.</w:t>
+        <w:rPr>
+          <w:i/>
+          <w:iCs/>
+        </w:rPr>
+        <w:t xml:space="preserve">That check was added after an audit of an earlier draft found real problems, all now fixed. The draft had no test for net = gross − fee, which the brief requires, so it missed two short-paid settlements. It didn't quantify the fee overcharge. It counted four reference-formatting variants instead of six, because a case-insensitive database comparison hid three. It filed three start-of-week settlements as unrecognised money rather than timing. The bridge balanced throughout. The errors were in how the differences were labelled and summarised, which is why the categories are now cross-checked independently.</w:t>
       </w:r>
     </w:p>
     <w:p>
       <w:pPr>
         <w:pStyle w:val="Heading2"/>
+        <w:keepNext/>
+        <w:keepLines/>
         <w:spacing w:after="150" w:before="300"/>
       </w:pPr>
       <w:r>
-        <w:t xml:space="preserve">API contract — Postman</w:t>
+        <w:t xml:space="preserve">Automating this daily</w:t>
+      </w:r>
+    </w:p>
+    <w:p>
+      <w:pPr>
+        <w:pStyle w:val="ListParagraph"/>
+        <w:numPr>
+          <w:ilvl w:val="0"/>
+          <w:numId w:val="2"/>
+        </w:numPr>
+        <w:spacing w:after="80"/>
+      </w:pPr>
+      <w:r>
+        <w:t xml:space="preserve">Land both feeds daily as-is, never overwriting, and log control totals (row count, sum) per source before matching. A source-declared-vs-received mismatch is itself an alert.</w:t>
+      </w:r>
+    </w:p>
+    <w:p>
+      <w:pPr>
+        <w:pStyle w:val="ListParagraph"/>
+        <w:numPr>
+          <w:ilvl w:val="0"/>
+          <w:numId w:val="2"/>
+        </w:numPr>
+        <w:spacing w:after="80"/>
+      </w:pPr>
+      <w:r>
+        <w:t xml:space="preserve">Run the categorisation as a scheduled dbt model; persist history, never overwrite yesterday's result.</w:t>
+      </w:r>
+    </w:p>
+    <w:p>
+      <w:pPr>
+        <w:pStyle w:val="ListParagraph"/>
+        <w:numPr>
+          <w:ilvl w:val="0"/>
+          <w:numId w:val="2"/>
+        </w:numPr>
+        <w:spacing w:after="80"/>
+      </w:pPr>
+      <w:r>
+        <w:t xml:space="preserve">Alert tiers: page immediately on "wallet not credited" or "unrecognised settlement"; same-day on new duplicates or disputes above a materiality threshold; daily digest for reversals and timing items still within the cut-off window.</w:t>
+      </w:r>
+    </w:p>
+    <w:p>
+      <w:pPr>
+        <w:pStyle w:val="ListParagraph"/>
+        <w:numPr>
+          <w:ilvl w:val="0"/>
+          <w:numId w:val="2"/>
+        </w:numPr>
+        <w:spacing w:after="80"/>
+      </w:pPr>
+      <w:r>
+        <w:t xml:space="preserve">Ageing: unresolved after 3 days escalates to Finance management; unresolved after 7 days requires a signed-off write-off or credit note.</w:t>
+      </w:r>
+    </w:p>
+    <w:p>
+      <w:pPr>
+        <w:pStyle w:val="Heading1"/>
+        <w:pageBreakBefore/>
+        <w:spacing w:after="200" w:before="400"/>
+      </w:pPr>
+      <w:r>
+        <w:t xml:space="preserve">Exercise 2 — Incremental, Restartable API Ingestion</w:t>
       </w:r>
     </w:p>
     <w:p>
@@ -2630,7 +2894,96 @@
         <w:spacing w:after="160"/>
       </w:pPr>
       <w:r>
-        <w:t xml:space="preserve">A Postman collection documents the API's pagination, filtering, auth and admin-simulation behaviour, and includes a self-paginating request that walks every page and reports the total record count directly in Postman's Test Results panel.</w:t>
+        <w:rPr>
+          <w:i/>
+          <w:iCs/>
+          <w:color w:val="595959"/>
+          <w:sz w:val="20"/>
+          <w:szCs w:val="20"/>
+        </w:rPr>
+        <w:t xml:space="preserve">Tools used: Python 3 (standard library urllib only — no HTTP framework dependency), MySQL 8.0 for the checkpoint/ledger tables, Postman/Newman for exercising and documenting the API contract.</w:t>
+      </w:r>
+    </w:p>
+    <w:p>
+      <w:pPr>
+        <w:pStyle w:val="Heading2"/>
+        <w:keepNext/>
+        <w:keepLines/>
+        <w:spacing w:after="150" w:before="300"/>
+      </w:pPr>
+      <w:r>
+        <w:t xml:space="preserve">Design</w:t>
+      </w:r>
+    </w:p>
+    <w:p>
+      <w:pPr>
+        <w:pStyle w:val="ListParagraph"/>
+        <w:numPr>
+          <w:ilvl w:val="0"/>
+          <w:numId w:val="2"/>
+        </w:numPr>
+        <w:spacing w:after="80"/>
+      </w:pPr>
+      <w:r>
+        <w:t xml:space="preserve">Progress lives in MySQL (ingest_checkpoint), not memory or a local file, so any process on any host can resume it. Each run resumes from updated_since = last processed updated_at (inclusive), then paginates within the run via the server's cursor.</w:t>
+      </w:r>
+    </w:p>
+    <w:p>
+      <w:pPr>
+        <w:pStyle w:val="ListParagraph"/>
+        <w:numPr>
+          <w:ilvl w:val="0"/>
+          <w:numId w:val="2"/>
+        </w:numPr>
+        <w:spacing w:after="80"/>
+      </w:pPr>
+      <w:r>
+        <w:t xml:space="preserve">Every write is an upsert (INSERT … ON DUPLICATE KEY UPDATE) keyed on the provider's id — replaying a page is always safe. The data upsert, the reject-quarantine insert, the checkpoint update, and the run counters are committed together in one transaction per page.</w:t>
+      </w:r>
+    </w:p>
+    <w:p>
+      <w:pPr>
+        <w:pStyle w:val="ListParagraph"/>
+        <w:numPr>
+          <w:ilvl w:val="0"/>
+          <w:numId w:val="2"/>
+        </w:numPr>
+        <w:spacing w:after="80"/>
+      </w:pPr>
+      <w:r>
+        <w:t xml:space="preserve">429 (rate limited): sleep for Retry-After, retry the same request. 500 / network errors: exponential backoff. Bad records (unparseable amount, missing player_id): quarantined with the reason and the full raw JSON — never silently dropped.</w:t>
+      </w:r>
+    </w:p>
+    <w:p>
+      <w:pPr>
+        <w:pStyle w:val="ListParagraph"/>
+        <w:numPr>
+          <w:ilvl w:val="0"/>
+          <w:numId w:val="2"/>
+        </w:numPr>
+        <w:spacing w:after="80"/>
+      </w:pPr>
+      <w:r>
+        <w:t xml:space="preserve">Every run writes one row to ingest_runs: pages fetched, rows upserted/rejected, 429/500 counts, status. A run stuck RUNNING past one scheduling interval is the signal a stale-run monitor pages on.</w:t>
+      </w:r>
+    </w:p>
+    <w:p>
+      <w:pPr>
+        <w:pStyle w:val="Heading2"/>
+        <w:keepNext/>
+        <w:keepLines/>
+        <w:spacing w:after="150" w:before="300"/>
+      </w:pPr>
+      <w:r>
+        <w:t xml:space="preserve">Evidence: kill, restart, new activity</w:t>
+      </w:r>
+    </w:p>
+    <w:p>
+      <w:pPr>
+        <w:spacing w:after="160"/>
+      </w:pPr>
+      <w:r>
+        <w:t xml:space="preserve">The process was started with a small page size and an artificial pre-commit delay, then killed with SIGKILL mid-page — a hard crash, not a graceful shutdown.</w:t>
       </w:r>
     </w:p>
     <w:p>
@@ -2641,7 +2994,7 @@
       <w:r>
         <w:drawing>
           <wp:inline distT="0" distB="0" distL="0" distR="0">
-            <wp:extent cx="5334000" cy="3752850"/>
+            <wp:extent cx="5334000" cy="4667250"/>
             <wp:effectExtent t="0" r="0" b="0" l="0"/>
             <wp:docPr id="3" name="" descr="" title=""/>
             <wp:cNvGraphicFramePr>
@@ -2666,7 +3019,7 @@
                   <pic:spPr bwMode="auto">
                     <a:xfrm>
                       <a:off x="0" y="0"/>
-                      <a:ext cx="5334000" cy="3752850"/>
+                      <a:ext cx="5334000" cy="4667250"/>
                     </a:xfrm>
                     <a:prstGeom prst="rect">
                       <a:avLst/>
@@ -2692,16 +3045,26 @@
           <w:sz w:val="20"/>
           <w:szCs w:val="20"/>
         </w:rPr>
-        <w:t xml:space="preserve">Newman run of the Exercise 2 collection: 5 requests, 10/10 assertions passing.</w:t>
+        <w:t xml:space="preserve">Actual terminal output: kill mid-page → restart → complete → simulate new provider activity → rerun.</w:t>
+      </w:r>
+    </w:p>
+    <w:p>
+      <w:pPr>
+        <w:spacing w:after="160"/>
+      </w:pPr>
+      <w:r>
+        <w:t xml:space="preserve">Result: 50 rows committed before the kill (exactly page 1 — page 2 never landed), the run left visibly RUNNING (the stale-run signal), and a clean restart resumed correctly with zero duplicates and zero missing rows. After simulating new activity (POST /admin/advance), a rerun correctly picked up 40 changed records and 25 new ones — including a live 429 that was retried automatically.</w:t>
       </w:r>
     </w:p>
     <w:p>
       <w:pPr>
         <w:pStyle w:val="Heading2"/>
+        <w:keepNext/>
+        <w:keepLines/>
         <w:spacing w:after="150" w:before="300"/>
       </w:pPr>
       <w:r>
-        <w:t xml:space="preserve">Live run — Postman Desktop against the local mock API</w:t>
+        <w:t xml:space="preserve">API contract — Postman</w:t>
       </w:r>
     </w:p>
     <w:p>
@@ -2709,7 +3072,7 @@
         <w:spacing w:after="160"/>
       </w:pPr>
       <w:r>
-        <w:t xml:space="preserve">The same collection was then imported into Postman Desktop on a Windows workstation and run against mock_api.py started from PyCharm — an independent environment from the one the code was built in.</w:t>
+        <w:t xml:space="preserve">A Postman collection documents the API's pagination, filtering, auth and admin-simulation behaviour, and includes a self-paginating request that walks every page and reports the total record count directly in Postman's Test Results panel.</w:t>
       </w:r>
     </w:p>
     <w:p>
@@ -2720,7 +3083,7 @@
       <w:r>
         <w:drawing>
           <wp:inline distT="0" distB="0" distL="0" distR="0">
-            <wp:extent cx="5715000" cy="3143250"/>
+            <wp:extent cx="5334000" cy="3752850"/>
             <wp:effectExtent t="0" r="0" b="0" l="0"/>
             <wp:docPr id="4" name="" descr="" title=""/>
             <wp:cNvGraphicFramePr>
@@ -2745,7 +3108,7 @@
                   <pic:spPr bwMode="auto">
                     <a:xfrm>
                       <a:off x="0" y="0"/>
-                      <a:ext cx="5715000" cy="3143250"/>
+                      <a:ext cx="5334000" cy="3752850"/>
                     </a:xfrm>
                     <a:prstGeom prst="rect">
                       <a:avLst/>
@@ -2771,7 +3134,26 @@
           <w:sz w:val="20"/>
           <w:szCs w:val="20"/>
         </w:rPr>
-        <w:t xml:space="preserve">mock_api.py running in PyCharm: "Mock API on http://127.0.0.1:8000 (faults on)".</w:t>
+        <w:t xml:space="preserve">Newman run of the Exercise 2 collection: 5 requests, 10/10 assertions passing.</w:t>
+      </w:r>
+    </w:p>
+    <w:p>
+      <w:pPr>
+        <w:pStyle w:val="Heading2"/>
+        <w:keepNext/>
+        <w:keepLines/>
+        <w:spacing w:after="150" w:before="300"/>
+      </w:pPr>
+      <w:r>
+        <w:t xml:space="preserve">Live run — Postman Desktop against the local mock API</w:t>
+      </w:r>
+    </w:p>
+    <w:p>
+      <w:pPr>
+        <w:spacing w:after="160"/>
+      </w:pPr>
+      <w:r>
+        <w:t xml:space="preserve">The same collection was then imported into Postman Desktop on a Windows workstation and run against mock_api.py started from PyCharm — an independent environment from the one the code was built in.</w:t>
       </w:r>
     </w:p>
     <w:p>
@@ -2782,7 +3164,7 @@
       <w:r>
         <w:drawing>
           <wp:inline distT="0" distB="0" distL="0" distR="0">
-            <wp:extent cx="4381500" cy="3000375"/>
+            <wp:extent cx="5715000" cy="3143250"/>
             <wp:effectExtent t="0" r="0" b="0" l="0"/>
             <wp:docPr id="5" name="" descr="" title=""/>
             <wp:cNvGraphicFramePr>
@@ -2807,7 +3189,7 @@
                   <pic:spPr bwMode="auto">
                     <a:xfrm>
                       <a:off x="0" y="0"/>
-                      <a:ext cx="4381500" cy="3000375"/>
+                      <a:ext cx="5715000" cy="3143250"/>
                     </a:xfrm>
                     <a:prstGeom prst="rect">
                       <a:avLst/>
@@ -2833,7 +3215,7 @@
           <w:sz w:val="20"/>
           <w:szCs w:val="20"/>
         </w:rPr>
-        <w:t xml:space="preserve">Collection Runner configuration: all seven requests, one iteration.</w:t>
+        <w:t xml:space="preserve">mock_api.py running in PyCharm: "Mock API on http://127.0.0.1:8000 (faults on)".</w:t>
       </w:r>
     </w:p>
     <w:p>
@@ -2844,7 +3226,7 @@
       <w:r>
         <w:drawing>
           <wp:inline distT="0" distB="0" distL="0" distR="0">
-            <wp:extent cx="4572000" cy="3790950"/>
+            <wp:extent cx="4381500" cy="3000375"/>
             <wp:effectExtent t="0" r="0" b="0" l="0"/>
             <wp:docPr id="6" name="" descr="" title=""/>
             <wp:cNvGraphicFramePr>
@@ -2869,7 +3251,7 @@
                   <pic:spPr bwMode="auto">
                     <a:xfrm>
                       <a:off x="0" y="0"/>
-                      <a:ext cx="4572000" cy="3790950"/>
+                      <a:ext cx="4381500" cy="3000375"/>
                     </a:xfrm>
                     <a:prstGeom prst="rect">
                       <a:avLst/>
@@ -2895,7 +3277,7 @@
           <w:sz w:val="20"/>
           <w:szCs w:val="20"/>
         </w:rPr>
-        <w:t xml:space="preserve">Runner results, pages 1–4 of the self-paginating count. Page 1 returns 201 rows for limit=200 (the API's documented in-page duplicate); page 4 hits a live 500 and retries the same page.</w:t>
+        <w:t xml:space="preserve">Collection Runner configuration: all seven requests, one iteration.</w:t>
       </w:r>
     </w:p>
     <w:p>
@@ -2957,118 +3339,7 @@
           <w:sz w:val="20"/>
           <w:szCs w:val="20"/>
         </w:rPr>
-        <w:t xml:space="preserve">Runner results, pages 4–6: DONE — total records returned by the API: 1,027 across 6 pages.</w:t>
-      </w:r>
-    </w:p>
-    <w:p>
-      <w:pPr>
-        <w:spacing w:after="160"/>
-      </w:pPr>
-      <w:r>
-        <w:t xml:space="preserve">The run reports 16 of 18 assertions passing. The two failures are on request 2 ("Next page"), a one-shot documentation request with no retry logic, which happened to land on the mock API's injected 429. Only the counting request carries retry handling. That is by design, and it shows why the ingestion program retries every call.</w:t>
-      </w:r>
-    </w:p>
-    <w:p>
-      <w:pPr>
-        <w:spacing w:after="160"/>
-      </w:pPr>
-      <w:r>
-        <w:t xml:space="preserve">Why 1,027 rather than 1,025: the runner executes /admin/advance (request 5) before the count, so the dataset is already 1,025 records; the extra rows are the API's deliberate in-page duplicates, counted raw here. ingest.py deduplicates them, which is why its loaded row count is lower than the raw count.</w:t>
-      </w:r>
-    </w:p>
-    <w:p>
-      <w:pPr>
-        <w:pStyle w:val="Heading2"/>
-        <w:spacing w:after="150" w:before="300"/>
-      </w:pPr>
-      <w:r>
-        <w:t xml:space="preserve">What I'd change for production</w:t>
-      </w:r>
-    </w:p>
-    <w:p>
-      <w:pPr>
-        <w:pStyle w:val="ListParagraph"/>
-        <w:numPr>
-          <w:ilvl w:val="0"/>
-          <w:numId w:val="2"/>
-        </w:numPr>
-        <w:spacing w:after="80"/>
-      </w:pPr>
-      <w:r>
-        <w:t xml:space="preserve">A managed scheduler (Airflow / cron+systemd) with a concurrency lock, so two overlapping runs can't race.</w:t>
-      </w:r>
-    </w:p>
-    <w:p>
-      <w:pPr>
-        <w:pStyle w:val="ListParagraph"/>
-        <w:numPr>
-          <w:ilvl w:val="0"/>
-          <w:numId w:val="2"/>
-        </w:numPr>
-        <w:spacing w:after="80"/>
-      </w:pPr>
-      <w:r>
-        <w:t xml:space="preserve">Secrets (API key, DB credentials) out of source and into a secrets manager.</w:t>
-      </w:r>
-    </w:p>
-    <w:p>
-      <w:pPr>
-        <w:pStyle w:val="ListParagraph"/>
-        <w:numPr>
-          <w:ilvl w:val="0"/>
-          <w:numId w:val="2"/>
-        </w:numPr>
-        <w:spacing w:after="80"/>
-      </w:pPr>
-      <w:r>
-        <w:t xml:space="preserve">Page on FAILED runs, a stale RUNNING row, or a rejects-rate spike (usually a schema change, not random dirty data).</w:t>
-      </w:r>
-    </w:p>
-    <w:p>
-      <w:pPr>
-        <w:pStyle w:val="ListParagraph"/>
-        <w:numPr>
-          <w:ilvl w:val="0"/>
-          <w:numId w:val="2"/>
-        </w:numPr>
-        <w:spacing w:after="80"/>
-      </w:pPr>
-      <w:r>
-        <w:t xml:space="preserve">At real volume: staging-table + bulk MERGE instead of row-by-row upserts; partition by date; multiple workers on disjoint id ranges if one API key's rate limit becomes the bottleneck.</w:t>
-      </w:r>
-    </w:p>
-    <w:p>
-      <w:pPr>
-        <w:pStyle w:val="Heading1"/>
-        <w:pageBreakBefore/>
-        <w:spacing w:after="200" w:before="400"/>
-      </w:pPr>
-      <w:r>
-        <w:t xml:space="preserve">Exercise 3 — Database Design: Players, Wallets, Bets, Bonuses</w:t>
-      </w:r>
-    </w:p>
-    <w:p>
-      <w:pPr>
-        <w:spacing w:after="160"/>
-      </w:pPr>
-      <w:r>
-        <w:rPr>
-          <w:i/>
-          <w:iCs/>
-          <w:color w:val="595959"/>
-          <w:sz w:val="20"/>
-          <w:szCs w:val="20"/>
-        </w:rPr>
-        <w:t xml:space="preserve">Tools used: MySQL 8.0 for the schema (cross-verified against MariaDB 10.11), Mermaid for the ERD, dbt for the reporting-model mapping.</w:t>
-      </w:r>
-    </w:p>
-    <w:p>
-      <w:pPr>
-        <w:pStyle w:val="Heading2"/>
-        <w:spacing w:after="150" w:before="300"/>
-      </w:pPr>
-      <w:r>
-        <w:t xml:space="preserve">Entity-relationship diagram</w:t>
+        <w:t xml:space="preserve">Runner results, pages 1–4 of the self-paginating count. Page 1 returns 201 rows for limit=200 (the API's documented in-page duplicate); page 4 hits a live 500 and retries the same page.</w:t>
       </w:r>
     </w:p>
     <w:p>
@@ -3079,7 +3350,7 @@
       <w:r>
         <w:drawing>
           <wp:inline distT="0" distB="0" distL="0" distR="0">
-            <wp:extent cx="5905500" cy="5162550"/>
+            <wp:extent cx="4572000" cy="3790950"/>
             <wp:effectExtent t="0" r="0" b="0" l="0"/>
             <wp:docPr id="8" name="" descr="" title=""/>
             <wp:cNvGraphicFramePr>
@@ -3104,7 +3375,7 @@
                   <pic:spPr bwMode="auto">
                     <a:xfrm>
                       <a:off x="0" y="0"/>
-                      <a:ext cx="5905500" cy="5162550"/>
+                      <a:ext cx="4572000" cy="3790950"/>
                     </a:xfrm>
                     <a:prstGeom prst="rect">
                       <a:avLst/>
@@ -3130,25 +3401,96 @@
           <w:sz w:val="20"/>
           <w:szCs w:val="20"/>
         </w:rPr>
-        <w:t xml:space="preserve">23-table operational schema — full DDL in exercise3-schema-design/ddl.sql, verified to run clean on both MySQL 8.0 and MariaDB 10.11.</w:t>
+        <w:t xml:space="preserve">Runner results, pages 4–6: DONE — total records returned by the API: 1,027 across 6 pages.</w:t>
+      </w:r>
+    </w:p>
+    <w:p>
+      <w:pPr>
+        <w:spacing w:after="160"/>
+      </w:pPr>
+      <w:r>
+        <w:t xml:space="preserve">The run reports 16 of 18 assertions passing. The two failures are on request 2 ("Next page"), a one-shot documentation request with no retry logic, which happened to land on the mock API's injected 429. Only the counting request carries retry handling. That is by design, and it shows why the ingestion program retries every call.</w:t>
+      </w:r>
+    </w:p>
+    <w:p>
+      <w:pPr>
+        <w:spacing w:after="160"/>
+      </w:pPr>
+      <w:r>
+        <w:t xml:space="preserve">Why 1,027 rather than 1,025: the runner executes /admin/advance (request 5) before the count, so the dataset is already 1,025 records; the extra rows are the API's deliberate in-page duplicates, counted raw here. ingest.py deduplicates them, which is why its loaded row count is lower than the raw count.</w:t>
       </w:r>
     </w:p>
     <w:p>
       <w:pPr>
         <w:pStyle w:val="Heading2"/>
+        <w:keepNext/>
+        <w:keepLines/>
         <w:spacing w:after="150" w:before="300"/>
       </w:pPr>
       <w:r>
-        <w:t xml:space="preserve">Design principles</w:t>
-      </w:r>
-    </w:p>
-    <w:p>
-      <w:pPr>
-        <w:pStyle w:val="Heading3"/>
-        <w:spacing w:after="100" w:before="200"/>
-      </w:pPr>
-      <w:r>
-        <w:t xml:space="preserve">Money and time</w:t>
+        <w:t xml:space="preserve">What I'd change for production</w:t>
+      </w:r>
+    </w:p>
+    <w:p>
+      <w:pPr>
+        <w:pStyle w:val="ListParagraph"/>
+        <w:numPr>
+          <w:ilvl w:val="0"/>
+          <w:numId w:val="2"/>
+        </w:numPr>
+        <w:spacing w:after="80"/>
+      </w:pPr>
+      <w:r>
+        <w:t xml:space="preserve">A managed scheduler (Airflow / cron+systemd) with a concurrency lock, so two overlapping runs can't race.</w:t>
+      </w:r>
+    </w:p>
+    <w:p>
+      <w:pPr>
+        <w:pStyle w:val="ListParagraph"/>
+        <w:numPr>
+          <w:ilvl w:val="0"/>
+          <w:numId w:val="2"/>
+        </w:numPr>
+        <w:spacing w:after="80"/>
+      </w:pPr>
+      <w:r>
+        <w:t xml:space="preserve">Secrets (API key, DB credentials) out of source and into a secrets manager.</w:t>
+      </w:r>
+    </w:p>
+    <w:p>
+      <w:pPr>
+        <w:pStyle w:val="ListParagraph"/>
+        <w:numPr>
+          <w:ilvl w:val="0"/>
+          <w:numId w:val="2"/>
+        </w:numPr>
+        <w:spacing w:after="80"/>
+      </w:pPr>
+      <w:r>
+        <w:t xml:space="preserve">Page on FAILED runs, a stale RUNNING row, or a rejects-rate spike (usually a schema change, not random dirty data).</w:t>
+      </w:r>
+    </w:p>
+    <w:p>
+      <w:pPr>
+        <w:pStyle w:val="ListParagraph"/>
+        <w:numPr>
+          <w:ilvl w:val="0"/>
+          <w:numId w:val="2"/>
+        </w:numPr>
+        <w:spacing w:after="80"/>
+      </w:pPr>
+      <w:r>
+        <w:t xml:space="preserve">At real volume: staging-table + bulk MERGE instead of row-by-row upserts; partition by date; multiple workers on disjoint id ranges if one API key's rate limit becomes the bottleneck.</w:t>
+      </w:r>
+    </w:p>
+    <w:p>
+      <w:pPr>
+        <w:pStyle w:val="Heading1"/>
+        <w:pageBreakBefore/>
+        <w:spacing w:after="200" w:before="400"/>
+      </w:pPr>
+      <w:r>
+        <w:t xml:space="preserve">Exercise 3 — Database Design: Players, Wallets, Bets, Bonuses</w:t>
       </w:r>
     </w:p>
     <w:p>
@@ -3156,75 +3498,25 @@
         <w:spacing w:after="160"/>
       </w:pPr>
       <w:r>
-        <w:t xml:space="preserve">DECIMAL(18,4) everywhere a balance or amount is stored — never FLOAT/DOUBLE. DATETIME(6), always UTC, columns suffixed _at_utc; MySQL's TIMESTAMP is deliberately avoided because it silently converts using the session/server time zone.</w:t>
-      </w:r>
-    </w:p>
-    <w:p>
-      <w:pPr>
-        <w:pStyle w:val="Heading3"/>
-        <w:spacing w:after="100" w:before="200"/>
-      </w:pPr>
-      <w:r>
-        <w:t xml:space="preserve">Balance correctness</w:t>
-      </w:r>
-    </w:p>
-    <w:p>
-      <w:pPr>
-        <w:spacing w:after="160"/>
-      </w:pPr>
-      <w:r>
-        <w:t xml:space="preserve">wallets.real_balance / bonus_balance are a materialised cache, not the source of truth — wallet_transactions (an append-only ledger) is. A balance at any point in time is SUM(credit) − SUM(debit) up to that moment, proven directly by example query (c) below. Corrections and reversals are new rows referencing the original (reversal_of_wallet_txn_id), never edits; every row carries a deterministic idempotency_key so replaying an event can never double-post it. A dbt test (assert_wallet_cache_matches_ledger) fails the build if the cache ever disagrees with the ledger.</w:t>
-      </w:r>
-    </w:p>
-    <w:p>
-      <w:pPr>
-        <w:pStyle w:val="Heading3"/>
-        <w:spacing w:after="100" w:before="200"/>
-      </w:pPr>
-      <w:r>
-        <w:t xml:space="preserve">History over time</w:t>
-      </w:r>
-    </w:p>
-    <w:p>
-      <w:pPr>
-        <w:spacing w:after="160"/>
-      </w:pPr>
-      <w:r>
-        <w:t xml:space="preserve">player_vip_tier_history and player_tag_history are SCD Type 2 (a new row per change, valid_from/valid_to), so "what tier was this player on 3 September" is answerable, not just "what tier are they now".</w:t>
-      </w:r>
-    </w:p>
-    <w:p>
-      <w:pPr>
-        <w:pStyle w:val="Heading3"/>
-        <w:spacing w:after="100" w:before="200"/>
-      </w:pPr>
-      <w:r>
-        <w:t xml:space="preserve">Protecting personal information</w:t>
-      </w:r>
-    </w:p>
-    <w:p>
-      <w:pPr>
-        <w:spacing w:after="160"/>
-      </w:pPr>
-      <w:r>
-        <w:t xml:space="preserve">player_identity is a separate table, joined only by player_id — every other table (bets, wallet transactions, bonuses) never sees a name or ID number. In production: application-layer encryption on sensitive fields, a dedicated low-privilege DB role, and every read of the identity table logged.</w:t>
+        <w:rPr>
+          <w:i/>
+          <w:iCs/>
+          <w:color w:val="595959"/>
+          <w:sz w:val="20"/>
+          <w:szCs w:val="20"/>
+        </w:rPr>
+        <w:t xml:space="preserve">Tools used: MySQL 8.0 for the schema (cross-verified against MariaDB 10.11), Mermaid for the ERD, dbt for the reporting-model mapping.</w:t>
       </w:r>
     </w:p>
     <w:p>
       <w:pPr>
         <w:pStyle w:val="Heading2"/>
+        <w:keepNext/>
+        <w:keepLines/>
         <w:spacing w:after="150" w:before="300"/>
       </w:pPr>
       <w:r>
-        <w:t xml:space="preserve">The four required queries — verified output</w:t>
-      </w:r>
-    </w:p>
-    <w:p>
-      <w:pPr>
-        <w:spacing w:after="160"/>
-      </w:pPr>
-      <w:r>
-        <w:t xml:space="preserve">Run against the seed data in exercise3-schema-design/seed.sql; identical results on MySQL 8.0 and MariaDB 10.11.</w:t>
+        <w:t xml:space="preserve">Entity-relationship diagram</w:t>
       </w:r>
     </w:p>
     <w:p>
@@ -3235,7 +3527,7 @@
       <w:r>
         <w:drawing>
           <wp:inline distT="0" distB="0" distL="0" distR="0">
-            <wp:extent cx="5334000" cy="1314450"/>
+            <wp:extent cx="5905500" cy="5162550"/>
             <wp:effectExtent t="0" r="0" b="0" l="0"/>
             <wp:docPr id="9" name="" descr="" title=""/>
             <wp:cNvGraphicFramePr>
@@ -3260,7 +3552,7 @@
                   <pic:spPr bwMode="auto">
                     <a:xfrm>
                       <a:off x="0" y="0"/>
-                      <a:ext cx="5334000" cy="1314450"/>
+                      <a:ext cx="5905500" cy="5162550"/>
                     </a:xfrm>
                     <a:prstGeom prst="rect">
                       <a:avLst/>
@@ -3286,326 +3578,29 @@
           <w:sz w:val="20"/>
           <w:szCs w:val="20"/>
         </w:rPr>
-        <w:t xml:space="preserve">mysql -- jsb_platform -- example_queries.sql</w:t>
-      </w:r>
-    </w:p>
-    <w:tbl>
-      <w:tblPr>
-        <w:tblW w:type="dxa" w:w="9360"/>
-        <w:tblBorders>
-          <w:top w:val="single" w:color="auto" w:sz="4"/>
-          <w:left w:val="single" w:color="auto" w:sz="4"/>
-          <w:bottom w:val="single" w:color="auto" w:sz="4"/>
-          <w:right w:val="single" w:color="auto" w:sz="4"/>
-          <w:insideH w:val="single" w:color="auto" w:sz="4"/>
-          <w:insideV w:val="single" w:color="auto" w:sz="4"/>
-        </w:tblBorders>
-      </w:tblPr>
-      <w:tblGrid>
-        <w:gridCol w:w="3400"/>
-        <w:gridCol w:w="5960"/>
-      </w:tblGrid>
-      <w:tr>
-        <w:trPr>
-          <w:tblHeader/>
-        </w:trPr>
-        <w:tc>
-          <w:tcPr>
-            <w:tcW w:type="dxa" w:w="3400"/>
-            <w:shd w:fill="1F3864" w:val="clear"/>
-            <w:tcMar>
-              <w:top w:type="dxa" w:w="60"/>
-              <w:left w:type="dxa" w:w="100"/>
-              <w:bottom w:type="dxa" w:w="60"/>
-              <w:right w:type="dxa" w:w="100"/>
-            </w:tcMar>
-            <w:vAlign w:val="center"/>
-          </w:tcPr>
-          <w:p>
-            <w:pPr>
-              <w:jc w:val="left"/>
-            </w:pPr>
-            <w:r>
-              <w:rPr>
-                <w:b/>
-                <w:bCs/>
-                <w:color w:val="FFFFFF"/>
-                <w:sz w:val="19"/>
-                <w:szCs w:val="19"/>
-              </w:rPr>
-              <w:t xml:space="preserve">Query</w:t>
-            </w:r>
-          </w:p>
-        </w:tc>
-        <w:tc>
-          <w:tcPr>
-            <w:tcW w:type="dxa" w:w="5960"/>
-            <w:shd w:fill="1F3864" w:val="clear"/>
-            <w:tcMar>
-              <w:top w:type="dxa" w:w="60"/>
-              <w:left w:type="dxa" w:w="100"/>
-              <w:bottom w:type="dxa" w:w="60"/>
-              <w:right w:type="dxa" w:w="100"/>
-            </w:tcMar>
-            <w:vAlign w:val="center"/>
-          </w:tcPr>
-          <w:p>
-            <w:pPr>
-              <w:jc w:val="left"/>
-            </w:pPr>
-            <w:r>
-              <w:rPr>
-                <w:b/>
-                <w:bCs/>
-                <w:color w:val="FFFFFF"/>
-                <w:sz w:val="19"/>
-                <w:szCs w:val="19"/>
-              </w:rPr>
-              <w:t xml:space="preserve">Result</w:t>
-            </w:r>
-          </w:p>
-        </w:tc>
-      </w:tr>
-      <w:tr>
-        <w:trPr>
-          <w:cantSplit/>
-        </w:trPr>
-        <w:tc>
-          <w:tcPr>
-            <w:tcW w:type="dxa" w:w="3400"/>
-            <w:tcMar>
-              <w:top w:type="dxa" w:w="60"/>
-              <w:left w:type="dxa" w:w="100"/>
-              <w:bottom w:type="dxa" w:w="60"/>
-              <w:right w:type="dxa" w:w="100"/>
-            </w:tcMar>
-            <w:vAlign w:val="center"/>
-          </w:tcPr>
-          <w:p>
-            <w:pPr>
-              <w:jc w:val="left"/>
-            </w:pPr>
-            <w:r>
-              <w:rPr>
-                <w:b w:val="false"/>
-                <w:bCs w:val="false"/>
-                <w:sz w:val="19"/>
-                <w:szCs w:val="19"/>
-              </w:rPr>
-              <w:t xml:space="preserve">(a) NGR by product for a month</w:t>
-            </w:r>
-          </w:p>
-        </w:tc>
-        <w:tc>
-          <w:tcPr>
-            <w:tcW w:type="dxa" w:w="5960"/>
-            <w:tcMar>
-              <w:top w:type="dxa" w:w="60"/>
-              <w:left w:type="dxa" w:w="100"/>
-              <w:bottom w:type="dxa" w:w="60"/>
-              <w:right w:type="dxa" w:w="100"/>
-            </w:tcMar>
-            <w:vAlign w:val="center"/>
-          </w:tcPr>
-          <w:p>
-            <w:pPr>
-              <w:jc w:val="left"/>
-            </w:pPr>
-            <w:r>
-              <w:rPr>
-                <w:b w:val="false"/>
-                <w:bCs w:val="false"/>
-                <w:sz w:val="19"/>
-                <w:szCs w:val="19"/>
-              </w:rPr>
-              <w:t xml:space="preserve">sportsbook -160.00 · casino -30.00 · retail 100.00 (NAD)</w:t>
-            </w:r>
-          </w:p>
-        </w:tc>
-      </w:tr>
-      <w:tr>
-        <w:trPr>
-          <w:cantSplit/>
-        </w:trPr>
-        <w:tc>
-          <w:tcPr>
-            <w:tcW w:type="dxa" w:w="3400"/>
-            <w:shd w:fill="EEF3F8" w:val="clear"/>
-            <w:tcMar>
-              <w:top w:type="dxa" w:w="60"/>
-              <w:left w:type="dxa" w:w="100"/>
-              <w:bottom w:type="dxa" w:w="60"/>
-              <w:right w:type="dxa" w:w="100"/>
-            </w:tcMar>
-            <w:vAlign w:val="center"/>
-          </w:tcPr>
-          <w:p>
-            <w:pPr>
-              <w:jc w:val="left"/>
-            </w:pPr>
-            <w:r>
-              <w:rPr>
-                <w:b w:val="false"/>
-                <w:bCs w:val="false"/>
-                <w:sz w:val="19"/>
-                <w:szCs w:val="19"/>
-              </w:rPr>
-              <w:t xml:space="preserve">(b) Bonus cost as % of NGR, by campaign</w:t>
-            </w:r>
-          </w:p>
-        </w:tc>
-        <w:tc>
-          <w:tcPr>
-            <w:tcW w:type="dxa" w:w="5960"/>
-            <w:shd w:fill="EEF3F8" w:val="clear"/>
-            <w:tcMar>
-              <w:top w:type="dxa" w:w="60"/>
-              <w:left w:type="dxa" w:w="100"/>
-              <w:bottom w:type="dxa" w:w="60"/>
-              <w:right w:type="dxa" w:w="100"/>
-            </w:tcMar>
-            <w:vAlign w:val="center"/>
-          </w:tcPr>
-          <w:p>
-            <w:pPr>
-              <w:jc w:val="left"/>
-            </w:pPr>
-            <w:r>
-              <w:rPr>
-                <w:b w:val="false"/>
-                <w:bCs w:val="false"/>
-                <w:sz w:val="19"/>
-                <w:szCs w:val="19"/>
-              </w:rPr>
-              <w:t xml:space="preserve">Registration Bonus: -27.78% (matches the dbt mart's independently-computed figure exactly)</w:t>
-            </w:r>
-          </w:p>
-        </w:tc>
-      </w:tr>
-      <w:tr>
-        <w:trPr>
-          <w:cantSplit/>
-        </w:trPr>
-        <w:tc>
-          <w:tcPr>
-            <w:tcW w:type="dxa" w:w="3400"/>
-            <w:tcMar>
-              <w:top w:type="dxa" w:w="60"/>
-              <w:left w:type="dxa" w:w="100"/>
-              <w:bottom w:type="dxa" w:w="60"/>
-              <w:right w:type="dxa" w:w="100"/>
-            </w:tcMar>
-            <w:vAlign w:val="center"/>
-          </w:tcPr>
-          <w:p>
-            <w:pPr>
-              <w:jc w:val="left"/>
-            </w:pPr>
-            <w:r>
-              <w:rPr>
-                <w:b w:val="false"/>
-                <w:bCs w:val="false"/>
-                <w:sz w:val="19"/>
-                <w:szCs w:val="19"/>
-              </w:rPr>
-              <w:t xml:space="preserve">(c) A player's balance at a given date/time</w:t>
-            </w:r>
-          </w:p>
-        </w:tc>
-        <w:tc>
-          <w:tcPr>
-            <w:tcW w:type="dxa" w:w="5960"/>
-            <w:tcMar>
-              <w:top w:type="dxa" w:w="60"/>
-              <w:left w:type="dxa" w:w="100"/>
-              <w:bottom w:type="dxa" w:w="60"/>
-              <w:right w:type="dxa" w:w="100"/>
-            </w:tcMar>
-            <w:vAlign w:val="center"/>
-          </w:tcPr>
-          <w:p>
-            <w:pPr>
-              <w:jc w:val="left"/>
-            </w:pPr>
-            <w:r>
-              <w:rPr>
-                <w:b w:val="false"/>
-                <w:bCs w:val="false"/>
-                <w:sz w:val="19"/>
-                <w:szCs w:val="19"/>
-              </w:rPr>
-              <w:t xml:space="preserve">Reconstructed purely from the ledger (SUM), not a stored column — proves the design</w:t>
-            </w:r>
-          </w:p>
-        </w:tc>
-      </w:tr>
-      <w:tr>
-        <w:trPr>
-          <w:cantSplit/>
-        </w:trPr>
-        <w:tc>
-          <w:tcPr>
-            <w:tcW w:type="dxa" w:w="3400"/>
-            <w:shd w:fill="EEF3F8" w:val="clear"/>
-            <w:tcMar>
-              <w:top w:type="dxa" w:w="60"/>
-              <w:left w:type="dxa" w:w="100"/>
-              <w:bottom w:type="dxa" w:w="60"/>
-              <w:right w:type="dxa" w:w="100"/>
-            </w:tcMar>
-            <w:vAlign w:val="center"/>
-          </w:tcPr>
-          <w:p>
-            <w:pPr>
-              <w:jc w:val="left"/>
-            </w:pPr>
-            <w:r>
-              <w:rPr>
-                <w:b w:val="false"/>
-                <w:bCs w:val="false"/>
-                <w:sz w:val="19"/>
-                <w:szCs w:val="19"/>
-              </w:rPr>
-              <w:t xml:space="preserve">(d) Deposits that failed, then later succeeded</w:t>
-            </w:r>
-          </w:p>
-        </w:tc>
-        <w:tc>
-          <w:tcPr>
-            <w:tcW w:type="dxa" w:w="5960"/>
-            <w:shd w:fill="EEF3F8" w:val="clear"/>
-            <w:tcMar>
-              <w:top w:type="dxa" w:w="60"/>
-              <w:left w:type="dxa" w:w="100"/>
-              <w:bottom w:type="dxa" w:w="60"/>
-              <w:right w:type="dxa" w:w="100"/>
-            </w:tcMar>
-            <w:vAlign w:val="center"/>
-          </w:tcPr>
-          <w:p>
-            <w:pPr>
-              <w:jc w:val="left"/>
-            </w:pPr>
-            <w:r>
-              <w:rPr>
-                <w:b w:val="false"/>
-                <w:bCs w:val="false"/>
-                <w:sz w:val="19"/>
-                <w:szCs w:val="19"/>
-              </w:rPr>
-              <w:t xml:space="preserve">Self-join on deposit_attempts finds the failed→success pair, 4 minutes apart</w:t>
-            </w:r>
-          </w:p>
-        </w:tc>
-      </w:tr>
-    </w:tbl>
+        <w:t xml:space="preserve">23-table operational schema — full DDL in exercise3-schema-design/ddl.sql, verified to run clean on both MySQL 8.0 and MariaDB 10.11.</w:t>
+      </w:r>
+    </w:p>
     <w:p>
       <w:pPr>
         <w:pStyle w:val="Heading2"/>
+        <w:keepNext/>
+        <w:keepLines/>
         <w:spacing w:after="150" w:before="300"/>
       </w:pPr>
       <w:r>
-        <w:t xml:space="preserve">Operational design → reporting model</w:t>
+        <w:t xml:space="preserve">Design principles</w:t>
+      </w:r>
+    </w:p>
+    <w:p>
+      <w:pPr>
+        <w:pStyle w:val="Heading3"/>
+        <w:keepNext/>
+        <w:keepLines/>
+        <w:spacing w:after="100" w:before="200"/>
+      </w:pPr>
+      <w:r>
+        <w:t xml:space="preserve">Money and time</w:t>
       </w:r>
     </w:p>
     <w:p>
@@ -3613,7 +3608,83 @@
         <w:spacing w:after="160"/>
       </w:pPr>
       <w:r>
-        <w:t xml:space="preserve">A dbt project (dbt_jsb_assessment/) builds a star schema on top of this operational design: conformed dimensions (dim_player, dim_date, dim_campaign — dim_player_vip_tier_scd carries the same Type-2 history pattern through to the reporting layer) surrounding grain-specific facts (fact_bet, fact_wallet_transaction, fact_bonus_transaction). Two reusable marts answer queries (a) and (b) directly, and — extended during this review — the project now also covers Exercise 1's reconciliation as a scheduled, tested model.</w:t>
+        <w:t xml:space="preserve">DECIMAL(18,4) everywhere a balance or amount is stored — never FLOAT/DOUBLE. DATETIME(6), always UTC, columns suffixed _at_utc; MySQL's TIMESTAMP is deliberately avoided because it silently converts using the session/server time zone.</w:t>
+      </w:r>
+    </w:p>
+    <w:p>
+      <w:pPr>
+        <w:pStyle w:val="Heading3"/>
+        <w:keepNext/>
+        <w:keepLines/>
+        <w:spacing w:after="100" w:before="200"/>
+      </w:pPr>
+      <w:r>
+        <w:t xml:space="preserve">Balance correctness</w:t>
+      </w:r>
+    </w:p>
+    <w:p>
+      <w:pPr>
+        <w:spacing w:after="160"/>
+      </w:pPr>
+      <w:r>
+        <w:t xml:space="preserve">wallets.real_balance / bonus_balance are a materialised cache, not the source of truth — wallet_transactions (an append-only ledger) is. A balance at any point in time is SUM(credit) − SUM(debit) up to that moment, proven directly by example query (c) below. Corrections and reversals are new rows referencing the original (reversal_of_wallet_txn_id), never edits; every row carries a deterministic idempotency_key so replaying an event can never double-post it. A dbt test (assert_wallet_cache_matches_ledger) fails the build if the cache ever disagrees with the ledger.</w:t>
+      </w:r>
+    </w:p>
+    <w:p>
+      <w:pPr>
+        <w:pStyle w:val="Heading3"/>
+        <w:keepNext/>
+        <w:keepLines/>
+        <w:spacing w:after="100" w:before="200"/>
+      </w:pPr>
+      <w:r>
+        <w:t xml:space="preserve">History over time</w:t>
+      </w:r>
+    </w:p>
+    <w:p>
+      <w:pPr>
+        <w:spacing w:after="160"/>
+      </w:pPr>
+      <w:r>
+        <w:t xml:space="preserve">player_vip_tier_history and player_tag_history are SCD Type 2 (a new row per change, valid_from/valid_to), so "what tier was this player on 3 September" is answerable, not just "what tier are they now".</w:t>
+      </w:r>
+    </w:p>
+    <w:p>
+      <w:pPr>
+        <w:pStyle w:val="Heading3"/>
+        <w:keepNext/>
+        <w:keepLines/>
+        <w:spacing w:after="100" w:before="200"/>
+      </w:pPr>
+      <w:r>
+        <w:t xml:space="preserve">Protecting personal information</w:t>
+      </w:r>
+    </w:p>
+    <w:p>
+      <w:pPr>
+        <w:spacing w:after="160"/>
+      </w:pPr>
+      <w:r>
+        <w:t xml:space="preserve">player_identity is a separate table, joined only by player_id — every other table (bets, wallet transactions, bonuses) never sees a name or ID number. In production: application-layer encryption on sensitive fields, a dedicated low-privilege DB role, and every read of the identity table logged.</w:t>
+      </w:r>
+    </w:p>
+    <w:p>
+      <w:pPr>
+        <w:pStyle w:val="Heading2"/>
+        <w:keepNext/>
+        <w:keepLines/>
+        <w:spacing w:after="150" w:before="300"/>
+      </w:pPr>
+      <w:r>
+        <w:t xml:space="preserve">The four required queries — verified output</w:t>
+      </w:r>
+    </w:p>
+    <w:p>
+      <w:pPr>
+        <w:spacing w:after="160"/>
+      </w:pPr>
+      <w:r>
+        <w:t xml:space="preserve">Run against the seed data in exercise3-schema-design/seed.sql; identical results on MySQL 8.0 and MariaDB 10.11.</w:t>
       </w:r>
     </w:p>
     <w:p>
@@ -3624,7 +3695,7 @@
       <w:r>
         <w:drawing>
           <wp:inline distT="0" distB="0" distL="0" distR="0">
-            <wp:extent cx="5334000" cy="1390650"/>
+            <wp:extent cx="5334000" cy="1314450"/>
             <wp:effectExtent t="0" r="0" b="0" l="0"/>
             <wp:docPr id="10" name="" descr="" title=""/>
             <wp:cNvGraphicFramePr>
@@ -3649,7 +3720,7 @@
                   <pic:spPr bwMode="auto">
                     <a:xfrm>
                       <a:off x="0" y="0"/>
-                      <a:ext cx="5334000" cy="1390650"/>
+                      <a:ext cx="5334000" cy="1314450"/>
                     </a:xfrm>
                     <a:prstGeom prst="rect">
                       <a:avLst/>
@@ -3675,17 +3746,328 @@
           <w:sz w:val="20"/>
           <w:szCs w:val="20"/>
         </w:rPr>
-        <w:t xml:space="preserve">dbt build across all three exercises: 61/61 pass, 21 models, 40 tests, 0 errors.</w:t>
-      </w:r>
-    </w:p>
-    <w:p>
-      <w:pPr>
-        <w:pStyle w:val="Heading1"/>
-        <w:pageBreakBefore/>
-        <w:spacing w:after="200" w:before="400"/>
-      </w:pPr>
-      <w:r>
-        <w:t xml:space="preserve">Power BI — Reporting Data Model and Report</w:t>
+        <w:t xml:space="preserve">mysql -- jsb_platform -- example_queries.sql</w:t>
+      </w:r>
+    </w:p>
+    <w:tbl>
+      <w:tblPr>
+        <w:tblW w:type="dxa" w:w="9360"/>
+        <w:tblBorders>
+          <w:top w:val="single" w:color="auto" w:sz="4"/>
+          <w:left w:val="single" w:color="auto" w:sz="4"/>
+          <w:bottom w:val="single" w:color="auto" w:sz="4"/>
+          <w:right w:val="single" w:color="auto" w:sz="4"/>
+          <w:insideH w:val="single" w:color="auto" w:sz="4"/>
+          <w:insideV w:val="single" w:color="auto" w:sz="4"/>
+        </w:tblBorders>
+      </w:tblPr>
+      <w:tblGrid>
+        <w:gridCol w:w="3400"/>
+        <w:gridCol w:w="5960"/>
+      </w:tblGrid>
+      <w:tr>
+        <w:trPr>
+          <w:tblHeader/>
+        </w:trPr>
+        <w:tc>
+          <w:tcPr>
+            <w:tcW w:type="dxa" w:w="3400"/>
+            <w:shd w:fill="1F3864" w:val="clear"/>
+            <w:tcMar>
+              <w:top w:type="dxa" w:w="60"/>
+              <w:left w:type="dxa" w:w="100"/>
+              <w:bottom w:type="dxa" w:w="60"/>
+              <w:right w:type="dxa" w:w="100"/>
+            </w:tcMar>
+            <w:vAlign w:val="center"/>
+          </w:tcPr>
+          <w:p>
+            <w:pPr>
+              <w:jc w:val="left"/>
+            </w:pPr>
+            <w:r>
+              <w:rPr>
+                <w:b/>
+                <w:bCs/>
+                <w:color w:val="FFFFFF"/>
+                <w:sz w:val="19"/>
+                <w:szCs w:val="19"/>
+              </w:rPr>
+              <w:t xml:space="preserve">Query</w:t>
+            </w:r>
+          </w:p>
+        </w:tc>
+        <w:tc>
+          <w:tcPr>
+            <w:tcW w:type="dxa" w:w="5960"/>
+            <w:shd w:fill="1F3864" w:val="clear"/>
+            <w:tcMar>
+              <w:top w:type="dxa" w:w="60"/>
+              <w:left w:type="dxa" w:w="100"/>
+              <w:bottom w:type="dxa" w:w="60"/>
+              <w:right w:type="dxa" w:w="100"/>
+            </w:tcMar>
+            <w:vAlign w:val="center"/>
+          </w:tcPr>
+          <w:p>
+            <w:pPr>
+              <w:jc w:val="left"/>
+            </w:pPr>
+            <w:r>
+              <w:rPr>
+                <w:b/>
+                <w:bCs/>
+                <w:color w:val="FFFFFF"/>
+                <w:sz w:val="19"/>
+                <w:szCs w:val="19"/>
+              </w:rPr>
+              <w:t xml:space="preserve">Result</w:t>
+            </w:r>
+          </w:p>
+        </w:tc>
+      </w:tr>
+      <w:tr>
+        <w:trPr>
+          <w:cantSplit/>
+        </w:trPr>
+        <w:tc>
+          <w:tcPr>
+            <w:tcW w:type="dxa" w:w="3400"/>
+            <w:tcMar>
+              <w:top w:type="dxa" w:w="60"/>
+              <w:left w:type="dxa" w:w="100"/>
+              <w:bottom w:type="dxa" w:w="60"/>
+              <w:right w:type="dxa" w:w="100"/>
+            </w:tcMar>
+            <w:vAlign w:val="center"/>
+          </w:tcPr>
+          <w:p>
+            <w:pPr>
+              <w:jc w:val="left"/>
+            </w:pPr>
+            <w:r>
+              <w:rPr>
+                <w:b w:val="false"/>
+                <w:bCs w:val="false"/>
+                <w:sz w:val="19"/>
+                <w:szCs w:val="19"/>
+              </w:rPr>
+              <w:t xml:space="preserve">(a) NGR by product for a month</w:t>
+            </w:r>
+          </w:p>
+        </w:tc>
+        <w:tc>
+          <w:tcPr>
+            <w:tcW w:type="dxa" w:w="5960"/>
+            <w:tcMar>
+              <w:top w:type="dxa" w:w="60"/>
+              <w:left w:type="dxa" w:w="100"/>
+              <w:bottom w:type="dxa" w:w="60"/>
+              <w:right w:type="dxa" w:w="100"/>
+            </w:tcMar>
+            <w:vAlign w:val="center"/>
+          </w:tcPr>
+          <w:p>
+            <w:pPr>
+              <w:jc w:val="left"/>
+            </w:pPr>
+            <w:r>
+              <w:rPr>
+                <w:b w:val="false"/>
+                <w:bCs w:val="false"/>
+                <w:sz w:val="19"/>
+                <w:szCs w:val="19"/>
+              </w:rPr>
+              <w:t xml:space="preserve">sportsbook -160.00 · casino -30.00 · retail 100.00 (NAD)</w:t>
+            </w:r>
+          </w:p>
+        </w:tc>
+      </w:tr>
+      <w:tr>
+        <w:trPr>
+          <w:cantSplit/>
+        </w:trPr>
+        <w:tc>
+          <w:tcPr>
+            <w:tcW w:type="dxa" w:w="3400"/>
+            <w:shd w:fill="EEF3F8" w:val="clear"/>
+            <w:tcMar>
+              <w:top w:type="dxa" w:w="60"/>
+              <w:left w:type="dxa" w:w="100"/>
+              <w:bottom w:type="dxa" w:w="60"/>
+              <w:right w:type="dxa" w:w="100"/>
+            </w:tcMar>
+            <w:vAlign w:val="center"/>
+          </w:tcPr>
+          <w:p>
+            <w:pPr>
+              <w:jc w:val="left"/>
+            </w:pPr>
+            <w:r>
+              <w:rPr>
+                <w:b w:val="false"/>
+                <w:bCs w:val="false"/>
+                <w:sz w:val="19"/>
+                <w:szCs w:val="19"/>
+              </w:rPr>
+              <w:t xml:space="preserve">(b) Bonus cost as % of NGR, by campaign</w:t>
+            </w:r>
+          </w:p>
+        </w:tc>
+        <w:tc>
+          <w:tcPr>
+            <w:tcW w:type="dxa" w:w="5960"/>
+            <w:shd w:fill="EEF3F8" w:val="clear"/>
+            <w:tcMar>
+              <w:top w:type="dxa" w:w="60"/>
+              <w:left w:type="dxa" w:w="100"/>
+              <w:bottom w:type="dxa" w:w="60"/>
+              <w:right w:type="dxa" w:w="100"/>
+            </w:tcMar>
+            <w:vAlign w:val="center"/>
+          </w:tcPr>
+          <w:p>
+            <w:pPr>
+              <w:jc w:val="left"/>
+            </w:pPr>
+            <w:r>
+              <w:rPr>
+                <w:b w:val="false"/>
+                <w:bCs w:val="false"/>
+                <w:sz w:val="19"/>
+                <w:szCs w:val="19"/>
+              </w:rPr>
+              <w:t xml:space="preserve">Registration Bonus: -27.78% (matches the dbt mart's independently-computed figure exactly)</w:t>
+            </w:r>
+          </w:p>
+        </w:tc>
+      </w:tr>
+      <w:tr>
+        <w:trPr>
+          <w:cantSplit/>
+        </w:trPr>
+        <w:tc>
+          <w:tcPr>
+            <w:tcW w:type="dxa" w:w="3400"/>
+            <w:tcMar>
+              <w:top w:type="dxa" w:w="60"/>
+              <w:left w:type="dxa" w:w="100"/>
+              <w:bottom w:type="dxa" w:w="60"/>
+              <w:right w:type="dxa" w:w="100"/>
+            </w:tcMar>
+            <w:vAlign w:val="center"/>
+          </w:tcPr>
+          <w:p>
+            <w:pPr>
+              <w:jc w:val="left"/>
+            </w:pPr>
+            <w:r>
+              <w:rPr>
+                <w:b w:val="false"/>
+                <w:bCs w:val="false"/>
+                <w:sz w:val="19"/>
+                <w:szCs w:val="19"/>
+              </w:rPr>
+              <w:t xml:space="preserve">(c) A player's balance at a given date/time</w:t>
+            </w:r>
+          </w:p>
+        </w:tc>
+        <w:tc>
+          <w:tcPr>
+            <w:tcW w:type="dxa" w:w="5960"/>
+            <w:tcMar>
+              <w:top w:type="dxa" w:w="60"/>
+              <w:left w:type="dxa" w:w="100"/>
+              <w:bottom w:type="dxa" w:w="60"/>
+              <w:right w:type="dxa" w:w="100"/>
+            </w:tcMar>
+            <w:vAlign w:val="center"/>
+          </w:tcPr>
+          <w:p>
+            <w:pPr>
+              <w:jc w:val="left"/>
+            </w:pPr>
+            <w:r>
+              <w:rPr>
+                <w:b w:val="false"/>
+                <w:bCs w:val="false"/>
+                <w:sz w:val="19"/>
+                <w:szCs w:val="19"/>
+              </w:rPr>
+              <w:t xml:space="preserve">Reconstructed purely from the ledger (SUM), not a stored column — proves the design</w:t>
+            </w:r>
+          </w:p>
+        </w:tc>
+      </w:tr>
+      <w:tr>
+        <w:trPr>
+          <w:cantSplit/>
+        </w:trPr>
+        <w:tc>
+          <w:tcPr>
+            <w:tcW w:type="dxa" w:w="3400"/>
+            <w:shd w:fill="EEF3F8" w:val="clear"/>
+            <w:tcMar>
+              <w:top w:type="dxa" w:w="60"/>
+              <w:left w:type="dxa" w:w="100"/>
+              <w:bottom w:type="dxa" w:w="60"/>
+              <w:right w:type="dxa" w:w="100"/>
+            </w:tcMar>
+            <w:vAlign w:val="center"/>
+          </w:tcPr>
+          <w:p>
+            <w:pPr>
+              <w:jc w:val="left"/>
+            </w:pPr>
+            <w:r>
+              <w:rPr>
+                <w:b w:val="false"/>
+                <w:bCs w:val="false"/>
+                <w:sz w:val="19"/>
+                <w:szCs w:val="19"/>
+              </w:rPr>
+              <w:t xml:space="preserve">(d) Deposits that failed, then later succeeded</w:t>
+            </w:r>
+          </w:p>
+        </w:tc>
+        <w:tc>
+          <w:tcPr>
+            <w:tcW w:type="dxa" w:w="5960"/>
+            <w:shd w:fill="EEF3F8" w:val="clear"/>
+            <w:tcMar>
+              <w:top w:type="dxa" w:w="60"/>
+              <w:left w:type="dxa" w:w="100"/>
+              <w:bottom w:type="dxa" w:w="60"/>
+              <w:right w:type="dxa" w:w="100"/>
+            </w:tcMar>
+            <w:vAlign w:val="center"/>
+          </w:tcPr>
+          <w:p>
+            <w:pPr>
+              <w:jc w:val="left"/>
+            </w:pPr>
+            <w:r>
+              <w:rPr>
+                <w:b w:val="false"/>
+                <w:bCs w:val="false"/>
+                <w:sz w:val="19"/>
+                <w:szCs w:val="19"/>
+              </w:rPr>
+              <w:t xml:space="preserve">Self-join on deposit_attempts finds the failed→success pair, 4 minutes apart</w:t>
+            </w:r>
+          </w:p>
+        </w:tc>
+      </w:tr>
+    </w:tbl>
+    <w:p>
+      <w:pPr>
+        <w:pStyle w:val="Heading2"/>
+        <w:keepNext/>
+        <w:keepLines/>
+        <w:spacing w:after="150" w:before="300"/>
+      </w:pPr>
+      <w:r>
+        <w:t xml:space="preserve">Operational design → reporting model</w:t>
       </w:r>
     </w:p>
     <w:p>
@@ -3693,22 +4075,7 @@
         <w:spacing w:after="160"/>
       </w:pPr>
       <w:r>
-        <w:rPr>
-          <w:i/>
-          <w:iCs/>
-          <w:color w:val="595959"/>
-          <w:sz w:val="20"/>
-          <w:szCs w:val="20"/>
-        </w:rPr>
-        <w:t xml:space="preserve">Tools used: Power BI project format (.pbip), generated by a Python script from one set of definitions, loading the dbt marts from CSV.</w:t>
-      </w:r>
-    </w:p>
-    <w:p>
-      <w:pPr>
-        <w:spacing w:after="160"/>
-      </w:pPr>
-      <w:r>
-        <w:t xml:space="preserve">The dbt marts become a Power BI project, JSB_Assessment.pbip. It holds the semantic model (7 tables, 7 relationships, 10 DAX measures) and a two-page report, and loads from CSV, so no database connection is needed. The same script writes the model, the report pages, the readable DAX file and a list of expected values, then validates them, so the four cannot drift apart.</w:t>
+        <w:t xml:space="preserve">A dbt project (dbt_jsb_assessment/) builds a star schema on top of this operational design: conformed dimensions (dim_player, dim_date, dim_campaign — dim_player_vip_tier_scd carries the same Type-2 history pattern through to the reporting layer) surrounding grain-specific facts (fact_bet, fact_wallet_transaction, fact_bonus_transaction). Two reusable marts answer queries (a) and (b) directly, and — extended during this review — the project now also covers Exercise 1's reconciliation as a scheduled, tested model.</w:t>
       </w:r>
     </w:p>
     <w:p>
@@ -3719,7 +4086,7 @@
       <w:r>
         <w:drawing>
           <wp:inline distT="0" distB="0" distL="0" distR="0">
-            <wp:extent cx="5715000" cy="3171825"/>
+            <wp:extent cx="4191000" cy="4619625"/>
             <wp:effectExtent t="0" r="0" b="0" l="0"/>
             <wp:docPr id="11" name="" descr="" title=""/>
             <wp:cNvGraphicFramePr>
@@ -3744,6 +4111,101 @@
                   <pic:spPr bwMode="auto">
                     <a:xfrm>
                       <a:off x="0" y="0"/>
+                      <a:ext cx="4191000" cy="4619625"/>
+                    </a:xfrm>
+                    <a:prstGeom prst="rect">
+                      <a:avLst/>
+                    </a:prstGeom>
+                  </pic:spPr>
+                </pic:pic>
+              </a:graphicData>
+            </a:graphic>
+          </wp:inline>
+        </w:drawing>
+      </w:r>
+    </w:p>
+    <w:p>
+      <w:pPr>
+        <w:spacing w:after="300" w:before="80"/>
+        <w:jc w:val="center"/>
+      </w:pPr>
+      <w:r>
+        <w:rPr>
+          <w:i/>
+          <w:iCs/>
+          <w:color w:val="595959"/>
+          <w:sz w:val="20"/>
+          <w:szCs w:val="20"/>
+        </w:rPr>
+        <w:t xml:space="preserve">dbt build across all three exercises: 66/66 pass (23 models, 43 tests), 0 errors.</w:t>
+      </w:r>
+    </w:p>
+    <w:p>
+      <w:pPr>
+        <w:pStyle w:val="Heading1"/>
+        <w:pageBreakBefore/>
+        <w:spacing w:after="200" w:before="400"/>
+      </w:pPr>
+      <w:r>
+        <w:t xml:space="preserve">Power BI — Reporting Data Model and Report</w:t>
+      </w:r>
+    </w:p>
+    <w:p>
+      <w:pPr>
+        <w:spacing w:after="160"/>
+      </w:pPr>
+      <w:r>
+        <w:rPr>
+          <w:i/>
+          <w:iCs/>
+          <w:color w:val="595959"/>
+          <w:sz w:val="20"/>
+          <w:szCs w:val="20"/>
+        </w:rPr>
+        <w:t xml:space="preserve">Tools used: Power BI project format (.pbip), generated by a Python script from one set of definitions, with the dbt marts embedded as data.</w:t>
+      </w:r>
+    </w:p>
+    <w:p>
+      <w:pPr>
+        <w:spacing w:after="160"/>
+      </w:pPr>
+      <w:r>
+        <w:t xml:space="preserve">The dbt marts become a Power BI project, JSB_Assessment.pbip, covering all three exercises. The semantic model has 11 tables, 7 relationships and 20 DAX measures, and the report has four pages. The data is embedded in the project, so it opens and refreshes on any machine with no folder path or database connection to set up. The same script writes the model, the report pages, the readable DAX file and a list of expected values, then validates them, so the four cannot drift apart.</w:t>
+      </w:r>
+    </w:p>
+    <w:p>
+      <w:pPr>
+        <w:spacing w:before="200"/>
+        <w:jc w:val="center"/>
+      </w:pPr>
+      <w:r>
+        <w:drawing>
+          <wp:inline distT="0" distB="0" distL="0" distR="0">
+            <wp:extent cx="5715000" cy="3171825"/>
+            <wp:effectExtent t="0" r="0" b="0" l="0"/>
+            <wp:docPr id="12" name="" descr="" title=""/>
+            <wp:cNvGraphicFramePr>
+              <a:graphicFrameLocks xmlns:a="http://schemas.openxmlformats.org/drawingml/2006/main" noChangeAspect="1"/>
+            </wp:cNvGraphicFramePr>
+            <a:graphic xmlns:a="http://schemas.openxmlformats.org/drawingml/2006/main">
+              <a:graphicData uri="http://schemas.openxmlformats.org/drawingml/2006/picture">
+                <pic:pic xmlns:pic="http://schemas.openxmlformats.org/drawingml/2006/picture">
+                  <pic:nvPicPr>
+                    <pic:cNvPr id="0" name="" descr=""/>
+                    <pic:cNvPicPr>
+                      <a:picLocks noChangeAspect="1" noChangeArrowheads="1"/>
+                    </pic:cNvPicPr>
+                  </pic:nvPicPr>
+                  <pic:blipFill>
+                    <a:blip r:embed="rId20" cstate="none"/>
+                    <a:srcRect/>
+                    <a:stretch>
+                      <a:fillRect/>
+                    </a:stretch>
+                  </pic:blipFill>
+                  <pic:spPr bwMode="auto">
+                    <a:xfrm>
+                      <a:off x="0" y="0"/>
                       <a:ext cx="5715000" cy="3171825"/>
                     </a:xfrm>
                     <a:prstGeom prst="rect">
@@ -3770,16 +4232,18 @@
           <w:sz w:val="20"/>
           <w:szCs w:val="20"/>
         </w:rPr>
-        <w:t xml:space="preserve">Power BI model view: three dimensions filter three facts. Facts are not joined to each other.</w:t>
+        <w:t xml:space="preserve">Power BI model view for Exercise 3: three dimensions filter three facts. Facts are not joined to each other.</w:t>
       </w:r>
     </w:p>
     <w:p>
       <w:pPr>
         <w:pStyle w:val="Heading2"/>
+        <w:keepNext/>
+        <w:keepLines/>
         <w:spacing w:after="150" w:before="300"/>
       </w:pPr>
       <w:r>
-        <w:t xml:space="preserve">Two modelling decisions worth calling out</w:t>
+        <w:t xml:space="preserve">Modelling decisions worth calling out</w:t>
       </w:r>
     </w:p>
     <w:p>
@@ -3810,7 +4274,22 @@
     </w:p>
     <w:p>
       <w:pPr>
+        <w:pStyle w:val="ListParagraph"/>
+        <w:numPr>
+          <w:ilvl w:val="0"/>
+          <w:numId w:val="2"/>
+        </w:numPr>
+        <w:spacing w:after="80"/>
+      </w:pPr>
+      <w:r>
+        <w:t xml:space="preserve">The Exercise 1 and 2 tables (fct_recon_exceptions, mart_recon_bridge, ingest_runs, transactions) stand alone. They share no keys with the player model, so they have no relationships to it, and a filter on one page can't leak into another.</w:t>
+      </w:r>
+    </w:p>
+    <w:p>
+      <w:pPr>
         <w:pStyle w:val="Heading2"/>
+        <w:keepNext/>
+        <w:keepLines/>
         <w:spacing w:after="150" w:before="300"/>
       </w:pPr>
       <w:r>
@@ -3830,8 +4309,8 @@
         </w:tblBorders>
       </w:tblPr>
       <w:tblGrid>
-        <w:gridCol w:w="3000"/>
-        <w:gridCol w:w="6360"/>
+        <w:gridCol w:w="3400"/>
+        <w:gridCol w:w="5960"/>
       </w:tblGrid>
       <w:tr>
         <w:trPr>
@@ -3839,7 +4318,7 @@
         </w:trPr>
         <w:tc>
           <w:tcPr>
-            <w:tcW w:type="dxa" w:w="3000"/>
+            <w:tcW w:type="dxa" w:w="3400"/>
             <w:shd w:fill="1F3864" w:val="clear"/>
             <w:tcMar>
               <w:top w:type="dxa" w:w="60"/>
@@ -3867,7 +4346,7 @@
         </w:tc>
         <w:tc>
           <w:tcPr>
-            <w:tcW w:type="dxa" w:w="6360"/>
+            <w:tcW w:type="dxa" w:w="5960"/>
             <w:shd w:fill="1F3864" w:val="clear"/>
             <w:tcMar>
               <w:top w:type="dxa" w:w="60"/>
@@ -3900,7 +4379,7 @@
         </w:trPr>
         <w:tc>
           <w:tcPr>
-            <w:tcW w:type="dxa" w:w="3000"/>
+            <w:tcW w:type="dxa" w:w="3400"/>
             <w:tcMar>
               <w:top w:type="dxa" w:w="60"/>
               <w:left w:type="dxa" w:w="100"/>
@@ -3926,7 +4405,7 @@
         </w:tc>
         <w:tc>
           <w:tcPr>
-            <w:tcW w:type="dxa" w:w="6360"/>
+            <w:tcW w:type="dxa" w:w="5960"/>
             <w:tcMar>
               <w:top w:type="dxa" w:w="60"/>
               <w:left w:type="dxa" w:w="100"/>
@@ -3957,7 +4436,7 @@
         </w:trPr>
         <w:tc>
           <w:tcPr>
-            <w:tcW w:type="dxa" w:w="3000"/>
+            <w:tcW w:type="dxa" w:w="3400"/>
             <w:shd w:fill="EEF3F8" w:val="clear"/>
             <w:tcMar>
               <w:top w:type="dxa" w:w="60"/>
@@ -3984,7 +4463,7 @@
         </w:tc>
         <w:tc>
           <w:tcPr>
-            <w:tcW w:type="dxa" w:w="6360"/>
+            <w:tcW w:type="dxa" w:w="5960"/>
             <w:shd w:fill="EEF3F8" w:val="clear"/>
             <w:tcMar>
               <w:top w:type="dxa" w:w="60"/>
@@ -4016,7 +4495,7 @@
         </w:trPr>
         <w:tc>
           <w:tcPr>
-            <w:tcW w:type="dxa" w:w="3000"/>
+            <w:tcW w:type="dxa" w:w="3400"/>
             <w:tcMar>
               <w:top w:type="dxa" w:w="60"/>
               <w:left w:type="dxa" w:w="100"/>
@@ -4042,7 +4521,7 @@
         </w:tc>
         <w:tc>
           <w:tcPr>
-            <w:tcW w:type="dxa" w:w="6360"/>
+            <w:tcW w:type="dxa" w:w="5960"/>
             <w:tcMar>
               <w:top w:type="dxa" w:w="60"/>
               <w:left w:type="dxa" w:w="100"/>
@@ -4073,7 +4552,7 @@
         </w:trPr>
         <w:tc>
           <w:tcPr>
-            <w:tcW w:type="dxa" w:w="3000"/>
+            <w:tcW w:type="dxa" w:w="3400"/>
             <w:shd w:fill="EEF3F8" w:val="clear"/>
             <w:tcMar>
               <w:top w:type="dxa" w:w="60"/>
@@ -4094,13 +4573,13 @@
                 <w:sz w:val="19"/>
                 <w:szCs w:val="19"/>
               </w:rPr>
-              <w:t xml:space="preserve">Campaign Bonus Cost</w:t>
-            </w:r>
-          </w:p>
-        </w:tc>
-        <w:tc>
-          <w:tcPr>
-            <w:tcW w:type="dxa" w:w="6360"/>
+              <w:t xml:space="preserve">Campaign Bonus Cost / % of NGR</w:t>
+            </w:r>
+          </w:p>
+        </w:tc>
+        <w:tc>
+          <w:tcPr>
+            <w:tcW w:type="dxa" w:w="5960"/>
             <w:shd w:fill="EEF3F8" w:val="clear"/>
             <w:tcMar>
               <w:top w:type="dxa" w:w="60"/>
@@ -4121,7 +4600,7 @@
                 <w:sz w:val="19"/>
                 <w:szCs w:val="19"/>
               </w:rPr>
-              <w:t xml:space="preserve">Granted amount of bonuses that completed, expired or were forfeited</w:t>
+              <w:t xml:space="preserve">Granted amount of resolved bonuses, ÷ total NGR — query (b)</w:t>
             </w:r>
           </w:p>
         </w:tc>
@@ -4132,53 +4611,53 @@
         </w:trPr>
         <w:tc>
           <w:tcPr>
-            <w:tcW w:type="dxa" w:w="3000"/>
-            <w:tcMar>
-              <w:top w:type="dxa" w:w="60"/>
-              <w:left w:type="dxa" w:w="100"/>
-              <w:bottom w:type="dxa" w:w="60"/>
-              <w:right w:type="dxa" w:w="100"/>
-            </w:tcMar>
-            <w:vAlign w:val="center"/>
-          </w:tcPr>
-          <w:p>
-            <w:pPr>
-              <w:jc w:val="left"/>
-            </w:pPr>
-            <w:r>
-              <w:rPr>
-                <w:b w:val="false"/>
-                <w:bCs w:val="false"/>
-                <w:sz w:val="19"/>
-                <w:szCs w:val="19"/>
-              </w:rPr>
-              <w:t xml:space="preserve">Campaign Bonus Cost % of NGR</w:t>
-            </w:r>
-          </w:p>
-        </w:tc>
-        <w:tc>
-          <w:tcPr>
-            <w:tcW w:type="dxa" w:w="6360"/>
-            <w:tcMar>
-              <w:top w:type="dxa" w:w="60"/>
-              <w:left w:type="dxa" w:w="100"/>
-              <w:bottom w:type="dxa" w:w="60"/>
-              <w:right w:type="dxa" w:w="100"/>
-            </w:tcMar>
-            <w:vAlign w:val="center"/>
-          </w:tcPr>
-          <w:p>
-            <w:pPr>
-              <w:jc w:val="left"/>
-            </w:pPr>
-            <w:r>
-              <w:rPr>
-                <w:b w:val="false"/>
-                <w:bCs w:val="false"/>
-                <w:sz w:val="19"/>
-                <w:szCs w:val="19"/>
-              </w:rPr>
-              <w:t xml:space="preserve">Campaign Bonus Cost ÷ total NGR — query (b)</w:t>
+            <w:tcW w:type="dxa" w:w="3400"/>
+            <w:tcMar>
+              <w:top w:type="dxa" w:w="60"/>
+              <w:left w:type="dxa" w:w="100"/>
+              <w:bottom w:type="dxa" w:w="60"/>
+              <w:right w:type="dxa" w:w="100"/>
+            </w:tcMar>
+            <w:vAlign w:val="center"/>
+          </w:tcPr>
+          <w:p>
+            <w:pPr>
+              <w:jc w:val="left"/>
+            </w:pPr>
+            <w:r>
+              <w:rPr>
+                <w:b w:val="false"/>
+                <w:bCs w:val="false"/>
+                <w:sz w:val="19"/>
+                <w:szCs w:val="19"/>
+              </w:rPr>
+              <w:t xml:space="preserve">Bonus Liability Outstanding</w:t>
+            </w:r>
+          </w:p>
+        </w:tc>
+        <w:tc>
+          <w:tcPr>
+            <w:tcW w:type="dxa" w:w="5960"/>
+            <w:tcMar>
+              <w:top w:type="dxa" w:w="60"/>
+              <w:left w:type="dxa" w:w="100"/>
+              <w:bottom w:type="dxa" w:w="60"/>
+              <w:right w:type="dxa" w:w="100"/>
+            </w:tcMar>
+            <w:vAlign w:val="center"/>
+          </w:tcPr>
+          <w:p>
+            <w:pPr>
+              <w:jc w:val="left"/>
+            </w:pPr>
+            <w:r>
+              <w:rPr>
+                <w:b w:val="false"/>
+                <w:bCs w:val="false"/>
+                <w:sz w:val="19"/>
+                <w:szCs w:val="19"/>
+              </w:rPr>
+              <w:t xml:space="preserve">Granted amount of bonuses still active: owed, not yet a cost</w:t>
             </w:r>
           </w:p>
         </w:tc>
@@ -4189,7 +4668,7 @@
         </w:trPr>
         <w:tc>
           <w:tcPr>
-            <w:tcW w:type="dxa" w:w="3000"/>
+            <w:tcW w:type="dxa" w:w="3400"/>
             <w:shd w:fill="EEF3F8" w:val="clear"/>
             <w:tcMar>
               <w:top w:type="dxa" w:w="60"/>
@@ -4210,13 +4689,13 @@
                 <w:sz w:val="19"/>
                 <w:szCs w:val="19"/>
               </w:rPr>
-              <w:t xml:space="preserve">Bonus Liability Outstanding</w:t>
-            </w:r>
-          </w:p>
-        </w:tc>
-        <w:tc>
-          <w:tcPr>
-            <w:tcW w:type="dxa" w:w="6360"/>
+              <w:t xml:space="preserve">Balance as of selected date</w:t>
+            </w:r>
+          </w:p>
+        </w:tc>
+        <w:tc>
+          <w:tcPr>
+            <w:tcW w:type="dxa" w:w="5960"/>
             <w:shd w:fill="EEF3F8" w:val="clear"/>
             <w:tcMar>
               <w:top w:type="dxa" w:w="60"/>
@@ -4237,7 +4716,7 @@
                 <w:sz w:val="19"/>
                 <w:szCs w:val="19"/>
               </w:rPr>
-              <w:t xml:space="preserve">Granted amount of bonuses still active: owed, not yet a cost</w:t>
+              <w:t xml:space="preserve">Sum of the ledger up to the last date in the date filter — query (c)</w:t>
             </w:r>
           </w:p>
         </w:tc>
@@ -4248,53 +4727,53 @@
         </w:trPr>
         <w:tc>
           <w:tcPr>
-            <w:tcW w:type="dxa" w:w="3000"/>
-            <w:tcMar>
-              <w:top w:type="dxa" w:w="60"/>
-              <w:left w:type="dxa" w:w="100"/>
-              <w:bottom w:type="dxa" w:w="60"/>
-              <w:right w:type="dxa" w:w="100"/>
-            </w:tcMar>
-            <w:vAlign w:val="center"/>
-          </w:tcPr>
-          <w:p>
-            <w:pPr>
-              <w:jc w:val="left"/>
-            </w:pPr>
-            <w:r>
-              <w:rPr>
-                <w:b w:val="false"/>
-                <w:bCs w:val="false"/>
-                <w:sz w:val="19"/>
-                <w:szCs w:val="19"/>
-              </w:rPr>
-              <w:t xml:space="preserve">Balance as of selected date</w:t>
-            </w:r>
-          </w:p>
-        </w:tc>
-        <w:tc>
-          <w:tcPr>
-            <w:tcW w:type="dxa" w:w="6360"/>
-            <w:tcMar>
-              <w:top w:type="dxa" w:w="60"/>
-              <w:left w:type="dxa" w:w="100"/>
-              <w:bottom w:type="dxa" w:w="60"/>
-              <w:right w:type="dxa" w:w="100"/>
-            </w:tcMar>
-            <w:vAlign w:val="center"/>
-          </w:tcPr>
-          <w:p>
-            <w:pPr>
-              <w:jc w:val="left"/>
-            </w:pPr>
-            <w:r>
-              <w:rPr>
-                <w:b w:val="false"/>
-                <w:bCs w:val="false"/>
-                <w:sz w:val="19"/>
-                <w:szCs w:val="19"/>
-              </w:rPr>
-              <w:t xml:space="preserve">Sum of the ledger up to the last date in the date filter — query (c)</w:t>
+            <w:tcW w:type="dxa" w:w="3400"/>
+            <w:tcMar>
+              <w:top w:type="dxa" w:w="60"/>
+              <w:left w:type="dxa" w:w="100"/>
+              <w:bottom w:type="dxa" w:w="60"/>
+              <w:right w:type="dxa" w:w="100"/>
+            </w:tcMar>
+            <w:vAlign w:val="center"/>
+          </w:tcPr>
+          <w:p>
+            <w:pPr>
+              <w:jc w:val="left"/>
+            </w:pPr>
+            <w:r>
+              <w:rPr>
+                <w:b w:val="false"/>
+                <w:bCs w:val="false"/>
+                <w:sz w:val="19"/>
+                <w:szCs w:val="19"/>
+              </w:rPr>
+              <w:t xml:space="preserve">Settlements Matched Exactly / Exceptions</w:t>
+            </w:r>
+          </w:p>
+        </w:tc>
+        <w:tc>
+          <w:tcPr>
+            <w:tcW w:type="dxa" w:w="5960"/>
+            <w:tcMar>
+              <w:top w:type="dxa" w:w="60"/>
+              <w:left w:type="dxa" w:w="100"/>
+              <w:bottom w:type="dxa" w:w="60"/>
+              <w:right w:type="dxa" w:w="100"/>
+            </w:tcMar>
+            <w:vAlign w:val="center"/>
+          </w:tcPr>
+          <w:p>
+            <w:pPr>
+              <w:jc w:val="left"/>
+            </w:pPr>
+            <w:r>
+              <w:rPr>
+                <w:b w:val="false"/>
+                <w:bCs w:val="false"/>
+                <w:sz w:val="19"/>
+                <w:szCs w:val="19"/>
+              </w:rPr>
+              <w:t xml:space="preserve">Counts of OK rows and of every other category in fct_recon_exceptions</w:t>
             </w:r>
           </w:p>
         </w:tc>
@@ -4305,7 +4784,7 @@
         </w:trPr>
         <w:tc>
           <w:tcPr>
-            <w:tcW w:type="dxa" w:w="3000"/>
+            <w:tcW w:type="dxa" w:w="3400"/>
             <w:shd w:fill="EEF3F8" w:val="clear"/>
             <w:tcMar>
               <w:top w:type="dxa" w:w="60"/>
@@ -4326,13 +4805,13 @@
                 <w:sz w:val="19"/>
                 <w:szCs w:val="19"/>
               </w:rPr>
-              <w:t xml:space="preserve">Deposits</w:t>
-            </w:r>
-          </w:p>
-        </w:tc>
-        <w:tc>
-          <w:tcPr>
-            <w:tcW w:type="dxa" w:w="6360"/>
+              <w:t xml:space="preserve">Act Now Value</w:t>
+            </w:r>
+          </w:p>
+        </w:tc>
+        <w:tc>
+          <w:tcPr>
+            <w:tcW w:type="dxa" w:w="5960"/>
             <w:shd w:fill="EEF3F8" w:val="clear"/>
             <w:tcMar>
               <w:top w:type="dxa" w:w="60"/>
@@ -4353,7 +4832,123 @@
                 <w:sz w:val="19"/>
                 <w:szCs w:val="19"/>
               </w:rPr>
-              <w:t xml:space="preserve">Sum of deposit movements in the ledger</w:t>
+              <w:t xml:space="preserve">Impact of the two act-now categories: settled but marked FAILED, and unrecognised settlements</w:t>
+            </w:r>
+          </w:p>
+        </w:tc>
+      </w:tr>
+      <w:tr>
+        <w:trPr>
+          <w:cantSplit/>
+        </w:trPr>
+        <w:tc>
+          <w:tcPr>
+            <w:tcW w:type="dxa" w:w="3400"/>
+            <w:tcMar>
+              <w:top w:type="dxa" w:w="60"/>
+              <w:left w:type="dxa" w:w="100"/>
+              <w:bottom w:type="dxa" w:w="60"/>
+              <w:right w:type="dxa" w:w="100"/>
+            </w:tcMar>
+            <w:vAlign w:val="center"/>
+          </w:tcPr>
+          <w:p>
+            <w:pPr>
+              <w:jc w:val="left"/>
+            </w:pPr>
+            <w:r>
+              <w:rPr>
+                <w:b w:val="false"/>
+                <w:bCs w:val="false"/>
+                <w:sz w:val="19"/>
+                <w:szCs w:val="19"/>
+              </w:rPr>
+              <w:t xml:space="preserve">Bridge Amount / Bridge Residual</w:t>
+            </w:r>
+          </w:p>
+        </w:tc>
+        <w:tc>
+          <w:tcPr>
+            <w:tcW w:type="dxa" w:w="5960"/>
+            <w:tcMar>
+              <w:top w:type="dxa" w:w="60"/>
+              <w:left w:type="dxa" w:w="100"/>
+              <w:bottom w:type="dxa" w:w="60"/>
+              <w:right w:type="dxa" w:w="100"/>
+            </w:tcMar>
+            <w:vAlign w:val="center"/>
+          </w:tcPr>
+          <w:p>
+            <w:pPr>
+              <w:jc w:val="left"/>
+            </w:pPr>
+            <w:r>
+              <w:rPr>
+                <w:b w:val="false"/>
+                <w:bCs w:val="false"/>
+                <w:sz w:val="19"/>
+                <w:szCs w:val="19"/>
+              </w:rPr>
+              <w:t xml:space="preserve">Sum of the bridge steps; residual = gateway total − steps, which must be 0.00</w:t>
+            </w:r>
+          </w:p>
+        </w:tc>
+      </w:tr>
+      <w:tr>
+        <w:trPr>
+          <w:cantSplit/>
+        </w:trPr>
+        <w:tc>
+          <w:tcPr>
+            <w:tcW w:type="dxa" w:w="3400"/>
+            <w:shd w:fill="EEF3F8" w:val="clear"/>
+            <w:tcMar>
+              <w:top w:type="dxa" w:w="60"/>
+              <w:left w:type="dxa" w:w="100"/>
+              <w:bottom w:type="dxa" w:w="60"/>
+              <w:right w:type="dxa" w:w="100"/>
+            </w:tcMar>
+            <w:vAlign w:val="center"/>
+          </w:tcPr>
+          <w:p>
+            <w:pPr>
+              <w:jc w:val="left"/>
+            </w:pPr>
+            <w:r>
+              <w:rPr>
+                <w:b w:val="false"/>
+                <w:bCs w:val="false"/>
+                <w:sz w:val="19"/>
+                <w:szCs w:val="19"/>
+              </w:rPr>
+              <w:t xml:space="preserve">Transactions Loaded / Runs / Rows Rejected / Retries</w:t>
+            </w:r>
+          </w:p>
+        </w:tc>
+        <w:tc>
+          <w:tcPr>
+            <w:tcW w:type="dxa" w:w="5960"/>
+            <w:shd w:fill="EEF3F8" w:val="clear"/>
+            <w:tcMar>
+              <w:top w:type="dxa" w:w="60"/>
+              <w:left w:type="dxa" w:w="100"/>
+              <w:bottom w:type="dxa" w:w="60"/>
+              <w:right w:type="dxa" w:w="100"/>
+            </w:tcMar>
+            <w:vAlign w:val="center"/>
+          </w:tcPr>
+          <w:p>
+            <w:pPr>
+              <w:jc w:val="left"/>
+            </w:pPr>
+            <w:r>
+              <w:rPr>
+                <w:b w:val="false"/>
+                <w:bCs w:val="false"/>
+                <w:sz w:val="19"/>
+                <w:szCs w:val="19"/>
+              </w:rPr>
+              <w:t xml:space="preserve">Exercise 2's loaded rows and run log</w:t>
             </w:r>
           </w:p>
         </w:tc>
@@ -4362,6 +4957,8 @@
     <w:p>
       <w:pPr>
         <w:pStyle w:val="Heading2"/>
+        <w:keepNext/>
+        <w:keepLines/>
         <w:spacing w:after="150" w:before="300"/>
       </w:pPr>
       <w:r>
@@ -4370,10 +4967,62 @@
     </w:p>
     <w:p>
       <w:pPr>
+        <w:pStyle w:val="ListParagraph"/>
+        <w:numPr>
+          <w:ilvl w:val="0"/>
+          <w:numId w:val="2"/>
+        </w:numPr>
+        <w:spacing w:after="80"/>
+      </w:pPr>
+      <w:r>
+        <w:t xml:space="preserve">NGR overview (Ex. 3): GGR, realised bonus cost, NGR and bonus liability cards; GGR vs NGR by product; bonus cost as a percentage of NGR by campaign.</w:t>
+      </w:r>
+    </w:p>
+    <w:p>
+      <w:pPr>
+        <w:pStyle w:val="ListParagraph"/>
+        <w:numPr>
+          <w:ilvl w:val="0"/>
+          <w:numId w:val="2"/>
+        </w:numPr>
+        <w:spacing w:after="80"/>
+      </w:pPr>
+      <w:r>
+        <w:t xml:space="preserve">Player balances (Ex. 3): a date slicer, deposits, and each player's balance rebuilt from the ledger as of the slicer's end date.</w:t>
+      </w:r>
+    </w:p>
+    <w:p>
+      <w:pPr>
+        <w:pStyle w:val="ListParagraph"/>
+        <w:numPr>
+          <w:ilvl w:val="0"/>
+          <w:numId w:val="2"/>
+        </w:numPr>
+        <w:spacing w:after="80"/>
+      </w:pPr>
+      <w:r>
+        <w:t xml:space="preserve">Reconciliation (Ex. 1): headline cards, the bridge as a waterfall from the internal total to the gateway total, exceptions by category, and a detail table.</w:t>
+      </w:r>
+    </w:p>
+    <w:p>
+      <w:pPr>
+        <w:pStyle w:val="ListParagraph"/>
+        <w:numPr>
+          <w:ilvl w:val="0"/>
+          <w:numId w:val="2"/>
+        </w:numPr>
+        <w:spacing w:after="80"/>
+      </w:pPr>
+      <w:r>
+        <w:t xml:space="preserve">Ingestion monitoring (Ex. 2): loaded rows, runs, rejected rows and rate-limit retries; the run history, including the run killed mid-page; transactions by status.</w:t>
+      </w:r>
+    </w:p>
+    <w:p>
+      <w:pPr>
         <w:spacing w:after="160"/>
       </w:pPr>
       <w:r>
-        <w:t xml:space="preserve">Page 1, NGR overview: four cards, GGR vs NGR by product, and a campaign table. Page 2, Player balances: a date slicer, deposits, and each player's balance from the ledger. Each value below was computed from the CSVs with pandas, independently of the DAX, and matches the MySQL, MariaDB and dbt results.</w:t>
+        <w:t xml:space="preserve">Each value below was computed from the CSVs with pandas, independently of the DAX, and matches the MySQL, MariaDB and dbt results. The full list is in powerbi/expected_values.md.</w:t>
       </w:r>
     </w:p>
     <w:tbl>
@@ -4653,7 +5302,7 @@
                 <w:sz w:val="19"/>
                 <w:szCs w:val="19"/>
               </w:rPr>
-              <w:t xml:space="preserve">Bonus Liability Outstanding</w:t>
+              <w:t xml:space="preserve">Player 1 balance, slicer ending 2026-09-06</w:t>
             </w:r>
           </w:p>
         </w:tc>
@@ -4680,7 +5329,7 @@
                 <w:sz w:val="19"/>
                 <w:szCs w:val="19"/>
               </w:rPr>
-              <w:t xml:space="preserve">50.00</w:t>
+              <w:t xml:space="preserve">1,160.00 (real)</w:t>
             </w:r>
           </w:p>
         </w:tc>
@@ -4711,7 +5360,7 @@
                 <w:sz w:val="19"/>
                 <w:szCs w:val="19"/>
               </w:rPr>
-              <w:t xml:space="preserve">Player 1 balance, slicer ending 2026-09-06</w:t>
+              <w:t xml:space="preserve">Balances, full date range</w:t>
             </w:r>
           </w:p>
         </w:tc>
@@ -4737,7 +5386,7 @@
                 <w:sz w:val="19"/>
                 <w:szCs w:val="19"/>
               </w:rPr>
-              <w:t xml:space="preserve">1,160.00 (real)</w:t>
+              <w:t xml:space="preserve">Player 1: 1,190.00 · Player 2: 400.00 · Player 3: 100.00 real + 30.00 bonus</w:t>
             </w:r>
           </w:p>
         </w:tc>
@@ -4769,7 +5418,7 @@
                 <w:sz w:val="19"/>
                 <w:szCs w:val="19"/>
               </w:rPr>
-              <w:t xml:space="preserve">Balances, full date range</w:t>
+              <w:t xml:space="preserve">Settlements matched exactly / exceptions</w:t>
             </w:r>
           </w:p>
         </w:tc>
@@ -4796,7 +5445,239 @@
                 <w:sz w:val="19"/>
                 <w:szCs w:val="19"/>
               </w:rPr>
-              <w:t xml:space="preserve">Player 1: 1,190.00 · Player 2: 400.00 · Player 3: 100.00 real + 30.00 bonus</w:t>
+              <w:t xml:space="preserve">274 / 43</w:t>
+            </w:r>
+          </w:p>
+        </w:tc>
+      </w:tr>
+      <w:tr>
+        <w:trPr>
+          <w:cantSplit/>
+        </w:trPr>
+        <w:tc>
+          <w:tcPr>
+            <w:tcW w:type="dxa" w:w="4200"/>
+            <w:tcMar>
+              <w:top w:type="dxa" w:w="60"/>
+              <w:left w:type="dxa" w:w="100"/>
+              <w:bottom w:type="dxa" w:w="60"/>
+              <w:right w:type="dxa" w:w="100"/>
+            </w:tcMar>
+            <w:vAlign w:val="center"/>
+          </w:tcPr>
+          <w:p>
+            <w:pPr>
+              <w:jc w:val="left"/>
+            </w:pPr>
+            <w:r>
+              <w:rPr>
+                <w:b w:val="false"/>
+                <w:bCs w:val="false"/>
+                <w:sz w:val="19"/>
+                <w:szCs w:val="19"/>
+              </w:rPr>
+              <w:t xml:space="preserve">Act Now Value / Bridge Residual</w:t>
+            </w:r>
+          </w:p>
+        </w:tc>
+        <w:tc>
+          <w:tcPr>
+            <w:tcW w:type="dxa" w:w="5160"/>
+            <w:tcMar>
+              <w:top w:type="dxa" w:w="60"/>
+              <w:left w:type="dxa" w:w="100"/>
+              <w:bottom w:type="dxa" w:w="60"/>
+              <w:right w:type="dxa" w:w="100"/>
+            </w:tcMar>
+            <w:vAlign w:val="center"/>
+          </w:tcPr>
+          <w:p>
+            <w:pPr>
+              <w:jc w:val="left"/>
+            </w:pPr>
+            <w:r>
+              <w:rPr>
+                <w:b w:val="false"/>
+                <w:bCs w:val="false"/>
+                <w:sz w:val="19"/>
+                <w:szCs w:val="19"/>
+              </w:rPr>
+              <w:t xml:space="preserve">3,150.00 / 0.00</w:t>
+            </w:r>
+          </w:p>
+        </w:tc>
+      </w:tr>
+      <w:tr>
+        <w:trPr>
+          <w:cantSplit/>
+        </w:trPr>
+        <w:tc>
+          <w:tcPr>
+            <w:tcW w:type="dxa" w:w="4200"/>
+            <w:shd w:fill="EEF3F8" w:val="clear"/>
+            <w:tcMar>
+              <w:top w:type="dxa" w:w="60"/>
+              <w:left w:type="dxa" w:w="100"/>
+              <w:bottom w:type="dxa" w:w="60"/>
+              <w:right w:type="dxa" w:w="100"/>
+            </w:tcMar>
+            <w:vAlign w:val="center"/>
+          </w:tcPr>
+          <w:p>
+            <w:pPr>
+              <w:jc w:val="left"/>
+            </w:pPr>
+            <w:r>
+              <w:rPr>
+                <w:b w:val="false"/>
+                <w:bCs w:val="false"/>
+                <w:sz w:val="19"/>
+                <w:szCs w:val="19"/>
+              </w:rPr>
+              <w:t xml:space="preserve">Waterfall</w:t>
+            </w:r>
+          </w:p>
+        </w:tc>
+        <w:tc>
+          <w:tcPr>
+            <w:tcW w:type="dxa" w:w="5160"/>
+            <w:shd w:fill="EEF3F8" w:val="clear"/>
+            <w:tcMar>
+              <w:top w:type="dxa" w:w="60"/>
+              <w:left w:type="dxa" w:w="100"/>
+              <w:bottom w:type="dxa" w:w="60"/>
+              <w:right w:type="dxa" w:w="100"/>
+            </w:tcMar>
+            <w:vAlign w:val="center"/>
+          </w:tcPr>
+          <w:p>
+            <w:pPr>
+              <w:jc w:val="left"/>
+            </w:pPr>
+            <w:r>
+              <w:rPr>
+                <w:b w:val="false"/>
+                <w:bCs w:val="false"/>
+                <w:sz w:val="19"/>
+                <w:szCs w:val="19"/>
+              </w:rPr>
+              <w:t xml:space="preserve">218,280.00 → 217,979.97 in 10 adjustment steps</w:t>
+            </w:r>
+          </w:p>
+        </w:tc>
+      </w:tr>
+      <w:tr>
+        <w:trPr>
+          <w:cantSplit/>
+        </w:trPr>
+        <w:tc>
+          <w:tcPr>
+            <w:tcW w:type="dxa" w:w="4200"/>
+            <w:tcMar>
+              <w:top w:type="dxa" w:w="60"/>
+              <w:left w:type="dxa" w:w="100"/>
+              <w:bottom w:type="dxa" w:w="60"/>
+              <w:right w:type="dxa" w:w="100"/>
+            </w:tcMar>
+            <w:vAlign w:val="center"/>
+          </w:tcPr>
+          <w:p>
+            <w:pPr>
+              <w:jc w:val="left"/>
+            </w:pPr>
+            <w:r>
+              <w:rPr>
+                <w:b w:val="false"/>
+                <w:bCs w:val="false"/>
+                <w:sz w:val="19"/>
+                <w:szCs w:val="19"/>
+              </w:rPr>
+              <w:t xml:space="preserve">Transactions loaded / runs / rows rejected / retries</w:t>
+            </w:r>
+          </w:p>
+        </w:tc>
+        <w:tc>
+          <w:tcPr>
+            <w:tcW w:type="dxa" w:w="5160"/>
+            <w:tcMar>
+              <w:top w:type="dxa" w:w="60"/>
+              <w:left w:type="dxa" w:w="100"/>
+              <w:bottom w:type="dxa" w:w="60"/>
+              <w:right w:type="dxa" w:w="100"/>
+            </w:tcMar>
+            <w:vAlign w:val="center"/>
+          </w:tcPr>
+          <w:p>
+            <w:pPr>
+              <w:jc w:val="left"/>
+            </w:pPr>
+            <w:r>
+              <w:rPr>
+                <w:b w:val="false"/>
+                <w:bCs w:val="false"/>
+                <w:sz w:val="19"/>
+                <w:szCs w:val="19"/>
+              </w:rPr>
+              <w:t xml:space="preserve">1,024 / 3 / 1 / 1</w:t>
+            </w:r>
+          </w:p>
+        </w:tc>
+      </w:tr>
+      <w:tr>
+        <w:trPr>
+          <w:cantSplit/>
+        </w:trPr>
+        <w:tc>
+          <w:tcPr>
+            <w:tcW w:type="dxa" w:w="4200"/>
+            <w:shd w:fill="EEF3F8" w:val="clear"/>
+            <w:tcMar>
+              <w:top w:type="dxa" w:w="60"/>
+              <w:left w:type="dxa" w:w="100"/>
+              <w:bottom w:type="dxa" w:w="60"/>
+              <w:right w:type="dxa" w:w="100"/>
+            </w:tcMar>
+            <w:vAlign w:val="center"/>
+          </w:tcPr>
+          <w:p>
+            <w:pPr>
+              <w:jc w:val="left"/>
+            </w:pPr>
+            <w:r>
+              <w:rPr>
+                <w:b w:val="false"/>
+                <w:bCs w:val="false"/>
+                <w:sz w:val="19"/>
+                <w:szCs w:val="19"/>
+              </w:rPr>
+              <w:t xml:space="preserve">Transactions by status</w:t>
+            </w:r>
+          </w:p>
+        </w:tc>
+        <w:tc>
+          <w:tcPr>
+            <w:tcW w:type="dxa" w:w="5160"/>
+            <w:shd w:fill="EEF3F8" w:val="clear"/>
+            <w:tcMar>
+              <w:top w:type="dxa" w:w="60"/>
+              <w:left w:type="dxa" w:w="100"/>
+              <w:bottom w:type="dxa" w:w="60"/>
+              <w:right w:type="dxa" w:w="100"/>
+            </w:tcMar>
+            <w:vAlign w:val="center"/>
+          </w:tcPr>
+          <w:p>
+            <w:pPr>
+              <w:jc w:val="left"/>
+            </w:pPr>
+            <w:r>
+              <w:rPr>
+                <w:b w:val="false"/>
+                <w:bCs w:val="false"/>
+                <w:sz w:val="19"/>
+                <w:szCs w:val="19"/>
+              </w:rPr>
+              <w:t xml:space="preserve">completed 587 · failed 214 · pending 207 · reversed 16</w:t>
             </w:r>
           </w:p>
         </w:tc>
@@ -4805,6 +5686,8 @@
     <w:p>
       <w:pPr>
         <w:pStyle w:val="Heading2"/>
+        <w:keepNext/>
+        <w:keepLines/>
         <w:spacing w:after="150" w:before="300"/>
       </w:pPr>
       <w:r>
@@ -4816,7 +5699,15 @@
         <w:spacing w:after="160"/>
       </w:pPr>
       <w:r>
-        <w:t xml:space="preserve">Power BI Desktop doesn't run in the Linux environment this was built in, so the project was not opened in Power BI there. Instead, the build script checks that every visual field and every DAX reference resolves to the model, that every relationship column exists, and that no filter path is ambiguous. A negative test confirmed it rejects an ambiguous relationship and a misspelled measure. The report layout follows the supplied Demo.pbix (Power BI Desktop 2.130, CY24SU06 theme). If Desktop objects to the project file, powerbi/README.md gives a five-minute manual route to build the same model in Demo.pbix.</w:t>
+        <w:t xml:space="preserve">Power BI Desktop doesn't run in the Linux environment this was built in. Instead, the build script checks that every visual field, sort and DAX reference resolves to the model, that every CSV's columns match the model, that every relationship column exists, and that no filter path is ambiguous. A negative test confirmed it rejects an ambiguous relationship and a misspelled measure. The report layout follows the supplied Demo.pbix (Power BI Desktop 2.130, CY24SU06 theme).</w:t>
+      </w:r>
+    </w:p>
+    <w:p>
+      <w:pPr>
+        <w:spacing w:after="160"/>
+      </w:pPr>
+      <w:r>
+        <w:t xml:space="preserve">Power BI Desktop has since opened an earlier version of this project on a Windows machine: the pages and visuals loaded. The one failure was that the data folder path didn't exist on that machine, and embedding the data removes that step. If Desktop objects to the project for any other reason, powerbi/README.md gives a five-minute manual route to build the same model in Demo.pbix.</w:t>
       </w:r>
     </w:p>
     <w:p>

</xml_diff>

<commit_message>
Address Codex QA-01..06: exit codes, exact thresholds, provisional timing, one-page summary
- QA-02: ingest.py exits 1 on FAILED, 130 on INTERRUPTED; unit tests with no
  network or DB (401, exhausted 429/500 retries, completed run)
- QA-03: fee/net flagged at any whole-cent difference, rounding is exactly
  1 cent, bridge residual must be zero; boundary fixtures at 0.01/0.02/0.03
  run the real SQL and check dbt and pandas use the same thresholds. No
  figure changes on the real data. Fresh dbt build on MariaDB: 67/67.
- QA-05: timing lines labelled provisional with the confirming files named
- QA-06: standalone one-page Finance_Summary.pdf; also page 3 of the
  submission and the top of summary.md
- QA-01: old drop script withdrawn (Codex removed the old builds with a
  backup); replies in CODEX_REVIEW.md

Co-Authored-By: Claude Opus 5.5 <noreply@anthropic.com>
Claude-Session: https://claude.ai/code/session_01GpY9vtVnSw1tgz3K4xTp8Q
</commit_message>
<xml_diff>
--- a/candidate-assessment/JSB_Candidate_Submission.docx
+++ b/candidate-assessment/JSB_Candidate_Submission.docx
@@ -201,6 +201,1708 @@
     </w:p>
     <w:p>
       <w:pPr>
+        <w:spacing w:after="60"/>
+      </w:pPr>
+      <w:r>
+        <w:rPr>
+          <w:b/>
+          <w:bCs/>
+          <w:color w:val="0E7C7B"/>
+          <w:sz w:val="26"/>
+          <w:szCs w:val="26"/>
+        </w:rPr>
+        <w:t xml:space="preserve">Finance Manager summary</w:t>
+      </w:r>
+    </w:p>
+    <w:p>
+      <w:pPr>
+        <w:spacing w:after="60"/>
+      </w:pPr>
+      <w:r>
+        <w:rPr>
+          <w:i/>
+          <w:iCs/>
+          <w:color w:val="595959"/>
+          <w:sz w:val="18"/>
+          <w:szCs w:val="18"/>
+        </w:rPr>
+        <w:t xml:space="preserve">Week 1–7 September 2026 (UTC) · NAD · internal_deposits (326 rows) vs gateway_settlement (306 rows)</w:t>
+      </w:r>
+    </w:p>
+    <w:p>
+      <w:pPr>
+        <w:spacing w:after="80"/>
+      </w:pPr>
+      <w:r>
+        <w:rPr>
+          <w:b/>
+          <w:bCs/>
+          <w:sz w:val="20"/>
+          <w:szCs w:val="20"/>
+        </w:rPr>
+        <w:t xml:space="preserve">274 of 306 gateway settlements (90%) match exactly </w:t>
+      </w:r>
+      <w:r>
+        <w:rPr>
+          <w:sz w:val="20"/>
+          <w:szCs w:val="20"/>
+        </w:rPr>
+        <w:t xml:space="preserve">on reference, gross, fee and net. The bridge from our R218,280.00 to the gateway's R217,979.97 leaves R0.00 unexplained. Two of its timing lines are provisional until the adjacent weeks' files confirm them (see assumptions).</w:t>
+      </w:r>
+    </w:p>
+    <w:p>
+      <w:pPr>
+        <w:spacing w:after="60" w:before="140"/>
+      </w:pPr>
+      <w:r>
+        <w:rPr>
+          <w:b/>
+          <w:bCs/>
+          <w:color w:val="0E7C7B"/>
+          <w:sz w:val="22"/>
+          <w:szCs w:val="22"/>
+        </w:rPr>
+        <w:t xml:space="preserve">Bridge on gross amounts: internal total → gateway total</w:t>
+      </w:r>
+    </w:p>
+    <w:tbl>
+      <w:tblPr>
+        <w:tblW w:type="dxa" w:w="9360"/>
+        <w:tblBorders>
+          <w:top w:val="single" w:color="auto" w:sz="4"/>
+          <w:left w:val="single" w:color="auto" w:sz="4"/>
+          <w:bottom w:val="single" w:color="auto" w:sz="4"/>
+          <w:right w:val="single" w:color="auto" w:sz="4"/>
+          <w:insideH w:val="single" w:color="auto" w:sz="4"/>
+          <w:insideV w:val="single" w:color="auto" w:sz="4"/>
+        </w:tblBorders>
+      </w:tblPr>
+      <w:tblGrid>
+        <w:gridCol w:w="7360"/>
+        <w:gridCol w:w="2000"/>
+      </w:tblGrid>
+      <w:tr>
+        <w:trPr>
+          <w:tblHeader/>
+        </w:trPr>
+        <w:tc>
+          <w:tcPr>
+            <w:tcW w:type="dxa" w:w="7360"/>
+            <w:shd w:fill="1F3864" w:val="clear"/>
+            <w:tcMar>
+              <w:top w:type="dxa" w:w="25"/>
+              <w:left w:type="dxa" w:w="90"/>
+              <w:bottom w:type="dxa" w:w="25"/>
+              <w:right w:type="dxa" w:w="90"/>
+            </w:tcMar>
+            <w:vAlign w:val="center"/>
+          </w:tcPr>
+          <w:p>
+            <w:r>
+              <w:rPr>
+                <w:b/>
+                <w:bCs/>
+                <w:color w:val="FFFFFF"/>
+                <w:sz w:val="18"/>
+                <w:szCs w:val="18"/>
+              </w:rPr>
+              <w:t xml:space="preserve">Line</w:t>
+            </w:r>
+          </w:p>
+        </w:tc>
+        <w:tc>
+          <w:tcPr>
+            <w:tcW w:type="dxa" w:w="2000"/>
+            <w:shd w:fill="1F3864" w:val="clear"/>
+            <w:tcMar>
+              <w:top w:type="dxa" w:w="25"/>
+              <w:left w:type="dxa" w:w="90"/>
+              <w:bottom w:type="dxa" w:w="25"/>
+              <w:right w:type="dxa" w:w="90"/>
+            </w:tcMar>
+            <w:vAlign w:val="center"/>
+          </w:tcPr>
+          <w:p>
+            <w:r>
+              <w:rPr>
+                <w:b/>
+                <w:bCs/>
+                <w:color w:val="FFFFFF"/>
+                <w:sz w:val="18"/>
+                <w:szCs w:val="18"/>
+              </w:rPr>
+              <w:t xml:space="preserve">NAD</w:t>
+            </w:r>
+          </w:p>
+        </w:tc>
+      </w:tr>
+      <w:tr>
+        <w:trPr>
+          <w:cantSplit/>
+        </w:trPr>
+        <w:tc>
+          <w:tcPr>
+            <w:tcW w:type="dxa" w:w="7360"/>
+            <w:tcMar>
+              <w:top w:type="dxa" w:w="25"/>
+              <w:left w:type="dxa" w:w="90"/>
+              <w:bottom w:type="dxa" w:w="25"/>
+              <w:right w:type="dxa" w:w="90"/>
+            </w:tcMar>
+            <w:vAlign w:val="center"/>
+          </w:tcPr>
+          <w:p>
+            <w:r>
+              <w:rPr>
+                <w:b w:val="false"/>
+                <w:bCs w:val="false"/>
+                <w:sz w:val="18"/>
+                <w:szCs w:val="18"/>
+              </w:rPr>
+              <w:t xml:space="preserve">Internal SUCCESS deposits, total</w:t>
+            </w:r>
+          </w:p>
+        </w:tc>
+        <w:tc>
+          <w:tcPr>
+            <w:tcW w:type="dxa" w:w="2000"/>
+            <w:tcMar>
+              <w:top w:type="dxa" w:w="25"/>
+              <w:left w:type="dxa" w:w="90"/>
+              <w:bottom w:type="dxa" w:w="25"/>
+              <w:right w:type="dxa" w:w="90"/>
+            </w:tcMar>
+            <w:vAlign w:val="center"/>
+          </w:tcPr>
+          <w:p>
+            <w:r>
+              <w:rPr>
+                <w:b w:val="false"/>
+                <w:bCs w:val="false"/>
+                <w:sz w:val="18"/>
+                <w:szCs w:val="18"/>
+              </w:rPr>
+              <w:t xml:space="preserve">218,280.00</w:t>
+            </w:r>
+          </w:p>
+        </w:tc>
+      </w:tr>
+      <w:tr>
+        <w:trPr>
+          <w:cantSplit/>
+        </w:trPr>
+        <w:tc>
+          <w:tcPr>
+            <w:tcW w:type="dxa" w:w="7360"/>
+            <w:shd w:fill="EEF3F8" w:val="clear"/>
+            <w:tcMar>
+              <w:top w:type="dxa" w:w="25"/>
+              <w:left w:type="dxa" w:w="90"/>
+              <w:bottom w:type="dxa" w:w="25"/>
+              <w:right w:type="dxa" w:w="90"/>
+            </w:tcMar>
+            <w:vAlign w:val="center"/>
+          </w:tcPr>
+          <w:p>
+            <w:r>
+              <w:rPr>
+                <w:b w:val="false"/>
+                <w:bCs w:val="false"/>
+                <w:sz w:val="18"/>
+                <w:szCs w:val="18"/>
+              </w:rPr>
+              <w:t xml:space="preserve">− Duplicate internal deposit rows (same settlement counted twice)</w:t>
+            </w:r>
+          </w:p>
+        </w:tc>
+        <w:tc>
+          <w:tcPr>
+            <w:tcW w:type="dxa" w:w="2000"/>
+            <w:shd w:fill="EEF3F8" w:val="clear"/>
+            <w:tcMar>
+              <w:top w:type="dxa" w:w="25"/>
+              <w:left w:type="dxa" w:w="90"/>
+              <w:bottom w:type="dxa" w:w="25"/>
+              <w:right w:type="dxa" w:w="90"/>
+            </w:tcMar>
+            <w:vAlign w:val="center"/>
+          </w:tcPr>
+          <w:p>
+            <w:r>
+              <w:rPr>
+                <w:b w:val="false"/>
+                <w:bCs w:val="false"/>
+                <w:sz w:val="18"/>
+                <w:szCs w:val="18"/>
+              </w:rPr>
+              <w:t xml:space="preserve">(1,300.00)</w:t>
+            </w:r>
+          </w:p>
+        </w:tc>
+      </w:tr>
+      <w:tr>
+        <w:trPr>
+          <w:cantSplit/>
+        </w:trPr>
+        <w:tc>
+          <w:tcPr>
+            <w:tcW w:type="dxa" w:w="7360"/>
+            <w:tcMar>
+              <w:top w:type="dxa" w:w="25"/>
+              <w:left w:type="dxa" w:w="90"/>
+              <w:bottom w:type="dxa" w:w="25"/>
+              <w:right w:type="dxa" w:w="90"/>
+            </w:tcMar>
+            <w:vAlign w:val="center"/>
+          </w:tcPr>
+          <w:p>
+            <w:r>
+              <w:rPr>
+                <w:b w:val="false"/>
+                <w:bCs w:val="false"/>
+                <w:sz w:val="18"/>
+                <w:szCs w:val="18"/>
+              </w:rPr>
+              <w:t xml:space="preserve">− Reversals / chargebacks (not in the gateway's SETTLED total)</w:t>
+            </w:r>
+          </w:p>
+        </w:tc>
+        <w:tc>
+          <w:tcPr>
+            <w:tcW w:type="dxa" w:w="2000"/>
+            <w:tcMar>
+              <w:top w:type="dxa" w:w="25"/>
+              <w:left w:type="dxa" w:w="90"/>
+              <w:bottom w:type="dxa" w:w="25"/>
+              <w:right w:type="dxa" w:w="90"/>
+            </w:tcMar>
+            <w:vAlign w:val="center"/>
+          </w:tcPr>
+          <w:p>
+            <w:r>
+              <w:rPr>
+                <w:b w:val="false"/>
+                <w:bCs w:val="false"/>
+                <w:sz w:val="18"/>
+                <w:szCs w:val="18"/>
+              </w:rPr>
+              <w:t xml:space="preserve">(850.00)</w:t>
+            </w:r>
+          </w:p>
+        </w:tc>
+      </w:tr>
+      <w:tr>
+        <w:trPr>
+          <w:cantSplit/>
+        </w:trPr>
+        <w:tc>
+          <w:tcPr>
+            <w:tcW w:type="dxa" w:w="7360"/>
+            <w:shd w:fill="EEF3F8" w:val="clear"/>
+            <w:tcMar>
+              <w:top w:type="dxa" w:w="25"/>
+              <w:left w:type="dxa" w:w="90"/>
+              <w:bottom w:type="dxa" w:w="25"/>
+              <w:right w:type="dxa" w:w="90"/>
+            </w:tcMar>
+            <w:vAlign w:val="center"/>
+          </w:tcPr>
+          <w:p>
+            <w:r>
+              <w:rPr>
+                <w:b w:val="false"/>
+                <w:bCs w:val="false"/>
+                <w:sz w:val="18"/>
+                <w:szCs w:val="18"/>
+              </w:rPr>
+              <w:t xml:space="preserve">− Deposits with no settlement yet (mid-week)</w:t>
+            </w:r>
+          </w:p>
+        </w:tc>
+        <w:tc>
+          <w:tcPr>
+            <w:tcW w:type="dxa" w:w="2000"/>
+            <w:shd w:fill="EEF3F8" w:val="clear"/>
+            <w:tcMar>
+              <w:top w:type="dxa" w:w="25"/>
+              <w:left w:type="dxa" w:w="90"/>
+              <w:bottom w:type="dxa" w:w="25"/>
+              <w:right w:type="dxa" w:w="90"/>
+            </w:tcMar>
+            <w:vAlign w:val="center"/>
+          </w:tcPr>
+          <w:p>
+            <w:r>
+              <w:rPr>
+                <w:b w:val="false"/>
+                <w:bCs w:val="false"/>
+                <w:sz w:val="18"/>
+                <w:szCs w:val="18"/>
+              </w:rPr>
+              <w:t xml:space="preserve">(2,700.00)</w:t>
+            </w:r>
+          </w:p>
+        </w:tc>
+      </w:tr>
+      <w:tr>
+        <w:trPr>
+          <w:cantSplit/>
+        </w:trPr>
+        <w:tc>
+          <w:tcPr>
+            <w:tcW w:type="dxa" w:w="7360"/>
+            <w:tcMar>
+              <w:top w:type="dxa" w:w="25"/>
+              <w:left w:type="dxa" w:w="90"/>
+              <w:bottom w:type="dxa" w:w="25"/>
+              <w:right w:type="dxa" w:w="90"/>
+            </w:tcMar>
+            <w:vAlign w:val="center"/>
+          </w:tcPr>
+          <w:p>
+            <w:r>
+              <w:rPr>
+                <w:b w:val="false"/>
+                <w:bCs w:val="false"/>
+                <w:sz w:val="18"/>
+                <w:szCs w:val="18"/>
+              </w:rPr>
+              <w:t xml:space="preserve">− Created in the last 15 min, not yet settled (provisional)</w:t>
+            </w:r>
+          </w:p>
+        </w:tc>
+        <w:tc>
+          <w:tcPr>
+            <w:tcW w:type="dxa" w:w="2000"/>
+            <w:tcMar>
+              <w:top w:type="dxa" w:w="25"/>
+              <w:left w:type="dxa" w:w="90"/>
+              <w:bottom w:type="dxa" w:w="25"/>
+              <w:right w:type="dxa" w:w="90"/>
+            </w:tcMar>
+            <w:vAlign w:val="center"/>
+          </w:tcPr>
+          <w:p>
+            <w:r>
+              <w:rPr>
+                <w:b w:val="false"/>
+                <w:bCs w:val="false"/>
+                <w:sz w:val="18"/>
+                <w:szCs w:val="18"/>
+              </w:rPr>
+              <w:t xml:space="preserve">(3,650.00)</w:t>
+            </w:r>
+          </w:p>
+        </w:tc>
+      </w:tr>
+      <w:tr>
+        <w:trPr>
+          <w:cantSplit/>
+        </w:trPr>
+        <w:tc>
+          <w:tcPr>
+            <w:tcW w:type="dxa" w:w="7360"/>
+            <w:shd w:fill="EEF3F8" w:val="clear"/>
+            <w:tcMar>
+              <w:top w:type="dxa" w:w="25"/>
+              <w:left w:type="dxa" w:w="90"/>
+              <w:bottom w:type="dxa" w:w="25"/>
+              <w:right w:type="dxa" w:w="90"/>
+            </w:tcMar>
+            <w:vAlign w:val="center"/>
+          </w:tcPr>
+          <w:p>
+            <w:r>
+              <w:rPr>
+                <w:b w:val="false"/>
+                <w:bCs w:val="false"/>
+                <w:sz w:val="18"/>
+                <w:szCs w:val="18"/>
+              </w:rPr>
+              <w:t xml:space="preserve">+ Settled in the first 15 min, no deposit this week (provisional)</w:t>
+            </w:r>
+          </w:p>
+        </w:tc>
+        <w:tc>
+          <w:tcPr>
+            <w:tcW w:type="dxa" w:w="2000"/>
+            <w:shd w:fill="EEF3F8" w:val="clear"/>
+            <w:tcMar>
+              <w:top w:type="dxa" w:w="25"/>
+              <w:left w:type="dxa" w:w="90"/>
+              <w:bottom w:type="dxa" w:w="25"/>
+              <w:right w:type="dxa" w:w="90"/>
+            </w:tcMar>
+            <w:vAlign w:val="center"/>
+          </w:tcPr>
+          <w:p>
+            <w:r>
+              <w:rPr>
+                <w:b w:val="false"/>
+                <w:bCs w:val="false"/>
+                <w:sz w:val="18"/>
+                <w:szCs w:val="18"/>
+              </w:rPr>
+              <w:t xml:space="preserve">2,600.00</w:t>
+            </w:r>
+          </w:p>
+        </w:tc>
+      </w:tr>
+      <w:tr>
+        <w:trPr>
+          <w:cantSplit/>
+        </w:trPr>
+        <w:tc>
+          <w:tcPr>
+            <w:tcW w:type="dxa" w:w="7360"/>
+            <w:tcMar>
+              <w:top w:type="dxa" w:w="25"/>
+              <w:left w:type="dxa" w:w="90"/>
+              <w:bottom w:type="dxa" w:w="25"/>
+              <w:right w:type="dxa" w:w="90"/>
+            </w:tcMar>
+            <w:vAlign w:val="center"/>
+          </w:tcPr>
+          <w:p>
+            <w:r>
+              <w:rPr>
+                <w:b w:val="false"/>
+                <w:bCs w:val="false"/>
+                <w:sz w:val="18"/>
+                <w:szCs w:val="18"/>
+              </w:rPr>
+              <w:t xml:space="preserve">+ Settlements with no internal record</w:t>
+            </w:r>
+          </w:p>
+        </w:tc>
+        <w:tc>
+          <w:tcPr>
+            <w:tcW w:type="dxa" w:w="2000"/>
+            <w:tcMar>
+              <w:top w:type="dxa" w:w="25"/>
+              <w:left w:type="dxa" w:w="90"/>
+              <w:bottom w:type="dxa" w:w="25"/>
+              <w:right w:type="dxa" w:w="90"/>
+            </w:tcMar>
+            <w:vAlign w:val="center"/>
+          </w:tcPr>
+          <w:p>
+            <w:r>
+              <w:rPr>
+                <w:b w:val="false"/>
+                <w:bCs w:val="false"/>
+                <w:sz w:val="18"/>
+                <w:szCs w:val="18"/>
+              </w:rPr>
+              <w:t xml:space="preserve">2,900.00</w:t>
+            </w:r>
+          </w:p>
+        </w:tc>
+      </w:tr>
+      <w:tr>
+        <w:trPr>
+          <w:cantSplit/>
+        </w:trPr>
+        <w:tc>
+          <w:tcPr>
+            <w:tcW w:type="dxa" w:w="7360"/>
+            <w:shd w:fill="EEF3F8" w:val="clear"/>
+            <w:tcMar>
+              <w:top w:type="dxa" w:w="25"/>
+              <w:left w:type="dxa" w:w="90"/>
+              <w:bottom w:type="dxa" w:w="25"/>
+              <w:right w:type="dxa" w:w="90"/>
+            </w:tcMar>
+            <w:vAlign w:val="center"/>
+          </w:tcPr>
+          <w:p>
+            <w:r>
+              <w:rPr>
+                <w:b w:val="false"/>
+                <w:bCs w:val="false"/>
+                <w:sz w:val="18"/>
+                <w:szCs w:val="18"/>
+              </w:rPr>
+              <w:t xml:space="preserve">+ Settled by the gateway but marked FAILED by us</w:t>
+            </w:r>
+          </w:p>
+        </w:tc>
+        <w:tc>
+          <w:tcPr>
+            <w:tcW w:type="dxa" w:w="2000"/>
+            <w:shd w:fill="EEF3F8" w:val="clear"/>
+            <w:tcMar>
+              <w:top w:type="dxa" w:w="25"/>
+              <w:left w:type="dxa" w:w="90"/>
+              <w:bottom w:type="dxa" w:w="25"/>
+              <w:right w:type="dxa" w:w="90"/>
+            </w:tcMar>
+            <w:vAlign w:val="center"/>
+          </w:tcPr>
+          <w:p>
+            <w:r>
+              <w:rPr>
+                <w:b w:val="false"/>
+                <w:bCs w:val="false"/>
+                <w:sz w:val="18"/>
+                <w:szCs w:val="18"/>
+              </w:rPr>
+              <w:t xml:space="preserve">250.00</w:t>
+            </w:r>
+          </w:p>
+        </w:tc>
+      </w:tr>
+      <w:tr>
+        <w:trPr>
+          <w:cantSplit/>
+        </w:trPr>
+        <w:tc>
+          <w:tcPr>
+            <w:tcW w:type="dxa" w:w="7360"/>
+            <w:tcMar>
+              <w:top w:type="dxa" w:w="25"/>
+              <w:left w:type="dxa" w:w="90"/>
+              <w:bottom w:type="dxa" w:w="25"/>
+              <w:right w:type="dxa" w:w="90"/>
+            </w:tcMar>
+            <w:vAlign w:val="center"/>
+          </w:tcPr>
+          <w:p>
+            <w:r>
+              <w:rPr>
+                <w:b w:val="false"/>
+                <w:bCs w:val="false"/>
+                <w:sz w:val="18"/>
+                <w:szCs w:val="18"/>
+              </w:rPr>
+              <w:t xml:space="preserve">+ Duplicate gateway settlement rows</w:t>
+            </w:r>
+          </w:p>
+        </w:tc>
+        <w:tc>
+          <w:tcPr>
+            <w:tcW w:type="dxa" w:w="2000"/>
+            <w:tcMar>
+              <w:top w:type="dxa" w:w="25"/>
+              <w:left w:type="dxa" w:w="90"/>
+              <w:bottom w:type="dxa" w:w="25"/>
+              <w:right w:type="dxa" w:w="90"/>
+            </w:tcMar>
+            <w:vAlign w:val="center"/>
+          </w:tcPr>
+          <w:p>
+            <w:r>
+              <w:rPr>
+                <w:b w:val="false"/>
+                <w:bCs w:val="false"/>
+                <w:sz w:val="18"/>
+                <w:szCs w:val="18"/>
+              </w:rPr>
+              <w:t xml:space="preserve">1,550.00</w:t>
+            </w:r>
+          </w:p>
+        </w:tc>
+      </w:tr>
+      <w:tr>
+        <w:trPr>
+          <w:cantSplit/>
+        </w:trPr>
+        <w:tc>
+          <w:tcPr>
+            <w:tcW w:type="dxa" w:w="7360"/>
+            <w:shd w:fill="EEF3F8" w:val="clear"/>
+            <w:tcMar>
+              <w:top w:type="dxa" w:w="25"/>
+              <w:left w:type="dxa" w:w="90"/>
+              <w:bottom w:type="dxa" w:w="25"/>
+              <w:right w:type="dxa" w:w="90"/>
+            </w:tcMar>
+            <w:vAlign w:val="center"/>
+          </w:tcPr>
+          <w:p>
+            <w:r>
+              <w:rPr>
+                <w:b w:val="false"/>
+                <w:bCs w:val="false"/>
+                <w:sz w:val="18"/>
+                <w:szCs w:val="18"/>
+              </w:rPr>
+              <w:t xml:space="preserve">+/− Gross amount differences with the gateway (net)</w:t>
+            </w:r>
+          </w:p>
+        </w:tc>
+        <w:tc>
+          <w:tcPr>
+            <w:tcW w:type="dxa" w:w="2000"/>
+            <w:shd w:fill="EEF3F8" w:val="clear"/>
+            <w:tcMar>
+              <w:top w:type="dxa" w:w="25"/>
+              <w:left w:type="dxa" w:w="90"/>
+              <w:bottom w:type="dxa" w:w="25"/>
+              <w:right w:type="dxa" w:w="90"/>
+            </w:tcMar>
+            <w:vAlign w:val="center"/>
+          </w:tcPr>
+          <w:p>
+            <w:r>
+              <w:rPr>
+                <w:b w:val="false"/>
+                <w:bCs w:val="false"/>
+                <w:sz w:val="18"/>
+                <w:szCs w:val="18"/>
+              </w:rPr>
+              <w:t xml:space="preserve">900.00</w:t>
+            </w:r>
+          </w:p>
+        </w:tc>
+      </w:tr>
+      <w:tr>
+        <w:trPr>
+          <w:cantSplit/>
+        </w:trPr>
+        <w:tc>
+          <w:tcPr>
+            <w:tcW w:type="dxa" w:w="7360"/>
+            <w:tcMar>
+              <w:top w:type="dxa" w:w="25"/>
+              <w:left w:type="dxa" w:w="90"/>
+              <w:bottom w:type="dxa" w:w="25"/>
+              <w:right w:type="dxa" w:w="90"/>
+            </w:tcMar>
+            <w:vAlign w:val="center"/>
+          </w:tcPr>
+          <w:p>
+            <w:r>
+              <w:rPr>
+                <w:b w:val="false"/>
+                <w:bCs w:val="false"/>
+                <w:sz w:val="18"/>
+                <w:szCs w:val="18"/>
+              </w:rPr>
+              <w:t xml:space="preserve">+/− Rounding (exactly 1 cent on 3 rows)</w:t>
+            </w:r>
+          </w:p>
+        </w:tc>
+        <w:tc>
+          <w:tcPr>
+            <w:tcW w:type="dxa" w:w="2000"/>
+            <w:tcMar>
+              <w:top w:type="dxa" w:w="25"/>
+              <w:left w:type="dxa" w:w="90"/>
+              <w:bottom w:type="dxa" w:w="25"/>
+              <w:right w:type="dxa" w:w="90"/>
+            </w:tcMar>
+            <w:vAlign w:val="center"/>
+          </w:tcPr>
+          <w:p>
+            <w:r>
+              <w:rPr>
+                <w:b w:val="false"/>
+                <w:bCs w:val="false"/>
+                <w:sz w:val="18"/>
+                <w:szCs w:val="18"/>
+              </w:rPr>
+              <w:t xml:space="preserve">(0.03)</w:t>
+            </w:r>
+          </w:p>
+        </w:tc>
+      </w:tr>
+      <w:tr>
+        <w:trPr>
+          <w:cantSplit/>
+        </w:trPr>
+        <w:tc>
+          <w:tcPr>
+            <w:tcW w:type="dxa" w:w="7360"/>
+            <w:shd w:fill="EEF3F8" w:val="clear"/>
+            <w:tcMar>
+              <w:top w:type="dxa" w:w="25"/>
+              <w:left w:type="dxa" w:w="90"/>
+              <w:bottom w:type="dxa" w:w="25"/>
+              <w:right w:type="dxa" w:w="90"/>
+            </w:tcMar>
+            <w:vAlign w:val="center"/>
+          </w:tcPr>
+          <w:p>
+            <w:r>
+              <w:rPr>
+                <w:b/>
+                <w:bCs/>
+                <w:sz w:val="18"/>
+                <w:szCs w:val="18"/>
+              </w:rPr>
+              <w:t xml:space="preserve">= Gateway SETTLED total</w:t>
+            </w:r>
+          </w:p>
+        </w:tc>
+        <w:tc>
+          <w:tcPr>
+            <w:tcW w:type="dxa" w:w="2000"/>
+            <w:shd w:fill="EEF3F8" w:val="clear"/>
+            <w:tcMar>
+              <w:top w:type="dxa" w:w="25"/>
+              <w:left w:type="dxa" w:w="90"/>
+              <w:bottom w:type="dxa" w:w="25"/>
+              <w:right w:type="dxa" w:w="90"/>
+            </w:tcMar>
+            <w:vAlign w:val="center"/>
+          </w:tcPr>
+          <w:p>
+            <w:r>
+              <w:rPr>
+                <w:b/>
+                <w:bCs/>
+                <w:sz w:val="18"/>
+                <w:szCs w:val="18"/>
+              </w:rPr>
+              <w:t xml:space="preserve">217,979.97</w:t>
+            </w:r>
+          </w:p>
+        </w:tc>
+      </w:tr>
+      <w:tr>
+        <w:trPr>
+          <w:cantSplit/>
+        </w:trPr>
+        <w:tc>
+          <w:tcPr>
+            <w:tcW w:type="dxa" w:w="7360"/>
+            <w:tcMar>
+              <w:top w:type="dxa" w:w="25"/>
+              <w:left w:type="dxa" w:w="90"/>
+              <w:bottom w:type="dxa" w:w="25"/>
+              <w:right w:type="dxa" w:w="90"/>
+            </w:tcMar>
+            <w:vAlign w:val="center"/>
+          </w:tcPr>
+          <w:p>
+            <w:r>
+              <w:rPr>
+                <w:b/>
+                <w:bCs/>
+                <w:sz w:val="18"/>
+                <w:szCs w:val="18"/>
+              </w:rPr>
+              <w:t xml:space="preserve">Residual (unexplained)</w:t>
+            </w:r>
+          </w:p>
+        </w:tc>
+        <w:tc>
+          <w:tcPr>
+            <w:tcW w:type="dxa" w:w="2000"/>
+            <w:tcMar>
+              <w:top w:type="dxa" w:w="25"/>
+              <w:left w:type="dxa" w:w="90"/>
+              <w:bottom w:type="dxa" w:w="25"/>
+              <w:right w:type="dxa" w:w="90"/>
+            </w:tcMar>
+            <w:vAlign w:val="center"/>
+          </w:tcPr>
+          <w:p>
+            <w:r>
+              <w:rPr>
+                <w:b/>
+                <w:bCs/>
+                <w:sz w:val="18"/>
+                <w:szCs w:val="18"/>
+              </w:rPr>
+              <w:t xml:space="preserve">0.00</w:t>
+            </w:r>
+          </w:p>
+        </w:tc>
+      </w:tr>
+    </w:tbl>
+    <w:p>
+      <w:pPr>
+        <w:spacing w:after="60" w:before="140"/>
+      </w:pPr>
+      <w:r>
+        <w:rPr>
+          <w:b/>
+          <w:bCs/>
+          <w:color w:val="0E7C7B"/>
+          <w:sz w:val="22"/>
+          <w:szCs w:val="22"/>
+        </w:rPr>
+        <w:t xml:space="preserve">Priority actions</w:t>
+      </w:r>
+    </w:p>
+    <w:tbl>
+      <w:tblPr>
+        <w:tblW w:type="dxa" w:w="9360"/>
+        <w:tblBorders>
+          <w:top w:val="single" w:color="auto" w:sz="4"/>
+          <w:left w:val="single" w:color="auto" w:sz="4"/>
+          <w:bottom w:val="single" w:color="auto" w:sz="4"/>
+          <w:right w:val="single" w:color="auto" w:sz="4"/>
+          <w:insideH w:val="single" w:color="auto" w:sz="4"/>
+          <w:insideV w:val="single" w:color="auto" w:sz="4"/>
+        </w:tblBorders>
+      </w:tblPr>
+      <w:tblGrid>
+        <w:gridCol w:w="800"/>
+        <w:gridCol w:w="5960"/>
+        <w:gridCol w:w="1100"/>
+        <w:gridCol w:w="1500"/>
+      </w:tblGrid>
+      <w:tr>
+        <w:trPr>
+          <w:tblHeader/>
+        </w:trPr>
+        <w:tc>
+          <w:tcPr>
+            <w:tcW w:type="dxa" w:w="800"/>
+            <w:shd w:fill="1F3864" w:val="clear"/>
+            <w:tcMar>
+              <w:top w:type="dxa" w:w="25"/>
+              <w:left w:type="dxa" w:w="90"/>
+              <w:bottom w:type="dxa" w:w="25"/>
+              <w:right w:type="dxa" w:w="90"/>
+            </w:tcMar>
+            <w:vAlign w:val="center"/>
+          </w:tcPr>
+          <w:p>
+            <w:r>
+              <w:rPr>
+                <w:b/>
+                <w:bCs/>
+                <w:color w:val="FFFFFF"/>
+                <w:sz w:val="18"/>
+                <w:szCs w:val="18"/>
+              </w:rPr>
+              <w:t xml:space="preserve">When</w:t>
+            </w:r>
+          </w:p>
+        </w:tc>
+        <w:tc>
+          <w:tcPr>
+            <w:tcW w:type="dxa" w:w="5960"/>
+            <w:shd w:fill="1F3864" w:val="clear"/>
+            <w:tcMar>
+              <w:top w:type="dxa" w:w="25"/>
+              <w:left w:type="dxa" w:w="90"/>
+              <w:bottom w:type="dxa" w:w="25"/>
+              <w:right w:type="dxa" w:w="90"/>
+            </w:tcMar>
+            <w:vAlign w:val="center"/>
+          </w:tcPr>
+          <w:p>
+            <w:r>
+              <w:rPr>
+                <w:b/>
+                <w:bCs/>
+                <w:color w:val="FFFFFF"/>
+                <w:sz w:val="18"/>
+                <w:szCs w:val="18"/>
+              </w:rPr>
+              <w:t xml:space="preserve">Action</w:t>
+            </w:r>
+          </w:p>
+        </w:tc>
+        <w:tc>
+          <w:tcPr>
+            <w:tcW w:type="dxa" w:w="1100"/>
+            <w:shd w:fill="1F3864" w:val="clear"/>
+            <w:tcMar>
+              <w:top w:type="dxa" w:w="25"/>
+              <w:left w:type="dxa" w:w="90"/>
+              <w:bottom w:type="dxa" w:w="25"/>
+              <w:right w:type="dxa" w:w="90"/>
+            </w:tcMar>
+            <w:vAlign w:val="center"/>
+          </w:tcPr>
+          <w:p>
+            <w:r>
+              <w:rPr>
+                <w:b/>
+                <w:bCs/>
+                <w:color w:val="FFFFFF"/>
+                <w:sz w:val="18"/>
+                <w:szCs w:val="18"/>
+              </w:rPr>
+              <w:t xml:space="preserve">Owner</w:t>
+            </w:r>
+          </w:p>
+        </w:tc>
+        <w:tc>
+          <w:tcPr>
+            <w:tcW w:type="dxa" w:w="1500"/>
+            <w:shd w:fill="1F3864" w:val="clear"/>
+            <w:tcMar>
+              <w:top w:type="dxa" w:w="25"/>
+              <w:left w:type="dxa" w:w="90"/>
+              <w:bottom w:type="dxa" w:w="25"/>
+              <w:right w:type="dxa" w:w="90"/>
+            </w:tcMar>
+            <w:vAlign w:val="center"/>
+          </w:tcPr>
+          <w:p>
+            <w:r>
+              <w:rPr>
+                <w:b/>
+                <w:bCs/>
+                <w:color w:val="FFFFFF"/>
+                <w:sz w:val="18"/>
+                <w:szCs w:val="18"/>
+              </w:rPr>
+              <w:t xml:space="preserve">NAD</w:t>
+            </w:r>
+          </w:p>
+        </w:tc>
+      </w:tr>
+      <w:tr>
+        <w:trPr>
+          <w:cantSplit/>
+        </w:trPr>
+        <w:tc>
+          <w:tcPr>
+            <w:tcW w:type="dxa" w:w="800"/>
+            <w:tcMar>
+              <w:top w:type="dxa" w:w="25"/>
+              <w:left w:type="dxa" w:w="90"/>
+              <w:bottom w:type="dxa" w:w="25"/>
+              <w:right w:type="dxa" w:w="90"/>
+            </w:tcMar>
+            <w:vAlign w:val="center"/>
+          </w:tcPr>
+          <w:p>
+            <w:r>
+              <w:rPr>
+                <w:b w:val="false"/>
+                <w:bCs w:val="false"/>
+                <w:sz w:val="18"/>
+                <w:szCs w:val="18"/>
+              </w:rPr>
+              <w:t xml:space="preserve">Today</w:t>
+            </w:r>
+          </w:p>
+        </w:tc>
+        <w:tc>
+          <w:tcPr>
+            <w:tcW w:type="dxa" w:w="5960"/>
+            <w:tcMar>
+              <w:top w:type="dxa" w:w="25"/>
+              <w:left w:type="dxa" w:w="90"/>
+              <w:bottom w:type="dxa" w:w="25"/>
+              <w:right w:type="dxa" w:w="90"/>
+            </w:tcMar>
+            <w:vAlign w:val="center"/>
+          </w:tcPr>
+          <w:p>
+            <w:r>
+              <w:rPr>
+                <w:b w:val="false"/>
+                <w:bCs w:val="false"/>
+                <w:sz w:val="18"/>
+                <w:szCs w:val="18"/>
+              </w:rPr>
+              <w:t xml:space="preserve">Re-credit 2 players: marked FAILED by us, settled by the gateway</w:t>
+            </w:r>
+          </w:p>
+        </w:tc>
+        <w:tc>
+          <w:tcPr>
+            <w:tcW w:type="dxa" w:w="1100"/>
+            <w:tcMar>
+              <w:top w:type="dxa" w:w="25"/>
+              <w:left w:type="dxa" w:w="90"/>
+              <w:bottom w:type="dxa" w:w="25"/>
+              <w:right w:type="dxa" w:w="90"/>
+            </w:tcMar>
+            <w:vAlign w:val="center"/>
+          </w:tcPr>
+          <w:p>
+            <w:r>
+              <w:rPr>
+                <w:b w:val="false"/>
+                <w:bCs w:val="false"/>
+                <w:sz w:val="18"/>
+                <w:szCs w:val="18"/>
+              </w:rPr>
+              <w:t xml:space="preserve">Payments</w:t>
+            </w:r>
+          </w:p>
+        </w:tc>
+        <w:tc>
+          <w:tcPr>
+            <w:tcW w:type="dxa" w:w="1500"/>
+            <w:tcMar>
+              <w:top w:type="dxa" w:w="25"/>
+              <w:left w:type="dxa" w:w="90"/>
+              <w:bottom w:type="dxa" w:w="25"/>
+              <w:right w:type="dxa" w:w="90"/>
+            </w:tcMar>
+            <w:vAlign w:val="center"/>
+          </w:tcPr>
+          <w:p>
+            <w:r>
+              <w:rPr>
+                <w:b w:val="false"/>
+                <w:bCs w:val="false"/>
+                <w:sz w:val="18"/>
+                <w:szCs w:val="18"/>
+              </w:rPr>
+              <w:t xml:space="preserve">250.00</w:t>
+            </w:r>
+          </w:p>
+        </w:tc>
+      </w:tr>
+      <w:tr>
+        <w:trPr>
+          <w:cantSplit/>
+        </w:trPr>
+        <w:tc>
+          <w:tcPr>
+            <w:tcW w:type="dxa" w:w="800"/>
+            <w:shd w:fill="EEF3F8" w:val="clear"/>
+            <w:tcMar>
+              <w:top w:type="dxa" w:w="25"/>
+              <w:left w:type="dxa" w:w="90"/>
+              <w:bottom w:type="dxa" w:w="25"/>
+              <w:right w:type="dxa" w:w="90"/>
+            </w:tcMar>
+            <w:vAlign w:val="center"/>
+          </w:tcPr>
+          <w:p>
+            <w:r>
+              <w:rPr>
+                <w:b w:val="false"/>
+                <w:bCs w:val="false"/>
+                <w:sz w:val="18"/>
+                <w:szCs w:val="18"/>
+              </w:rPr>
+              <w:t xml:space="preserve">Today</w:t>
+            </w:r>
+          </w:p>
+        </w:tc>
+        <w:tc>
+          <w:tcPr>
+            <w:tcW w:type="dxa" w:w="5960"/>
+            <w:shd w:fill="EEF3F8" w:val="clear"/>
+            <w:tcMar>
+              <w:top w:type="dxa" w:w="25"/>
+              <w:left w:type="dxa" w:w="90"/>
+              <w:bottom w:type="dxa" w:w="25"/>
+              <w:right w:type="dxa" w:w="90"/>
+            </w:tcMar>
+            <w:vAlign w:val="center"/>
+          </w:tcPr>
+          <w:p>
+            <w:r>
+              <w:rPr>
+                <w:b w:val="false"/>
+                <w:bCs w:val="false"/>
+                <w:sz w:val="18"/>
+                <w:szCs w:val="18"/>
+              </w:rPr>
+              <w:t xml:space="preserve">Get gateway detail for 4 unrecognised settlements (GW-000301 to 304)</w:t>
+            </w:r>
+          </w:p>
+        </w:tc>
+        <w:tc>
+          <w:tcPr>
+            <w:tcW w:type="dxa" w:w="1100"/>
+            <w:shd w:fill="EEF3F8" w:val="clear"/>
+            <w:tcMar>
+              <w:top w:type="dxa" w:w="25"/>
+              <w:left w:type="dxa" w:w="90"/>
+              <w:bottom w:type="dxa" w:w="25"/>
+              <w:right w:type="dxa" w:w="90"/>
+            </w:tcMar>
+            <w:vAlign w:val="center"/>
+          </w:tcPr>
+          <w:p>
+            <w:r>
+              <w:rPr>
+                <w:b w:val="false"/>
+                <w:bCs w:val="false"/>
+                <w:sz w:val="18"/>
+                <w:szCs w:val="18"/>
+              </w:rPr>
+              <w:t xml:space="preserve">Payments</w:t>
+            </w:r>
+          </w:p>
+        </w:tc>
+        <w:tc>
+          <w:tcPr>
+            <w:tcW w:type="dxa" w:w="1500"/>
+            <w:shd w:fill="EEF3F8" w:val="clear"/>
+            <w:tcMar>
+              <w:top w:type="dxa" w:w="25"/>
+              <w:left w:type="dxa" w:w="90"/>
+              <w:bottom w:type="dxa" w:w="25"/>
+              <w:right w:type="dxa" w:w="90"/>
+            </w:tcMar>
+            <w:vAlign w:val="center"/>
+          </w:tcPr>
+          <w:p>
+            <w:r>
+              <w:rPr>
+                <w:b w:val="false"/>
+                <w:bCs w:val="false"/>
+                <w:sz w:val="18"/>
+                <w:szCs w:val="18"/>
+              </w:rPr>
+              <w:t xml:space="preserve">2,900.00</w:t>
+            </w:r>
+          </w:p>
+        </w:tc>
+      </w:tr>
+      <w:tr>
+        <w:trPr>
+          <w:cantSplit/>
+        </w:trPr>
+        <w:tc>
+          <w:tcPr>
+            <w:tcW w:type="dxa" w:w="800"/>
+            <w:tcMar>
+              <w:top w:type="dxa" w:w="25"/>
+              <w:left w:type="dxa" w:w="90"/>
+              <w:bottom w:type="dxa" w:w="25"/>
+              <w:right w:type="dxa" w:w="90"/>
+            </w:tcMar>
+            <w:vAlign w:val="center"/>
+          </w:tcPr>
+          <w:p>
+            <w:r>
+              <w:rPr>
+                <w:b w:val="false"/>
+                <w:bCs w:val="false"/>
+                <w:sz w:val="18"/>
+                <w:szCs w:val="18"/>
+              </w:rPr>
+              <w:t xml:space="preserve">Week</w:t>
+            </w:r>
+          </w:p>
+        </w:tc>
+        <w:tc>
+          <w:tcPr>
+            <w:tcW w:type="dxa" w:w="5960"/>
+            <w:tcMar>
+              <w:top w:type="dxa" w:w="25"/>
+              <w:left w:type="dxa" w:w="90"/>
+              <w:bottom w:type="dxa" w:w="25"/>
+              <w:right w:type="dxa" w:w="90"/>
+            </w:tcMar>
+            <w:vAlign w:val="center"/>
+          </w:tcPr>
+          <w:p>
+            <w:r>
+              <w:rPr>
+                <w:b w:val="false"/>
+                <w:bCs w:val="false"/>
+                <w:sz w:val="18"/>
+                <w:szCs w:val="18"/>
+              </w:rPr>
+              <w:t xml:space="preserve">Dispute 4 gross differences (3 players under-credited R950, 1 over R50)</w:t>
+            </w:r>
+          </w:p>
+        </w:tc>
+        <w:tc>
+          <w:tcPr>
+            <w:tcW w:type="dxa" w:w="1100"/>
+            <w:tcMar>
+              <w:top w:type="dxa" w:w="25"/>
+              <w:left w:type="dxa" w:w="90"/>
+              <w:bottom w:type="dxa" w:w="25"/>
+              <w:right w:type="dxa" w:w="90"/>
+            </w:tcMar>
+            <w:vAlign w:val="center"/>
+          </w:tcPr>
+          <w:p>
+            <w:r>
+              <w:rPr>
+                <w:b w:val="false"/>
+                <w:bCs w:val="false"/>
+                <w:sz w:val="18"/>
+                <w:szCs w:val="18"/>
+              </w:rPr>
+              <w:t xml:space="preserve">Finance</w:t>
+            </w:r>
+          </w:p>
+        </w:tc>
+        <w:tc>
+          <w:tcPr>
+            <w:tcW w:type="dxa" w:w="1500"/>
+            <w:tcMar>
+              <w:top w:type="dxa" w:w="25"/>
+              <w:left w:type="dxa" w:w="90"/>
+              <w:bottom w:type="dxa" w:w="25"/>
+              <w:right w:type="dxa" w:w="90"/>
+            </w:tcMar>
+            <w:vAlign w:val="center"/>
+          </w:tcPr>
+          <w:p>
+            <w:r>
+              <w:rPr>
+                <w:b w:val="false"/>
+                <w:bCs w:val="false"/>
+                <w:sz w:val="18"/>
+                <w:szCs w:val="18"/>
+              </w:rPr>
+              <w:t xml:space="preserve">900.00 net</w:t>
+            </w:r>
+          </w:p>
+        </w:tc>
+      </w:tr>
+      <w:tr>
+        <w:trPr>
+          <w:cantSplit/>
+        </w:trPr>
+        <w:tc>
+          <w:tcPr>
+            <w:tcW w:type="dxa" w:w="800"/>
+            <w:shd w:fill="EEF3F8" w:val="clear"/>
+            <w:tcMar>
+              <w:top w:type="dxa" w:w="25"/>
+              <w:left w:type="dxa" w:w="90"/>
+              <w:bottom w:type="dxa" w:w="25"/>
+              <w:right w:type="dxa" w:w="90"/>
+            </w:tcMar>
+            <w:vAlign w:val="center"/>
+          </w:tcPr>
+          <w:p>
+            <w:r>
+              <w:rPr>
+                <w:b w:val="false"/>
+                <w:bCs w:val="false"/>
+                <w:sz w:val="18"/>
+                <w:szCs w:val="18"/>
+              </w:rPr>
+              <w:t xml:space="preserve">Week</w:t>
+            </w:r>
+          </w:p>
+        </w:tc>
+        <w:tc>
+          <w:tcPr>
+            <w:tcW w:type="dxa" w:w="5960"/>
+            <w:shd w:fill="EEF3F8" w:val="clear"/>
+            <w:tcMar>
+              <w:top w:type="dxa" w:w="25"/>
+              <w:left w:type="dxa" w:w="90"/>
+              <w:bottom w:type="dxa" w:w="25"/>
+              <w:right w:type="dxa" w:w="90"/>
+            </w:tcMar>
+            <w:vAlign w:val="center"/>
+          </w:tcPr>
+          <w:p>
+            <w:r>
+              <w:rPr>
+                <w:b w:val="false"/>
+                <w:bCs w:val="false"/>
+                <w:sz w:val="18"/>
+                <w:szCs w:val="18"/>
+              </w:rPr>
+              <w:t xml:space="preserve">Claim fee overcharges (4) and short-paid nets (2)</w:t>
+            </w:r>
+          </w:p>
+        </w:tc>
+        <w:tc>
+          <w:tcPr>
+            <w:tcW w:type="dxa" w:w="1100"/>
+            <w:shd w:fill="EEF3F8" w:val="clear"/>
+            <w:tcMar>
+              <w:top w:type="dxa" w:w="25"/>
+              <w:left w:type="dxa" w:w="90"/>
+              <w:bottom w:type="dxa" w:w="25"/>
+              <w:right w:type="dxa" w:w="90"/>
+            </w:tcMar>
+            <w:vAlign w:val="center"/>
+          </w:tcPr>
+          <w:p>
+            <w:r>
+              <w:rPr>
+                <w:b w:val="false"/>
+                <w:bCs w:val="false"/>
+                <w:sz w:val="18"/>
+                <w:szCs w:val="18"/>
+              </w:rPr>
+              <w:t xml:space="preserve">Finance</w:t>
+            </w:r>
+          </w:p>
+        </w:tc>
+        <w:tc>
+          <w:tcPr>
+            <w:tcW w:type="dxa" w:w="1500"/>
+            <w:shd w:fill="EEF3F8" w:val="clear"/>
+            <w:tcMar>
+              <w:top w:type="dxa" w:w="25"/>
+              <w:left w:type="dxa" w:w="90"/>
+              <w:bottom w:type="dxa" w:w="25"/>
+              <w:right w:type="dxa" w:w="90"/>
+            </w:tcMar>
+            <w:vAlign w:val="center"/>
+          </w:tcPr>
+          <w:p>
+            <w:r>
+              <w:rPr>
+                <w:b w:val="false"/>
+                <w:bCs w:val="false"/>
+                <w:sz w:val="18"/>
+                <w:szCs w:val="18"/>
+              </w:rPr>
+              <w:t xml:space="preserve">7.75</w:t>
+            </w:r>
+          </w:p>
+        </w:tc>
+      </w:tr>
+      <w:tr>
+        <w:trPr>
+          <w:cantSplit/>
+        </w:trPr>
+        <w:tc>
+          <w:tcPr>
+            <w:tcW w:type="dxa" w:w="800"/>
+            <w:tcMar>
+              <w:top w:type="dxa" w:w="25"/>
+              <w:left w:type="dxa" w:w="90"/>
+              <w:bottom w:type="dxa" w:w="25"/>
+              <w:right w:type="dxa" w:w="90"/>
+            </w:tcMar>
+            <w:vAlign w:val="center"/>
+          </w:tcPr>
+          <w:p>
+            <w:r>
+              <w:rPr>
+                <w:b w:val="false"/>
+                <w:bCs w:val="false"/>
+                <w:sz w:val="18"/>
+                <w:szCs w:val="18"/>
+              </w:rPr>
+              <w:t xml:space="preserve">Week</w:t>
+            </w:r>
+          </w:p>
+        </w:tc>
+        <w:tc>
+          <w:tcPr>
+            <w:tcW w:type="dxa" w:w="5960"/>
+            <w:tcMar>
+              <w:top w:type="dxa" w:w="25"/>
+              <w:left w:type="dxa" w:w="90"/>
+              <w:bottom w:type="dxa" w:w="25"/>
+              <w:right w:type="dxa" w:w="90"/>
+            </w:tcMar>
+            <w:vAlign w:val="center"/>
+          </w:tcPr>
+          <w:p>
+            <w:r>
+              <w:rPr>
+                <w:b w:val="false"/>
+                <w:bCs w:val="false"/>
+                <w:sz w:val="18"/>
+                <w:szCs w:val="18"/>
+              </w:rPr>
+              <w:t xml:space="preserve">Did 2 duplicate settlements pay twice? Audit 3 duplicate deposits</w:t>
+            </w:r>
+          </w:p>
+        </w:tc>
+        <w:tc>
+          <w:tcPr>
+            <w:tcW w:type="dxa" w:w="1100"/>
+            <w:tcMar>
+              <w:top w:type="dxa" w:w="25"/>
+              <w:left w:type="dxa" w:w="90"/>
+              <w:bottom w:type="dxa" w:w="25"/>
+              <w:right w:type="dxa" w:w="90"/>
+            </w:tcMar>
+            <w:vAlign w:val="center"/>
+          </w:tcPr>
+          <w:p>
+            <w:r>
+              <w:rPr>
+                <w:b w:val="false"/>
+                <w:bCs w:val="false"/>
+                <w:sz w:val="18"/>
+                <w:szCs w:val="18"/>
+              </w:rPr>
+              <w:t xml:space="preserve">Payments</w:t>
+            </w:r>
+          </w:p>
+        </w:tc>
+        <w:tc>
+          <w:tcPr>
+            <w:tcW w:type="dxa" w:w="1500"/>
+            <w:tcMar>
+              <w:top w:type="dxa" w:w="25"/>
+              <w:left w:type="dxa" w:w="90"/>
+              <w:bottom w:type="dxa" w:w="25"/>
+              <w:right w:type="dxa" w:w="90"/>
+            </w:tcMar>
+            <w:vAlign w:val="center"/>
+          </w:tcPr>
+          <w:p>
+            <w:r>
+              <w:rPr>
+                <w:b w:val="false"/>
+                <w:bCs w:val="false"/>
+                <w:sz w:val="18"/>
+                <w:szCs w:val="18"/>
+              </w:rPr>
+              <w:t xml:space="preserve">1,550 / 1,300</w:t>
+            </w:r>
+          </w:p>
+        </w:tc>
+      </w:tr>
+      <w:tr>
+        <w:trPr>
+          <w:cantSplit/>
+        </w:trPr>
+        <w:tc>
+          <w:tcPr>
+            <w:tcW w:type="dxa" w:w="800"/>
+            <w:shd w:fill="EEF3F8" w:val="clear"/>
+            <w:tcMar>
+              <w:top w:type="dxa" w:w="25"/>
+              <w:left w:type="dxa" w:w="90"/>
+              <w:bottom w:type="dxa" w:w="25"/>
+              <w:right w:type="dxa" w:w="90"/>
+            </w:tcMar>
+            <w:vAlign w:val="center"/>
+          </w:tcPr>
+          <w:p>
+            <w:r>
+              <w:rPr>
+                <w:b w:val="false"/>
+                <w:bCs w:val="false"/>
+                <w:sz w:val="18"/>
+                <w:szCs w:val="18"/>
+              </w:rPr>
+              <w:t xml:space="preserve">Week</w:t>
+            </w:r>
+          </w:p>
+        </w:tc>
+        <w:tc>
+          <w:tcPr>
+            <w:tcW w:type="dxa" w:w="5960"/>
+            <w:shd w:fill="EEF3F8" w:val="clear"/>
+            <w:tcMar>
+              <w:top w:type="dxa" w:w="25"/>
+              <w:left w:type="dxa" w:w="90"/>
+              <w:bottom w:type="dxa" w:w="25"/>
+              <w:right w:type="dxa" w:w="90"/>
+            </w:tcMar>
+            <w:vAlign w:val="center"/>
+          </w:tcPr>
+          <w:p>
+            <w:r>
+              <w:rPr>
+                <w:b w:val="false"/>
+                <w:bCs w:val="false"/>
+                <w:sz w:val="18"/>
+                <w:szCs w:val="18"/>
+              </w:rPr>
+              <w:t xml:space="preserve">Confirm the wallet debit for each of 3 reversals</w:t>
+            </w:r>
+          </w:p>
+        </w:tc>
+        <w:tc>
+          <w:tcPr>
+            <w:tcW w:type="dxa" w:w="1100"/>
+            <w:shd w:fill="EEF3F8" w:val="clear"/>
+            <w:tcMar>
+              <w:top w:type="dxa" w:w="25"/>
+              <w:left w:type="dxa" w:w="90"/>
+              <w:bottom w:type="dxa" w:w="25"/>
+              <w:right w:type="dxa" w:w="90"/>
+            </w:tcMar>
+            <w:vAlign w:val="center"/>
+          </w:tcPr>
+          <w:p>
+            <w:r>
+              <w:rPr>
+                <w:b w:val="false"/>
+                <w:bCs w:val="false"/>
+                <w:sz w:val="18"/>
+                <w:szCs w:val="18"/>
+              </w:rPr>
+              <w:t xml:space="preserve">Finance</w:t>
+            </w:r>
+          </w:p>
+        </w:tc>
+        <w:tc>
+          <w:tcPr>
+            <w:tcW w:type="dxa" w:w="1500"/>
+            <w:shd w:fill="EEF3F8" w:val="clear"/>
+            <w:tcMar>
+              <w:top w:type="dxa" w:w="25"/>
+              <w:left w:type="dxa" w:w="90"/>
+              <w:bottom w:type="dxa" w:w="25"/>
+              <w:right w:type="dxa" w:w="90"/>
+            </w:tcMar>
+            <w:vAlign w:val="center"/>
+          </w:tcPr>
+          <w:p>
+            <w:r>
+              <w:rPr>
+                <w:b w:val="false"/>
+                <w:bCs w:val="false"/>
+                <w:sz w:val="18"/>
+                <w:szCs w:val="18"/>
+              </w:rPr>
+              <w:t xml:space="preserve">850.00</w:t>
+            </w:r>
+          </w:p>
+        </w:tc>
+      </w:tr>
+      <w:tr>
+        <w:trPr>
+          <w:cantSplit/>
+        </w:trPr>
+        <w:tc>
+          <w:tcPr>
+            <w:tcW w:type="dxa" w:w="800"/>
+            <w:tcMar>
+              <w:top w:type="dxa" w:w="25"/>
+              <w:left w:type="dxa" w:w="90"/>
+              <w:bottom w:type="dxa" w:w="25"/>
+              <w:right w:type="dxa" w:w="90"/>
+            </w:tcMar>
+            <w:vAlign w:val="center"/>
+          </w:tcPr>
+          <w:p>
+            <w:r>
+              <w:rPr>
+                <w:b w:val="false"/>
+                <w:bCs w:val="false"/>
+                <w:sz w:val="18"/>
+                <w:szCs w:val="18"/>
+              </w:rPr>
+              <w:t xml:space="preserve">3 days</w:t>
+            </w:r>
+          </w:p>
+        </w:tc>
+        <w:tc>
+          <w:tcPr>
+            <w:tcW w:type="dxa" w:w="5960"/>
+            <w:tcMar>
+              <w:top w:type="dxa" w:w="25"/>
+              <w:left w:type="dxa" w:w="90"/>
+              <w:bottom w:type="dxa" w:w="25"/>
+              <w:right w:type="dxa" w:w="90"/>
+            </w:tcMar>
+            <w:vAlign w:val="center"/>
+          </w:tcPr>
+          <w:p>
+            <w:r>
+              <w:rPr>
+                <w:b w:val="false"/>
+                <w:bCs w:val="false"/>
+                <w:sz w:val="18"/>
+                <w:szCs w:val="18"/>
+              </w:rPr>
+              <w:t xml:space="preserve">5 deposits with no settlement: re-check next file, then escalate</w:t>
+            </w:r>
+          </w:p>
+        </w:tc>
+        <w:tc>
+          <w:tcPr>
+            <w:tcW w:type="dxa" w:w="1100"/>
+            <w:tcMar>
+              <w:top w:type="dxa" w:w="25"/>
+              <w:left w:type="dxa" w:w="90"/>
+              <w:bottom w:type="dxa" w:w="25"/>
+              <w:right w:type="dxa" w:w="90"/>
+            </w:tcMar>
+            <w:vAlign w:val="center"/>
+          </w:tcPr>
+          <w:p>
+            <w:r>
+              <w:rPr>
+                <w:b w:val="false"/>
+                <w:bCs w:val="false"/>
+                <w:sz w:val="18"/>
+                <w:szCs w:val="18"/>
+              </w:rPr>
+              <w:t xml:space="preserve">Finance</w:t>
+            </w:r>
+          </w:p>
+        </w:tc>
+        <w:tc>
+          <w:tcPr>
+            <w:tcW w:type="dxa" w:w="1500"/>
+            <w:tcMar>
+              <w:top w:type="dxa" w:w="25"/>
+              <w:left w:type="dxa" w:w="90"/>
+              <w:bottom w:type="dxa" w:w="25"/>
+              <w:right w:type="dxa" w:w="90"/>
+            </w:tcMar>
+            <w:vAlign w:val="center"/>
+          </w:tcPr>
+          <w:p>
+            <w:r>
+              <w:rPr>
+                <w:b w:val="false"/>
+                <w:bCs w:val="false"/>
+                <w:sz w:val="18"/>
+                <w:szCs w:val="18"/>
+              </w:rPr>
+              <w:t xml:space="preserve">2,700.00</w:t>
+            </w:r>
+          </w:p>
+        </w:tc>
+      </w:tr>
+    </w:tbl>
+    <w:p>
+      <w:pPr>
+        <w:spacing w:after="60" w:before="140"/>
+      </w:pPr>
+      <w:r>
+        <w:rPr>
+          <w:b/>
+          <w:bCs/>
+          <w:color w:val="0E7C7B"/>
+          <w:sz w:val="22"/>
+          <w:szCs w:val="22"/>
+        </w:rPr>
+        <w:t xml:space="preserve">Material assumptions</w:t>
+      </w:r>
+    </w:p>
+    <w:p>
+      <w:pPr>
+        <w:pStyle w:val="ListParagraph"/>
+        <w:numPr>
+          <w:ilvl w:val="0"/>
+          <w:numId w:val="2"/>
+        </w:numPr>
+        <w:spacing w:after="40"/>
+      </w:pPr>
+      <w:r>
+        <w:rPr>
+          <w:sz w:val="18"/>
+          <w:szCs w:val="18"/>
+        </w:rPr>
+        <w:t xml:space="preserve">Timing lines are provisional: this week's files can't prove them. R3,650 (3 deposits created 23:54–23:55 on 7 Sep) should appear in the 8–14 Sep gateway file; R2,600 (3 settlements at 00:04–00:06 on 1 Sep, GW-000331 to 333) should match the 25–31 Aug internal file. Finance keeps all six open until matched; any unmatched item becomes a break.</w:t>
+      </w:r>
+    </w:p>
+    <w:p>
+      <w:pPr>
+        <w:pStyle w:val="ListParagraph"/>
+        <w:numPr>
+          <w:ilvl w:val="0"/>
+          <w:numId w:val="2"/>
+        </w:numPr>
+        <w:spacing w:after="40"/>
+      </w:pPr>
+      <w:r>
+        <w:rPr>
+          <w:sz w:val="18"/>
+          <w:szCs w:val="18"/>
+        </w:rPr>
+        <w:t xml:space="preserve">Fee = 2% of gross + R1.00, to the cent; any fee or net difference of 1 cent or more is flagged. Gross differences of exactly 1 cent (3 rows, R0.03) are treated as rounding, a materiality choice for Finance to confirm. Fee and net errors don't move gross, so they are actions, not bridge lines.</w:t>
+      </w:r>
+    </w:p>
+    <w:p>
+      <w:pPr>
+        <w:pStyle w:val="Heading2"/>
+        <w:keepNext/>
+        <w:pageBreakBefore/>
+      </w:pPr>
+      <w:r>
+        <w:t xml:space="preserve">Supporting detail</w:t>
+      </w:r>
+    </w:p>
+    <w:p>
+      <w:pPr>
         <w:spacing w:after="160"/>
       </w:pPr>
       <w:r>
@@ -216,10 +1918,10 @@
     </w:p>
     <w:p>
       <w:pPr>
-        <w:pStyle w:val="Heading2"/>
+        <w:pStyle w:val="Heading3"/>
         <w:keepNext/>
         <w:keepLines/>
-        <w:spacing w:after="150" w:before="300"/>
+        <w:spacing w:after="100" w:before="200"/>
       </w:pPr>
       <w:r>
         <w:t xml:space="preserve">Approach</w:t>
@@ -238,78 +1940,7 @@
         <w:spacing w:after="160"/>
       </w:pPr>
       <w:r>
-        <w:t xml:space="preserve">Every internal SUCCESS deposit and every gateway settlement row is either a clean match or one of twelve exception types: a genuine break, a timing difference, a business event (reversal), or not a problem at all. The rules live in exercise1-reconciliation/sql/03_reconciliation.sql and are ported into a dbt model (fct_recon_exceptions) so they run on a schedule with tests attached. The checks follow the brief's contract: fee = 2% of gross + R1.00, and net = gross − fee.</w:t>
-      </w:r>
-    </w:p>
-    <w:p>
-      <w:pPr>
-        <w:pStyle w:val="Heading2"/>
-        <w:keepNext/>
-        <w:keepLines/>
-        <w:spacing w:after="150" w:before="300"/>
-      </w:pPr>
-      <w:r>
-        <w:t xml:space="preserve">Result</w:t>
-      </w:r>
-    </w:p>
-    <w:p>
-      <w:pPr>
-        <w:spacing w:after="160"/>
-      </w:pPr>
-      <w:r>
-        <w:t xml:space="preserve">274 of the 306 settlement rows (90%) match exactly on reference, amount, fee and net. Three more differ by under a cent. The other 29 are categorised below, and the bridge from our total to the gateway's reconciles with R0.00 unexplained.</w:t>
-      </w:r>
-    </w:p>
-    <w:p>
-      <w:pPr>
-        <w:pStyle w:val="ListParagraph"/>
-        <w:numPr>
-          <w:ilvl w:val="0"/>
-          <w:numId w:val="2"/>
-        </w:numPr>
-        <w:spacing w:after="80"/>
-      </w:pPr>
-      <w:r>
-        <w:t xml:space="preserve">Act this week: R3,150. R250 is owed to two players whose deposits we marked FAILED although the gateway settled them. R2,900 is settlements for four references we have no record of.</w:t>
-      </w:r>
-    </w:p>
-    <w:p>
-      <w:pPr>
-        <w:pStyle w:val="ListParagraph"/>
-        <w:numPr>
-          <w:ilvl w:val="0"/>
-          <w:numId w:val="2"/>
-        </w:numPr>
-        <w:spacing w:after="80"/>
-      </w:pPr>
-      <w:r>
-        <w:t xml:space="preserve">The gateway owes us R7.75: R3.75 of fees above the contract rate, and R4.00 short-paid on two settlements where net ≠ gross − fee.</w:t>
-      </w:r>
-    </w:p>
-    <w:p>
-      <w:pPr>
-        <w:pStyle w:val="ListParagraph"/>
-        <w:numPr>
-          <w:ilvl w:val="0"/>
-          <w:numId w:val="2"/>
-        </w:numPr>
-        <w:spacing w:after="80"/>
-      </w:pPr>
-      <w:r>
-        <w:t xml:space="preserve">R950 of gross-amount differences suggest three players were under-credited (a fourth, R50, runs the other way). All four go to the gateway as disputes.</w:t>
-      </w:r>
-    </w:p>
-    <w:p>
-      <w:pPr>
-        <w:pStyle w:val="ListParagraph"/>
-        <w:numPr>
-          <w:ilvl w:val="0"/>
-          <w:numId w:val="2"/>
-        </w:numPr>
-        <w:spacing w:after="80"/>
-      </w:pPr>
-      <w:r>
-        <w:t xml:space="preserve">Timing, not problems: R3,650 of deposits from the week's last minutes settle next week, and R2,600 settled in the week's first six minutes, almost certainly last week's deposits.</w:t>
+        <w:t xml:space="preserve">Every internal SUCCESS deposit and every gateway settlement row is either a clean match or one of twelve exception types: a genuine break, a timing difference, a business event (reversal), or not a problem at all. The rules live in exercise1-reconciliation/sql/03_reconciliation.sql and are ported into a dbt model (fct_recon_exceptions) so they run on a schedule with tests attached. The checks follow the brief's contract exactly: fee = 2% of gross + R1.00 to the cent, and net = gross − fee. Boundary tests at 1, 2 and 3 cents (sql/06_threshold_fixtures.py) confirm that every fee or net difference of a cent or more is flagged.</w:t>
       </w:r>
     </w:p>
     <w:p>
@@ -320,7 +1951,7 @@
       <w:r>
         <w:drawing>
           <wp:inline distT="0" distB="0" distL="0" distR="0">
-            <wp:extent cx="4953000" cy="2066925"/>
+            <wp:extent cx="4572000" cy="1905000"/>
             <wp:effectExtent t="0" r="0" b="0" l="0"/>
             <wp:docPr id="1" name="" descr="" title=""/>
             <wp:cNvGraphicFramePr>
@@ -345,7 +1976,7 @@
                   <pic:spPr bwMode="auto">
                     <a:xfrm>
                       <a:off x="0" y="0"/>
-                      <a:ext cx="4953000" cy="2066925"/>
+                      <a:ext cx="4572000" cy="1905000"/>
                     </a:xfrm>
                     <a:prstGeom prst="rect">
                       <a:avLst/>
@@ -376,10 +2007,10 @@
     </w:p>
     <w:p>
       <w:pPr>
-        <w:pStyle w:val="Heading2"/>
+        <w:pStyle w:val="Heading3"/>
         <w:keepNext/>
         <w:keepLines/>
-        <w:spacing w:after="150" w:before="300"/>
+        <w:spacing w:after="100" w:before="200"/>
       </w:pPr>
       <w:r>
         <w:t xml:space="preserve">Exceptions by category</w:t>
@@ -1544,7 +3175,7 @@
                 <w:sz w:val="19"/>
                 <w:szCs w:val="19"/>
               </w:rPr>
-              <w:t xml:space="preserve">Created in the last 15 min (settles next week)</w:t>
+              <w:t xml:space="preserve">Created in the last 15 min (expected next week)</w:t>
             </w:r>
           </w:p>
         </w:tc>
@@ -1571,7 +3202,7 @@
                 <w:sz w:val="19"/>
                 <w:szCs w:val="19"/>
               </w:rPr>
-              <w:t xml:space="preserve">Timing — not a problem</w:t>
+              <w:t xml:space="preserve">Timing — provisional</w:t>
             </w:r>
           </w:p>
         </w:tc>
@@ -1656,7 +3287,7 @@
                 <w:sz w:val="19"/>
                 <w:szCs w:val="19"/>
               </w:rPr>
-              <w:t xml:space="preserve">Settled in the first 15 min (last week's deposits)</w:t>
+              <w:t xml:space="preserve">Settled in the first 15 min (likely last week's)</w:t>
             </w:r>
           </w:p>
         </w:tc>
@@ -1682,7 +3313,7 @@
                 <w:sz w:val="19"/>
                 <w:szCs w:val="19"/>
               </w:rPr>
-              <w:t xml:space="preserve">Timing — not a problem</w:t>
+              <w:t xml:space="preserve">Timing — provisional</w:t>
             </w:r>
           </w:p>
         </w:tc>
@@ -1766,7 +3397,7 @@
                 <w:sz w:val="19"/>
                 <w:szCs w:val="19"/>
               </w:rPr>
-              <w:t xml:space="preserve">Rounding ≤ 1 cent</w:t>
+              <w:t xml:space="preserve">Rounding, exactly 1 cent</w:t>
             </w:r>
           </w:p>
         </w:tc>
@@ -1865,870 +3496,15 @@
           <w:sz w:val="18"/>
           <w:szCs w:val="18"/>
         </w:rPr>
-        <w:t xml:space="preserve">* The deposit and settlement amounts match on these rows, so the row-level impact is 0. The real cost is the duplicate itself: a double-credit risk, or a disputed double settlement. The bridge accounts for each separately.</w:t>
-      </w:r>
-    </w:p>
-    <w:p>
-      <w:pPr>
-        <w:pStyle w:val="Heading2"/>
+        <w:t xml:space="preserve">* The deposit and settlement amounts match on these rows, so the row-level impact is 0. The real cost is the duplicate itself: a double-credit risk, or a disputed double settlement. The bridge accounts for each separately. A dbt test (assert_recon_bridge_reconciles) fails the build if the bridge residual is ever not exactly zero.</w:t>
+      </w:r>
+    </w:p>
+    <w:p>
+      <w:pPr>
+        <w:pStyle w:val="Heading3"/>
         <w:keepNext/>
         <w:keepLines/>
-        <w:spacing w:after="150" w:before="300"/>
-      </w:pPr>
-      <w:r>
-        <w:t xml:space="preserve">The bridge: internal total → gateway total</w:t>
-      </w:r>
-    </w:p>
-    <w:tbl>
-      <w:tblPr>
-        <w:tblW w:type="dxa" w:w="9360"/>
-        <w:tblBorders>
-          <w:top w:val="single" w:color="auto" w:sz="4"/>
-          <w:left w:val="single" w:color="auto" w:sz="4"/>
-          <w:bottom w:val="single" w:color="auto" w:sz="4"/>
-          <w:right w:val="single" w:color="auto" w:sz="4"/>
-          <w:insideH w:val="single" w:color="auto" w:sz="4"/>
-          <w:insideV w:val="single" w:color="auto" w:sz="4"/>
-        </w:tblBorders>
-      </w:tblPr>
-      <w:tblGrid>
-        <w:gridCol w:w="7360"/>
-        <w:gridCol w:w="2000"/>
-      </w:tblGrid>
-      <w:tr>
-        <w:trPr>
-          <w:tblHeader/>
-        </w:trPr>
-        <w:tc>
-          <w:tcPr>
-            <w:tcW w:type="dxa" w:w="7360"/>
-            <w:shd w:fill="1F3864" w:val="clear"/>
-            <w:tcMar>
-              <w:top w:type="dxa" w:w="60"/>
-              <w:left w:type="dxa" w:w="100"/>
-              <w:bottom w:type="dxa" w:w="60"/>
-              <w:right w:type="dxa" w:w="100"/>
-            </w:tcMar>
-            <w:vAlign w:val="center"/>
-          </w:tcPr>
-          <w:p>
-            <w:pPr>
-              <w:jc w:val="left"/>
-            </w:pPr>
-            <w:r>
-              <w:rPr>
-                <w:b/>
-                <w:bCs/>
-                <w:color w:val="FFFFFF"/>
-                <w:sz w:val="19"/>
-                <w:szCs w:val="19"/>
-              </w:rPr>
-              <w:t xml:space="preserve">Line</w:t>
-            </w:r>
-          </w:p>
-        </w:tc>
-        <w:tc>
-          <w:tcPr>
-            <w:tcW w:type="dxa" w:w="2000"/>
-            <w:shd w:fill="1F3864" w:val="clear"/>
-            <w:tcMar>
-              <w:top w:type="dxa" w:w="60"/>
-              <w:left w:type="dxa" w:w="100"/>
-              <w:bottom w:type="dxa" w:w="60"/>
-              <w:right w:type="dxa" w:w="100"/>
-            </w:tcMar>
-            <w:vAlign w:val="center"/>
-          </w:tcPr>
-          <w:p>
-            <w:pPr>
-              <w:jc w:val="left"/>
-            </w:pPr>
-            <w:r>
-              <w:rPr>
-                <w:b/>
-                <w:bCs/>
-                <w:color w:val="FFFFFF"/>
-                <w:sz w:val="19"/>
-                <w:szCs w:val="19"/>
-              </w:rPr>
-              <w:t xml:space="preserve">Amount (NAD)</w:t>
-            </w:r>
-          </w:p>
-        </w:tc>
-      </w:tr>
-      <w:tr>
-        <w:trPr>
-          <w:cantSplit/>
-        </w:trPr>
-        <w:tc>
-          <w:tcPr>
-            <w:tcW w:type="dxa" w:w="7360"/>
-            <w:tcMar>
-              <w:top w:type="dxa" w:w="60"/>
-              <w:left w:type="dxa" w:w="100"/>
-              <w:bottom w:type="dxa" w:w="60"/>
-              <w:right w:type="dxa" w:w="100"/>
-            </w:tcMar>
-            <w:vAlign w:val="center"/>
-          </w:tcPr>
-          <w:p>
-            <w:pPr>
-              <w:jc w:val="left"/>
-            </w:pPr>
-            <w:r>
-              <w:rPr>
-                <w:b w:val="false"/>
-                <w:bCs w:val="false"/>
-                <w:sz w:val="19"/>
-                <w:szCs w:val="19"/>
-              </w:rPr>
-              <w:t xml:space="preserve">Internal SUCCESS deposits, total</w:t>
-            </w:r>
-          </w:p>
-        </w:tc>
-        <w:tc>
-          <w:tcPr>
-            <w:tcW w:type="dxa" w:w="2000"/>
-            <w:tcMar>
-              <w:top w:type="dxa" w:w="60"/>
-              <w:left w:type="dxa" w:w="100"/>
-              <w:bottom w:type="dxa" w:w="60"/>
-              <w:right w:type="dxa" w:w="100"/>
-            </w:tcMar>
-            <w:vAlign w:val="center"/>
-          </w:tcPr>
-          <w:p>
-            <w:pPr>
-              <w:jc w:val="left"/>
-            </w:pPr>
-            <w:r>
-              <w:rPr>
-                <w:b w:val="false"/>
-                <w:bCs w:val="false"/>
-                <w:sz w:val="19"/>
-                <w:szCs w:val="19"/>
-              </w:rPr>
-              <w:t xml:space="preserve">218,280.00</w:t>
-            </w:r>
-          </w:p>
-        </w:tc>
-      </w:tr>
-      <w:tr>
-        <w:trPr>
-          <w:cantSplit/>
-        </w:trPr>
-        <w:tc>
-          <w:tcPr>
-            <w:tcW w:type="dxa" w:w="7360"/>
-            <w:shd w:fill="EEF3F8" w:val="clear"/>
-            <w:tcMar>
-              <w:top w:type="dxa" w:w="60"/>
-              <w:left w:type="dxa" w:w="100"/>
-              <w:bottom w:type="dxa" w:w="60"/>
-              <w:right w:type="dxa" w:w="100"/>
-            </w:tcMar>
-            <w:vAlign w:val="center"/>
-          </w:tcPr>
-          <w:p>
-            <w:pPr>
-              <w:jc w:val="left"/>
-            </w:pPr>
-            <w:r>
-              <w:rPr>
-                <w:b w:val="false"/>
-                <w:bCs w:val="false"/>
-                <w:sz w:val="19"/>
-                <w:szCs w:val="19"/>
-              </w:rPr>
-              <w:t xml:space="preserve">− Duplicate internal deposit rows (same settlement counted twice)</w:t>
-            </w:r>
-          </w:p>
-        </w:tc>
-        <w:tc>
-          <w:tcPr>
-            <w:tcW w:type="dxa" w:w="2000"/>
-            <w:shd w:fill="EEF3F8" w:val="clear"/>
-            <w:tcMar>
-              <w:top w:type="dxa" w:w="60"/>
-              <w:left w:type="dxa" w:w="100"/>
-              <w:bottom w:type="dxa" w:w="60"/>
-              <w:right w:type="dxa" w:w="100"/>
-            </w:tcMar>
-            <w:vAlign w:val="center"/>
-          </w:tcPr>
-          <w:p>
-            <w:pPr>
-              <w:jc w:val="left"/>
-            </w:pPr>
-            <w:r>
-              <w:rPr>
-                <w:b w:val="false"/>
-                <w:bCs w:val="false"/>
-                <w:sz w:val="19"/>
-                <w:szCs w:val="19"/>
-              </w:rPr>
-              <w:t xml:space="preserve">(1,300.00)</w:t>
-            </w:r>
-          </w:p>
-        </w:tc>
-      </w:tr>
-      <w:tr>
-        <w:trPr>
-          <w:cantSplit/>
-        </w:trPr>
-        <w:tc>
-          <w:tcPr>
-            <w:tcW w:type="dxa" w:w="7360"/>
-            <w:tcMar>
-              <w:top w:type="dxa" w:w="60"/>
-              <w:left w:type="dxa" w:w="100"/>
-              <w:bottom w:type="dxa" w:w="60"/>
-              <w:right w:type="dxa" w:w="100"/>
-            </w:tcMar>
-            <w:vAlign w:val="center"/>
-          </w:tcPr>
-          <w:p>
-            <w:pPr>
-              <w:jc w:val="left"/>
-            </w:pPr>
-            <w:r>
-              <w:rPr>
-                <w:b w:val="false"/>
-                <w:bCs w:val="false"/>
-                <w:sz w:val="19"/>
-                <w:szCs w:val="19"/>
-              </w:rPr>
-              <w:t xml:space="preserve">− Reversals / chargebacks (excluded from gateway's SETTLED total)</w:t>
-            </w:r>
-          </w:p>
-        </w:tc>
-        <w:tc>
-          <w:tcPr>
-            <w:tcW w:type="dxa" w:w="2000"/>
-            <w:tcMar>
-              <w:top w:type="dxa" w:w="60"/>
-              <w:left w:type="dxa" w:w="100"/>
-              <w:bottom w:type="dxa" w:w="60"/>
-              <w:right w:type="dxa" w:w="100"/>
-            </w:tcMar>
-            <w:vAlign w:val="center"/>
-          </w:tcPr>
-          <w:p>
-            <w:pPr>
-              <w:jc w:val="left"/>
-            </w:pPr>
-            <w:r>
-              <w:rPr>
-                <w:b w:val="false"/>
-                <w:bCs w:val="false"/>
-                <w:sz w:val="19"/>
-                <w:szCs w:val="19"/>
-              </w:rPr>
-              <w:t xml:space="preserve">(850.00)</w:t>
-            </w:r>
-          </w:p>
-        </w:tc>
-      </w:tr>
-      <w:tr>
-        <w:trPr>
-          <w:cantSplit/>
-        </w:trPr>
-        <w:tc>
-          <w:tcPr>
-            <w:tcW w:type="dxa" w:w="7360"/>
-            <w:shd w:fill="EEF3F8" w:val="clear"/>
-            <w:tcMar>
-              <w:top w:type="dxa" w:w="60"/>
-              <w:left w:type="dxa" w:w="100"/>
-              <w:bottom w:type="dxa" w:w="60"/>
-              <w:right w:type="dxa" w:w="100"/>
-            </w:tcMar>
-            <w:vAlign w:val="center"/>
-          </w:tcPr>
-          <w:p>
-            <w:pPr>
-              <w:jc w:val="left"/>
-            </w:pPr>
-            <w:r>
-              <w:rPr>
-                <w:b w:val="false"/>
-                <w:bCs w:val="false"/>
-                <w:sz w:val="19"/>
-                <w:szCs w:val="19"/>
-              </w:rPr>
-              <w:t xml:space="preserve">− Deposits not yet settled by the gateway</w:t>
-            </w:r>
-          </w:p>
-        </w:tc>
-        <w:tc>
-          <w:tcPr>
-            <w:tcW w:type="dxa" w:w="2000"/>
-            <w:shd w:fill="EEF3F8" w:val="clear"/>
-            <w:tcMar>
-              <w:top w:type="dxa" w:w="60"/>
-              <w:left w:type="dxa" w:w="100"/>
-              <w:bottom w:type="dxa" w:w="60"/>
-              <w:right w:type="dxa" w:w="100"/>
-            </w:tcMar>
-            <w:vAlign w:val="center"/>
-          </w:tcPr>
-          <w:p>
-            <w:pPr>
-              <w:jc w:val="left"/>
-            </w:pPr>
-            <w:r>
-              <w:rPr>
-                <w:b w:val="false"/>
-                <w:bCs w:val="false"/>
-                <w:sz w:val="19"/>
-                <w:szCs w:val="19"/>
-              </w:rPr>
-              <w:t xml:space="preserve">(2,700.00)</w:t>
-            </w:r>
-          </w:p>
-        </w:tc>
-      </w:tr>
-      <w:tr>
-        <w:trPr>
-          <w:cantSplit/>
-        </w:trPr>
-        <w:tc>
-          <w:tcPr>
-            <w:tcW w:type="dxa" w:w="7360"/>
-            <w:tcMar>
-              <w:top w:type="dxa" w:w="60"/>
-              <w:left w:type="dxa" w:w="100"/>
-              <w:bottom w:type="dxa" w:w="60"/>
-              <w:right w:type="dxa" w:w="100"/>
-            </w:tcMar>
-            <w:vAlign w:val="center"/>
-          </w:tcPr>
-          <w:p>
-            <w:pPr>
-              <w:jc w:val="left"/>
-            </w:pPr>
-            <w:r>
-              <w:rPr>
-                <w:b w:val="false"/>
-                <w:bCs w:val="false"/>
-                <w:sz w:val="19"/>
-                <w:szCs w:val="19"/>
-              </w:rPr>
-              <w:t xml:space="preserve">− Deposits created in the last 15 minutes of the period</w:t>
-            </w:r>
-          </w:p>
-        </w:tc>
-        <w:tc>
-          <w:tcPr>
-            <w:tcW w:type="dxa" w:w="2000"/>
-            <w:tcMar>
-              <w:top w:type="dxa" w:w="60"/>
-              <w:left w:type="dxa" w:w="100"/>
-              <w:bottom w:type="dxa" w:w="60"/>
-              <w:right w:type="dxa" w:w="100"/>
-            </w:tcMar>
-            <w:vAlign w:val="center"/>
-          </w:tcPr>
-          <w:p>
-            <w:pPr>
-              <w:jc w:val="left"/>
-            </w:pPr>
-            <w:r>
-              <w:rPr>
-                <w:b w:val="false"/>
-                <w:bCs w:val="false"/>
-                <w:sz w:val="19"/>
-                <w:szCs w:val="19"/>
-              </w:rPr>
-              <w:t xml:space="preserve">(3,650.00)</w:t>
-            </w:r>
-          </w:p>
-        </w:tc>
-      </w:tr>
-      <w:tr>
-        <w:trPr>
-          <w:cantSplit/>
-        </w:trPr>
-        <w:tc>
-          <w:tcPr>
-            <w:tcW w:type="dxa" w:w="7360"/>
-            <w:shd w:fill="EEF3F8" w:val="clear"/>
-            <w:tcMar>
-              <w:top w:type="dxa" w:w="60"/>
-              <w:left w:type="dxa" w:w="100"/>
-              <w:bottom w:type="dxa" w:w="60"/>
-              <w:right w:type="dxa" w:w="100"/>
-            </w:tcMar>
-            <w:vAlign w:val="center"/>
-          </w:tcPr>
-          <w:p>
-            <w:pPr>
-              <w:jc w:val="left"/>
-            </w:pPr>
-            <w:r>
-              <w:rPr>
-                <w:b w:val="false"/>
-                <w:bCs w:val="false"/>
-                <w:sz w:val="19"/>
-                <w:szCs w:val="19"/>
-              </w:rPr>
-              <w:t xml:space="preserve">+ Settled in the first 15 minutes (last week's deposits)</w:t>
-            </w:r>
-          </w:p>
-        </w:tc>
-        <w:tc>
-          <w:tcPr>
-            <w:tcW w:type="dxa" w:w="2000"/>
-            <w:shd w:fill="EEF3F8" w:val="clear"/>
-            <w:tcMar>
-              <w:top w:type="dxa" w:w="60"/>
-              <w:left w:type="dxa" w:w="100"/>
-              <w:bottom w:type="dxa" w:w="60"/>
-              <w:right w:type="dxa" w:w="100"/>
-            </w:tcMar>
-            <w:vAlign w:val="center"/>
-          </w:tcPr>
-          <w:p>
-            <w:pPr>
-              <w:jc w:val="left"/>
-            </w:pPr>
-            <w:r>
-              <w:rPr>
-                <w:b w:val="false"/>
-                <w:bCs w:val="false"/>
-                <w:sz w:val="19"/>
-                <w:szCs w:val="19"/>
-              </w:rPr>
-              <w:t xml:space="preserve">2,600.00</w:t>
-            </w:r>
-          </w:p>
-        </w:tc>
-      </w:tr>
-      <w:tr>
-        <w:trPr>
-          <w:cantSplit/>
-        </w:trPr>
-        <w:tc>
-          <w:tcPr>
-            <w:tcW w:type="dxa" w:w="7360"/>
-            <w:tcMar>
-              <w:top w:type="dxa" w:w="60"/>
-              <w:left w:type="dxa" w:w="100"/>
-              <w:bottom w:type="dxa" w:w="60"/>
-              <w:right w:type="dxa" w:w="100"/>
-            </w:tcMar>
-            <w:vAlign w:val="center"/>
-          </w:tcPr>
-          <w:p>
-            <w:pPr>
-              <w:jc w:val="left"/>
-            </w:pPr>
-            <w:r>
-              <w:rPr>
-                <w:b w:val="false"/>
-                <w:bCs w:val="false"/>
-                <w:sz w:val="19"/>
-                <w:szCs w:val="19"/>
-              </w:rPr>
-              <w:t xml:space="preserve">+ Settlements with no matching internal record</w:t>
-            </w:r>
-          </w:p>
-        </w:tc>
-        <w:tc>
-          <w:tcPr>
-            <w:tcW w:type="dxa" w:w="2000"/>
-            <w:tcMar>
-              <w:top w:type="dxa" w:w="60"/>
-              <w:left w:type="dxa" w:w="100"/>
-              <w:bottom w:type="dxa" w:w="60"/>
-              <w:right w:type="dxa" w:w="100"/>
-            </w:tcMar>
-            <w:vAlign w:val="center"/>
-          </w:tcPr>
-          <w:p>
-            <w:pPr>
-              <w:jc w:val="left"/>
-            </w:pPr>
-            <w:r>
-              <w:rPr>
-                <w:b w:val="false"/>
-                <w:bCs w:val="false"/>
-                <w:sz w:val="19"/>
-                <w:szCs w:val="19"/>
-              </w:rPr>
-              <w:t xml:space="preserve">2,900.00</w:t>
-            </w:r>
-          </w:p>
-        </w:tc>
-      </w:tr>
-      <w:tr>
-        <w:trPr>
-          <w:cantSplit/>
-        </w:trPr>
-        <w:tc>
-          <w:tcPr>
-            <w:tcW w:type="dxa" w:w="7360"/>
-            <w:shd w:fill="EEF3F8" w:val="clear"/>
-            <w:tcMar>
-              <w:top w:type="dxa" w:w="60"/>
-              <w:left w:type="dxa" w:w="100"/>
-              <w:bottom w:type="dxa" w:w="60"/>
-              <w:right w:type="dxa" w:w="100"/>
-            </w:tcMar>
-            <w:vAlign w:val="center"/>
-          </w:tcPr>
-          <w:p>
-            <w:pPr>
-              <w:jc w:val="left"/>
-            </w:pPr>
-            <w:r>
-              <w:rPr>
-                <w:b w:val="false"/>
-                <w:bCs w:val="false"/>
-                <w:sz w:val="19"/>
-                <w:szCs w:val="19"/>
-              </w:rPr>
-              <w:t xml:space="preserve">+ Payments the gateway settled that we marked FAILED</w:t>
-            </w:r>
-          </w:p>
-        </w:tc>
-        <w:tc>
-          <w:tcPr>
-            <w:tcW w:type="dxa" w:w="2000"/>
-            <w:shd w:fill="EEF3F8" w:val="clear"/>
-            <w:tcMar>
-              <w:top w:type="dxa" w:w="60"/>
-              <w:left w:type="dxa" w:w="100"/>
-              <w:bottom w:type="dxa" w:w="60"/>
-              <w:right w:type="dxa" w:w="100"/>
-            </w:tcMar>
-            <w:vAlign w:val="center"/>
-          </w:tcPr>
-          <w:p>
-            <w:pPr>
-              <w:jc w:val="left"/>
-            </w:pPr>
-            <w:r>
-              <w:rPr>
-                <w:b w:val="false"/>
-                <w:bCs w:val="false"/>
-                <w:sz w:val="19"/>
-                <w:szCs w:val="19"/>
-              </w:rPr>
-              <w:t xml:space="preserve">250.00</w:t>
-            </w:r>
-          </w:p>
-        </w:tc>
-      </w:tr>
-      <w:tr>
-        <w:trPr>
-          <w:cantSplit/>
-        </w:trPr>
-        <w:tc>
-          <w:tcPr>
-            <w:tcW w:type="dxa" w:w="7360"/>
-            <w:tcMar>
-              <w:top w:type="dxa" w:w="60"/>
-              <w:left w:type="dxa" w:w="100"/>
-              <w:bottom w:type="dxa" w:w="60"/>
-              <w:right w:type="dxa" w:w="100"/>
-            </w:tcMar>
-            <w:vAlign w:val="center"/>
-          </w:tcPr>
-          <w:p>
-            <w:pPr>
-              <w:jc w:val="left"/>
-            </w:pPr>
-            <w:r>
-              <w:rPr>
-                <w:b w:val="false"/>
-                <w:bCs w:val="false"/>
-                <w:sz w:val="19"/>
-                <w:szCs w:val="19"/>
-              </w:rPr>
-              <w:t xml:space="preserve">+ Duplicate gateway settlement rows</w:t>
-            </w:r>
-          </w:p>
-        </w:tc>
-        <w:tc>
-          <w:tcPr>
-            <w:tcW w:type="dxa" w:w="2000"/>
-            <w:tcMar>
-              <w:top w:type="dxa" w:w="60"/>
-              <w:left w:type="dxa" w:w="100"/>
-              <w:bottom w:type="dxa" w:w="60"/>
-              <w:right w:type="dxa" w:w="100"/>
-            </w:tcMar>
-            <w:vAlign w:val="center"/>
-          </w:tcPr>
-          <w:p>
-            <w:pPr>
-              <w:jc w:val="left"/>
-            </w:pPr>
-            <w:r>
-              <w:rPr>
-                <w:b w:val="false"/>
-                <w:bCs w:val="false"/>
-                <w:sz w:val="19"/>
-                <w:szCs w:val="19"/>
-              </w:rPr>
-              <w:t xml:space="preserve">1,550.00</w:t>
-            </w:r>
-          </w:p>
-        </w:tc>
-      </w:tr>
-      <w:tr>
-        <w:trPr>
-          <w:cantSplit/>
-        </w:trPr>
-        <w:tc>
-          <w:tcPr>
-            <w:tcW w:type="dxa" w:w="7360"/>
-            <w:shd w:fill="EEF3F8" w:val="clear"/>
-            <w:tcMar>
-              <w:top w:type="dxa" w:w="60"/>
-              <w:left w:type="dxa" w:w="100"/>
-              <w:bottom w:type="dxa" w:w="60"/>
-              <w:right w:type="dxa" w:w="100"/>
-            </w:tcMar>
-            <w:vAlign w:val="center"/>
-          </w:tcPr>
-          <w:p>
-            <w:pPr>
-              <w:jc w:val="left"/>
-            </w:pPr>
-            <w:r>
-              <w:rPr>
-                <w:b w:val="false"/>
-                <w:bCs w:val="false"/>
-                <w:sz w:val="19"/>
-                <w:szCs w:val="19"/>
-              </w:rPr>
-              <w:t xml:space="preserve">+/− Gross amount differences with the gateway (net)</w:t>
-            </w:r>
-          </w:p>
-        </w:tc>
-        <w:tc>
-          <w:tcPr>
-            <w:tcW w:type="dxa" w:w="2000"/>
-            <w:shd w:fill="EEF3F8" w:val="clear"/>
-            <w:tcMar>
-              <w:top w:type="dxa" w:w="60"/>
-              <w:left w:type="dxa" w:w="100"/>
-              <w:bottom w:type="dxa" w:w="60"/>
-              <w:right w:type="dxa" w:w="100"/>
-            </w:tcMar>
-            <w:vAlign w:val="center"/>
-          </w:tcPr>
-          <w:p>
-            <w:pPr>
-              <w:jc w:val="left"/>
-            </w:pPr>
-            <w:r>
-              <w:rPr>
-                <w:b w:val="false"/>
-                <w:bCs w:val="false"/>
-                <w:sz w:val="19"/>
-                <w:szCs w:val="19"/>
-              </w:rPr>
-              <w:t xml:space="preserve">900.00</w:t>
-            </w:r>
-          </w:p>
-        </w:tc>
-      </w:tr>
-      <w:tr>
-        <w:trPr>
-          <w:cantSplit/>
-        </w:trPr>
-        <w:tc>
-          <w:tcPr>
-            <w:tcW w:type="dxa" w:w="7360"/>
-            <w:tcMar>
-              <w:top w:type="dxa" w:w="60"/>
-              <w:left w:type="dxa" w:w="100"/>
-              <w:bottom w:type="dxa" w:w="60"/>
-              <w:right w:type="dxa" w:w="100"/>
-            </w:tcMar>
-            <w:vAlign w:val="center"/>
-          </w:tcPr>
-          <w:p>
-            <w:pPr>
-              <w:jc w:val="left"/>
-            </w:pPr>
-            <w:r>
-              <w:rPr>
-                <w:b w:val="false"/>
-                <w:bCs w:val="false"/>
-                <w:sz w:val="19"/>
-                <w:szCs w:val="19"/>
-              </w:rPr>
-              <w:t xml:space="preserve">+/− Rounding (≤ 1 cent, immaterial)</w:t>
-            </w:r>
-          </w:p>
-        </w:tc>
-        <w:tc>
-          <w:tcPr>
-            <w:tcW w:type="dxa" w:w="2000"/>
-            <w:tcMar>
-              <w:top w:type="dxa" w:w="60"/>
-              <w:left w:type="dxa" w:w="100"/>
-              <w:bottom w:type="dxa" w:w="60"/>
-              <w:right w:type="dxa" w:w="100"/>
-            </w:tcMar>
-            <w:vAlign w:val="center"/>
-          </w:tcPr>
-          <w:p>
-            <w:pPr>
-              <w:jc w:val="left"/>
-            </w:pPr>
-            <w:r>
-              <w:rPr>
-                <w:b w:val="false"/>
-                <w:bCs w:val="false"/>
-                <w:sz w:val="19"/>
-                <w:szCs w:val="19"/>
-              </w:rPr>
-              <w:t xml:space="preserve">(0.03)</w:t>
-            </w:r>
-          </w:p>
-        </w:tc>
-      </w:tr>
-      <w:tr>
-        <w:trPr>
-          <w:cantSplit/>
-        </w:trPr>
-        <w:tc>
-          <w:tcPr>
-            <w:tcW w:type="dxa" w:w="7360"/>
-            <w:shd w:fill="EEF3F8" w:val="clear"/>
-            <w:tcMar>
-              <w:top w:type="dxa" w:w="60"/>
-              <w:left w:type="dxa" w:w="100"/>
-              <w:bottom w:type="dxa" w:w="60"/>
-              <w:right w:type="dxa" w:w="100"/>
-            </w:tcMar>
-            <w:vAlign w:val="center"/>
-          </w:tcPr>
-          <w:p>
-            <w:pPr>
-              <w:jc w:val="left"/>
-            </w:pPr>
-            <w:r>
-              <w:rPr>
-                <w:b w:val="false"/>
-                <w:bCs w:val="false"/>
-                <w:sz w:val="19"/>
-                <w:szCs w:val="19"/>
-              </w:rPr>
-              <w:t xml:space="preserve">= Gateway SETTLED total</w:t>
-            </w:r>
-          </w:p>
-        </w:tc>
-        <w:tc>
-          <w:tcPr>
-            <w:tcW w:type="dxa" w:w="2000"/>
-            <w:shd w:fill="EEF3F8" w:val="clear"/>
-            <w:tcMar>
-              <w:top w:type="dxa" w:w="60"/>
-              <w:left w:type="dxa" w:w="100"/>
-              <w:bottom w:type="dxa" w:w="60"/>
-              <w:right w:type="dxa" w:w="100"/>
-            </w:tcMar>
-            <w:vAlign w:val="center"/>
-          </w:tcPr>
-          <w:p>
-            <w:pPr>
-              <w:jc w:val="left"/>
-            </w:pPr>
-            <w:r>
-              <w:rPr>
-                <w:b w:val="false"/>
-                <w:bCs w:val="false"/>
-                <w:sz w:val="19"/>
-                <w:szCs w:val="19"/>
-              </w:rPr>
-              <w:t xml:space="preserve">217,979.97</w:t>
-            </w:r>
-          </w:p>
-        </w:tc>
-      </w:tr>
-      <w:tr>
-        <w:trPr>
-          <w:cantSplit/>
-        </w:trPr>
-        <w:tc>
-          <w:tcPr>
-            <w:tcW w:type="dxa" w:w="7360"/>
-            <w:tcMar>
-              <w:top w:type="dxa" w:w="60"/>
-              <w:left w:type="dxa" w:w="100"/>
-              <w:bottom w:type="dxa" w:w="60"/>
-              <w:right w:type="dxa" w:w="100"/>
-            </w:tcMar>
-            <w:vAlign w:val="center"/>
-          </w:tcPr>
-          <w:p>
-            <w:pPr>
-              <w:jc w:val="left"/>
-            </w:pPr>
-            <w:r>
-              <w:rPr>
-                <w:b w:val="false"/>
-                <w:bCs w:val="false"/>
-                <w:sz w:val="19"/>
-                <w:szCs w:val="19"/>
-              </w:rPr>
-              <w:t xml:space="preserve">Residual (unexplained)</w:t>
-            </w:r>
-          </w:p>
-        </w:tc>
-        <w:tc>
-          <w:tcPr>
-            <w:tcW w:type="dxa" w:w="2000"/>
-            <w:tcMar>
-              <w:top w:type="dxa" w:w="60"/>
-              <w:left w:type="dxa" w:w="100"/>
-              <w:bottom w:type="dxa" w:w="60"/>
-              <w:right w:type="dxa" w:w="100"/>
-            </w:tcMar>
-            <w:vAlign w:val="center"/>
-          </w:tcPr>
-          <w:p>
-            <w:pPr>
-              <w:jc w:val="left"/>
-            </w:pPr>
-            <w:r>
-              <w:rPr>
-                <w:b w:val="false"/>
-                <w:bCs w:val="false"/>
-                <w:sz w:val="19"/>
-                <w:szCs w:val="19"/>
-              </w:rPr>
-              <w:t xml:space="preserve">0.00</w:t>
-            </w:r>
-          </w:p>
-        </w:tc>
-      </w:tr>
-    </w:tbl>
-    <w:p>
-      <w:pPr>
-        <w:spacing w:after="60"/>
-      </w:pPr>
-    </w:p>
-    <w:p>
-      <w:pPr>
-        <w:spacing w:after="160"/>
-      </w:pPr>
-      <w:r>
-        <w:t xml:space="preserve">The bridge is on gross amounts, because that's what our deposits record. Fee and net-amount errors don't move gross, so they sit outside the bridge as their own exceptions. A dbt test (assert_recon_bridge_reconciles) fails the build if the residual ever moves off zero.</w:t>
-      </w:r>
-    </w:p>
-    <w:p>
-      <w:pPr>
-        <w:pStyle w:val="Heading2"/>
-        <w:keepNext/>
-        <w:keepLines/>
-        <w:spacing w:after="150" w:before="300"/>
+        <w:spacing w:after="100" w:before="200"/>
       </w:pPr>
       <w:r>
         <w:t xml:space="preserve">How the figures were checked</w:t>
@@ -2813,15 +3589,15 @@
           <w:i/>
           <w:iCs/>
         </w:rPr>
-        <w:t xml:space="preserve">That check was added after an audit of an earlier draft found real problems, all now fixed. The draft had no test for net = gross − fee, which the brief requires, so it missed two short-paid settlements. It didn't quantify the fee overcharge. It counted four reference-formatting variants instead of six, because a case-insensitive database comparison hid three. It filed three start-of-week settlements as unrecognised money rather than timing. The bridge balanced throughout. The errors were in how the differences were labelled and summarised, which is why the categories are now cross-checked independently.</w:t>
-      </w:r>
-    </w:p>
-    <w:p>
-      <w:pPr>
-        <w:pStyle w:val="Heading2"/>
+        <w:t xml:space="preserve">That check was added after an audit of an earlier draft found real problems, all now fixed. The draft had no test for net = gross − fee, which the brief requires, so it missed two short-paid settlements. It didn't quantify the fee overcharge. It counted four reference-formatting variants instead of six, because a case-insensitive database comparison hid three. It filed three start-of-week settlements as unrecognised money rather than timing. A later review by Codex found the fee check tolerated differences of up to 2 cents and a 2-cent gross difference could be labelled rounding; the rules are now exact, with boundary tests, and no figure changed. The bridge balanced throughout. The errors were in how the differences were labelled and summarised, which is why the categories are now cross-checked independently.</w:t>
+      </w:r>
+    </w:p>
+    <w:p>
+      <w:pPr>
+        <w:pStyle w:val="Heading3"/>
         <w:keepNext/>
         <w:keepLines/>
-        <w:spacing w:after="150" w:before="300"/>
+        <w:spacing w:after="100" w:before="200"/>
       </w:pPr>
       <w:r>
         <w:t xml:space="preserve">Automating this daily</w:t>
@@ -4086,7 +4862,7 @@
       <w:r>
         <w:drawing>
           <wp:inline distT="0" distB="0" distL="0" distR="0">
-            <wp:extent cx="4191000" cy="4619625"/>
+            <wp:extent cx="4191000" cy="4686300"/>
             <wp:effectExtent t="0" r="0" b="0" l="0"/>
             <wp:docPr id="11" name="" descr="" title=""/>
             <wp:cNvGraphicFramePr>
@@ -4111,7 +4887,7 @@
                   <pic:spPr bwMode="auto">
                     <a:xfrm>
                       <a:off x="0" y="0"/>
-                      <a:ext cx="4191000" cy="4619625"/>
+                      <a:ext cx="4191000" cy="4686300"/>
                     </a:xfrm>
                     <a:prstGeom prst="rect">
                       <a:avLst/>
@@ -4137,7 +4913,7 @@
           <w:sz w:val="20"/>
           <w:szCs w:val="20"/>
         </w:rPr>
-        <w:t xml:space="preserve">dbt build across all three exercises: 66/66 pass (23 models, 43 tests), 0 errors.</w:t>
+        <w:t xml:space="preserve">dbt build across all three exercises: 67/67 pass (23 models, 44 tests), 0 errors.</w:t>
       </w:r>
     </w:p>
     <w:p>

</xml_diff>

<commit_message>
Power BI and docs follow the Exercise 2 and dbt changes
- powerbi/export_data.py exports the Power BI CSVs from the dbt models
  (reproduces the unchanged ones byte for byte); transactions now come
  from the incremental fct_api_transactions mart
- Power BI: run history shows new / changed / unchanged per run, API
  retries = 429 + 500; 28 measures; expected values regenerated
- Submission document: Exercise 2 rewritten against the brief (design,
  reproducible evidence, checks and tests); new screenshots; dbt 78/78;
  images kept on the same page as their captions
- TABLE_INVENTORY: 53 objects, keys and duplicates, incremental loads
- READMEs, setup_local.bat and the Codex handoff updated

Co-Authored-By: Claude Opus 5.5 <noreply@anthropic.com>
Claude-Session: https://claude.ai/code/session_01GpY9vtVnSw1tgz3K4xTp8Q
</commit_message>
<xml_diff>
--- a/candidate-assessment/JSB_Candidate_Submission.docx
+++ b/candidate-assessment/JSB_Candidate_Submission.docx
@@ -1945,6 +1945,7 @@
     </w:p>
     <w:p>
       <w:pPr>
+        <w:keepNext/>
         <w:spacing w:before="200"/>
         <w:jc w:val="center"/>
       </w:pPr>
@@ -3700,6 +3701,7 @@
     </w:p>
     <w:p>
       <w:pPr>
+        <w:keepNext/>
         <w:spacing w:before="200"/>
         <w:jc w:val="center"/>
       </w:pPr>
@@ -3857,7 +3859,7 @@
           <w:sz w:val="20"/>
           <w:szCs w:val="20"/>
         </w:rPr>
-        <w:t xml:space="preserve">Tools used: Python 3 (standard library urllib only — no HTTP framework dependency), MySQL 8.0 for the checkpoint/ledger tables, Postman/Newman for exercising and documenting the API contract.</w:t>
+        <w:t xml:space="preserve">Tools used: Python 3 (standard library HTTP, plus pymysql), MySQL 8 / MariaDB for the target and control tables (the brief allows any database; this one also holds the other exercises and dbt), Postman/Newman for the API contract.</w:t>
       </w:r>
     </w:p>
     <w:p>
@@ -3881,7 +3883,7 @@
         <w:spacing w:after="80"/>
       </w:pPr>
       <w:r>
-        <w:t xml:space="preserve">Progress lives in MySQL (ingest_checkpoint), not memory or a local file, so any process on any host can resume it. Each run resumes from updated_since = last processed updated_at (inclusive), then paginates within the run via the server's cursor.</w:t>
+        <w:t xml:space="preserve">Progress: a checkpoint table holds the last (updated_at, id) fully committed. Each run resumes with updated_since = that time (inclusive, per the API doc) and pages with the server's cursor. The API moves updated_at forward when a record changes, so one position covers new and changed records.</w:t>
       </w:r>
     </w:p>
     <w:p>
@@ -3894,7 +3896,7 @@
         <w:spacing w:after="80"/>
       </w:pPr>
       <w:r>
-        <w:t xml:space="preserve">Every write is an upsert (INSERT … ON DUPLICATE KEY UPDATE) keyed on the provider's id — replaying a page is always safe. The data upsert, the reject-quarantine insert, the checkpoint update, and the run counters are committed together in one transaction per page.</w:t>
+        <w:t xml:space="preserve">No duplicates: id is the primary key and every write is an upsert on it. Repeated rows within a page are collapsed; a record is written only if it is new or its updated_at moved forward, so an older version never overwrites a newer one. A page's rows, its rejects, the checkpoint and the run counters commit in one transaction, so a kill loses at most the uncommitted page, which the next run re-reads.</w:t>
       </w:r>
     </w:p>
     <w:p>
@@ -3907,7 +3909,7 @@
         <w:spacing w:after="80"/>
       </w:pPr>
       <w:r>
-        <w:t xml:space="preserve">429 (rate limited): sleep for Retry-After, retry the same request. 500 / network errors: exponential backoff. Bad records (unparseable amount, missing player_id): quarantined with the reason and the full raw JSON — never silently dropped.</w:t>
+        <w:t xml:space="preserve">Failures: 429 waits for Retry-After; 500 and network errors retry with 2, 4, 8… s backoff, then the run ends FAILED with exit code 1 and the checkpoint unchanged. A database lock stops two scheduled runs overlapping; a run killed mid-way is marked ABANDONED by the next.</w:t>
       </w:r>
     </w:p>
     <w:p>
@@ -3920,7 +3922,20 @@
         <w:spacing w:after="80"/>
       </w:pPr>
       <w:r>
-        <w:t xml:space="preserve">Every run writes one row to ingest_runs: pages fetched, rows upserted/rejected, 429/500 counts, status. A run stuck RUNNING past one scheduling interval is the signal a stale-run monitor pages on.</w:t>
+        <w:t xml:space="preserve">Unclean data: numbers sent as strings are coerced; records with a missing player_id, an unparseable amount or time, or a negative amount go to ingest_rejects with the reason and raw JSON, once per distinct payload. The run carries on.</w:t>
+      </w:r>
+    </w:p>
+    <w:p>
+      <w:pPr>
+        <w:pStyle w:val="ListParagraph"/>
+        <w:numPr>
+          <w:ilvl w:val="0"/>
+          <w:numId w:val="2"/>
+        </w:numPr>
+        <w:spacing w:after="80"/>
+      </w:pPr>
+      <w:r>
+        <w:t xml:space="preserve">Monitoring: ingest_runs records, per run, pages, new / changed / unchanged / rejected rows, 429 and 500 counts, start and end time, status and any error; the checkpoint is the last successful position. checks.sql holds the monitoring and alert queries.</w:t>
       </w:r>
     </w:p>
     <w:p>
@@ -3939,18 +3954,19 @@
         <w:spacing w:after="160"/>
       </w:pPr>
       <w:r>
-        <w:t xml:space="preserve">The process was started with a small page size and an artificial pre-commit delay, then killed with SIGKILL mid-page — a hard crash, not a graceful shutdown.</w:t>
-      </w:r>
-    </w:p>
-    <w:p>
-      <w:pPr>
+        <w:t xml:space="preserve">demo.py reproduces the whole sequence on any machine, with the mock API's faults switched on. Run 1 uses 50-record pages and a pause before each commit, and is hard-killed while page 2 is uncommitted. Only page 1 (50 rows) is in the table; the restart marks run 1 ABANDONED, resumes from the checkpoint and loads the rest.</w:t>
+      </w:r>
+    </w:p>
+    <w:p>
+      <w:pPr>
+        <w:keepNext/>
         <w:spacing w:before="200"/>
         <w:jc w:val="center"/>
       </w:pPr>
       <w:r>
         <w:drawing>
           <wp:inline distT="0" distB="0" distL="0" distR="0">
-            <wp:extent cx="5334000" cy="4667250"/>
+            <wp:extent cx="5334000" cy="3790950"/>
             <wp:effectExtent t="0" r="0" b="0" l="0"/>
             <wp:docPr id="3" name="" descr="" title=""/>
             <wp:cNvGraphicFramePr>
@@ -3975,7 +3991,7 @@
                   <pic:spPr bwMode="auto">
                     <a:xfrm>
                       <a:off x="0" y="0"/>
-                      <a:ext cx="5334000" cy="4667250"/>
+                      <a:ext cx="5334000" cy="3790950"/>
                     </a:xfrm>
                     <a:prstGeom prst="rect">
                       <a:avLst/>
@@ -4001,7 +4017,7 @@
           <w:sz w:val="20"/>
           <w:szCs w:val="20"/>
         </w:rPr>
-        <w:t xml:space="preserve">Actual terminal output: kill mid-page → restart → complete → simulate new provider activity → rerun.</w:t>
+        <w:t xml:space="preserve">demo.py, steps 3–6: hard kill mid-page, restart from the checkpoint, check every id against the API.</w:t>
       </w:r>
     </w:p>
     <w:p>
@@ -4009,37 +4025,19 @@
         <w:spacing w:after="160"/>
       </w:pPr>
       <w:r>
-        <w:t xml:space="preserve">Result: 50 rows committed before the kill (exactly page 1 — page 2 never landed), the run left visibly RUNNING (the stale-run signal), and a clean restart resumed correctly with zero duplicates and zero missing rows. After simulating new activity (POST /admin/advance), a rerun correctly picked up 40 changed records and 25 new ones — including a live 429 that was retried automatically.</w:t>
-      </w:r>
-    </w:p>
-    <w:p>
-      <w:pPr>
-        <w:pStyle w:val="Heading2"/>
+        <w:t xml:space="preserve">Run 3, straight after, finds nothing new or changed. After the interviewer's step (POST /admin/advance), run 4 loads exactly the 25 new and 40 changed records. verify_against_api.py then reads the whole API and compares id by id: 1,025 ids = 1,024 loaded + 1 quarantined (TX000777, missing player_id), with 0 missing, 0 stale versions and 0 duplicates. A live 500 and a 429 were retried along the way.</w:t>
+      </w:r>
+    </w:p>
+    <w:p>
+      <w:pPr>
         <w:keepNext/>
-        <w:keepLines/>
-        <w:spacing w:after="150" w:before="300"/>
-      </w:pPr>
-      <w:r>
-        <w:t xml:space="preserve">API contract — Postman</w:t>
-      </w:r>
-    </w:p>
-    <w:p>
-      <w:pPr>
-        <w:spacing w:after="160"/>
-      </w:pPr>
-      <w:r>
-        <w:t xml:space="preserve">A Postman collection documents the API's pagination, filtering, auth and admin-simulation behaviour, and includes a self-paginating request that walks every page and reports the total record count directly in Postman's Test Results panel.</w:t>
-      </w:r>
-    </w:p>
-    <w:p>
-      <w:pPr>
         <w:spacing w:before="200"/>
         <w:jc w:val="center"/>
       </w:pPr>
       <w:r>
         <w:drawing>
           <wp:inline distT="0" distB="0" distL="0" distR="0">
-            <wp:extent cx="5334000" cy="3752850"/>
+            <wp:extent cx="5334000" cy="3333750"/>
             <wp:effectExtent t="0" r="0" b="0" l="0"/>
             <wp:docPr id="4" name="" descr="" title=""/>
             <wp:cNvGraphicFramePr>
@@ -4064,7 +4062,7 @@
                   <pic:spPr bwMode="auto">
                     <a:xfrm>
                       <a:off x="0" y="0"/>
-                      <a:ext cx="5334000" cy="3752850"/>
+                      <a:ext cx="5334000" cy="3333750"/>
                     </a:xfrm>
                     <a:prstGeom prst="rect">
                       <a:avLst/>
@@ -4090,7 +4088,15 @@
           <w:sz w:val="20"/>
           <w:szCs w:val="20"/>
         </w:rPr>
-        <w:t xml:space="preserve">Newman run of the Exercise 2 collection: 5 requests, 10/10 assertions passing.</w:t>
+        <w:t xml:space="preserve">demo.py, steps 7–10: rerun, new provider activity, incremental rerun, final state.</w:t>
+      </w:r>
+    </w:p>
+    <w:p>
+      <w:pPr>
+        <w:spacing w:after="160"/>
+      </w:pPr>
+      <w:r>
+        <w:t xml:space="preserve">The load continues incrementally into the reporting layer: the dbt model fct_api_transactions picks up only rows the ingestion stamped since its last run. incremental_demo.py shows 999 rows on the first build, 0 on a rerun, and exactly the 65 new and changed rows after the new activity, with the mart then equal to the source.</w:t>
       </w:r>
     </w:p>
     <w:p>
@@ -4101,7 +4107,57 @@
         <w:spacing w:after="150" w:before="300"/>
       </w:pPr>
       <w:r>
-        <w:t xml:space="preserve">Live run — Postman Desktop against the local mock API</w:t>
+        <w:t xml:space="preserve">Checks and tests</w:t>
+      </w:r>
+    </w:p>
+    <w:p>
+      <w:pPr>
+        <w:pStyle w:val="ListParagraph"/>
+        <w:numPr>
+          <w:ilvl w:val="0"/>
+          <w:numId w:val="2"/>
+        </w:numPr>
+        <w:spacing w:after="80"/>
+      </w:pPr>
+      <w:r>
+        <w:t xml:space="preserve">checks.sql: duplicates, reject accounting, run history, stale or failed runs, and the last successful position.</w:t>
+      </w:r>
+    </w:p>
+    <w:p>
+      <w:pPr>
+        <w:pStyle w:val="ListParagraph"/>
+        <w:numPr>
+          <w:ilvl w:val="0"/>
+          <w:numId w:val="2"/>
+        </w:numPr>
+        <w:spacing w:after="80"/>
+      </w:pPr>
+      <w:r>
+        <w:t xml:space="preserve">verify_against_api.py: every id in the table against the API (missing, unexpected, stale, duplicates); exits 1 on any mismatch.</w:t>
+      </w:r>
+    </w:p>
+    <w:p>
+      <w:pPr>
+        <w:pStyle w:val="ListParagraph"/>
+        <w:numPr>
+          <w:ilvl w:val="0"/>
+          <w:numId w:val="2"/>
+        </w:numPr>
+        <w:spacing w:after="80"/>
+      </w:pPr>
+      <w:r>
+        <w:t xml:space="preserve">9 unit tests with no network or database: exit codes (401, exhausted 429 and 500 retries, success), the run lock, validation of unclean records, and the new / changed / unchanged classification.</w:t>
+      </w:r>
+    </w:p>
+    <w:p>
+      <w:pPr>
+        <w:pStyle w:val="Heading2"/>
+        <w:keepNext/>
+        <w:keepLines/>
+        <w:spacing w:after="150" w:before="300"/>
+      </w:pPr>
+      <w:r>
+        <w:t xml:space="preserve">API contract — Postman</w:t>
       </w:r>
     </w:p>
     <w:p>
@@ -4109,18 +4165,19 @@
         <w:spacing w:after="160"/>
       </w:pPr>
       <w:r>
-        <w:t xml:space="preserve">The same collection was then imported into Postman Desktop on a Windows workstation and run against mock_api.py started from PyCharm — an independent environment from the one the code was built in.</w:t>
-      </w:r>
-    </w:p>
-    <w:p>
-      <w:pPr>
+        <w:t xml:space="preserve">A Postman collection documents the API's pagination, filtering, auth and admin-simulation behaviour, and includes a self-paginating request that walks every page and reports the total record count.</w:t>
+      </w:r>
+    </w:p>
+    <w:p>
+      <w:pPr>
+        <w:keepNext/>
         <w:spacing w:before="200"/>
         <w:jc w:val="center"/>
       </w:pPr>
       <w:r>
         <w:drawing>
           <wp:inline distT="0" distB="0" distL="0" distR="0">
-            <wp:extent cx="5715000" cy="3143250"/>
+            <wp:extent cx="5334000" cy="3752850"/>
             <wp:effectExtent t="0" r="0" b="0" l="0"/>
             <wp:docPr id="5" name="" descr="" title=""/>
             <wp:cNvGraphicFramePr>
@@ -4145,7 +4202,7 @@
                   <pic:spPr bwMode="auto">
                     <a:xfrm>
                       <a:off x="0" y="0"/>
-                      <a:ext cx="5715000" cy="3143250"/>
+                      <a:ext cx="5334000" cy="3752850"/>
                     </a:xfrm>
                     <a:prstGeom prst="rect">
                       <a:avLst/>
@@ -4171,18 +4228,38 @@
           <w:sz w:val="20"/>
           <w:szCs w:val="20"/>
         </w:rPr>
-        <w:t xml:space="preserve">mock_api.py running in PyCharm: "Mock API on http://127.0.0.1:8000 (faults on)".</w:t>
-      </w:r>
-    </w:p>
-    <w:p>
-      <w:pPr>
+        <w:t xml:space="preserve">Newman run of the Exercise 2 collection.</w:t>
+      </w:r>
+    </w:p>
+    <w:p>
+      <w:pPr>
+        <w:pStyle w:val="Heading2"/>
+        <w:keepNext/>
+        <w:keepLines/>
+        <w:spacing w:after="150" w:before="300"/>
+      </w:pPr>
+      <w:r>
+        <w:t xml:space="preserve">Live run — Postman Desktop against the local mock API</w:t>
+      </w:r>
+    </w:p>
+    <w:p>
+      <w:pPr>
+        <w:spacing w:after="160"/>
+      </w:pPr>
+      <w:r>
+        <w:t xml:space="preserve">The same collection was run in Postman Desktop on a Windows workstation against mock_api.py started from PyCharm, an independent environment from the one the code was built in.</w:t>
+      </w:r>
+    </w:p>
+    <w:p>
+      <w:pPr>
+        <w:keepNext/>
         <w:spacing w:before="200"/>
         <w:jc w:val="center"/>
       </w:pPr>
       <w:r>
         <w:drawing>
           <wp:inline distT="0" distB="0" distL="0" distR="0">
-            <wp:extent cx="4381500" cy="3000375"/>
+            <wp:extent cx="5715000" cy="3143250"/>
             <wp:effectExtent t="0" r="0" b="0" l="0"/>
             <wp:docPr id="6" name="" descr="" title=""/>
             <wp:cNvGraphicFramePr>
@@ -4207,7 +4284,7 @@
                   <pic:spPr bwMode="auto">
                     <a:xfrm>
                       <a:off x="0" y="0"/>
-                      <a:ext cx="4381500" cy="3000375"/>
+                      <a:ext cx="5715000" cy="3143250"/>
                     </a:xfrm>
                     <a:prstGeom prst="rect">
                       <a:avLst/>
@@ -4233,18 +4310,19 @@
           <w:sz w:val="20"/>
           <w:szCs w:val="20"/>
         </w:rPr>
-        <w:t xml:space="preserve">Collection Runner configuration: all seven requests, one iteration.</w:t>
-      </w:r>
-    </w:p>
-    <w:p>
-      <w:pPr>
+        <w:t xml:space="preserve">mock_api.py running in PyCharm: "Mock API on http://127.0.0.1:8000 (faults on)".</w:t>
+      </w:r>
+    </w:p>
+    <w:p>
+      <w:pPr>
+        <w:keepNext/>
         <w:spacing w:before="200"/>
         <w:jc w:val="center"/>
       </w:pPr>
       <w:r>
         <w:drawing>
           <wp:inline distT="0" distB="0" distL="0" distR="0">
-            <wp:extent cx="4572000" cy="3790950"/>
+            <wp:extent cx="4381500" cy="3000375"/>
             <wp:effectExtent t="0" r="0" b="0" l="0"/>
             <wp:docPr id="7" name="" descr="" title=""/>
             <wp:cNvGraphicFramePr>
@@ -4269,7 +4347,7 @@
                   <pic:spPr bwMode="auto">
                     <a:xfrm>
                       <a:off x="0" y="0"/>
-                      <a:ext cx="4572000" cy="3790950"/>
+                      <a:ext cx="4381500" cy="3000375"/>
                     </a:xfrm>
                     <a:prstGeom prst="rect">
                       <a:avLst/>
@@ -4295,11 +4373,12 @@
           <w:sz w:val="20"/>
           <w:szCs w:val="20"/>
         </w:rPr>
-        <w:t xml:space="preserve">Runner results, pages 1–4 of the self-paginating count. Page 1 returns 201 rows for limit=200 (the API's documented in-page duplicate); page 4 hits a live 500 and retries the same page.</w:t>
-      </w:r>
-    </w:p>
-    <w:p>
-      <w:pPr>
+        <w:t xml:space="preserve">Collection Runner configuration: all seven requests, one iteration.</w:t>
+      </w:r>
+    </w:p>
+    <w:p>
+      <w:pPr>
+        <w:keepNext/>
         <w:spacing w:before="200"/>
         <w:jc w:val="center"/>
       </w:pPr>
@@ -4357,133 +4436,19 @@
           <w:sz w:val="20"/>
           <w:szCs w:val="20"/>
         </w:rPr>
-        <w:t xml:space="preserve">Runner results, pages 4–6: DONE — total records returned by the API: 1,027 across 6 pages.</w:t>
-      </w:r>
-    </w:p>
-    <w:p>
-      <w:pPr>
-        <w:spacing w:after="160"/>
-      </w:pPr>
-      <w:r>
-        <w:t xml:space="preserve">The run reports 16 of 18 assertions passing. The two failures are on request 2 ("Next page"), a one-shot documentation request with no retry logic, which happened to land on the mock API's injected 429. Only the counting request carries retry handling. That is by design, and it shows why the ingestion program retries every call.</w:t>
-      </w:r>
-    </w:p>
-    <w:p>
-      <w:pPr>
-        <w:spacing w:after="160"/>
-      </w:pPr>
-      <w:r>
-        <w:t xml:space="preserve">Why 1,027 rather than 1,025: the runner executes /admin/advance (request 5) before the count, so the dataset is already 1,025 records; the extra rows are the API's deliberate in-page duplicates, counted raw here. ingest.py deduplicates them, which is why its loaded row count is lower than the raw count.</w:t>
-      </w:r>
-    </w:p>
-    <w:p>
-      <w:pPr>
-        <w:pStyle w:val="Heading2"/>
+        <w:t xml:space="preserve">Runner results, pages 1–4 of the self-paginating count. Page 1 returns 201 rows for limit=200 (an in-page repeated row); page 4 hits a live 500 and retries the same page.</w:t>
+      </w:r>
+    </w:p>
+    <w:p>
+      <w:pPr>
         <w:keepNext/>
-        <w:keepLines/>
-        <w:spacing w:after="150" w:before="300"/>
-      </w:pPr>
-      <w:r>
-        <w:t xml:space="preserve">What I'd change for production</w:t>
-      </w:r>
-    </w:p>
-    <w:p>
-      <w:pPr>
-        <w:pStyle w:val="ListParagraph"/>
-        <w:numPr>
-          <w:ilvl w:val="0"/>
-          <w:numId w:val="2"/>
-        </w:numPr>
-        <w:spacing w:after="80"/>
-      </w:pPr>
-      <w:r>
-        <w:t xml:space="preserve">A managed scheduler (Airflow / cron+systemd) with a concurrency lock, so two overlapping runs can't race.</w:t>
-      </w:r>
-    </w:p>
-    <w:p>
-      <w:pPr>
-        <w:pStyle w:val="ListParagraph"/>
-        <w:numPr>
-          <w:ilvl w:val="0"/>
-          <w:numId w:val="2"/>
-        </w:numPr>
-        <w:spacing w:after="80"/>
-      </w:pPr>
-      <w:r>
-        <w:t xml:space="preserve">Secrets (API key, DB credentials) out of source and into a secrets manager.</w:t>
-      </w:r>
-    </w:p>
-    <w:p>
-      <w:pPr>
-        <w:pStyle w:val="ListParagraph"/>
-        <w:numPr>
-          <w:ilvl w:val="0"/>
-          <w:numId w:val="2"/>
-        </w:numPr>
-        <w:spacing w:after="80"/>
-      </w:pPr>
-      <w:r>
-        <w:t xml:space="preserve">Page on FAILED runs, a stale RUNNING row, or a rejects-rate spike (usually a schema change, not random dirty data).</w:t>
-      </w:r>
-    </w:p>
-    <w:p>
-      <w:pPr>
-        <w:pStyle w:val="ListParagraph"/>
-        <w:numPr>
-          <w:ilvl w:val="0"/>
-          <w:numId w:val="2"/>
-        </w:numPr>
-        <w:spacing w:after="80"/>
-      </w:pPr>
-      <w:r>
-        <w:t xml:space="preserve">At real volume: staging-table + bulk MERGE instead of row-by-row upserts; partition by date; multiple workers on disjoint id ranges if one API key's rate limit becomes the bottleneck.</w:t>
-      </w:r>
-    </w:p>
-    <w:p>
-      <w:pPr>
-        <w:pStyle w:val="Heading1"/>
-        <w:pageBreakBefore/>
-        <w:spacing w:after="200" w:before="400"/>
-      </w:pPr>
-      <w:r>
-        <w:t xml:space="preserve">Exercise 3 — Database Design: Players, Wallets, Bets, Bonuses</w:t>
-      </w:r>
-    </w:p>
-    <w:p>
-      <w:pPr>
-        <w:spacing w:after="160"/>
-      </w:pPr>
-      <w:r>
-        <w:rPr>
-          <w:i/>
-          <w:iCs/>
-          <w:color w:val="595959"/>
-          <w:sz w:val="20"/>
-          <w:szCs w:val="20"/>
-        </w:rPr>
-        <w:t xml:space="preserve">Tools used: MySQL 8.0 for the schema (cross-verified against MariaDB 10.11), Mermaid for the ERD, dbt for the reporting-model mapping.</w:t>
-      </w:r>
-    </w:p>
-    <w:p>
-      <w:pPr>
-        <w:pStyle w:val="Heading2"/>
-        <w:keepNext/>
-        <w:keepLines/>
-        <w:spacing w:after="150" w:before="300"/>
-      </w:pPr>
-      <w:r>
-        <w:t xml:space="preserve">Entity-relationship diagram</w:t>
-      </w:r>
-    </w:p>
-    <w:p>
-      <w:pPr>
         <w:spacing w:before="200"/>
         <w:jc w:val="center"/>
       </w:pPr>
       <w:r>
         <w:drawing>
           <wp:inline distT="0" distB="0" distL="0" distR="0">
-            <wp:extent cx="5905500" cy="5162550"/>
+            <wp:extent cx="4572000" cy="3790950"/>
             <wp:effectExtent t="0" r="0" b="0" l="0"/>
             <wp:docPr id="9" name="" descr="" title=""/>
             <wp:cNvGraphicFramePr>
@@ -4508,7 +4473,7 @@
                   <pic:spPr bwMode="auto">
                     <a:xfrm>
                       <a:off x="0" y="0"/>
-                      <a:ext cx="5905500" cy="5162550"/>
+                      <a:ext cx="4572000" cy="3790950"/>
                     </a:xfrm>
                     <a:prstGeom prst="rect">
                       <a:avLst/>
@@ -4534,7 +4499,15 @@
           <w:sz w:val="20"/>
           <w:szCs w:val="20"/>
         </w:rPr>
-        <w:t xml:space="preserve">23-table operational schema — full DDL in exercise3-schema-design/ddl.sql, verified to run clean on both MySQL 8.0 and MariaDB 10.11.</w:t>
+        <w:t xml:space="preserve">Runner results, pages 4–6: DONE — total rows returned by the API: 1,027 across 6 pages.</w:t>
+      </w:r>
+    </w:p>
+    <w:p>
+      <w:pPr>
+        <w:spacing w:after="160"/>
+      </w:pPr>
+      <w:r>
+        <w:t xml:space="preserve">Two assertions fail on request 2 ("Next page"), a one-shot documentation request with no retry logic that happened to land on an injected 429; only the counting request retries. 1,027 rather than 1,025 because the raw count includes the API's in-page repeated rows, which ingest.py collapses.</w:t>
       </w:r>
     </w:p>
     <w:p>
@@ -4545,18 +4518,69 @@
         <w:spacing w:after="150" w:before="300"/>
       </w:pPr>
       <w:r>
-        <w:t xml:space="preserve">Design principles</w:t>
-      </w:r>
-    </w:p>
-    <w:p>
-      <w:pPr>
-        <w:pStyle w:val="Heading3"/>
-        <w:keepNext/>
-        <w:keepLines/>
-        <w:spacing w:after="100" w:before="200"/>
-      </w:pPr>
-      <w:r>
-        <w:t xml:space="preserve">Money and time</w:t>
+        <w:t xml:space="preserve">What I'd change for production</w:t>
+      </w:r>
+    </w:p>
+    <w:p>
+      <w:pPr>
+        <w:pStyle w:val="ListParagraph"/>
+        <w:numPr>
+          <w:ilvl w:val="0"/>
+          <w:numId w:val="2"/>
+        </w:numPr>
+        <w:spacing w:after="80"/>
+      </w:pPr>
+      <w:r>
+        <w:t xml:space="preserve">Scheduling: Airflow or cron every few minutes; the lock already makes overlapping runs harmless.</w:t>
+      </w:r>
+    </w:p>
+    <w:p>
+      <w:pPr>
+        <w:pStyle w:val="ListParagraph"/>
+        <w:numPr>
+          <w:ilvl w:val="0"/>
+          <w:numId w:val="2"/>
+        </w:numPr>
+        <w:spacing w:after="80"/>
+      </w:pPr>
+      <w:r>
+        <w:t xml:space="preserve">Alerting: page on a non-zero exit code, a run stuck RUNNING past one interval, a rising reject rate, or checkpoint lag.</w:t>
+      </w:r>
+    </w:p>
+    <w:p>
+      <w:pPr>
+        <w:pStyle w:val="ListParagraph"/>
+        <w:numPr>
+          <w:ilvl w:val="0"/>
+          <w:numId w:val="2"/>
+        </w:numPr>
+        <w:spacing w:after="80"/>
+      </w:pPr>
+      <w:r>
+        <w:t xml:space="preserve">Secrets: the API key and database password come from environment variables today; in production, from a secrets manager.</w:t>
+      </w:r>
+    </w:p>
+    <w:p>
+      <w:pPr>
+        <w:pStyle w:val="ListParagraph"/>
+        <w:numPr>
+          <w:ilvl w:val="0"/>
+          <w:numId w:val="2"/>
+        </w:numPr>
+        <w:spacing w:after="80"/>
+      </w:pPr>
+      <w:r>
+        <w:t xml:space="preserve">Scale: bulk-load each page into a staging table and MERGE; partition by date; split id ranges across workers if the rate limit becomes the bottleneck.</w:t>
+      </w:r>
+    </w:p>
+    <w:p>
+      <w:pPr>
+        <w:pStyle w:val="Heading1"/>
+        <w:pageBreakBefore/>
+        <w:spacing w:after="200" w:before="400"/>
+      </w:pPr>
+      <w:r>
+        <w:t xml:space="preserve">Exercise 3 — Database Design: Players, Wallets, Bets, Bonuses</w:t>
       </w:r>
     </w:p>
     <w:p>
@@ -4564,64 +4588,14 @@
         <w:spacing w:after="160"/>
       </w:pPr>
       <w:r>
-        <w:t xml:space="preserve">DECIMAL(18,4) everywhere a balance or amount is stored — never FLOAT/DOUBLE. DATETIME(6), always UTC, columns suffixed _at_utc; MySQL's TIMESTAMP is deliberately avoided because it silently converts using the session/server time zone.</w:t>
-      </w:r>
-    </w:p>
-    <w:p>
-      <w:pPr>
-        <w:pStyle w:val="Heading3"/>
-        <w:keepNext/>
-        <w:keepLines/>
-        <w:spacing w:after="100" w:before="200"/>
-      </w:pPr>
-      <w:r>
-        <w:t xml:space="preserve">Balance correctness</w:t>
-      </w:r>
-    </w:p>
-    <w:p>
-      <w:pPr>
-        <w:spacing w:after="160"/>
-      </w:pPr>
-      <w:r>
-        <w:t xml:space="preserve">wallets.real_balance / bonus_balance are a materialised cache, not the source of truth — wallet_transactions (an append-only ledger) is. A balance at any point in time is SUM(credit) − SUM(debit) up to that moment, proven directly by example query (c) below. Corrections and reversals are new rows referencing the original (reversal_of_wallet_txn_id), never edits; every row carries a deterministic idempotency_key so replaying an event can never double-post it. A dbt test (assert_wallet_cache_matches_ledger) fails the build if the cache ever disagrees with the ledger.</w:t>
-      </w:r>
-    </w:p>
-    <w:p>
-      <w:pPr>
-        <w:pStyle w:val="Heading3"/>
-        <w:keepNext/>
-        <w:keepLines/>
-        <w:spacing w:after="100" w:before="200"/>
-      </w:pPr>
-      <w:r>
-        <w:t xml:space="preserve">History over time</w:t>
-      </w:r>
-    </w:p>
-    <w:p>
-      <w:pPr>
-        <w:spacing w:after="160"/>
-      </w:pPr>
-      <w:r>
-        <w:t xml:space="preserve">player_vip_tier_history and player_tag_history are SCD Type 2 (a new row per change, valid_from/valid_to), so "what tier was this player on 3 September" is answerable, not just "what tier are they now".</w:t>
-      </w:r>
-    </w:p>
-    <w:p>
-      <w:pPr>
-        <w:pStyle w:val="Heading3"/>
-        <w:keepNext/>
-        <w:keepLines/>
-        <w:spacing w:after="100" w:before="200"/>
-      </w:pPr>
-      <w:r>
-        <w:t xml:space="preserve">Protecting personal information</w:t>
-      </w:r>
-    </w:p>
-    <w:p>
-      <w:pPr>
-        <w:spacing w:after="160"/>
-      </w:pPr>
-      <w:r>
-        <w:t xml:space="preserve">player_identity is a separate table, joined only by player_id — every other table (bets, wallet transactions, bonuses) never sees a name or ID number. In production: application-layer encryption on sensitive fields, a dedicated low-privilege DB role, and every read of the identity table logged.</w:t>
+        <w:rPr>
+          <w:i/>
+          <w:iCs/>
+          <w:color w:val="595959"/>
+          <w:sz w:val="20"/>
+          <w:szCs w:val="20"/>
+        </w:rPr>
+        <w:t xml:space="preserve">Tools used: MySQL 8.0 for the schema (cross-verified against MariaDB 10.11), Mermaid for the ERD, dbt for the reporting-model mapping.</w:t>
       </w:r>
     </w:p>
     <w:p>
@@ -4632,26 +4606,19 @@
         <w:spacing w:after="150" w:before="300"/>
       </w:pPr>
       <w:r>
-        <w:t xml:space="preserve">The four required queries — verified output</w:t>
-      </w:r>
-    </w:p>
-    <w:p>
-      <w:pPr>
-        <w:spacing w:after="160"/>
-      </w:pPr>
-      <w:r>
-        <w:t xml:space="preserve">Run against the seed data in exercise3-schema-design/seed.sql; identical results on MySQL 8.0 and MariaDB 10.11.</w:t>
-      </w:r>
-    </w:p>
-    <w:p>
-      <w:pPr>
+        <w:t xml:space="preserve">Entity-relationship diagram</w:t>
+      </w:r>
+    </w:p>
+    <w:p>
+      <w:pPr>
+        <w:keepNext/>
         <w:spacing w:before="200"/>
         <w:jc w:val="center"/>
       </w:pPr>
       <w:r>
         <w:drawing>
           <wp:inline distT="0" distB="0" distL="0" distR="0">
-            <wp:extent cx="5334000" cy="1314450"/>
+            <wp:extent cx="5905500" cy="5162550"/>
             <wp:effectExtent t="0" r="0" b="0" l="0"/>
             <wp:docPr id="10" name="" descr="" title=""/>
             <wp:cNvGraphicFramePr>
@@ -4676,7 +4643,7 @@
                   <pic:spPr bwMode="auto">
                     <a:xfrm>
                       <a:off x="0" y="0"/>
-                      <a:ext cx="5334000" cy="1314450"/>
+                      <a:ext cx="5905500" cy="5162550"/>
                     </a:xfrm>
                     <a:prstGeom prst="rect">
                       <a:avLst/>
@@ -4702,319 +4669,9 @@
           <w:sz w:val="20"/>
           <w:szCs w:val="20"/>
         </w:rPr>
-        <w:t xml:space="preserve">mysql -- jsb_platform -- example_queries.sql</w:t>
-      </w:r>
-    </w:p>
-    <w:tbl>
-      <w:tblPr>
-        <w:tblW w:type="dxa" w:w="9360"/>
-        <w:tblBorders>
-          <w:top w:val="single" w:color="auto" w:sz="4"/>
-          <w:left w:val="single" w:color="auto" w:sz="4"/>
-          <w:bottom w:val="single" w:color="auto" w:sz="4"/>
-          <w:right w:val="single" w:color="auto" w:sz="4"/>
-          <w:insideH w:val="single" w:color="auto" w:sz="4"/>
-          <w:insideV w:val="single" w:color="auto" w:sz="4"/>
-        </w:tblBorders>
-      </w:tblPr>
-      <w:tblGrid>
-        <w:gridCol w:w="3400"/>
-        <w:gridCol w:w="5960"/>
-      </w:tblGrid>
-      <w:tr>
-        <w:trPr>
-          <w:tblHeader/>
-        </w:trPr>
-        <w:tc>
-          <w:tcPr>
-            <w:tcW w:type="dxa" w:w="3400"/>
-            <w:shd w:fill="1F3864" w:val="clear"/>
-            <w:tcMar>
-              <w:top w:type="dxa" w:w="60"/>
-              <w:left w:type="dxa" w:w="100"/>
-              <w:bottom w:type="dxa" w:w="60"/>
-              <w:right w:type="dxa" w:w="100"/>
-            </w:tcMar>
-            <w:vAlign w:val="center"/>
-          </w:tcPr>
-          <w:p>
-            <w:pPr>
-              <w:jc w:val="left"/>
-            </w:pPr>
-            <w:r>
-              <w:rPr>
-                <w:b/>
-                <w:bCs/>
-                <w:color w:val="FFFFFF"/>
-                <w:sz w:val="19"/>
-                <w:szCs w:val="19"/>
-              </w:rPr>
-              <w:t xml:space="preserve">Query</w:t>
-            </w:r>
-          </w:p>
-        </w:tc>
-        <w:tc>
-          <w:tcPr>
-            <w:tcW w:type="dxa" w:w="5960"/>
-            <w:shd w:fill="1F3864" w:val="clear"/>
-            <w:tcMar>
-              <w:top w:type="dxa" w:w="60"/>
-              <w:left w:type="dxa" w:w="100"/>
-              <w:bottom w:type="dxa" w:w="60"/>
-              <w:right w:type="dxa" w:w="100"/>
-            </w:tcMar>
-            <w:vAlign w:val="center"/>
-          </w:tcPr>
-          <w:p>
-            <w:pPr>
-              <w:jc w:val="left"/>
-            </w:pPr>
-            <w:r>
-              <w:rPr>
-                <w:b/>
-                <w:bCs/>
-                <w:color w:val="FFFFFF"/>
-                <w:sz w:val="19"/>
-                <w:szCs w:val="19"/>
-              </w:rPr>
-              <w:t xml:space="preserve">Result</w:t>
-            </w:r>
-          </w:p>
-        </w:tc>
-      </w:tr>
-      <w:tr>
-        <w:trPr>
-          <w:cantSplit/>
-        </w:trPr>
-        <w:tc>
-          <w:tcPr>
-            <w:tcW w:type="dxa" w:w="3400"/>
-            <w:tcMar>
-              <w:top w:type="dxa" w:w="60"/>
-              <w:left w:type="dxa" w:w="100"/>
-              <w:bottom w:type="dxa" w:w="60"/>
-              <w:right w:type="dxa" w:w="100"/>
-            </w:tcMar>
-            <w:vAlign w:val="center"/>
-          </w:tcPr>
-          <w:p>
-            <w:pPr>
-              <w:jc w:val="left"/>
-            </w:pPr>
-            <w:r>
-              <w:rPr>
-                <w:b w:val="false"/>
-                <w:bCs w:val="false"/>
-                <w:sz w:val="19"/>
-                <w:szCs w:val="19"/>
-              </w:rPr>
-              <w:t xml:space="preserve">(a) NGR by product for a month</w:t>
-            </w:r>
-          </w:p>
-        </w:tc>
-        <w:tc>
-          <w:tcPr>
-            <w:tcW w:type="dxa" w:w="5960"/>
-            <w:tcMar>
-              <w:top w:type="dxa" w:w="60"/>
-              <w:left w:type="dxa" w:w="100"/>
-              <w:bottom w:type="dxa" w:w="60"/>
-              <w:right w:type="dxa" w:w="100"/>
-            </w:tcMar>
-            <w:vAlign w:val="center"/>
-          </w:tcPr>
-          <w:p>
-            <w:pPr>
-              <w:jc w:val="left"/>
-            </w:pPr>
-            <w:r>
-              <w:rPr>
-                <w:b w:val="false"/>
-                <w:bCs w:val="false"/>
-                <w:sz w:val="19"/>
-                <w:szCs w:val="19"/>
-              </w:rPr>
-              <w:t xml:space="preserve">sportsbook -160.00 · casino -30.00 · retail 100.00 (NAD)</w:t>
-            </w:r>
-          </w:p>
-        </w:tc>
-      </w:tr>
-      <w:tr>
-        <w:trPr>
-          <w:cantSplit/>
-        </w:trPr>
-        <w:tc>
-          <w:tcPr>
-            <w:tcW w:type="dxa" w:w="3400"/>
-            <w:shd w:fill="EEF3F8" w:val="clear"/>
-            <w:tcMar>
-              <w:top w:type="dxa" w:w="60"/>
-              <w:left w:type="dxa" w:w="100"/>
-              <w:bottom w:type="dxa" w:w="60"/>
-              <w:right w:type="dxa" w:w="100"/>
-            </w:tcMar>
-            <w:vAlign w:val="center"/>
-          </w:tcPr>
-          <w:p>
-            <w:pPr>
-              <w:jc w:val="left"/>
-            </w:pPr>
-            <w:r>
-              <w:rPr>
-                <w:b w:val="false"/>
-                <w:bCs w:val="false"/>
-                <w:sz w:val="19"/>
-                <w:szCs w:val="19"/>
-              </w:rPr>
-              <w:t xml:space="preserve">(b) Bonus cost as % of NGR, by campaign</w:t>
-            </w:r>
-          </w:p>
-        </w:tc>
-        <w:tc>
-          <w:tcPr>
-            <w:tcW w:type="dxa" w:w="5960"/>
-            <w:shd w:fill="EEF3F8" w:val="clear"/>
-            <w:tcMar>
-              <w:top w:type="dxa" w:w="60"/>
-              <w:left w:type="dxa" w:w="100"/>
-              <w:bottom w:type="dxa" w:w="60"/>
-              <w:right w:type="dxa" w:w="100"/>
-            </w:tcMar>
-            <w:vAlign w:val="center"/>
-          </w:tcPr>
-          <w:p>
-            <w:pPr>
-              <w:jc w:val="left"/>
-            </w:pPr>
-            <w:r>
-              <w:rPr>
-                <w:b w:val="false"/>
-                <w:bCs w:val="false"/>
-                <w:sz w:val="19"/>
-                <w:szCs w:val="19"/>
-              </w:rPr>
-              <w:t xml:space="preserve">Registration Bonus: -27.78% (matches the dbt mart's independently-computed figure exactly)</w:t>
-            </w:r>
-          </w:p>
-        </w:tc>
-      </w:tr>
-      <w:tr>
-        <w:trPr>
-          <w:cantSplit/>
-        </w:trPr>
-        <w:tc>
-          <w:tcPr>
-            <w:tcW w:type="dxa" w:w="3400"/>
-            <w:tcMar>
-              <w:top w:type="dxa" w:w="60"/>
-              <w:left w:type="dxa" w:w="100"/>
-              <w:bottom w:type="dxa" w:w="60"/>
-              <w:right w:type="dxa" w:w="100"/>
-            </w:tcMar>
-            <w:vAlign w:val="center"/>
-          </w:tcPr>
-          <w:p>
-            <w:pPr>
-              <w:jc w:val="left"/>
-            </w:pPr>
-            <w:r>
-              <w:rPr>
-                <w:b w:val="false"/>
-                <w:bCs w:val="false"/>
-                <w:sz w:val="19"/>
-                <w:szCs w:val="19"/>
-              </w:rPr>
-              <w:t xml:space="preserve">(c) A player's balance at a given date/time</w:t>
-            </w:r>
-          </w:p>
-        </w:tc>
-        <w:tc>
-          <w:tcPr>
-            <w:tcW w:type="dxa" w:w="5960"/>
-            <w:tcMar>
-              <w:top w:type="dxa" w:w="60"/>
-              <w:left w:type="dxa" w:w="100"/>
-              <w:bottom w:type="dxa" w:w="60"/>
-              <w:right w:type="dxa" w:w="100"/>
-            </w:tcMar>
-            <w:vAlign w:val="center"/>
-          </w:tcPr>
-          <w:p>
-            <w:pPr>
-              <w:jc w:val="left"/>
-            </w:pPr>
-            <w:r>
-              <w:rPr>
-                <w:b w:val="false"/>
-                <w:bCs w:val="false"/>
-                <w:sz w:val="19"/>
-                <w:szCs w:val="19"/>
-              </w:rPr>
-              <w:t xml:space="preserve">Reconstructed purely from the ledger (SUM), not a stored column — proves the design</w:t>
-            </w:r>
-          </w:p>
-        </w:tc>
-      </w:tr>
-      <w:tr>
-        <w:trPr>
-          <w:cantSplit/>
-        </w:trPr>
-        <w:tc>
-          <w:tcPr>
-            <w:tcW w:type="dxa" w:w="3400"/>
-            <w:shd w:fill="EEF3F8" w:val="clear"/>
-            <w:tcMar>
-              <w:top w:type="dxa" w:w="60"/>
-              <w:left w:type="dxa" w:w="100"/>
-              <w:bottom w:type="dxa" w:w="60"/>
-              <w:right w:type="dxa" w:w="100"/>
-            </w:tcMar>
-            <w:vAlign w:val="center"/>
-          </w:tcPr>
-          <w:p>
-            <w:pPr>
-              <w:jc w:val="left"/>
-            </w:pPr>
-            <w:r>
-              <w:rPr>
-                <w:b w:val="false"/>
-                <w:bCs w:val="false"/>
-                <w:sz w:val="19"/>
-                <w:szCs w:val="19"/>
-              </w:rPr>
-              <w:t xml:space="preserve">(d) Deposits that failed, then later succeeded</w:t>
-            </w:r>
-          </w:p>
-        </w:tc>
-        <w:tc>
-          <w:tcPr>
-            <w:tcW w:type="dxa" w:w="5960"/>
-            <w:shd w:fill="EEF3F8" w:val="clear"/>
-            <w:tcMar>
-              <w:top w:type="dxa" w:w="60"/>
-              <w:left w:type="dxa" w:w="100"/>
-              <w:bottom w:type="dxa" w:w="60"/>
-              <w:right w:type="dxa" w:w="100"/>
-            </w:tcMar>
-            <w:vAlign w:val="center"/>
-          </w:tcPr>
-          <w:p>
-            <w:pPr>
-              <w:jc w:val="left"/>
-            </w:pPr>
-            <w:r>
-              <w:rPr>
-                <w:b w:val="false"/>
-                <w:bCs w:val="false"/>
-                <w:sz w:val="19"/>
-                <w:szCs w:val="19"/>
-              </w:rPr>
-              <w:t xml:space="preserve">Self-join on deposit_attempts finds the failed→success pair, 4 minutes apart</w:t>
-            </w:r>
-          </w:p>
-        </w:tc>
-      </w:tr>
-    </w:tbl>
+        <w:t xml:space="preserve">23-table operational schema — full DDL in exercise3-schema-design/ddl.sql, verified to run clean on both MySQL 8.0 and MariaDB 10.11.</w:t>
+      </w:r>
+    </w:p>
     <w:p>
       <w:pPr>
         <w:pStyle w:val="Heading2"/>
@@ -5023,7 +4680,18 @@
         <w:spacing w:after="150" w:before="300"/>
       </w:pPr>
       <w:r>
-        <w:t xml:space="preserve">Operational design → reporting model</w:t>
+        <w:t xml:space="preserve">Design principles</w:t>
+      </w:r>
+    </w:p>
+    <w:p>
+      <w:pPr>
+        <w:pStyle w:val="Heading3"/>
+        <w:keepNext/>
+        <w:keepLines/>
+        <w:spacing w:after="100" w:before="200"/>
+      </w:pPr>
+      <w:r>
+        <w:t xml:space="preserve">Money and time</w:t>
       </w:r>
     </w:p>
     <w:p>
@@ -5031,18 +4699,95 @@
         <w:spacing w:after="160"/>
       </w:pPr>
       <w:r>
-        <w:t xml:space="preserve">A dbt project (dbt_jsb_assessment/) builds a star schema on top of this operational design: conformed dimensions (dim_player, dim_date, dim_campaign — dim_player_vip_tier_scd carries the same Type-2 history pattern through to the reporting layer) surrounding grain-specific facts (fact_bet, fact_wallet_transaction, fact_bonus_transaction). Two reusable marts answer queries (a) and (b) directly, and — extended during this review — the project now also covers Exercise 1's reconciliation as a scheduled, tested model.</w:t>
-      </w:r>
-    </w:p>
-    <w:p>
-      <w:pPr>
+        <w:t xml:space="preserve">DECIMAL(18,4) everywhere a balance or amount is stored — never FLOAT/DOUBLE. DATETIME(6), always UTC, columns suffixed _at_utc; MySQL's TIMESTAMP is deliberately avoided because it silently converts using the session/server time zone.</w:t>
+      </w:r>
+    </w:p>
+    <w:p>
+      <w:pPr>
+        <w:pStyle w:val="Heading3"/>
+        <w:keepNext/>
+        <w:keepLines/>
+        <w:spacing w:after="100" w:before="200"/>
+      </w:pPr>
+      <w:r>
+        <w:t xml:space="preserve">Balance correctness</w:t>
+      </w:r>
+    </w:p>
+    <w:p>
+      <w:pPr>
+        <w:spacing w:after="160"/>
+      </w:pPr>
+      <w:r>
+        <w:t xml:space="preserve">wallets.real_balance / bonus_balance are a materialised cache, not the source of truth — wallet_transactions (an append-only ledger) is. A balance at any point in time is SUM(credit) − SUM(debit) up to that moment, proven directly by example query (c) below. Corrections and reversals are new rows referencing the original (reversal_of_wallet_txn_id), never edits; every row carries a deterministic idempotency_key so replaying an event can never double-post it. A dbt test (assert_wallet_cache_matches_ledger) fails the build if the cache ever disagrees with the ledger.</w:t>
+      </w:r>
+    </w:p>
+    <w:p>
+      <w:pPr>
+        <w:pStyle w:val="Heading3"/>
+        <w:keepNext/>
+        <w:keepLines/>
+        <w:spacing w:after="100" w:before="200"/>
+      </w:pPr>
+      <w:r>
+        <w:t xml:space="preserve">History over time</w:t>
+      </w:r>
+    </w:p>
+    <w:p>
+      <w:pPr>
+        <w:spacing w:after="160"/>
+      </w:pPr>
+      <w:r>
+        <w:t xml:space="preserve">player_vip_tier_history and player_tag_history are SCD Type 2 (a new row per change, valid_from/valid_to), so "what tier was this player on 3 September" is answerable, not just "what tier are they now".</w:t>
+      </w:r>
+    </w:p>
+    <w:p>
+      <w:pPr>
+        <w:pStyle w:val="Heading3"/>
+        <w:keepNext/>
+        <w:keepLines/>
+        <w:spacing w:after="100" w:before="200"/>
+      </w:pPr>
+      <w:r>
+        <w:t xml:space="preserve">Protecting personal information</w:t>
+      </w:r>
+    </w:p>
+    <w:p>
+      <w:pPr>
+        <w:spacing w:after="160"/>
+      </w:pPr>
+      <w:r>
+        <w:t xml:space="preserve">player_identity is a separate table, joined only by player_id — every other table (bets, wallet transactions, bonuses) never sees a name or ID number. In production: application-layer encryption on sensitive fields, a dedicated low-privilege DB role, and every read of the identity table logged.</w:t>
+      </w:r>
+    </w:p>
+    <w:p>
+      <w:pPr>
+        <w:pStyle w:val="Heading2"/>
+        <w:keepNext/>
+        <w:keepLines/>
+        <w:spacing w:after="150" w:before="300"/>
+      </w:pPr>
+      <w:r>
+        <w:t xml:space="preserve">The four required queries — verified output</w:t>
+      </w:r>
+    </w:p>
+    <w:p>
+      <w:pPr>
+        <w:spacing w:after="160"/>
+      </w:pPr>
+      <w:r>
+        <w:t xml:space="preserve">Run against the seed data in exercise3-schema-design/seed.sql; identical results on MySQL 8.0 and MariaDB 10.11.</w:t>
+      </w:r>
+    </w:p>
+    <w:p>
+      <w:pPr>
+        <w:keepNext/>
         <w:spacing w:before="200"/>
         <w:jc w:val="center"/>
       </w:pPr>
       <w:r>
         <w:drawing>
           <wp:inline distT="0" distB="0" distL="0" distR="0">
-            <wp:extent cx="4191000" cy="4686300"/>
+            <wp:extent cx="5334000" cy="1314450"/>
             <wp:effectExtent t="0" r="0" b="0" l="0"/>
             <wp:docPr id="11" name="" descr="" title=""/>
             <wp:cNvGraphicFramePr>
@@ -5067,7 +4812,7 @@
                   <pic:spPr bwMode="auto">
                     <a:xfrm>
                       <a:off x="0" y="0"/>
-                      <a:ext cx="4191000" cy="4686300"/>
+                      <a:ext cx="5334000" cy="1314450"/>
                     </a:xfrm>
                     <a:prstGeom prst="rect">
                       <a:avLst/>
@@ -5093,17 +4838,328 @@
           <w:sz w:val="20"/>
           <w:szCs w:val="20"/>
         </w:rPr>
-        <w:t xml:space="preserve">dbt build across all three exercises: 67/67 pass (23 models, 44 tests), 0 errors.</w:t>
-      </w:r>
-    </w:p>
-    <w:p>
-      <w:pPr>
-        <w:pStyle w:val="Heading1"/>
-        <w:pageBreakBefore/>
-        <w:spacing w:after="200" w:before="400"/>
-      </w:pPr>
-      <w:r>
-        <w:t xml:space="preserve">Power BI — Reporting Data Model and Report</w:t>
+        <w:t xml:space="preserve">mysql -- jsb_platform -- example_queries.sql</w:t>
+      </w:r>
+    </w:p>
+    <w:tbl>
+      <w:tblPr>
+        <w:tblW w:type="dxa" w:w="9360"/>
+        <w:tblBorders>
+          <w:top w:val="single" w:color="auto" w:sz="4"/>
+          <w:left w:val="single" w:color="auto" w:sz="4"/>
+          <w:bottom w:val="single" w:color="auto" w:sz="4"/>
+          <w:right w:val="single" w:color="auto" w:sz="4"/>
+          <w:insideH w:val="single" w:color="auto" w:sz="4"/>
+          <w:insideV w:val="single" w:color="auto" w:sz="4"/>
+        </w:tblBorders>
+      </w:tblPr>
+      <w:tblGrid>
+        <w:gridCol w:w="3400"/>
+        <w:gridCol w:w="5960"/>
+      </w:tblGrid>
+      <w:tr>
+        <w:trPr>
+          <w:tblHeader/>
+        </w:trPr>
+        <w:tc>
+          <w:tcPr>
+            <w:tcW w:type="dxa" w:w="3400"/>
+            <w:shd w:fill="1F3864" w:val="clear"/>
+            <w:tcMar>
+              <w:top w:type="dxa" w:w="60"/>
+              <w:left w:type="dxa" w:w="100"/>
+              <w:bottom w:type="dxa" w:w="60"/>
+              <w:right w:type="dxa" w:w="100"/>
+            </w:tcMar>
+            <w:vAlign w:val="center"/>
+          </w:tcPr>
+          <w:p>
+            <w:pPr>
+              <w:jc w:val="left"/>
+            </w:pPr>
+            <w:r>
+              <w:rPr>
+                <w:b/>
+                <w:bCs/>
+                <w:color w:val="FFFFFF"/>
+                <w:sz w:val="19"/>
+                <w:szCs w:val="19"/>
+              </w:rPr>
+              <w:t xml:space="preserve">Query</w:t>
+            </w:r>
+          </w:p>
+        </w:tc>
+        <w:tc>
+          <w:tcPr>
+            <w:tcW w:type="dxa" w:w="5960"/>
+            <w:shd w:fill="1F3864" w:val="clear"/>
+            <w:tcMar>
+              <w:top w:type="dxa" w:w="60"/>
+              <w:left w:type="dxa" w:w="100"/>
+              <w:bottom w:type="dxa" w:w="60"/>
+              <w:right w:type="dxa" w:w="100"/>
+            </w:tcMar>
+            <w:vAlign w:val="center"/>
+          </w:tcPr>
+          <w:p>
+            <w:pPr>
+              <w:jc w:val="left"/>
+            </w:pPr>
+            <w:r>
+              <w:rPr>
+                <w:b/>
+                <w:bCs/>
+                <w:color w:val="FFFFFF"/>
+                <w:sz w:val="19"/>
+                <w:szCs w:val="19"/>
+              </w:rPr>
+              <w:t xml:space="preserve">Result</w:t>
+            </w:r>
+          </w:p>
+        </w:tc>
+      </w:tr>
+      <w:tr>
+        <w:trPr>
+          <w:cantSplit/>
+        </w:trPr>
+        <w:tc>
+          <w:tcPr>
+            <w:tcW w:type="dxa" w:w="3400"/>
+            <w:tcMar>
+              <w:top w:type="dxa" w:w="60"/>
+              <w:left w:type="dxa" w:w="100"/>
+              <w:bottom w:type="dxa" w:w="60"/>
+              <w:right w:type="dxa" w:w="100"/>
+            </w:tcMar>
+            <w:vAlign w:val="center"/>
+          </w:tcPr>
+          <w:p>
+            <w:pPr>
+              <w:jc w:val="left"/>
+            </w:pPr>
+            <w:r>
+              <w:rPr>
+                <w:b w:val="false"/>
+                <w:bCs w:val="false"/>
+                <w:sz w:val="19"/>
+                <w:szCs w:val="19"/>
+              </w:rPr>
+              <w:t xml:space="preserve">(a) NGR by product for a month</w:t>
+            </w:r>
+          </w:p>
+        </w:tc>
+        <w:tc>
+          <w:tcPr>
+            <w:tcW w:type="dxa" w:w="5960"/>
+            <w:tcMar>
+              <w:top w:type="dxa" w:w="60"/>
+              <w:left w:type="dxa" w:w="100"/>
+              <w:bottom w:type="dxa" w:w="60"/>
+              <w:right w:type="dxa" w:w="100"/>
+            </w:tcMar>
+            <w:vAlign w:val="center"/>
+          </w:tcPr>
+          <w:p>
+            <w:pPr>
+              <w:jc w:val="left"/>
+            </w:pPr>
+            <w:r>
+              <w:rPr>
+                <w:b w:val="false"/>
+                <w:bCs w:val="false"/>
+                <w:sz w:val="19"/>
+                <w:szCs w:val="19"/>
+              </w:rPr>
+              <w:t xml:space="preserve">sportsbook -160.00 · casino -30.00 · retail 100.00 (NAD)</w:t>
+            </w:r>
+          </w:p>
+        </w:tc>
+      </w:tr>
+      <w:tr>
+        <w:trPr>
+          <w:cantSplit/>
+        </w:trPr>
+        <w:tc>
+          <w:tcPr>
+            <w:tcW w:type="dxa" w:w="3400"/>
+            <w:shd w:fill="EEF3F8" w:val="clear"/>
+            <w:tcMar>
+              <w:top w:type="dxa" w:w="60"/>
+              <w:left w:type="dxa" w:w="100"/>
+              <w:bottom w:type="dxa" w:w="60"/>
+              <w:right w:type="dxa" w:w="100"/>
+            </w:tcMar>
+            <w:vAlign w:val="center"/>
+          </w:tcPr>
+          <w:p>
+            <w:pPr>
+              <w:jc w:val="left"/>
+            </w:pPr>
+            <w:r>
+              <w:rPr>
+                <w:b w:val="false"/>
+                <w:bCs w:val="false"/>
+                <w:sz w:val="19"/>
+                <w:szCs w:val="19"/>
+              </w:rPr>
+              <w:t xml:space="preserve">(b) Bonus cost as % of NGR, by campaign</w:t>
+            </w:r>
+          </w:p>
+        </w:tc>
+        <w:tc>
+          <w:tcPr>
+            <w:tcW w:type="dxa" w:w="5960"/>
+            <w:shd w:fill="EEF3F8" w:val="clear"/>
+            <w:tcMar>
+              <w:top w:type="dxa" w:w="60"/>
+              <w:left w:type="dxa" w:w="100"/>
+              <w:bottom w:type="dxa" w:w="60"/>
+              <w:right w:type="dxa" w:w="100"/>
+            </w:tcMar>
+            <w:vAlign w:val="center"/>
+          </w:tcPr>
+          <w:p>
+            <w:pPr>
+              <w:jc w:val="left"/>
+            </w:pPr>
+            <w:r>
+              <w:rPr>
+                <w:b w:val="false"/>
+                <w:bCs w:val="false"/>
+                <w:sz w:val="19"/>
+                <w:szCs w:val="19"/>
+              </w:rPr>
+              <w:t xml:space="preserve">Registration Bonus: -27.78% (matches the dbt mart's independently-computed figure exactly)</w:t>
+            </w:r>
+          </w:p>
+        </w:tc>
+      </w:tr>
+      <w:tr>
+        <w:trPr>
+          <w:cantSplit/>
+        </w:trPr>
+        <w:tc>
+          <w:tcPr>
+            <w:tcW w:type="dxa" w:w="3400"/>
+            <w:tcMar>
+              <w:top w:type="dxa" w:w="60"/>
+              <w:left w:type="dxa" w:w="100"/>
+              <w:bottom w:type="dxa" w:w="60"/>
+              <w:right w:type="dxa" w:w="100"/>
+            </w:tcMar>
+            <w:vAlign w:val="center"/>
+          </w:tcPr>
+          <w:p>
+            <w:pPr>
+              <w:jc w:val="left"/>
+            </w:pPr>
+            <w:r>
+              <w:rPr>
+                <w:b w:val="false"/>
+                <w:bCs w:val="false"/>
+                <w:sz w:val="19"/>
+                <w:szCs w:val="19"/>
+              </w:rPr>
+              <w:t xml:space="preserve">(c) A player's balance at a given date/time</w:t>
+            </w:r>
+          </w:p>
+        </w:tc>
+        <w:tc>
+          <w:tcPr>
+            <w:tcW w:type="dxa" w:w="5960"/>
+            <w:tcMar>
+              <w:top w:type="dxa" w:w="60"/>
+              <w:left w:type="dxa" w:w="100"/>
+              <w:bottom w:type="dxa" w:w="60"/>
+              <w:right w:type="dxa" w:w="100"/>
+            </w:tcMar>
+            <w:vAlign w:val="center"/>
+          </w:tcPr>
+          <w:p>
+            <w:pPr>
+              <w:jc w:val="left"/>
+            </w:pPr>
+            <w:r>
+              <w:rPr>
+                <w:b w:val="false"/>
+                <w:bCs w:val="false"/>
+                <w:sz w:val="19"/>
+                <w:szCs w:val="19"/>
+              </w:rPr>
+              <w:t xml:space="preserve">Reconstructed purely from the ledger (SUM), not a stored column — proves the design</w:t>
+            </w:r>
+          </w:p>
+        </w:tc>
+      </w:tr>
+      <w:tr>
+        <w:trPr>
+          <w:cantSplit/>
+        </w:trPr>
+        <w:tc>
+          <w:tcPr>
+            <w:tcW w:type="dxa" w:w="3400"/>
+            <w:shd w:fill="EEF3F8" w:val="clear"/>
+            <w:tcMar>
+              <w:top w:type="dxa" w:w="60"/>
+              <w:left w:type="dxa" w:w="100"/>
+              <w:bottom w:type="dxa" w:w="60"/>
+              <w:right w:type="dxa" w:w="100"/>
+            </w:tcMar>
+            <w:vAlign w:val="center"/>
+          </w:tcPr>
+          <w:p>
+            <w:pPr>
+              <w:jc w:val="left"/>
+            </w:pPr>
+            <w:r>
+              <w:rPr>
+                <w:b w:val="false"/>
+                <w:bCs w:val="false"/>
+                <w:sz w:val="19"/>
+                <w:szCs w:val="19"/>
+              </w:rPr>
+              <w:t xml:space="preserve">(d) Deposits that failed, then later succeeded</w:t>
+            </w:r>
+          </w:p>
+        </w:tc>
+        <w:tc>
+          <w:tcPr>
+            <w:tcW w:type="dxa" w:w="5960"/>
+            <w:shd w:fill="EEF3F8" w:val="clear"/>
+            <w:tcMar>
+              <w:top w:type="dxa" w:w="60"/>
+              <w:left w:type="dxa" w:w="100"/>
+              <w:bottom w:type="dxa" w:w="60"/>
+              <w:right w:type="dxa" w:w="100"/>
+            </w:tcMar>
+            <w:vAlign w:val="center"/>
+          </w:tcPr>
+          <w:p>
+            <w:pPr>
+              <w:jc w:val="left"/>
+            </w:pPr>
+            <w:r>
+              <w:rPr>
+                <w:b w:val="false"/>
+                <w:bCs w:val="false"/>
+                <w:sz w:val="19"/>
+                <w:szCs w:val="19"/>
+              </w:rPr>
+              <w:t xml:space="preserve">Self-join on deposit_attempts finds the failed→success pair, 4 minutes apart</w:t>
+            </w:r>
+          </w:p>
+        </w:tc>
+      </w:tr>
+    </w:tbl>
+    <w:p>
+      <w:pPr>
+        <w:pStyle w:val="Heading2"/>
+        <w:keepNext/>
+        <w:keepLines/>
+        <w:spacing w:after="150" w:before="300"/>
+      </w:pPr>
+      <w:r>
+        <w:t xml:space="preserve">Operational design → reporting model</w:t>
       </w:r>
     </w:p>
     <w:p>
@@ -5111,33 +5167,19 @@
         <w:spacing w:after="160"/>
       </w:pPr>
       <w:r>
-        <w:rPr>
-          <w:i/>
-          <w:iCs/>
-          <w:color w:val="595959"/>
-          <w:sz w:val="20"/>
-          <w:szCs w:val="20"/>
-        </w:rPr>
-        <w:t xml:space="preserve">Tools used: Power BI project format (.pbip), generated by a Python script from one set of definitions, with the dbt marts embedded as data.</w:t>
-      </w:r>
-    </w:p>
-    <w:p>
-      <w:pPr>
-        <w:spacing w:after="160"/>
-      </w:pPr>
-      <w:r>
-        <w:t xml:space="preserve">The dbt marts become a Power BI project, JSB_Assessment.pbip, covering all three exercises. The semantic model has 11 tables, 7 relationships and 26 DAX measures (20 calculations and 6 colour rules for the KPI tiles), and the report has four pages. The data is embedded in the project, so it opens and refreshes on any machine with no folder path or database connection to set up. The same script writes the model, the report pages, the readable DAX file and a list of expected values, then validates them, so the four cannot drift apart.</w:t>
-      </w:r>
-    </w:p>
-    <w:p>
-      <w:pPr>
+        <w:t xml:space="preserve">A dbt project (dbt_jsb_assessment/) builds a star schema on top of this operational design: conformed dimensions (dim_player, dim_date, dim_campaign — dim_player_vip_tier_scd carries the same Type-2 history pattern through to the reporting layer) surrounding grain-specific facts (fact_bet, fact_wallet_transaction, fact_bonus_transaction). Two reusable marts answer queries (a) and (b) directly, and — extended during this review — the project now also covers Exercise 1's reconciliation as a scheduled, tested model.</w:t>
+      </w:r>
+    </w:p>
+    <w:p>
+      <w:pPr>
+        <w:keepNext/>
         <w:spacing w:before="200"/>
         <w:jc w:val="center"/>
       </w:pPr>
       <w:r>
         <w:drawing>
           <wp:inline distT="0" distB="0" distL="0" distR="0">
-            <wp:extent cx="5715000" cy="3171825"/>
+            <wp:extent cx="4191000" cy="5400675"/>
             <wp:effectExtent t="0" r="0" b="0" l="0"/>
             <wp:docPr id="12" name="" descr="" title=""/>
             <wp:cNvGraphicFramePr>
@@ -5162,6 +5204,102 @@
                   <pic:spPr bwMode="auto">
                     <a:xfrm>
                       <a:off x="0" y="0"/>
+                      <a:ext cx="4191000" cy="5400675"/>
+                    </a:xfrm>
+                    <a:prstGeom prst="rect">
+                      <a:avLst/>
+                    </a:prstGeom>
+                  </pic:spPr>
+                </pic:pic>
+              </a:graphicData>
+            </a:graphic>
+          </wp:inline>
+        </w:drawing>
+      </w:r>
+    </w:p>
+    <w:p>
+      <w:pPr>
+        <w:spacing w:after="300" w:before="80"/>
+        <w:jc w:val="center"/>
+      </w:pPr>
+      <w:r>
+        <w:rPr>
+          <w:i/>
+          <w:iCs/>
+          <w:color w:val="595959"/>
+          <w:sz w:val="20"/>
+          <w:szCs w:val="20"/>
+        </w:rPr>
+        <w:t xml:space="preserve">dbt build across all three exercises: 78/78 pass (24 models, 54 tests), 0 errors. Every mart has a primary key; two models load incrementally.</w:t>
+      </w:r>
+    </w:p>
+    <w:p>
+      <w:pPr>
+        <w:pStyle w:val="Heading1"/>
+        <w:pageBreakBefore/>
+        <w:spacing w:after="200" w:before="400"/>
+      </w:pPr>
+      <w:r>
+        <w:t xml:space="preserve">Power BI — Reporting Data Model and Report</w:t>
+      </w:r>
+    </w:p>
+    <w:p>
+      <w:pPr>
+        <w:spacing w:after="160"/>
+      </w:pPr>
+      <w:r>
+        <w:rPr>
+          <w:i/>
+          <w:iCs/>
+          <w:color w:val="595959"/>
+          <w:sz w:val="20"/>
+          <w:szCs w:val="20"/>
+        </w:rPr>
+        <w:t xml:space="preserve">Tools used: Power BI project format (.pbip), generated by a Python script from one set of definitions, with the dbt marts embedded as data.</w:t>
+      </w:r>
+    </w:p>
+    <w:p>
+      <w:pPr>
+        <w:spacing w:after="160"/>
+      </w:pPr>
+      <w:r>
+        <w:t xml:space="preserve">The dbt marts become a Power BI project, JSB_Assessment.pbip, covering all three exercises. The semantic model has 11 tables, 7 relationships and 28 DAX measures (22 calculations and 6 colour rules for the KPI tiles), and the report has four pages. The data is embedded in the project, so it opens and refreshes on any machine with no folder path or database connection to set up. The same script writes the model, the report pages, the readable DAX file and a list of expected values, then validates them, so the four cannot drift apart.</w:t>
+      </w:r>
+    </w:p>
+    <w:p>
+      <w:pPr>
+        <w:keepNext/>
+        <w:spacing w:before="200"/>
+        <w:jc w:val="center"/>
+      </w:pPr>
+      <w:r>
+        <w:drawing>
+          <wp:inline distT="0" distB="0" distL="0" distR="0">
+            <wp:extent cx="5715000" cy="3171825"/>
+            <wp:effectExtent t="0" r="0" b="0" l="0"/>
+            <wp:docPr id="13" name="" descr="" title=""/>
+            <wp:cNvGraphicFramePr>
+              <a:graphicFrameLocks xmlns:a="http://schemas.openxmlformats.org/drawingml/2006/main" noChangeAspect="1"/>
+            </wp:cNvGraphicFramePr>
+            <a:graphic xmlns:a="http://schemas.openxmlformats.org/drawingml/2006/main">
+              <a:graphicData uri="http://schemas.openxmlformats.org/drawingml/2006/picture">
+                <pic:pic xmlns:pic="http://schemas.openxmlformats.org/drawingml/2006/picture">
+                  <pic:nvPicPr>
+                    <pic:cNvPr id="0" name="" descr=""/>
+                    <pic:cNvPicPr>
+                      <a:picLocks noChangeAspect="1" noChangeArrowheads="1"/>
+                    </pic:cNvPicPr>
+                  </pic:nvPicPr>
+                  <pic:blipFill>
+                    <a:blip r:embed="rId21" cstate="none"/>
+                    <a:srcRect/>
+                    <a:stretch>
+                      <a:fillRect/>
+                    </a:stretch>
+                  </pic:blipFill>
+                  <pic:spPr bwMode="auto">
+                    <a:xfrm>
+                      <a:off x="0" y="0"/>
                       <a:ext cx="5715000" cy="3171825"/>
                     </a:xfrm>
                     <a:prstGeom prst="rect">
@@ -6548,7 +6686,7 @@
                 <w:sz w:val="19"/>
                 <w:szCs w:val="19"/>
               </w:rPr>
-              <w:t xml:space="preserve">Transactions loaded / runs / rows rejected / retries</w:t>
+              <w:t xml:space="preserve">Transactions loaded / runs / rows rejected / API retries</w:t>
             </w:r>
           </w:p>
         </w:tc>
@@ -6574,7 +6712,7 @@
                 <w:sz w:val="19"/>
                 <w:szCs w:val="19"/>
               </w:rPr>
-              <w:t xml:space="preserve">1,024 / 3 / 1 / 1</w:t>
+              <w:t xml:space="preserve">1,024 / 4 / 1 / 1</w:t>
             </w:r>
           </w:p>
         </w:tc>

</xml_diff>

<commit_message>
Submission: add the Databricks section (workspace run, 32/32); refresh local evidence; Codex verification checklist
Co-Authored-By: Claude Opus 5.5 <noreply@anthropic.com>
Claude-Session: https://claude.ai/code/session_01GpY9vtVnSw1tgz3K4xTp8Q
</commit_message>
<xml_diff>
--- a/candidate-assessment/JSB_Candidate_Submission.docx
+++ b/candidate-assessment/JSB_Candidate_Submission.docx
@@ -81,7 +81,7 @@
           <w:sz w:val="20"/>
           <w:szCs w:val="20"/>
         </w:rPr>
-        <w:t xml:space="preserve">MySQL 8.0 · MariaDB 10.11 (cross-verified) · Python 3.11 · dbt-core 1.7 (dbt-mysql) · Postman / Newman · Mermaid · Power BI (data model)</w:t>
+        <w:t xml:space="preserve">MySQL 8.0 · MariaDB 10.11 (cross-verified) · Python 3.11 · dbt-core 1.7 (dbt-mysql) · Postman / Newman · Mermaid · Power BI (data model) · Databricks (Delta Lake, serverless)</w:t>
       </w:r>
     </w:p>
     <w:p>
@@ -187,6 +187,19 @@
       </w:pPr>
       <w:r>
         <w:t xml:space="preserve">Power BI — Reporting Data Model and Report</w:t>
+      </w:r>
+    </w:p>
+    <w:p>
+      <w:pPr>
+        <w:pStyle w:val="ListParagraph"/>
+        <w:numPr>
+          <w:ilvl w:val="0"/>
+          <w:numId w:val="2"/>
+        </w:numPr>
+        <w:spacing w:after="80"/>
+      </w:pPr>
+      <w:r>
+        <w:t xml:space="preserve">Databricks — The Same Three Exercises on Delta Lake</w:t>
       </w:r>
     </w:p>
     <w:p>
@@ -7225,6 +7238,988 @@
       </w:pPr>
       <w:r>
         <w:t xml:space="preserve">Building this layer also caught a real defect upstream. The seed data's wallet balance cache didn't match its own ledger, breaking the rule that the ledger is the truth. The seed was fixed, and a dbt test (assert_wallet_cache_matches_ledger) now fails the build if the two ever diverge. The test failed on the old data and passes on the corrected data.</w:t>
+      </w:r>
+    </w:p>
+    <w:p>
+      <w:pPr>
+        <w:pStyle w:val="Heading1"/>
+        <w:pageBreakBefore/>
+        <w:spacing w:after="200" w:before="400"/>
+      </w:pPr>
+      <w:r>
+        <w:t xml:space="preserve">Databricks — The Same Three Exercises on Delta Lake</w:t>
+      </w:r>
+    </w:p>
+    <w:p>
+      <w:pPr>
+        <w:spacing w:after="160"/>
+      </w:pPr>
+      <w:r>
+        <w:rPr>
+          <w:i/>
+          <w:iCs/>
+          <w:color w:val="595959"/>
+          <w:sz w:val="20"/>
+          <w:szCs w:val="20"/>
+        </w:rPr>
+        <w:t xml:space="preserve">Tools used: Databricks Free Edition (serverless compute, Unity Catalog, Delta Lake); open-source Spark 4 + Delta 4 for the local test.</w:t>
+      </w:r>
+    </w:p>
+    <w:p>
+      <w:pPr>
+        <w:spacing w:after="160"/>
+      </w:pPr>
+      <w:r>
+        <w:t xml:space="preserve">The three exercises also run as Databricks notebooks. build_notebooks.py generates them from the project's own files, so they can't drift from the MySQL version: the two Exercise 1 CSVs, the Exercise 2 mock API and the retry and validation code from ingest.py, and Exercise 3's ddl.sql translated to Delta plus seed.sql. Each notebook ends with checks that fail loudly if a figure differs from the MySQL and dbt results.</w:t>
+      </w:r>
+    </w:p>
+    <w:tbl>
+      <w:tblPr>
+        <w:tblW w:type="dxa" w:w="9360"/>
+        <w:tblBorders>
+          <w:top w:val="single" w:color="auto" w:sz="4"/>
+          <w:left w:val="single" w:color="auto" w:sz="4"/>
+          <w:bottom w:val="single" w:color="auto" w:sz="4"/>
+          <w:right w:val="single" w:color="auto" w:sz="4"/>
+          <w:insideH w:val="single" w:color="auto" w:sz="4"/>
+          <w:insideV w:val="single" w:color="auto" w:sz="4"/>
+        </w:tblBorders>
+      </w:tblPr>
+      <w:tblGrid>
+        <w:gridCol w:w="2600"/>
+        <w:gridCol w:w="3960"/>
+        <w:gridCol w:w="2800"/>
+      </w:tblGrid>
+      <w:tr>
+        <w:trPr>
+          <w:tblHeader/>
+        </w:trPr>
+        <w:tc>
+          <w:tcPr>
+            <w:tcW w:type="dxa" w:w="2600"/>
+            <w:shd w:fill="1F3864" w:val="clear"/>
+            <w:tcMar>
+              <w:top w:type="dxa" w:w="60"/>
+              <w:left w:type="dxa" w:w="100"/>
+              <w:bottom w:type="dxa" w:w="60"/>
+              <w:right w:type="dxa" w:w="100"/>
+            </w:tcMar>
+            <w:vAlign w:val="center"/>
+          </w:tcPr>
+          <w:p>
+            <w:pPr>
+              <w:jc w:val="left"/>
+            </w:pPr>
+            <w:r>
+              <w:rPr>
+                <w:b/>
+                <w:bCs/>
+                <w:color w:val="FFFFFF"/>
+                <w:sz w:val="19"/>
+                <w:szCs w:val="19"/>
+              </w:rPr>
+              <w:t xml:space="preserve">Notebook</w:t>
+            </w:r>
+          </w:p>
+        </w:tc>
+        <w:tc>
+          <w:tcPr>
+            <w:tcW w:type="dxa" w:w="3960"/>
+            <w:shd w:fill="1F3864" w:val="clear"/>
+            <w:tcMar>
+              <w:top w:type="dxa" w:w="60"/>
+              <w:left w:type="dxa" w:w="100"/>
+              <w:bottom w:type="dxa" w:w="60"/>
+              <w:right w:type="dxa" w:w="100"/>
+            </w:tcMar>
+            <w:vAlign w:val="center"/>
+          </w:tcPr>
+          <w:p>
+            <w:pPr>
+              <w:jc w:val="left"/>
+            </w:pPr>
+            <w:r>
+              <w:rPr>
+                <w:b/>
+                <w:bCs/>
+                <w:color w:val="FFFFFF"/>
+                <w:sz w:val="19"/>
+                <w:szCs w:val="19"/>
+              </w:rPr>
+              <w:t xml:space="preserve">What it does</w:t>
+            </w:r>
+          </w:p>
+        </w:tc>
+        <w:tc>
+          <w:tcPr>
+            <w:tcW w:type="dxa" w:w="2800"/>
+            <w:shd w:fill="1F3864" w:val="clear"/>
+            <w:tcMar>
+              <w:top w:type="dxa" w:w="60"/>
+              <w:left w:type="dxa" w:w="100"/>
+              <w:bottom w:type="dxa" w:w="60"/>
+              <w:right w:type="dxa" w:w="100"/>
+            </w:tcMar>
+            <w:vAlign w:val="center"/>
+          </w:tcPr>
+          <w:p>
+            <w:pPr>
+              <w:jc w:val="left"/>
+            </w:pPr>
+            <w:r>
+              <w:rPr>
+                <w:b/>
+                <w:bCs/>
+                <w:color w:val="FFFFFF"/>
+                <w:sz w:val="19"/>
+                <w:szCs w:val="19"/>
+              </w:rPr>
+              <w:t xml:space="preserve">Checks</w:t>
+            </w:r>
+          </w:p>
+        </w:tc>
+      </w:tr>
+      <w:tr>
+        <w:trPr>
+          <w:cantSplit/>
+        </w:trPr>
+        <w:tc>
+          <w:tcPr>
+            <w:tcW w:type="dxa" w:w="2600"/>
+            <w:tcMar>
+              <w:top w:type="dxa" w:w="60"/>
+              <w:left w:type="dxa" w:w="100"/>
+              <w:bottom w:type="dxa" w:w="60"/>
+              <w:right w:type="dxa" w:w="100"/>
+            </w:tcMar>
+            <w:vAlign w:val="center"/>
+          </w:tcPr>
+          <w:p>
+            <w:pPr>
+              <w:jc w:val="left"/>
+            </w:pPr>
+            <w:r>
+              <w:rPr>
+                <w:b w:val="false"/>
+                <w:bCs w:val="false"/>
+                <w:sz w:val="19"/>
+                <w:szCs w:val="19"/>
+              </w:rPr>
+              <w:t xml:space="preserve">01_exercise1_reconciliation</w:t>
+            </w:r>
+          </w:p>
+        </w:tc>
+        <w:tc>
+          <w:tcPr>
+            <w:tcW w:type="dxa" w:w="3960"/>
+            <w:tcMar>
+              <w:top w:type="dxa" w:w="60"/>
+              <w:left w:type="dxa" w:w="100"/>
+              <w:bottom w:type="dxa" w:w="60"/>
+              <w:right w:type="dxa" w:w="100"/>
+            </w:tcMar>
+            <w:vAlign w:val="center"/>
+          </w:tcPr>
+          <w:p>
+            <w:pPr>
+              <w:jc w:val="left"/>
+            </w:pPr>
+            <w:r>
+              <w:rPr>
+                <w:b w:val="false"/>
+                <w:bCs w:val="false"/>
+                <w:sz w:val="19"/>
+                <w:szCs w:val="19"/>
+              </w:rPr>
+              <w:t xml:space="preserve">Loads both files with an idempotent MERGE (twice, to prove no duplicates), categorises every row and builds the bridge</w:t>
+            </w:r>
+          </w:p>
+        </w:tc>
+        <w:tc>
+          <w:tcPr>
+            <w:tcW w:type="dxa" w:w="2800"/>
+            <w:tcMar>
+              <w:top w:type="dxa" w:w="60"/>
+              <w:left w:type="dxa" w:w="100"/>
+              <w:bottom w:type="dxa" w:w="60"/>
+              <w:right w:type="dxa" w:w="100"/>
+            </w:tcMar>
+            <w:vAlign w:val="center"/>
+          </w:tcPr>
+          <w:p>
+            <w:pPr>
+              <w:jc w:val="left"/>
+            </w:pPr>
+            <w:r>
+              <w:rPr>
+                <w:b w:val="false"/>
+                <w:bCs w:val="false"/>
+                <w:sz w:val="19"/>
+                <w:szCs w:val="19"/>
+              </w:rPr>
+              <w:t xml:space="preserve">17: every category's count and value equal MySQL/dbt; bridge residual 0.00</w:t>
+            </w:r>
+          </w:p>
+        </w:tc>
+      </w:tr>
+      <w:tr>
+        <w:trPr>
+          <w:cantSplit/>
+        </w:trPr>
+        <w:tc>
+          <w:tcPr>
+            <w:tcW w:type="dxa" w:w="2600"/>
+            <w:shd w:fill="EEF3F8" w:val="clear"/>
+            <w:tcMar>
+              <w:top w:type="dxa" w:w="60"/>
+              <w:left w:type="dxa" w:w="100"/>
+              <w:bottom w:type="dxa" w:w="60"/>
+              <w:right w:type="dxa" w:w="100"/>
+            </w:tcMar>
+            <w:vAlign w:val="center"/>
+          </w:tcPr>
+          <w:p>
+            <w:pPr>
+              <w:jc w:val="left"/>
+            </w:pPr>
+            <w:r>
+              <w:rPr>
+                <w:b w:val="false"/>
+                <w:bCs w:val="false"/>
+                <w:sz w:val="19"/>
+                <w:szCs w:val="19"/>
+              </w:rPr>
+              <w:t xml:space="preserve">02_exercise2_incremental_ingestion</w:t>
+            </w:r>
+          </w:p>
+        </w:tc>
+        <w:tc>
+          <w:tcPr>
+            <w:tcW w:type="dxa" w:w="3960"/>
+            <w:shd w:fill="EEF3F8" w:val="clear"/>
+            <w:tcMar>
+              <w:top w:type="dxa" w:w="60"/>
+              <w:left w:type="dxa" w:w="100"/>
+              <w:bottom w:type="dxa" w:w="60"/>
+              <w:right w:type="dxa" w:w="100"/>
+            </w:tcMar>
+            <w:vAlign w:val="center"/>
+          </w:tcPr>
+          <w:p>
+            <w:pPr>
+              <w:jc w:val="left"/>
+            </w:pPr>
+            <w:r>
+              <w:rPr>
+                <w:b w:val="false"/>
+                <w:bCs w:val="false"/>
+                <w:sz w:val="19"/>
+                <w:szCs w:val="19"/>
+              </w:rPr>
+              <w:t xml:space="preserve">Serves the supplied mock API inside the notebook and loads it into Delta with MERGE. Crashes on purpose between a page and its checkpoint, restarts, then loads new activity</w:t>
+            </w:r>
+          </w:p>
+        </w:tc>
+        <w:tc>
+          <w:tcPr>
+            <w:tcW w:type="dxa" w:w="2800"/>
+            <w:shd w:fill="EEF3F8" w:val="clear"/>
+            <w:tcMar>
+              <w:top w:type="dxa" w:w="60"/>
+              <w:left w:type="dxa" w:w="100"/>
+              <w:bottom w:type="dxa" w:w="60"/>
+              <w:right w:type="dxa" w:w="100"/>
+            </w:tcMar>
+            <w:vAlign w:val="center"/>
+          </w:tcPr>
+          <w:p>
+            <w:pPr>
+              <w:jc w:val="left"/>
+            </w:pPr>
+            <w:r>
+              <w:rPr>
+                <w:b w:val="false"/>
+                <w:bCs w:val="false"/>
+                <w:sz w:val="19"/>
+                <w:szCs w:val="19"/>
+              </w:rPr>
+              <w:t xml:space="preserve">6: table equals the API after the restart and after new activity; exactly 25 new and 40 changed; crashed run ABANDONED; one reject</w:t>
+            </w:r>
+          </w:p>
+        </w:tc>
+      </w:tr>
+      <w:tr>
+        <w:trPr>
+          <w:cantSplit/>
+        </w:trPr>
+        <w:tc>
+          <w:tcPr>
+            <w:tcW w:type="dxa" w:w="2600"/>
+            <w:tcMar>
+              <w:top w:type="dxa" w:w="60"/>
+              <w:left w:type="dxa" w:w="100"/>
+              <w:bottom w:type="dxa" w:w="60"/>
+              <w:right w:type="dxa" w:w="100"/>
+            </w:tcMar>
+            <w:vAlign w:val="center"/>
+          </w:tcPr>
+          <w:p>
+            <w:pPr>
+              <w:jc w:val="left"/>
+            </w:pPr>
+            <w:r>
+              <w:rPr>
+                <w:b w:val="false"/>
+                <w:bCs w:val="false"/>
+                <w:sz w:val="19"/>
+                <w:szCs w:val="19"/>
+              </w:rPr>
+              <w:t xml:space="preserve">03_exercise3_schema</w:t>
+            </w:r>
+          </w:p>
+        </w:tc>
+        <w:tc>
+          <w:tcPr>
+            <w:tcW w:type="dxa" w:w="3960"/>
+            <w:tcMar>
+              <w:top w:type="dxa" w:w="60"/>
+              <w:left w:type="dxa" w:w="100"/>
+              <w:bottom w:type="dxa" w:w="60"/>
+              <w:right w:type="dxa" w:w="100"/>
+            </w:tcMar>
+            <w:vAlign w:val="center"/>
+          </w:tcPr>
+          <w:p>
+            <w:pPr>
+              <w:jc w:val="left"/>
+            </w:pPr>
+            <w:r>
+              <w:rPr>
+                <w:b w:val="false"/>
+                <w:bCs w:val="false"/>
+                <w:sz w:val="19"/>
+                <w:szCs w:val="19"/>
+              </w:rPr>
+              <w:t xml:space="preserve">The 24 tables in Delta with 39 enforced CHECK constraints and Unity Catalog keys, the seed data and the four queries</w:t>
+            </w:r>
+          </w:p>
+        </w:tc>
+        <w:tc>
+          <w:tcPr>
+            <w:tcW w:type="dxa" w:w="2800"/>
+            <w:tcMar>
+              <w:top w:type="dxa" w:w="60"/>
+              <w:left w:type="dxa" w:w="100"/>
+              <w:bottom w:type="dxa" w:w="60"/>
+              <w:right w:type="dxa" w:w="100"/>
+            </w:tcMar>
+            <w:vAlign w:val="center"/>
+          </w:tcPr>
+          <w:p>
+            <w:pPr>
+              <w:jc w:val="left"/>
+            </w:pPr>
+            <w:r>
+              <w:rPr>
+                <w:b w:val="false"/>
+                <w:bCs w:val="false"/>
+                <w:sz w:val="19"/>
+                <w:szCs w:val="19"/>
+              </w:rPr>
+              <w:t xml:space="preserve">9: negative stake refused; no duplicate on 44 keys; no orphan on 32 foreign keys; the four answers; cache = ledger</w:t>
+            </w:r>
+          </w:p>
+        </w:tc>
+      </w:tr>
+    </w:tbl>
+    <w:p>
+      <w:pPr>
+        <w:pStyle w:val="Heading2"/>
+        <w:keepNext/>
+        <w:keepLines/>
+        <w:spacing w:after="150" w:before="300"/>
+      </w:pPr>
+      <w:r>
+        <w:t xml:space="preserve">Run on the Databricks workspace</w:t>
+      </w:r>
+    </w:p>
+    <w:p>
+      <w:pPr>
+        <w:spacing w:after="160"/>
+      </w:pPr>
+      <w:r>
+        <w:t xml:space="preserve">On 2026-09-28, one job ran the three notebooks in order (ex1 → ex2 → ex3) on serverless compute. All three tasks succeeded, and all 32 checks passed, the same total as the local test.</w:t>
+      </w:r>
+    </w:p>
+    <w:tbl>
+      <w:tblPr>
+        <w:tblW w:type="dxa" w:w="9360"/>
+        <w:tblBorders>
+          <w:top w:val="single" w:color="auto" w:sz="4"/>
+          <w:left w:val="single" w:color="auto" w:sz="4"/>
+          <w:bottom w:val="single" w:color="auto" w:sz="4"/>
+          <w:right w:val="single" w:color="auto" w:sz="4"/>
+          <w:insideH w:val="single" w:color="auto" w:sz="4"/>
+          <w:insideV w:val="single" w:color="auto" w:sz="4"/>
+        </w:tblBorders>
+      </w:tblPr>
+      <w:tblGrid>
+        <w:gridCol w:w="3800"/>
+        <w:gridCol w:w="2800"/>
+        <w:gridCol w:w="2760"/>
+      </w:tblGrid>
+      <w:tr>
+        <w:trPr>
+          <w:tblHeader/>
+        </w:trPr>
+        <w:tc>
+          <w:tcPr>
+            <w:tcW w:type="dxa" w:w="3800"/>
+            <w:shd w:fill="1F3864" w:val="clear"/>
+            <w:tcMar>
+              <w:top w:type="dxa" w:w="60"/>
+              <w:left w:type="dxa" w:w="100"/>
+              <w:bottom w:type="dxa" w:w="60"/>
+              <w:right w:type="dxa" w:w="100"/>
+            </w:tcMar>
+            <w:vAlign w:val="center"/>
+          </w:tcPr>
+          <w:p>
+            <w:pPr>
+              <w:jc w:val="left"/>
+            </w:pPr>
+            <w:r>
+              <w:rPr>
+                <w:b/>
+                <w:bCs/>
+                <w:color w:val="FFFFFF"/>
+                <w:sz w:val="19"/>
+                <w:szCs w:val="19"/>
+              </w:rPr>
+              <w:t xml:space="preserve">Task</w:t>
+            </w:r>
+          </w:p>
+        </w:tc>
+        <w:tc>
+          <w:tcPr>
+            <w:tcW w:type="dxa" w:w="2800"/>
+            <w:shd w:fill="1F3864" w:val="clear"/>
+            <w:tcMar>
+              <w:top w:type="dxa" w:w="60"/>
+              <w:left w:type="dxa" w:w="100"/>
+              <w:bottom w:type="dxa" w:w="60"/>
+              <w:right w:type="dxa" w:w="100"/>
+            </w:tcMar>
+            <w:vAlign w:val="center"/>
+          </w:tcPr>
+          <w:p>
+            <w:pPr>
+              <w:jc w:val="left"/>
+            </w:pPr>
+            <w:r>
+              <w:rPr>
+                <w:b/>
+                <w:bCs/>
+                <w:color w:val="FFFFFF"/>
+                <w:sz w:val="19"/>
+                <w:szCs w:val="19"/>
+              </w:rPr>
+              <w:t xml:space="preserve">Result</w:t>
+            </w:r>
+          </w:p>
+        </w:tc>
+        <w:tc>
+          <w:tcPr>
+            <w:tcW w:type="dxa" w:w="2760"/>
+            <w:shd w:fill="1F3864" w:val="clear"/>
+            <w:tcMar>
+              <w:top w:type="dxa" w:w="60"/>
+              <w:left w:type="dxa" w:w="100"/>
+              <w:bottom w:type="dxa" w:w="60"/>
+              <w:right w:type="dxa" w:w="100"/>
+            </w:tcMar>
+            <w:vAlign w:val="center"/>
+          </w:tcPr>
+          <w:p>
+            <w:pPr>
+              <w:jc w:val="left"/>
+            </w:pPr>
+            <w:r>
+              <w:rPr>
+                <w:b/>
+                <w:bCs/>
+                <w:color w:val="FFFFFF"/>
+                <w:sz w:val="19"/>
+                <w:szCs w:val="19"/>
+              </w:rPr>
+              <w:t xml:space="preserve">Run id</w:t>
+            </w:r>
+          </w:p>
+        </w:tc>
+      </w:tr>
+      <w:tr>
+        <w:trPr>
+          <w:cantSplit/>
+        </w:trPr>
+        <w:tc>
+          <w:tcPr>
+            <w:tcW w:type="dxa" w:w="3800"/>
+            <w:tcMar>
+              <w:top w:type="dxa" w:w="60"/>
+              <w:left w:type="dxa" w:w="100"/>
+              <w:bottom w:type="dxa" w:w="60"/>
+              <w:right w:type="dxa" w:w="100"/>
+            </w:tcMar>
+            <w:vAlign w:val="center"/>
+          </w:tcPr>
+          <w:p>
+            <w:pPr>
+              <w:jc w:val="left"/>
+            </w:pPr>
+            <w:r>
+              <w:rPr>
+                <w:b w:val="false"/>
+                <w:bCs w:val="false"/>
+                <w:sz w:val="19"/>
+                <w:szCs w:val="19"/>
+              </w:rPr>
+              <w:t xml:space="preserve">Job: JSB assessment – all exercises</w:t>
+            </w:r>
+          </w:p>
+        </w:tc>
+        <w:tc>
+          <w:tcPr>
+            <w:tcW w:type="dxa" w:w="2800"/>
+            <w:tcMar>
+              <w:top w:type="dxa" w:w="60"/>
+              <w:left w:type="dxa" w:w="100"/>
+              <w:bottom w:type="dxa" w:w="60"/>
+              <w:right w:type="dxa" w:w="100"/>
+            </w:tcMar>
+            <w:vAlign w:val="center"/>
+          </w:tcPr>
+          <w:p>
+            <w:pPr>
+              <w:jc w:val="left"/>
+            </w:pPr>
+            <w:r>
+              <w:rPr>
+                <w:b w:val="false"/>
+                <w:bCs w:val="false"/>
+                <w:sz w:val="19"/>
+                <w:szCs w:val="19"/>
+              </w:rPr>
+              <w:t xml:space="preserve">SUCCESS</w:t>
+            </w:r>
+          </w:p>
+        </w:tc>
+        <w:tc>
+          <w:tcPr>
+            <w:tcW w:type="dxa" w:w="2760"/>
+            <w:tcMar>
+              <w:top w:type="dxa" w:w="60"/>
+              <w:left w:type="dxa" w:w="100"/>
+              <w:bottom w:type="dxa" w:w="60"/>
+              <w:right w:type="dxa" w:w="100"/>
+            </w:tcMar>
+            <w:vAlign w:val="center"/>
+          </w:tcPr>
+          <w:p>
+            <w:pPr>
+              <w:jc w:val="left"/>
+            </w:pPr>
+            <w:r>
+              <w:rPr>
+                <w:b w:val="false"/>
+                <w:bCs w:val="false"/>
+                <w:sz w:val="19"/>
+                <w:szCs w:val="19"/>
+              </w:rPr>
+              <w:t xml:space="preserve">460654207301296</w:t>
+            </w:r>
+          </w:p>
+        </w:tc>
+      </w:tr>
+      <w:tr>
+        <w:trPr>
+          <w:cantSplit/>
+        </w:trPr>
+        <w:tc>
+          <w:tcPr>
+            <w:tcW w:type="dxa" w:w="3800"/>
+            <w:shd w:fill="EEF3F8" w:val="clear"/>
+            <w:tcMar>
+              <w:top w:type="dxa" w:w="60"/>
+              <w:left w:type="dxa" w:w="100"/>
+              <w:bottom w:type="dxa" w:w="60"/>
+              <w:right w:type="dxa" w:w="100"/>
+            </w:tcMar>
+            <w:vAlign w:val="center"/>
+          </w:tcPr>
+          <w:p>
+            <w:pPr>
+              <w:jc w:val="left"/>
+            </w:pPr>
+            <w:r>
+              <w:rPr>
+                <w:b w:val="false"/>
+                <w:bCs w:val="false"/>
+                <w:sz w:val="19"/>
+                <w:szCs w:val="19"/>
+              </w:rPr>
+              <w:t xml:space="preserve">ex1 — reconciliation</w:t>
+            </w:r>
+          </w:p>
+        </w:tc>
+        <w:tc>
+          <w:tcPr>
+            <w:tcW w:type="dxa" w:w="2800"/>
+            <w:shd w:fill="EEF3F8" w:val="clear"/>
+            <w:tcMar>
+              <w:top w:type="dxa" w:w="60"/>
+              <w:left w:type="dxa" w:w="100"/>
+              <w:bottom w:type="dxa" w:w="60"/>
+              <w:right w:type="dxa" w:w="100"/>
+            </w:tcMar>
+            <w:vAlign w:val="center"/>
+          </w:tcPr>
+          <w:p>
+            <w:pPr>
+              <w:jc w:val="left"/>
+            </w:pPr>
+            <w:r>
+              <w:rPr>
+                <w:b w:val="false"/>
+                <w:bCs w:val="false"/>
+                <w:sz w:val="19"/>
+                <w:szCs w:val="19"/>
+              </w:rPr>
+              <w:t xml:space="preserve">SUCCESS · 17/17 PASS</w:t>
+            </w:r>
+          </w:p>
+        </w:tc>
+        <w:tc>
+          <w:tcPr>
+            <w:tcW w:type="dxa" w:w="2760"/>
+            <w:shd w:fill="EEF3F8" w:val="clear"/>
+            <w:tcMar>
+              <w:top w:type="dxa" w:w="60"/>
+              <w:left w:type="dxa" w:w="100"/>
+              <w:bottom w:type="dxa" w:w="60"/>
+              <w:right w:type="dxa" w:w="100"/>
+            </w:tcMar>
+            <w:vAlign w:val="center"/>
+          </w:tcPr>
+          <w:p>
+            <w:pPr>
+              <w:jc w:val="left"/>
+            </w:pPr>
+            <w:r>
+              <w:rPr>
+                <w:b w:val="false"/>
+                <w:bCs w:val="false"/>
+                <w:sz w:val="19"/>
+                <w:szCs w:val="19"/>
+              </w:rPr>
+              <w:t xml:space="preserve">453545434689160</w:t>
+            </w:r>
+          </w:p>
+        </w:tc>
+      </w:tr>
+      <w:tr>
+        <w:trPr>
+          <w:cantSplit/>
+        </w:trPr>
+        <w:tc>
+          <w:tcPr>
+            <w:tcW w:type="dxa" w:w="3800"/>
+            <w:tcMar>
+              <w:top w:type="dxa" w:w="60"/>
+              <w:left w:type="dxa" w:w="100"/>
+              <w:bottom w:type="dxa" w:w="60"/>
+              <w:right w:type="dxa" w:w="100"/>
+            </w:tcMar>
+            <w:vAlign w:val="center"/>
+          </w:tcPr>
+          <w:p>
+            <w:pPr>
+              <w:jc w:val="left"/>
+            </w:pPr>
+            <w:r>
+              <w:rPr>
+                <w:b w:val="false"/>
+                <w:bCs w:val="false"/>
+                <w:sz w:val="19"/>
+                <w:szCs w:val="19"/>
+              </w:rPr>
+              <w:t xml:space="preserve">ex2 — incremental ingestion</w:t>
+            </w:r>
+          </w:p>
+        </w:tc>
+        <w:tc>
+          <w:tcPr>
+            <w:tcW w:type="dxa" w:w="2800"/>
+            <w:tcMar>
+              <w:top w:type="dxa" w:w="60"/>
+              <w:left w:type="dxa" w:w="100"/>
+              <w:bottom w:type="dxa" w:w="60"/>
+              <w:right w:type="dxa" w:w="100"/>
+            </w:tcMar>
+            <w:vAlign w:val="center"/>
+          </w:tcPr>
+          <w:p>
+            <w:pPr>
+              <w:jc w:val="left"/>
+            </w:pPr>
+            <w:r>
+              <w:rPr>
+                <w:b w:val="false"/>
+                <w:bCs w:val="false"/>
+                <w:sz w:val="19"/>
+                <w:szCs w:val="19"/>
+              </w:rPr>
+              <w:t xml:space="preserve">SUCCESS · 6/6 PASS</w:t>
+            </w:r>
+          </w:p>
+        </w:tc>
+        <w:tc>
+          <w:tcPr>
+            <w:tcW w:type="dxa" w:w="2760"/>
+            <w:tcMar>
+              <w:top w:type="dxa" w:w="60"/>
+              <w:left w:type="dxa" w:w="100"/>
+              <w:bottom w:type="dxa" w:w="60"/>
+              <w:right w:type="dxa" w:w="100"/>
+            </w:tcMar>
+            <w:vAlign w:val="center"/>
+          </w:tcPr>
+          <w:p>
+            <w:pPr>
+              <w:jc w:val="left"/>
+            </w:pPr>
+            <w:r>
+              <w:rPr>
+                <w:b w:val="false"/>
+                <w:bCs w:val="false"/>
+                <w:sz w:val="19"/>
+                <w:szCs w:val="19"/>
+              </w:rPr>
+              <w:t xml:space="preserve">340425981901042</w:t>
+            </w:r>
+          </w:p>
+        </w:tc>
+      </w:tr>
+      <w:tr>
+        <w:trPr>
+          <w:cantSplit/>
+        </w:trPr>
+        <w:tc>
+          <w:tcPr>
+            <w:tcW w:type="dxa" w:w="3800"/>
+            <w:shd w:fill="EEF3F8" w:val="clear"/>
+            <w:tcMar>
+              <w:top w:type="dxa" w:w="60"/>
+              <w:left w:type="dxa" w:w="100"/>
+              <w:bottom w:type="dxa" w:w="60"/>
+              <w:right w:type="dxa" w:w="100"/>
+            </w:tcMar>
+            <w:vAlign w:val="center"/>
+          </w:tcPr>
+          <w:p>
+            <w:pPr>
+              <w:jc w:val="left"/>
+            </w:pPr>
+            <w:r>
+              <w:rPr>
+                <w:b w:val="false"/>
+                <w:bCs w:val="false"/>
+                <w:sz w:val="19"/>
+                <w:szCs w:val="19"/>
+              </w:rPr>
+              <w:t xml:space="preserve">ex3 — schema design</w:t>
+            </w:r>
+          </w:p>
+        </w:tc>
+        <w:tc>
+          <w:tcPr>
+            <w:tcW w:type="dxa" w:w="2800"/>
+            <w:shd w:fill="EEF3F8" w:val="clear"/>
+            <w:tcMar>
+              <w:top w:type="dxa" w:w="60"/>
+              <w:left w:type="dxa" w:w="100"/>
+              <w:bottom w:type="dxa" w:w="60"/>
+              <w:right w:type="dxa" w:w="100"/>
+            </w:tcMar>
+            <w:vAlign w:val="center"/>
+          </w:tcPr>
+          <w:p>
+            <w:pPr>
+              <w:jc w:val="left"/>
+            </w:pPr>
+            <w:r>
+              <w:rPr>
+                <w:b w:val="false"/>
+                <w:bCs w:val="false"/>
+                <w:sz w:val="19"/>
+                <w:szCs w:val="19"/>
+              </w:rPr>
+              <w:t xml:space="preserve">SUCCESS · 9/9 PASS</w:t>
+            </w:r>
+          </w:p>
+        </w:tc>
+        <w:tc>
+          <w:tcPr>
+            <w:tcW w:type="dxa" w:w="2760"/>
+            <w:shd w:fill="EEF3F8" w:val="clear"/>
+            <w:tcMar>
+              <w:top w:type="dxa" w:w="60"/>
+              <w:left w:type="dxa" w:w="100"/>
+              <w:bottom w:type="dxa" w:w="60"/>
+              <w:right w:type="dxa" w:w="100"/>
+            </w:tcMar>
+            <w:vAlign w:val="center"/>
+          </w:tcPr>
+          <w:p>
+            <w:pPr>
+              <w:jc w:val="left"/>
+            </w:pPr>
+            <w:r>
+              <w:rPr>
+                <w:b w:val="false"/>
+                <w:bCs w:val="false"/>
+                <w:sz w:val="19"/>
+                <w:szCs w:val="19"/>
+              </w:rPr>
+              <w:t xml:space="preserve">685793852884612</w:t>
+            </w:r>
+          </w:p>
+        </w:tc>
+      </w:tr>
+    </w:tbl>
+    <w:p>
+      <w:pPr>
+        <w:spacing w:after="160"/>
+      </w:pPr>
+      <w:r>
+        <w:rPr>
+          <w:color w:val="595959"/>
+          <w:sz w:val="18"/>
+          <w:szCs w:val="18"/>
+        </w:rPr>
+        <w:t xml:space="preserve">Run pages: https://dbc-ea48b979-9753.cloud.databricks.com/?o=7474649344710062#job/308746372139777/run/&lt;run id&gt;. The full URLs are in databricks/evidence/databricks_run.md.</w:t>
+      </w:r>
+    </w:p>
+    <w:p>
+      <w:pPr>
+        <w:pStyle w:val="Heading2"/>
+        <w:keepNext/>
+        <w:keepLines/>
+        <w:spacing w:after="150" w:before="300"/>
+      </w:pPr>
+      <w:r>
+        <w:t xml:space="preserve">What Databricks changes, and what it needed</w:t>
+      </w:r>
+    </w:p>
+    <w:p>
+      <w:pPr>
+        <w:pStyle w:val="ListParagraph"/>
+        <w:numPr>
+          <w:ilvl w:val="0"/>
+          <w:numId w:val="2"/>
+        </w:numPr>
+        <w:spacing w:after="80"/>
+      </w:pPr>
+      <w:r>
+        <w:t xml:space="preserve">Keys: Unity Catalog primary and foreign keys are declared but not enforced, and there is no UNIQUE. Loads therefore MERGE on the key, and the notebooks check every key for duplicates and every foreign key for orphans. CHECK and NOT NULL are enforced by Delta, and the notebook proves it by trying a negative stake.</w:t>
+      </w:r>
+    </w:p>
+    <w:p>
+      <w:pPr>
+        <w:pStyle w:val="ListParagraph"/>
+        <w:numPr>
+          <w:ilvl w:val="0"/>
+          <w:numId w:val="2"/>
+        </w:numPr>
+        <w:spacing w:after="80"/>
+      </w:pPr>
+      <w:r>
+        <w:t xml:space="preserve">Restartability: Delta commits one table at a time, so writes are ordered data → rejects → checkpoint → counters, each an idempotent MERGE. A crash re-reads at most one page, and re-applying it changes nothing. Setting the job's Maximum concurrent runs to 1 replaces MySQL's GET_LOCK.</w:t>
+      </w:r>
+    </w:p>
+    <w:p>
+      <w:pPr>
+        <w:pStyle w:val="ListParagraph"/>
+        <w:numPr>
+          <w:ilvl w:val="0"/>
+          <w:numId w:val="2"/>
+        </w:numPr>
+        <w:spacing w:after="80"/>
+      </w:pPr>
+      <w:r>
+        <w:t xml:space="preserve">Two fixes only a real serverless run could show. First, serverless refuses connections to 127.0.0.1 and to fixed ports, so on Databricks the mock API binds an OS-assigned port and is called by host name. Second, Delta requires a generated column's type to match exactly, and DECIMAL(18,4) + DECIMAL(18,4) is DECIMAL(19,4), so generated expressions are now cast to the column type. No check was changed, and the local test still passes.</w:t>
+      </w:r>
+    </w:p>
+    <w:p>
+      <w:pPr>
+        <w:keepNext/>
+        <w:spacing w:before="200"/>
+        <w:jc w:val="center"/>
+      </w:pPr>
+      <w:r>
+        <w:drawing>
+          <wp:inline distT="0" distB="0" distL="0" distR="0">
+            <wp:extent cx="4953000" cy="2771775"/>
+            <wp:effectExtent t="0" r="0" b="0" l="0"/>
+            <wp:docPr id="15" name="" descr="" title=""/>
+            <wp:cNvGraphicFramePr>
+              <a:graphicFrameLocks xmlns:a="http://schemas.openxmlformats.org/drawingml/2006/main" noChangeAspect="1"/>
+            </wp:cNvGraphicFramePr>
+            <a:graphic xmlns:a="http://schemas.openxmlformats.org/drawingml/2006/main">
+              <a:graphicData uri="http://schemas.openxmlformats.org/drawingml/2006/picture">
+                <pic:pic xmlns:pic="http://schemas.openxmlformats.org/drawingml/2006/picture">
+                  <pic:nvPicPr>
+                    <pic:cNvPr id="0" name="" descr=""/>
+                    <pic:cNvPicPr>
+                      <a:picLocks noChangeAspect="1" noChangeArrowheads="1"/>
+                    </pic:cNvPicPr>
+                  </pic:nvPicPr>
+                  <pic:blipFill>
+                    <a:blip r:embed="rId23" cstate="none"/>
+                    <a:srcRect/>
+                    <a:stretch>
+                      <a:fillRect/>
+                    </a:stretch>
+                  </pic:blipFill>
+                  <pic:spPr bwMode="auto">
+                    <a:xfrm>
+                      <a:off x="0" y="0"/>
+                      <a:ext cx="4953000" cy="2771775"/>
+                    </a:xfrm>
+                    <a:prstGeom prst="rect">
+                      <a:avLst/>
+                    </a:prstGeom>
+                  </pic:spPr>
+                </pic:pic>
+              </a:graphicData>
+            </a:graphic>
+          </wp:inline>
+        </w:drawing>
+      </w:r>
+    </w:p>
+    <w:p>
+      <w:pPr>
+        <w:spacing w:after="300" w:before="80"/>
+        <w:jc w:val="center"/>
+      </w:pPr>
+      <w:r>
+        <w:rPr>
+          <w:i/>
+          <w:iCs/>
+          <w:color w:val="595959"/>
+          <w:sz w:val="20"/>
+          <w:szCs w:val="20"/>
+        </w:rPr>
+        <w:t xml:space="preserve">The same notebooks on open-source Spark 4 + Delta 4 (run_local.py): all 32 checks pass.</w:t>
       </w:r>
     </w:p>
     <w:sectPr>

</xml_diff>

<commit_message>
QA-08 package provenance, QA-09 traceability in the submission, QA-10 evidence manifest and proof queries
Co-Authored-By: Claude Opus 5.5 <noreply@anthropic.com>
Claude-Session: https://claude.ai/code/session_01GpY9vtVnSw1tgz3K4xTp8Q
</commit_message>
<xml_diff>
--- a/candidate-assessment/JSB_Candidate_Submission.docx
+++ b/candidate-assessment/JSB_Candidate_Submission.docx
@@ -124,6 +124,14 @@
       </w:pPr>
       <w:r>
         <w:t xml:space="preserve">A short note on assumptions: per the brief's instruction not to stop on ambiguity, every assumption made is written down at the point it's used, not buried — for example the definition of NGR used in Exercise 3, and the fee-rounding tolerance used in Exercise 1.</w:t>
+      </w:r>
+    </w:p>
+    <w:p>
+      <w:pPr>
+        <w:spacing w:after="160"/>
+      </w:pPr>
+      <w:r>
+        <w:t xml:space="preserve">Evidence: evidence/README.md lists every image in this document with its SHA-256 and the commit that produced it. It marks which are real application screenshots (Windows XAMPP, MySQL Workbench, Postman, PyCharm) and which are terminal output from a logged run redrawn as an image, whose text log is the primary evidence. INDEX.md maps each requirement to its evidence.</w:t>
       </w:r>
     </w:p>
     <w:p>
@@ -5058,6 +5066,51 @@
       </w:pPr>
       <w:r>
         <w:t xml:space="preserve">Indexes on the access paths: ledger (wallet, time) and (player, time) for balances; bets (product, settled time) for NGR; deposits (player, time); bonus links for campaign cost; (player, valid_to) on each history table.</w:t>
+      </w:r>
+    </w:p>
+    <w:p>
+      <w:pPr>
+        <w:pStyle w:val="Heading3"/>
+        <w:keepNext/>
+        <w:keepLines/>
+        <w:spacing w:after="100" w:before="200"/>
+      </w:pPr>
+      <w:r>
+        <w:t xml:space="preserve">Requirements traceability and deliberate extensions</w:t>
+      </w:r>
+    </w:p>
+    <w:p>
+      <w:pPr>
+        <w:spacing w:after="160"/>
+      </w:pPr>
+      <w:r>
+        <w:t xml:space="preserve">The brief names capabilities, not tables. Every one of the 24 tables maps to a stated requirement, either directly or as the normalisation or control that requirement needs. The full matrix is in SCHEMA_REQUIREMENTS_TRACEABILITY.md, and no table is an unexplained extension.</w:t>
+      </w:r>
+    </w:p>
+    <w:p>
+      <w:pPr>
+        <w:pStyle w:val="ListParagraph"/>
+        <w:numPr>
+          <w:ilvl w:val="0"/>
+          <w:numId w:val="2"/>
+        </w:numPr>
+        <w:spacing w:after="80"/>
+      </w:pPr>
+      <w:r>
+        <w:t xml:space="preserve">player_status_history is retained on purpose. The brief lists player status (active, blocked, self-excluded) and KYC status and asks for regulator queries. A current value on players can't answer "was this player self-excluded, or unverified, when the bet was placed?"; an SCD2 history can. It sits alongside the VIP-tier and tag histories the brief names.</w:t>
+      </w:r>
+    </w:p>
+    <w:p>
+      <w:pPr>
+        <w:pStyle w:val="ListParagraph"/>
+        <w:numPr>
+          <w:ilvl w:val="0"/>
+          <w:numId w:val="2"/>
+        </w:numPr>
+        <w:spacing w:after="80"/>
+      </w:pPr>
+      <w:r>
+        <w:t xml:space="preserve">Normalisation the brief implies: payment_methods; the product detail and reference tables (sports events and legs; casino games and providers; retail locations and devices); and bonus_rollover_events, which makes rollover progress auditable. There is no separate bonus-outcome table: player_bonuses.status and resolved_at_utc record completed, expired and forfeited.</w:t>
       </w:r>
     </w:p>
     <w:p>

</xml_diff>

<commit_message>
Submission PDF: genuine Windows dbt, Power BI Desktop and Databricks captures (23 pages); sign-off request to Codex
Co-Authored-By: Claude Opus 5.5 <noreply@anthropic.com>
Claude-Session: https://claude.ai/code/session_01GpY9vtVnSw1tgz3K4xTp8Q
</commit_message>
<xml_diff>
--- a/candidate-assessment/JSB_Candidate_Submission.docx
+++ b/candidate-assessment/JSB_Candidate_Submission.docx
@@ -5716,35 +5716,10 @@
     </w:p>
     <w:p>
       <w:pPr>
-        <w:pStyle w:val="Heading1"/>
-        <w:pageBreakBefore/>
-        <w:spacing w:after="200" w:before="400"/>
-      </w:pPr>
-      <w:r>
-        <w:t xml:space="preserve">Power BI — Reporting Data Model and Report</w:t>
-      </w:r>
-    </w:p>
-    <w:p>
-      <w:pPr>
         <w:spacing w:after="160"/>
       </w:pPr>
       <w:r>
-        <w:rPr>
-          <w:i/>
-          <w:iCs/>
-          <w:color w:val="595959"/>
-          <w:sz w:val="20"/>
-          <w:szCs w:val="20"/>
-        </w:rPr>
-        <w:t xml:space="preserve">Tools used: Power BI project format (.pbip), generated by a Python script from one set of definitions, with the dbt marts embedded as data.</w:t>
-      </w:r>
-    </w:p>
-    <w:p>
-      <w:pPr>
-        <w:spacing w:after="160"/>
-      </w:pPr>
-      <w:r>
-        <w:t xml:space="preserve">The dbt marts become a Power BI project, JSB_Assessment.pbip, covering all three exercises. The semantic model has 11 tables, 7 relationships and 28 DAX measures (22 calculations and 6 colour rules for the KPI tiles), and the report has four pages. The data is embedded in the project, so it opens and refreshes on any machine with no folder path or database connection to set up. The same script writes the model, the report pages, the readable DAX file and a list of expected values, then validates them, so the four cannot drift apart.</w:t>
+        <w:t xml:space="preserve">The same build on the candidate's Windows PC (XAMPP MariaDB 10.4, dbt 1.7.20): staging 11/11, marts 13/13, dbt test 54/54, and 43 tables + 11 views = 54 objects with no table missing a primary key. The genuine captures are in local_load/screenshots/ and listed in evidence/README.md.</w:t>
       </w:r>
     </w:p>
     <w:p>
@@ -5756,7 +5731,7 @@
       <w:r>
         <w:drawing>
           <wp:inline distT="0" distB="0" distL="0" distR="0">
-            <wp:extent cx="5715000" cy="3238500"/>
+            <wp:extent cx="4953000" cy="2781300"/>
             <wp:effectExtent t="0" r="0" b="0" l="0"/>
             <wp:docPr id="14" name="" descr="" title=""/>
             <wp:cNvGraphicFramePr>
@@ -5781,6 +5756,102 @@
                   <pic:spPr bwMode="auto">
                     <a:xfrm>
                       <a:off x="0" y="0"/>
+                      <a:ext cx="4953000" cy="2781300"/>
+                    </a:xfrm>
+                    <a:prstGeom prst="rect">
+                      <a:avLst/>
+                    </a:prstGeom>
+                  </pic:spPr>
+                </pic:pic>
+              </a:graphicData>
+            </a:graphic>
+          </wp:inline>
+        </w:drawing>
+      </w:r>
+    </w:p>
+    <w:p>
+      <w:pPr>
+        <w:spacing w:after="300" w:before="80"/>
+        <w:jc w:val="center"/>
+      </w:pPr>
+      <w:r>
+        <w:rPr>
+          <w:i/>
+          <w:iCs/>
+          <w:color w:val="595959"/>
+          <w:sz w:val="20"/>
+          <w:szCs w:val="20"/>
+        </w:rPr>
+        <w:t xml:space="preserve">Windows Command Prompt (genuine capture): dbt test on XAMPP MariaDB. PASS=54 WARN=0 ERROR=0.</w:t>
+      </w:r>
+    </w:p>
+    <w:p>
+      <w:pPr>
+        <w:pStyle w:val="Heading1"/>
+        <w:pageBreakBefore/>
+        <w:spacing w:after="200" w:before="400"/>
+      </w:pPr>
+      <w:r>
+        <w:t xml:space="preserve">Power BI — Reporting Data Model and Report</w:t>
+      </w:r>
+    </w:p>
+    <w:p>
+      <w:pPr>
+        <w:spacing w:after="160"/>
+      </w:pPr>
+      <w:r>
+        <w:rPr>
+          <w:i/>
+          <w:iCs/>
+          <w:color w:val="595959"/>
+          <w:sz w:val="20"/>
+          <w:szCs w:val="20"/>
+        </w:rPr>
+        <w:t xml:space="preserve">Tools used: Power BI project format (.pbip), generated by a Python script from one set of definitions, with the dbt marts embedded as data.</w:t>
+      </w:r>
+    </w:p>
+    <w:p>
+      <w:pPr>
+        <w:spacing w:after="160"/>
+      </w:pPr>
+      <w:r>
+        <w:t xml:space="preserve">The dbt marts become a Power BI project, JSB_Assessment.pbip, covering all three exercises. The semantic model has 11 tables, 7 relationships and 28 DAX measures (22 calculations and 6 colour rules for the KPI tiles), and the report has four pages. The data is embedded in the project, so it opens and refreshes on any machine with no folder path or database connection to set up. The same script writes the model, the report pages, the readable DAX file and a list of expected values, then validates them, so the four cannot drift apart.</w:t>
+      </w:r>
+    </w:p>
+    <w:p>
+      <w:pPr>
+        <w:keepNext/>
+        <w:spacing w:before="200"/>
+        <w:jc w:val="center"/>
+      </w:pPr>
+      <w:r>
+        <w:drawing>
+          <wp:inline distT="0" distB="0" distL="0" distR="0">
+            <wp:extent cx="5715000" cy="3238500"/>
+            <wp:effectExtent t="0" r="0" b="0" l="0"/>
+            <wp:docPr id="15" name="" descr="" title=""/>
+            <wp:cNvGraphicFramePr>
+              <a:graphicFrameLocks xmlns:a="http://schemas.openxmlformats.org/drawingml/2006/main" noChangeAspect="1"/>
+            </wp:cNvGraphicFramePr>
+            <a:graphic xmlns:a="http://schemas.openxmlformats.org/drawingml/2006/main">
+              <a:graphicData uri="http://schemas.openxmlformats.org/drawingml/2006/picture">
+                <pic:pic xmlns:pic="http://schemas.openxmlformats.org/drawingml/2006/picture">
+                  <pic:nvPicPr>
+                    <pic:cNvPr id="0" name="" descr=""/>
+                    <pic:cNvPicPr>
+                      <a:picLocks noChangeAspect="1" noChangeArrowheads="1"/>
+                    </pic:cNvPicPr>
+                  </pic:nvPicPr>
+                  <pic:blipFill>
+                    <a:blip r:embed="rId23" cstate="none"/>
+                    <a:srcRect/>
+                    <a:stretch>
+                      <a:fillRect/>
+                    </a:stretch>
+                  </pic:blipFill>
+                  <pic:spPr bwMode="auto">
+                    <a:xfrm>
+                      <a:off x="0" y="0"/>
                       <a:ext cx="5715000" cy="3238500"/>
                     </a:xfrm>
                     <a:prstGeom prst="rect">
@@ -7274,7 +7345,133 @@
         <w:spacing w:after="160"/>
       </w:pPr>
       <w:r>
-        <w:t xml:space="preserve">Power BI Desktop doesn't run in the Linux environment this was built in. Instead, the build script checks that every visual field, sort and DAX reference resolves to the model, that every CSV's columns match the model, that every relationship column exists, and that no filter path is ambiguous. A negative test confirmed it rejects an ambiguous relationship and a misspelled measure. The report layout follows the supplied Demo.pbix (Power BI Desktop 2.130, CY24SU06 theme).</w:t>
+        <w:t xml:space="preserve">The project was opened in Power BI Desktop on Windows from a fresh unzip of the minimal package (JSB_PowerBI_v7.zip) and refreshed. Every visible value matches expected_values.md, which is computed independently in pandas. The captures below are genuine Power BI Desktop screenshots; all four are hashed in evidence/README.md.</w:t>
+      </w:r>
+    </w:p>
+    <w:p>
+      <w:pPr>
+        <w:keepNext/>
+        <w:spacing w:before="200"/>
+        <w:jc w:val="center"/>
+      </w:pPr>
+      <w:r>
+        <w:drawing>
+          <wp:inline distT="0" distB="0" distL="0" distR="0">
+            <wp:extent cx="5334000" cy="3000375"/>
+            <wp:effectExtent t="0" r="0" b="0" l="0"/>
+            <wp:docPr id="16" name="" descr="" title=""/>
+            <wp:cNvGraphicFramePr>
+              <a:graphicFrameLocks xmlns:a="http://schemas.openxmlformats.org/drawingml/2006/main" noChangeAspect="1"/>
+            </wp:cNvGraphicFramePr>
+            <a:graphic xmlns:a="http://schemas.openxmlformats.org/drawingml/2006/main">
+              <a:graphicData uri="http://schemas.openxmlformats.org/drawingml/2006/picture">
+                <pic:pic xmlns:pic="http://schemas.openxmlformats.org/drawingml/2006/picture">
+                  <pic:nvPicPr>
+                    <pic:cNvPr id="0" name="" descr=""/>
+                    <pic:cNvPicPr>
+                      <a:picLocks noChangeAspect="1" noChangeArrowheads="1"/>
+                    </pic:cNvPicPr>
+                  </pic:nvPicPr>
+                  <pic:blipFill>
+                    <a:blip r:embed="rId24" cstate="none"/>
+                    <a:srcRect/>
+                    <a:stretch>
+                      <a:fillRect/>
+                    </a:stretch>
+                  </pic:blipFill>
+                  <pic:spPr bwMode="auto">
+                    <a:xfrm>
+                      <a:off x="0" y="0"/>
+                      <a:ext cx="5334000" cy="3000375"/>
+                    </a:xfrm>
+                    <a:prstGeom prst="rect">
+                      <a:avLst/>
+                    </a:prstGeom>
+                  </pic:spPr>
+                </pic:pic>
+              </a:graphicData>
+            </a:graphic>
+          </wp:inline>
+        </w:drawing>
+      </w:r>
+    </w:p>
+    <w:p>
+      <w:pPr>
+        <w:spacing w:after="300" w:before="80"/>
+        <w:jc w:val="center"/>
+      </w:pPr>
+      <w:r>
+        <w:rPr>
+          <w:i/>
+          <w:iCs/>
+          <w:color w:val="595959"/>
+          <w:sz w:val="20"/>
+          <w:szCs w:val="20"/>
+        </w:rPr>
+        <w:t xml:space="preserve">Power BI Desktop, page 1 after refresh: GGR 260.00, bonus cost 40.00, NGR 220.00, liability 10.00; Registration Bonus 40.00 = 18.18% of NGR.</w:t>
+      </w:r>
+    </w:p>
+    <w:p>
+      <w:pPr>
+        <w:keepNext/>
+        <w:spacing w:before="200"/>
+        <w:jc w:val="center"/>
+      </w:pPr>
+      <w:r>
+        <w:drawing>
+          <wp:inline distT="0" distB="0" distL="0" distR="0">
+            <wp:extent cx="5334000" cy="3000375"/>
+            <wp:effectExtent t="0" r="0" b="0" l="0"/>
+            <wp:docPr id="17" name="" descr="" title=""/>
+            <wp:cNvGraphicFramePr>
+              <a:graphicFrameLocks xmlns:a="http://schemas.openxmlformats.org/drawingml/2006/main" noChangeAspect="1"/>
+            </wp:cNvGraphicFramePr>
+            <a:graphic xmlns:a="http://schemas.openxmlformats.org/drawingml/2006/main">
+              <a:graphicData uri="http://schemas.openxmlformats.org/drawingml/2006/picture">
+                <pic:pic xmlns:pic="http://schemas.openxmlformats.org/drawingml/2006/picture">
+                  <pic:nvPicPr>
+                    <pic:cNvPr id="0" name="" descr=""/>
+                    <pic:cNvPicPr>
+                      <a:picLocks noChangeAspect="1" noChangeArrowheads="1"/>
+                    </pic:cNvPicPr>
+                  </pic:nvPicPr>
+                  <pic:blipFill>
+                    <a:blip r:embed="rId25" cstate="none"/>
+                    <a:srcRect/>
+                    <a:stretch>
+                      <a:fillRect/>
+                    </a:stretch>
+                  </pic:blipFill>
+                  <pic:spPr bwMode="auto">
+                    <a:xfrm>
+                      <a:off x="0" y="0"/>
+                      <a:ext cx="5334000" cy="3000375"/>
+                    </a:xfrm>
+                    <a:prstGeom prst="rect">
+                      <a:avLst/>
+                    </a:prstGeom>
+                  </pic:spPr>
+                </pic:pic>
+              </a:graphicData>
+            </a:graphic>
+          </wp:inline>
+        </w:drawing>
+      </w:r>
+    </w:p>
+    <w:p>
+      <w:pPr>
+        <w:spacing w:after="300" w:before="80"/>
+        <w:jc w:val="center"/>
+      </w:pPr>
+      <w:r>
+        <w:rPr>
+          <w:i/>
+          <w:iCs/>
+          <w:color w:val="595959"/>
+          <w:sz w:val="20"/>
+          <w:szCs w:val="20"/>
+        </w:rPr>
+        <w:t xml:space="preserve">Power BI Desktop, page 3: 274 matched, 43 exceptions, Act Now R3,150.00, bridge residual R0.00; the waterfall from R218,280 to R217,980.</w:t>
       </w:r>
     </w:p>
     <w:p>
@@ -7282,7 +7479,7 @@
         <w:spacing w:after="160"/>
       </w:pPr>
       <w:r>
-        <w:t xml:space="preserve">Power BI Desktop has since opened an earlier version of this project on a Windows machine: the pages and visuals loaded. The one failure was that the data folder path didn't exist on that machine, and embedding the data removes that step. If Desktop objects to the project for any other reason, powerbi/README.md gives a five-minute manual route to build the same model in Demo.pbix.</w:t>
+        <w:t xml:space="preserve">Before the desktop run, the build script had already checked that every visual field, sort and DAX reference resolves to the model, that every CSV's columns match it, and that no filter path is ambiguous. The data embedded in the model was also checked, row for row, against the exported tables.</w:t>
       </w:r>
     </w:p>
     <w:p>
@@ -8221,9 +8418,9 @@
       <w:r>
         <w:drawing>
           <wp:inline distT="0" distB="0" distL="0" distR="0">
-            <wp:extent cx="4953000" cy="2771775"/>
+            <wp:extent cx="5334000" cy="3000375"/>
             <wp:effectExtent t="0" r="0" b="0" l="0"/>
-            <wp:docPr id="15" name="" descr="" title=""/>
+            <wp:docPr id="18" name="" descr="" title=""/>
             <wp:cNvGraphicFramePr>
               <a:graphicFrameLocks xmlns:a="http://schemas.openxmlformats.org/drawingml/2006/main" noChangeAspect="1"/>
             </wp:cNvGraphicFramePr>
@@ -8237,7 +8434,70 @@
                     </pic:cNvPicPr>
                   </pic:nvPicPr>
                   <pic:blipFill>
-                    <a:blip r:embed="rId23" cstate="none"/>
+                    <a:blip r:embed="rId26" cstate="none"/>
+                    <a:srcRect/>
+                    <a:stretch>
+                      <a:fillRect/>
+                    </a:stretch>
+                  </pic:blipFill>
+                  <pic:spPr bwMode="auto">
+                    <a:xfrm>
+                      <a:off x="0" y="0"/>
+                      <a:ext cx="5334000" cy="3000375"/>
+                    </a:xfrm>
+                    <a:prstGeom prst="rect">
+                      <a:avLst/>
+                    </a:prstGeom>
+                  </pic:spPr>
+                </pic:pic>
+              </a:graphicData>
+            </a:graphic>
+          </wp:inline>
+        </w:drawing>
+      </w:r>
+    </w:p>
+    <w:p>
+      <w:pPr>
+        <w:spacing w:after="300" w:before="80"/>
+        <w:jc w:val="center"/>
+      </w:pPr>
+      <w:r>
+        <w:rPr>
+          <w:i/>
+          <w:iCs/>
+          <w:color w:val="595959"/>
+          <w:sz w:val="20"/>
+          <w:szCs w:val="20"/>
+        </w:rPr>
+        <w:t xml:space="preserve">Databricks Jobs UI (genuine capture): the job run with ex1, ex2 and ex3 all Succeeded on serverless.</w:t>
+      </w:r>
+    </w:p>
+    <w:p>
+      <w:pPr>
+        <w:keepNext/>
+        <w:spacing w:before="200"/>
+        <w:jc w:val="center"/>
+      </w:pPr>
+      <w:r>
+        <w:drawing>
+          <wp:inline distT="0" distB="0" distL="0" distR="0">
+            <wp:extent cx="4953000" cy="2771775"/>
+            <wp:effectExtent t="0" r="0" b="0" l="0"/>
+            <wp:docPr id="19" name="" descr="" title=""/>
+            <wp:cNvGraphicFramePr>
+              <a:graphicFrameLocks xmlns:a="http://schemas.openxmlformats.org/drawingml/2006/main" noChangeAspect="1"/>
+            </wp:cNvGraphicFramePr>
+            <a:graphic xmlns:a="http://schemas.openxmlformats.org/drawingml/2006/main">
+              <a:graphicData uri="http://schemas.openxmlformats.org/drawingml/2006/picture">
+                <pic:pic xmlns:pic="http://schemas.openxmlformats.org/drawingml/2006/picture">
+                  <pic:nvPicPr>
+                    <pic:cNvPr id="0" name="" descr=""/>
+                    <pic:cNvPicPr>
+                      <a:picLocks noChangeAspect="1" noChangeArrowheads="1"/>
+                    </pic:cNvPicPr>
+                  </pic:nvPicPr>
+                  <pic:blipFill>
+                    <a:blip r:embed="rId27" cstate="none"/>
                     <a:srcRect/>
                     <a:stretch>
                       <a:fillRect/>

</xml_diff>

<commit_message>
QA-17: Bronze/Silver/Gold example callout in §3.8, START_HERE.md and final ZIP builder
- eBook §3.8: the three requested lines as an example callout only; no schema,
  dbt, Databricks or Power BI change. PDF rebuilt (29 pages, pages re-measured).
- START_HERE.md: reading order, expected results, how to run, integrity check,
  and the repository-only items left out of the ZIP.
- submission_build/build_final_zip.py: deterministic ZIP from one commit.
- README/INDEX: remove stale docx/v7/P1-P7 wording and a stray PowerShell escape.

Co-Authored-By: Claude Opus 5.5 <noreply@anthropic.com>
Claude-Session: https://claude.ai/code/session_01GpY9vtVnSw1tgz3K4xTp8Q
</commit_message>
<xml_diff>
--- a/candidate-assessment/JSB_Candidate_Submission.docx
+++ b/candidate-assessment/JSB_Candidate_Submission.docx
@@ -14132,6 +14132,116 @@
           <w:szCs w:val="18"/>
         </w:rPr>
         <w:t xml:space="preserve">Exercise 3 · task 7: how the operational design becomes a reporting model (facts and dimensions) for dashboards. Chapter 4 builds it in Power BI</w:t>
+      </w:r>
+    </w:p>
+    <w:tbl>
+      <w:tblPr>
+        <w:tblW w:type="dxa" w:w="9360"/>
+        <w:tblBorders>
+          <w:top w:val="single" w:color="auto" w:sz="4"/>
+          <w:left w:val="single" w:color="auto" w:sz="4"/>
+          <w:bottom w:val="single" w:color="auto" w:sz="4"/>
+          <w:right w:val="single" w:color="auto" w:sz="4"/>
+          <w:insideH w:val="single" w:color="auto" w:sz="4"/>
+          <w:insideV w:val="single" w:color="auto" w:sz="4"/>
+        </w:tblBorders>
+      </w:tblPr>
+      <w:tblGrid>
+        <w:gridCol w:w="9360"/>
+      </w:tblGrid>
+      <w:tr>
+        <w:tc>
+          <w:tcPr>
+            <w:tcW w:type="dxa" w:w="9360"/>
+            <w:tcBorders>
+              <w:top w:val="single" w:color="0E7C7B" w:sz="8"/>
+              <w:left w:val="single" w:color="0E7C7B" w:sz="8"/>
+              <w:bottom w:val="single" w:color="0E7C7B" w:sz="8"/>
+              <w:right w:val="single" w:color="0E7C7B" w:sz="8"/>
+            </w:tcBorders>
+            <w:shd w:fill="EEF3F8" w:val="clear"/>
+            <w:tcMar>
+              <w:top w:type="dxa" w:w="120"/>
+              <w:left w:type="dxa" w:w="180"/>
+              <w:bottom w:type="dxa" w:w="120"/>
+              <w:right w:type="dxa" w:w="180"/>
+            </w:tcMar>
+          </w:tcPr>
+          <w:p>
+            <w:pPr>
+              <w:spacing w:after="80"/>
+            </w:pPr>
+            <w:r>
+              <w:rPr>
+                <w:b/>
+                <w:bCs/>
+                <w:color w:val="1F3864"/>
+                <w:sz w:val="21"/>
+                <w:szCs w:val="21"/>
+              </w:rPr>
+              <w:t xml:space="preserve">Example: the data in three layers</w:t>
+            </w:r>
+          </w:p>
+          <w:p>
+            <w:pPr>
+              <w:pStyle w:val="ListParagraph"/>
+              <w:numPr>
+                <w:ilvl w:val="0"/>
+                <w:numId w:val="2"/>
+              </w:numPr>
+              <w:spacing w:after="40"/>
+            </w:pPr>
+            <w:r>
+              <w:rPr>
+                <w:sz w:val="19"/>
+                <w:szCs w:val="19"/>
+              </w:rPr>
+              <w:t xml:space="preserve">Bronze: raw CSVs and API records.</w:t>
+            </w:r>
+          </w:p>
+          <w:p>
+            <w:pPr>
+              <w:pStyle w:val="ListParagraph"/>
+              <w:numPr>
+                <w:ilvl w:val="0"/>
+                <w:numId w:val="2"/>
+              </w:numPr>
+              <w:spacing w:after="40"/>
+            </w:pPr>
+            <w:r>
+              <w:rPr>
+                <w:sz w:val="19"/>
+                <w:szCs w:val="19"/>
+              </w:rPr>
+              <w:t xml:space="preserve">Silver: cleaned and matched data.</w:t>
+            </w:r>
+          </w:p>
+          <w:p>
+            <w:pPr>
+              <w:pStyle w:val="ListParagraph"/>
+              <w:numPr>
+                <w:ilvl w:val="0"/>
+                <w:numId w:val="2"/>
+              </w:numPr>
+              <w:spacing w:after="40"/>
+            </w:pPr>
+            <w:r>
+              <w:rPr>
+                <w:sz w:val="19"/>
+                <w:szCs w:val="19"/>
+              </w:rPr>
+              <w:t xml:space="preserve">Gold: the reconciliation, NGR and bonus-cost tables that Power BI reads.</w:t>
+            </w:r>
+          </w:p>
+        </w:tc>
+      </w:tr>
+    </w:tbl>
+    <w:p>
+      <w:pPr>
+        <w:spacing w:after="160"/>
+      </w:pPr>
+      <w:r>
+        <w:t xml:space="preserve"/>
       </w:r>
     </w:p>
     <w:p>

</xml_diff>

<commit_message>
QA-19: pixel-crop 19 genuine captures to the producing application
Removes the Claude app, browser tabs/address bar, desktop and taskbar. Pixel crop
only (no resize/retouch), checked against the original region by
submission_build/crop_screenshots.py; crop boxes and original/new SHA-256 in
evidence/screenshot_crops.md. Evidence hashes updated; eBook PDF/DOCX rebuilt
(29 pages, page numbers unchanged). No data, model or result changed.

Co-Authored-By: Claude Opus 5.5 <noreply@anthropic.com>
Claude-Session: https://claude.ai/code/session_01GpY9vtVnSw1tgz3K4xTp8Q
</commit_message>
<xml_diff>
--- a/candidate-assessment/JSB_Candidate_Submission.docx
+++ b/candidate-assessment/JSB_Candidate_Submission.docx
@@ -11911,7 +11911,7 @@
       <w:r>
         <w:drawing>
           <wp:inline distT="0" distB="0" distL="0" distR="0">
-            <wp:extent cx="4953000" cy="2781300"/>
+            <wp:extent cx="4953000" cy="2638425"/>
             <wp:effectExtent t="0" r="0" b="0" l="0"/>
             <wp:docPr id="6" name="" descr="" title=""/>
             <wp:cNvGraphicFramePr>
@@ -11936,7 +11936,7 @@
                   <pic:spPr bwMode="auto">
                     <a:xfrm>
                       <a:off x="0" y="0"/>
-                      <a:ext cx="4953000" cy="2781300"/>
+                      <a:ext cx="4953000" cy="2638425"/>
                     </a:xfrm>
                     <a:prstGeom prst="rect">
                       <a:avLst/>
@@ -11974,7 +11974,7 @@
       <w:r>
         <w:drawing>
           <wp:inline distT="0" distB="0" distL="0" distR="0">
-            <wp:extent cx="4953000" cy="2781300"/>
+            <wp:extent cx="4953000" cy="2638425"/>
             <wp:effectExtent t="0" r="0" b="0" l="0"/>
             <wp:docPr id="7" name="" descr="" title=""/>
             <wp:cNvGraphicFramePr>
@@ -11999,7 +11999,7 @@
                   <pic:spPr bwMode="auto">
                     <a:xfrm>
                       <a:off x="0" y="0"/>
-                      <a:ext cx="4953000" cy="2781300"/>
+                      <a:ext cx="4953000" cy="2638425"/>
                     </a:xfrm>
                     <a:prstGeom prst="rect">
                       <a:avLst/>
@@ -14332,7 +14332,7 @@
       <w:r>
         <w:drawing>
           <wp:inline distT="0" distB="0" distL="0" distR="0">
-            <wp:extent cx="4953000" cy="2781300"/>
+            <wp:extent cx="4953000" cy="2638425"/>
             <wp:effectExtent t="0" r="0" b="0" l="0"/>
             <wp:docPr id="12" name="" descr="" title=""/>
             <wp:cNvGraphicFramePr>
@@ -14357,7 +14357,7 @@
                   <pic:spPr bwMode="auto">
                     <a:xfrm>
                       <a:off x="0" y="0"/>
-                      <a:ext cx="4953000" cy="2781300"/>
+                      <a:ext cx="4953000" cy="2638425"/>
                     </a:xfrm>
                     <a:prstGeom prst="rect">
                       <a:avLst/>
@@ -15987,7 +15987,7 @@
       <w:r>
         <w:drawing>
           <wp:inline distT="0" distB="0" distL="0" distR="0">
-            <wp:extent cx="5334000" cy="3000375"/>
+            <wp:extent cx="5334000" cy="2838450"/>
             <wp:effectExtent t="0" r="0" b="0" l="0"/>
             <wp:docPr id="14" name="" descr="" title=""/>
             <wp:cNvGraphicFramePr>
@@ -16012,7 +16012,7 @@
                   <pic:spPr bwMode="auto">
                     <a:xfrm>
                       <a:off x="0" y="0"/>
-                      <a:ext cx="5334000" cy="3000375"/>
+                      <a:ext cx="5334000" cy="2838450"/>
                     </a:xfrm>
                     <a:prstGeom prst="rect">
                       <a:avLst/>
@@ -16050,7 +16050,7 @@
       <w:r>
         <w:drawing>
           <wp:inline distT="0" distB="0" distL="0" distR="0">
-            <wp:extent cx="5334000" cy="3000375"/>
+            <wp:extent cx="5334000" cy="2838450"/>
             <wp:effectExtent t="0" r="0" b="0" l="0"/>
             <wp:docPr id="15" name="" descr="" title=""/>
             <wp:cNvGraphicFramePr>
@@ -16075,7 +16075,7 @@
                   <pic:spPr bwMode="auto">
                     <a:xfrm>
                       <a:off x="0" y="0"/>
-                      <a:ext cx="5334000" cy="3000375"/>
+                      <a:ext cx="5334000" cy="2838450"/>
                     </a:xfrm>
                     <a:prstGeom prst="rect">
                       <a:avLst/>
@@ -16113,7 +16113,7 @@
       <w:r>
         <w:drawing>
           <wp:inline distT="0" distB="0" distL="0" distR="0">
-            <wp:extent cx="5334000" cy="3000375"/>
+            <wp:extent cx="5334000" cy="2838450"/>
             <wp:effectExtent t="0" r="0" b="0" l="0"/>
             <wp:docPr id="16" name="" descr="" title=""/>
             <wp:cNvGraphicFramePr>
@@ -16138,7 +16138,7 @@
                   <pic:spPr bwMode="auto">
                     <a:xfrm>
                       <a:off x="0" y="0"/>
-                      <a:ext cx="5334000" cy="3000375"/>
+                      <a:ext cx="5334000" cy="2838450"/>
                     </a:xfrm>
                     <a:prstGeom prst="rect">
                       <a:avLst/>
@@ -16176,7 +16176,7 @@
       <w:r>
         <w:drawing>
           <wp:inline distT="0" distB="0" distL="0" distR="0">
-            <wp:extent cx="5334000" cy="3000375"/>
+            <wp:extent cx="5334000" cy="2838450"/>
             <wp:effectExtent t="0" r="0" b="0" l="0"/>
             <wp:docPr id="17" name="" descr="" title=""/>
             <wp:cNvGraphicFramePr>
@@ -16201,7 +16201,7 @@
                   <pic:spPr bwMode="auto">
                     <a:xfrm>
                       <a:off x="0" y="0"/>
-                      <a:ext cx="5334000" cy="3000375"/>
+                      <a:ext cx="5334000" cy="2838450"/>
                     </a:xfrm>
                     <a:prstGeom prst="rect">
                       <a:avLst/>
@@ -16239,7 +16239,7 @@
       <w:r>
         <w:drawing>
           <wp:inline distT="0" distB="0" distL="0" distR="0">
-            <wp:extent cx="5334000" cy="3000375"/>
+            <wp:extent cx="5334000" cy="2838450"/>
             <wp:effectExtent t="0" r="0" b="0" l="0"/>
             <wp:docPr id="18" name="" descr="" title=""/>
             <wp:cNvGraphicFramePr>
@@ -16264,7 +16264,7 @@
                   <pic:spPr bwMode="auto">
                     <a:xfrm>
                       <a:off x="0" y="0"/>
-                      <a:ext cx="5334000" cy="3000375"/>
+                      <a:ext cx="5334000" cy="2838450"/>
                     </a:xfrm>
                     <a:prstGeom prst="rect">
                       <a:avLst/>
@@ -17266,7 +17266,7 @@
       <w:r>
         <w:drawing>
           <wp:inline distT="0" distB="0" distL="0" distR="0">
-            <wp:extent cx="5334000" cy="3000375"/>
+            <wp:extent cx="5334000" cy="2533650"/>
             <wp:effectExtent t="0" r="0" b="0" l="0"/>
             <wp:docPr id="19" name="" descr="" title=""/>
             <wp:cNvGraphicFramePr>
@@ -17291,7 +17291,7 @@
                   <pic:spPr bwMode="auto">
                     <a:xfrm>
                       <a:off x="0" y="0"/>
-                      <a:ext cx="5334000" cy="3000375"/>
+                      <a:ext cx="5334000" cy="2533650"/>
                     </a:xfrm>
                     <a:prstGeom prst="rect">
                       <a:avLst/>

</xml_diff>

<commit_message>
QA-21: accurate database versions, AI-use disclosure, executive summary
- Replace the unsupported MySQL 8.0 run claims with the evidenced MariaDB 10.11
  and 10.4 (XAMPP), MySQL-compatible, in the eBook, READMEs, notes and SQL headers
  (load SQL regenerated: comment lines only, data rows identical).
- Cover and README: state that AI coding assistants were used in development
  and review.
- Page 3: executive summary, one paragraph per exercise, with the 49/43
  explanation beside the first reconciliation figure; Power BI and Databricks
  labelled optional extensions. Still 29 pages.

Co-Authored-By: Claude Opus 5.5 <noreply@anthropic.com>
Claude-Session: https://claude.ai/code/session_01GpY9vtVnSw1tgz3K4xTp8Q
</commit_message>
<xml_diff>
--- a/candidate-assessment/JSB_Candidate_Submission.docx
+++ b/candidate-assessment/JSB_Candidate_Submission.docx
@@ -81,12 +81,26 @@
           <w:sz w:val="20"/>
           <w:szCs w:val="20"/>
         </w:rPr>
-        <w:t xml:space="preserve">MySQL 8.0 · MariaDB 10.11 and 10.4 (XAMPP) · Python 3.11 · dbt-core 1.7 (dbt-mysql) · Postman / Newman · Mermaid · Power BI (data model) · Databricks (Delta Lake, serverless)</w:t>
-      </w:r>
-    </w:p>
-    <w:p>
-      <w:pPr>
-        <w:spacing w:before="2000"/>
+        <w:t xml:space="preserve">MariaDB 10.11 and MariaDB 10.4 (XAMPP), MySQL-compatible · Python 3.11 · dbt-core 1.7 (dbt-mysql) · Postman / Newman · Mermaid · Power BI (data model) · Databricks (Delta Lake, serverless)</w:t>
+      </w:r>
+    </w:p>
+    <w:p>
+      <w:pPr>
+        <w:spacing w:after="200"/>
+        <w:jc w:val="center"/>
+      </w:pPr>
+      <w:r>
+        <w:rPr>
+          <w:color w:val="595959"/>
+          <w:sz w:val="20"/>
+          <w:szCs w:val="20"/>
+        </w:rPr>
+        <w:t xml:space="preserve">AI coding assistants (Claude Code and Codex) were used during development and review. The submitted code and results were executed and checked, including on my own Windows PC, and I can explain the design decisions.</w:t>
+      </w:r>
+    </w:p>
+    <w:p>
+      <w:pPr>
+        <w:spacing w:before="1400"/>
         <w:jc w:val="center"/>
       </w:pPr>
       <w:r>
@@ -2354,7 +2368,7 @@
                 <w:sz w:val="19"/>
                 <w:szCs w:val="19"/>
               </w:rPr>
-              <w:t xml:space="preserve">Power BI — Reporting Data Model and Report</w:t>
+              <w:t xml:space="preserve">Power BI — Reporting Model and Report (optional extension)</w:t>
             </w:r>
           </w:p>
         </w:tc>
@@ -2772,7 +2786,7 @@
                 <w:sz w:val="19"/>
                 <w:szCs w:val="19"/>
               </w:rPr>
-              <w:t xml:space="preserve">Databricks — The Same Three Exercises on Delta Lake</w:t>
+              <w:t xml:space="preserve">Databricks — The Three Exercises on Delta Lake (optional extension)</w:t>
             </w:r>
           </w:p>
         </w:tc>
@@ -3072,7 +3086,7 @@
         <w:spacing w:after="100"/>
       </w:pPr>
       <w:r>
-        <w:t xml:space="preserve">1.  Start with the requirements index (next page). Every line of the brief is listed with the section and page that answers it.</w:t>
+        <w:t xml:space="preserve">1.  The requirements index (next page) lists every line of the brief with the section and page that answers it.</w:t>
       </w:r>
     </w:p>
     <w:p>
@@ -3080,23 +3094,7 @@
         <w:spacing w:after="100"/>
       </w:pPr>
       <w:r>
-        <w:t xml:space="preserve">2.  Each exercise opens with a short summary. Every section starts with an "Answers" tag naming the part of the brief it answers.</w:t>
-      </w:r>
-    </w:p>
-    <w:p>
-      <w:pPr>
-        <w:spacing w:after="100"/>
-      </w:pPr>
-      <w:r>
-        <w:t xml:space="preserve">3.  Sections are numbered: chapter 1 is Exercise 1, chapter 2 is Exercise 2, chapter 3 is Exercise 3. Chapters 4 and 5 go beyond the brief: the Power BI report and the Databricks run.</w:t>
-      </w:r>
-    </w:p>
-    <w:p>
-      <w:pPr>
-        <w:spacing w:after="100"/>
-      </w:pPr>
-      <w:r>
-        <w:t xml:space="preserve">4.  Assumptions are written down where they are used (for example §1.4 and the definitions in §3.7). All data is fictitious, amounts are NAD and times are UTC.</w:t>
+        <w:t xml:space="preserve">2.  Chapters 1–3 are the three required exercises. Each opens with a short summary, and every section starts with an "Answers" tag naming the part of the brief it answers. Chapters 4 and 5 are optional extensions.</w:t>
       </w:r>
     </w:p>
     <w:p>
@@ -3104,7 +3102,7 @@
         <w:spacing w:after="240"/>
       </w:pPr>
       <w:r>
-        <w:t xml:space="preserve">5.  Every figure comes from running the code. Appendix A lists the files and how to reproduce them; evidence/README.md lists every screenshot with its SHA-256, marking which are real application captures and which are logged terminal output redrawn as an image.</w:t>
+        <w:t xml:space="preserve">3.  Assumptions are written where they are used (§1.4, §3.7). Data is fictitious, amounts are NAD and times UTC. Appendix A and evidence/README.md show how every figure and screenshot was produced.</w:t>
       </w:r>
     </w:p>
     <w:p>
@@ -3115,537 +3113,94 @@
         <w:spacing w:after="100" w:before="200"/>
       </w:pPr>
       <w:r>
-        <w:t xml:space="preserve">Results at a glance</w:t>
-      </w:r>
-    </w:p>
-    <w:tbl>
-      <w:tblPr>
-        <w:tblW w:type="dxa" w:w="9360"/>
-        <w:tblBorders>
-          <w:top w:val="single" w:color="auto" w:sz="4"/>
-          <w:left w:val="single" w:color="auto" w:sz="4"/>
-          <w:bottom w:val="single" w:color="auto" w:sz="4"/>
-          <w:right w:val="single" w:color="auto" w:sz="4"/>
-          <w:insideH w:val="single" w:color="auto" w:sz="4"/>
-          <w:insideV w:val="single" w:color="auto" w:sz="4"/>
-        </w:tblBorders>
-      </w:tblPr>
-      <w:tblGrid>
-        <w:gridCol w:w="2400"/>
-        <w:gridCol w:w="5160"/>
-        <w:gridCol w:w="1800"/>
-      </w:tblGrid>
-      <w:tr>
-        <w:trPr>
-          <w:tblHeader/>
-        </w:trPr>
-        <w:tc>
-          <w:tcPr>
-            <w:tcW w:type="dxa" w:w="2400"/>
-            <w:shd w:fill="1F3864" w:val="clear"/>
-            <w:tcMar>
-              <w:top w:type="dxa" w:w="60"/>
-              <w:left w:type="dxa" w:w="100"/>
-              <w:bottom w:type="dxa" w:w="60"/>
-              <w:right w:type="dxa" w:w="100"/>
-            </w:tcMar>
-            <w:vAlign w:val="center"/>
-          </w:tcPr>
-          <w:p>
-            <w:pPr>
-              <w:jc w:val="left"/>
-            </w:pPr>
-            <w:r>
-              <w:rPr>
-                <w:b/>
-                <w:bCs/>
-                <w:color w:val="FFFFFF"/>
-                <w:sz w:val="19"/>
-                <w:szCs w:val="19"/>
-              </w:rPr>
-              <w:t xml:space="preserve">Exercise</w:t>
-            </w:r>
-          </w:p>
-        </w:tc>
-        <w:tc>
-          <w:tcPr>
-            <w:tcW w:type="dxa" w:w="5160"/>
-            <w:shd w:fill="1F3864" w:val="clear"/>
-            <w:tcMar>
-              <w:top w:type="dxa" w:w="60"/>
-              <w:left w:type="dxa" w:w="100"/>
-              <w:bottom w:type="dxa" w:w="60"/>
-              <w:right w:type="dxa" w:w="100"/>
-            </w:tcMar>
-            <w:vAlign w:val="center"/>
-          </w:tcPr>
-          <w:p>
-            <w:pPr>
-              <w:jc w:val="left"/>
-            </w:pPr>
-            <w:r>
-              <w:rPr>
-                <w:b/>
-                <w:bCs/>
-                <w:color w:val="FFFFFF"/>
-                <w:sz w:val="19"/>
-                <w:szCs w:val="19"/>
-              </w:rPr>
-              <w:t xml:space="preserve">Result</w:t>
-            </w:r>
-          </w:p>
-        </w:tc>
-        <w:tc>
-          <w:tcPr>
-            <w:tcW w:type="dxa" w:w="1800"/>
-            <w:shd w:fill="1F3864" w:val="clear"/>
-            <w:tcMar>
-              <w:top w:type="dxa" w:w="60"/>
-              <w:left w:type="dxa" w:w="100"/>
-              <w:bottom w:type="dxa" w:w="60"/>
-              <w:right w:type="dxa" w:w="100"/>
-            </w:tcMar>
-            <w:vAlign w:val="center"/>
-          </w:tcPr>
-          <w:p>
-            <w:pPr>
-              <w:jc w:val="left"/>
-            </w:pPr>
-            <w:r>
-              <w:rPr>
-                <w:b/>
-                <w:bCs/>
-                <w:color w:val="FFFFFF"/>
-                <w:sz w:val="19"/>
-                <w:szCs w:val="19"/>
-              </w:rPr>
-              <w:t xml:space="preserve">Where</w:t>
-            </w:r>
-          </w:p>
-        </w:tc>
-      </w:tr>
-      <w:tr>
-        <w:trPr>
-          <w:cantSplit/>
-        </w:trPr>
-        <w:tc>
-          <w:tcPr>
-            <w:tcW w:type="dxa" w:w="2400"/>
-            <w:tcMar>
-              <w:top w:type="dxa" w:w="60"/>
-              <w:left w:type="dxa" w:w="100"/>
-              <w:bottom w:type="dxa" w:w="60"/>
-              <w:right w:type="dxa" w:w="100"/>
-            </w:tcMar>
-            <w:vAlign w:val="center"/>
-          </w:tcPr>
-          <w:p>
-            <w:pPr>
-              <w:jc w:val="left"/>
-            </w:pPr>
-            <w:r>
-              <w:rPr>
-                <w:b w:val="false"/>
-                <w:bCs w:val="false"/>
-                <w:sz w:val="19"/>
-                <w:szCs w:val="19"/>
-              </w:rPr>
-              <w:t xml:space="preserve">1. Reconciliation</w:t>
-            </w:r>
-          </w:p>
-        </w:tc>
-        <w:tc>
-          <w:tcPr>
-            <w:tcW w:type="dxa" w:w="5160"/>
-            <w:tcMar>
-              <w:top w:type="dxa" w:w="60"/>
-              <w:left w:type="dxa" w:w="100"/>
-              <w:bottom w:type="dxa" w:w="60"/>
-              <w:right w:type="dxa" w:w="100"/>
-            </w:tcMar>
-            <w:vAlign w:val="center"/>
-          </w:tcPr>
-          <w:p>
-            <w:pPr>
-              <w:jc w:val="left"/>
-            </w:pPr>
-            <w:r>
-              <w:rPr>
-                <w:b w:val="false"/>
-                <w:bCs w:val="false"/>
-                <w:sz w:val="19"/>
-                <w:szCs w:val="19"/>
-              </w:rPr>
-              <w:t xml:space="preserve">274 of 306 settlements match exactly; 49 differences in 13 categories (34 breaks, 6 timing, 9 not a problem); bridge R218,280.00 → R217,979.97 with R0.00 unexplained</w:t>
-            </w:r>
-          </w:p>
-        </w:tc>
-        <w:tc>
-          <w:tcPr>
-            <w:tcW w:type="dxa" w:w="1800"/>
-            <w:tcMar>
-              <w:top w:type="dxa" w:w="60"/>
-              <w:left w:type="dxa" w:w="100"/>
-              <w:bottom w:type="dxa" w:w="60"/>
-              <w:right w:type="dxa" w:w="100"/>
-            </w:tcMar>
-            <w:vAlign w:val="center"/>
-          </w:tcPr>
-          <w:p>
-            <w:pPr>
-              <w:jc w:val="left"/>
-            </w:pPr>
-            <w:r>
-              <w:rPr>
-                <w:b w:val="false"/>
-                <w:bCs w:val="false"/>
-                <w:sz w:val="19"/>
-                <w:szCs w:val="19"/>
-              </w:rPr>
-              <w:t xml:space="preserve">§1.1 · p. 6</w:t>
-            </w:r>
-          </w:p>
-        </w:tc>
-      </w:tr>
-      <w:tr>
-        <w:trPr>
-          <w:cantSplit/>
-        </w:trPr>
-        <w:tc>
-          <w:tcPr>
-            <w:tcW w:type="dxa" w:w="2400"/>
-            <w:shd w:fill="EEF3F8" w:val="clear"/>
-            <w:tcMar>
-              <w:top w:type="dxa" w:w="60"/>
-              <w:left w:type="dxa" w:w="100"/>
-              <w:bottom w:type="dxa" w:w="60"/>
-              <w:right w:type="dxa" w:w="100"/>
-            </w:tcMar>
-            <w:vAlign w:val="center"/>
-          </w:tcPr>
-          <w:p>
-            <w:pPr>
-              <w:jc w:val="left"/>
-            </w:pPr>
-            <w:r>
-              <w:rPr>
-                <w:b w:val="false"/>
-                <w:bCs w:val="false"/>
-                <w:sz w:val="19"/>
-                <w:szCs w:val="19"/>
-              </w:rPr>
-              <w:t xml:space="preserve">2. API ingestion</w:t>
-            </w:r>
-          </w:p>
-        </w:tc>
-        <w:tc>
-          <w:tcPr>
-            <w:tcW w:type="dxa" w:w="5160"/>
-            <w:shd w:fill="EEF3F8" w:val="clear"/>
-            <w:tcMar>
-              <w:top w:type="dxa" w:w="60"/>
-              <w:left w:type="dxa" w:w="100"/>
-              <w:bottom w:type="dxa" w:w="60"/>
-              <w:right w:type="dxa" w:w="100"/>
-            </w:tcMar>
-            <w:vAlign w:val="center"/>
-          </w:tcPr>
-          <w:p>
-            <w:pPr>
-              <w:jc w:val="left"/>
-            </w:pPr>
-            <w:r>
-              <w:rPr>
-                <w:b w:val="false"/>
-                <w:bCs w:val="false"/>
-                <w:sz w:val="19"/>
-                <w:szCs w:val="19"/>
-              </w:rPr>
-              <w:t xml:space="preserve">Kill and restart lose nothing and duplicate nothing: 1,025 API ids = 1,024 loaded + 1 quarantined. After new activity, exactly 25 new + 40 changed loaded</w:t>
-            </w:r>
-          </w:p>
-        </w:tc>
-        <w:tc>
-          <w:tcPr>
-            <w:tcW w:type="dxa" w:w="1800"/>
-            <w:shd w:fill="EEF3F8" w:val="clear"/>
-            <w:tcMar>
-              <w:top w:type="dxa" w:w="60"/>
-              <w:left w:type="dxa" w:w="100"/>
-              <w:bottom w:type="dxa" w:w="60"/>
-              <w:right w:type="dxa" w:w="100"/>
-            </w:tcMar>
-            <w:vAlign w:val="center"/>
-          </w:tcPr>
-          <w:p>
-            <w:pPr>
-              <w:jc w:val="left"/>
-            </w:pPr>
-            <w:r>
-              <w:rPr>
-                <w:b w:val="false"/>
-                <w:bCs w:val="false"/>
-                <w:sz w:val="19"/>
-                <w:szCs w:val="19"/>
-              </w:rPr>
-              <w:t xml:space="preserve">§2.2 · p. 11</w:t>
-            </w:r>
-          </w:p>
-        </w:tc>
-      </w:tr>
-      <w:tr>
-        <w:trPr>
-          <w:cantSplit/>
-        </w:trPr>
-        <w:tc>
-          <w:tcPr>
-            <w:tcW w:type="dxa" w:w="2400"/>
-            <w:tcMar>
-              <w:top w:type="dxa" w:w="60"/>
-              <w:left w:type="dxa" w:w="100"/>
-              <w:bottom w:type="dxa" w:w="60"/>
-              <w:right w:type="dxa" w:w="100"/>
-            </w:tcMar>
-            <w:vAlign w:val="center"/>
-          </w:tcPr>
-          <w:p>
-            <w:pPr>
-              <w:jc w:val="left"/>
-            </w:pPr>
-            <w:r>
-              <w:rPr>
-                <w:b w:val="false"/>
-                <w:bCs w:val="false"/>
-                <w:sz w:val="19"/>
-                <w:szCs w:val="19"/>
-              </w:rPr>
-              <w:t xml:space="preserve">3. Database design</w:t>
-            </w:r>
-          </w:p>
-        </w:tc>
-        <w:tc>
-          <w:tcPr>
-            <w:tcW w:type="dxa" w:w="5160"/>
-            <w:tcMar>
-              <w:top w:type="dxa" w:w="60"/>
-              <w:left w:type="dxa" w:w="100"/>
-              <w:bottom w:type="dxa" w:w="60"/>
-              <w:right w:type="dxa" w:w="100"/>
-            </w:tcMar>
-            <w:vAlign w:val="center"/>
-          </w:tcPr>
-          <w:p>
-            <w:pPr>
-              <w:jc w:val="left"/>
-            </w:pPr>
-            <w:r>
-              <w:rPr>
-                <w:b w:val="false"/>
-                <w:bCs w:val="false"/>
-                <w:sz w:val="19"/>
-                <w:szCs w:val="19"/>
-              </w:rPr>
-              <w:t xml:space="preserve">24 tables, 39 CHECK constraints, append-only ledger; NGR 220.00, bonus cost 18.18% of NGR; balances provable at any time</w:t>
-            </w:r>
-          </w:p>
-        </w:tc>
-        <w:tc>
-          <w:tcPr>
-            <w:tcW w:type="dxa" w:w="1800"/>
-            <w:tcMar>
-              <w:top w:type="dxa" w:w="60"/>
-              <w:left w:type="dxa" w:w="100"/>
-              <w:bottom w:type="dxa" w:w="60"/>
-              <w:right w:type="dxa" w:w="100"/>
-            </w:tcMar>
-            <w:vAlign w:val="center"/>
-          </w:tcPr>
-          <w:p>
-            <w:pPr>
-              <w:jc w:val="left"/>
-            </w:pPr>
-            <w:r>
-              <w:rPr>
-                <w:b w:val="false"/>
-                <w:bCs w:val="false"/>
-                <w:sz w:val="19"/>
-                <w:szCs w:val="19"/>
-              </w:rPr>
-              <w:t xml:space="preserve">§3.7 · p. 19</w:t>
-            </w:r>
-          </w:p>
-        </w:tc>
-      </w:tr>
-      <w:tr>
-        <w:trPr>
-          <w:cantSplit/>
-        </w:trPr>
-        <w:tc>
-          <w:tcPr>
-            <w:tcW w:type="dxa" w:w="2400"/>
-            <w:shd w:fill="EEF3F8" w:val="clear"/>
-            <w:tcMar>
-              <w:top w:type="dxa" w:w="60"/>
-              <w:left w:type="dxa" w:w="100"/>
-              <w:bottom w:type="dxa" w:w="60"/>
-              <w:right w:type="dxa" w:w="100"/>
-            </w:tcMar>
-            <w:vAlign w:val="center"/>
-          </w:tcPr>
-          <w:p>
-            <w:pPr>
-              <w:jc w:val="left"/>
-            </w:pPr>
-            <w:r>
-              <w:rPr>
-                <w:b w:val="false"/>
-                <w:bCs w:val="false"/>
-                <w:sz w:val="19"/>
-                <w:szCs w:val="19"/>
-              </w:rPr>
-              <w:t xml:space="preserve">Reporting (dbt, Power BI)</w:t>
-            </w:r>
-          </w:p>
-        </w:tc>
-        <w:tc>
-          <w:tcPr>
-            <w:tcW w:type="dxa" w:w="5160"/>
-            <w:shd w:fill="EEF3F8" w:val="clear"/>
-            <w:tcMar>
-              <w:top w:type="dxa" w:w="60"/>
-              <w:left w:type="dxa" w:w="100"/>
-              <w:bottom w:type="dxa" w:w="60"/>
-              <w:right w:type="dxa" w:w="100"/>
-            </w:tcMar>
-            <w:vAlign w:val="center"/>
-          </w:tcPr>
-          <w:p>
-            <w:pPr>
-              <w:jc w:val="left"/>
-            </w:pPr>
-            <w:r>
-              <w:rPr>
-                <w:b w:val="false"/>
-                <w:bCs w:val="false"/>
-                <w:sz w:val="19"/>
-                <w:szCs w:val="19"/>
-              </w:rPr>
-              <w:t xml:space="preserve">dbt 78/78 pass (local and Windows); Power BI 260 / 40 / 220 / 10 verified in Desktop</w:t>
-            </w:r>
-          </w:p>
-        </w:tc>
-        <w:tc>
-          <w:tcPr>
-            <w:tcW w:type="dxa" w:w="1800"/>
-            <w:shd w:fill="EEF3F8" w:val="clear"/>
-            <w:tcMar>
-              <w:top w:type="dxa" w:w="60"/>
-              <w:left w:type="dxa" w:w="100"/>
-              <w:bottom w:type="dxa" w:w="60"/>
-              <w:right w:type="dxa" w:w="100"/>
-            </w:tcMar>
-            <w:vAlign w:val="center"/>
-          </w:tcPr>
-          <w:p>
-            <w:pPr>
-              <w:jc w:val="left"/>
-            </w:pPr>
-            <w:r>
-              <w:rPr>
-                <w:b w:val="false"/>
-                <w:bCs w:val="false"/>
-                <w:sz w:val="19"/>
-                <w:szCs w:val="19"/>
-              </w:rPr>
-              <w:t xml:space="preserve">§3.8, §4.4</w:t>
-            </w:r>
-          </w:p>
-        </w:tc>
-      </w:tr>
-      <w:tr>
-        <w:trPr>
-          <w:cantSplit/>
-        </w:trPr>
-        <w:tc>
-          <w:tcPr>
-            <w:tcW w:type="dxa" w:w="2400"/>
-            <w:tcMar>
-              <w:top w:type="dxa" w:w="60"/>
-              <w:left w:type="dxa" w:w="100"/>
-              <w:bottom w:type="dxa" w:w="60"/>
-              <w:right w:type="dxa" w:w="100"/>
-            </w:tcMar>
-            <w:vAlign w:val="center"/>
-          </w:tcPr>
-          <w:p>
-            <w:pPr>
-              <w:jc w:val="left"/>
-            </w:pPr>
-            <w:r>
-              <w:rPr>
-                <w:b w:val="false"/>
-                <w:bCs w:val="false"/>
-                <w:sz w:val="19"/>
-                <w:szCs w:val="19"/>
-              </w:rPr>
-              <w:t xml:space="preserve">Databricks</w:t>
-            </w:r>
-          </w:p>
-        </w:tc>
-        <w:tc>
-          <w:tcPr>
-            <w:tcW w:type="dxa" w:w="5160"/>
-            <w:tcMar>
-              <w:top w:type="dxa" w:w="60"/>
-              <w:left w:type="dxa" w:w="100"/>
-              <w:bottom w:type="dxa" w:w="60"/>
-              <w:right w:type="dxa" w:w="100"/>
-            </w:tcMar>
-            <w:vAlign w:val="center"/>
-          </w:tcPr>
-          <w:p>
-            <w:pPr>
-              <w:jc w:val="left"/>
-            </w:pPr>
-            <w:r>
-              <w:rPr>
-                <w:b w:val="false"/>
-                <w:bCs w:val="false"/>
-                <w:sz w:val="19"/>
-                <w:szCs w:val="19"/>
-              </w:rPr>
-              <w:t xml:space="preserve">One serverless job, ex1 → ex2 → ex3 all Succeeded; 32/32 checks</w:t>
-            </w:r>
-          </w:p>
-        </w:tc>
-        <w:tc>
-          <w:tcPr>
-            <w:tcW w:type="dxa" w:w="1800"/>
-            <w:tcMar>
-              <w:top w:type="dxa" w:w="60"/>
-              <w:left w:type="dxa" w:w="100"/>
-              <w:bottom w:type="dxa" w:w="60"/>
-              <w:right w:type="dxa" w:w="100"/>
-            </w:tcMar>
-            <w:vAlign w:val="center"/>
-          </w:tcPr>
-          <w:p>
-            <w:pPr>
-              <w:jc w:val="left"/>
-            </w:pPr>
-            <w:r>
-              <w:rPr>
-                <w:b w:val="false"/>
-                <w:bCs w:val="false"/>
-                <w:sz w:val="19"/>
-                <w:szCs w:val="19"/>
-              </w:rPr>
-              <w:t xml:space="preserve">§5.1 · p. 27</w:t>
-            </w:r>
-          </w:p>
-        </w:tc>
-      </w:tr>
-    </w:tbl>
+        <w:t xml:space="preserve">Executive summary</w:t>
+      </w:r>
+    </w:p>
+    <w:p>
+      <w:pPr>
+        <w:spacing w:after="140"/>
+      </w:pPr>
+      <w:r>
+        <w:rPr>
+          <w:b/>
+          <w:bCs/>
+          <w:color w:val="1F3864"/>
+        </w:rPr>
+        <w:t xml:space="preserve">Exercise 1 · Reconciliation</w:t>
+      </w:r>
+      <w:r>
+        <w:rPr>
+          <w:color w:val="595959"/>
+        </w:rPr>
+        <w:t xml:space="preserve"> (§1.1, p. 6). </w:t>
+      </w:r>
+      <w:r>
+        <w:t xml:space="preserve">274 of 306 settlements match exactly, and the bridge from the internal total of R218,280.00 to the gateway total of R217,979.97 has R0.00 unexplained. 49 rows are categorised in exceptions.csv; six are formatting-only variants that still match, so the Power BI exception view shows 43. The 49 are 34 genuine breaks, 6 timing differences and 9 that are not a problem, each with a cause, impact, next step and owner.</w:t>
+      </w:r>
+    </w:p>
+    <w:p>
+      <w:pPr>
+        <w:spacing w:after="140"/>
+      </w:pPr>
+      <w:r>
+        <w:rPr>
+          <w:b/>
+          <w:bCs/>
+          <w:color w:val="1F3864"/>
+        </w:rPr>
+        <w:t xml:space="preserve">Exercise 2 · Incremental ingestion</w:t>
+      </w:r>
+      <w:r>
+        <w:rPr>
+          <w:color w:val="595959"/>
+        </w:rPr>
+        <w:t xml:space="preserve"> (§2.2, p. 11). </w:t>
+      </w:r>
+      <w:r>
+        <w:t xml:space="preserve">The loader is safe to stop at any point. Killed mid-page and restarted, it finished with 1,025 API ids = 1,024 loaded + 1 quarantined, with no duplicates and nothing missing. It retries rate limits and server errors, quarantines bad records instead of dropping them, and logs every run. After the new-activity step it loaded exactly 25 new and 40 changed records.</w:t>
+      </w:r>
+    </w:p>
+    <w:p>
+      <w:pPr>
+        <w:spacing w:after="140"/>
+      </w:pPr>
+      <w:r>
+        <w:rPr>
+          <w:b/>
+          <w:bCs/>
+          <w:color w:val="1F3864"/>
+        </w:rPr>
+        <w:t xml:space="preserve">Exercise 3 · Database design</w:t>
+      </w:r>
+      <w:r>
+        <w:rPr>
+          <w:color w:val="595959"/>
+        </w:rPr>
+        <w:t xml:space="preserve"> (§3.7, p. 19). </w:t>
+      </w:r>
+      <w:r>
+        <w:t xml:space="preserve">24 tables with keys, 39 CHECK constraints and an append-only wallet ledger, so any balance can be proved at any point in time and corrections are reversals, never edits. History is kept as SCD2 and personal data is held apart. Queries (a)–(d) run on the seed data: NGR 220.00, bonus cost 18.18% of NGR.</w:t>
+      </w:r>
+    </w:p>
+    <w:p>
+      <w:pPr>
+        <w:spacing w:after="120"/>
+      </w:pPr>
+      <w:r>
+        <w:rPr>
+          <w:b/>
+          <w:bCs/>
+          <w:color w:val="595959"/>
+        </w:rPr>
+        <w:t xml:space="preserve">Optional extensions: </w:t>
+      </w:r>
+      <w:r>
+        <w:rPr>
+          <w:color w:val="595959"/>
+        </w:rPr>
+        <w:t xml:space="preserve">the same work as a dbt project (78/78 pass, also on Windows XAMPP), a Power BI report (chapter 4) and a Databricks serverless run (chapter 5, 32/32 checks), showing one design both on-prem on MariaDB and in the cloud.</w:t>
+      </w:r>
+    </w:p>
     <w:p>
       <w:pPr>
         <w:pStyle w:val="Heading1"/>
@@ -8963,7 +8518,7 @@
           <w:sz w:val="20"/>
           <w:szCs w:val="20"/>
         </w:rPr>
-        <w:t xml:space="preserve">Tools used: MySQL 8.0 for the schema, load and categorisation SQL; Python/pandas for the load script, CSV export and an independent cross-check of the bridge arithmetic.</w:t>
+        <w:t xml:space="preserve">Tools used: MariaDB 10.11 and 10.4 (XAMPP), MySQL-compatible, for the schema, load and categorisation SQL; Python/pandas for the load script, CSV export and an independent cross-check of the bridge arithmetic.</w:t>
       </w:r>
     </w:p>
     <w:p>
@@ -9042,7 +8597,7 @@
           <w:sz w:val="20"/>
           <w:szCs w:val="20"/>
         </w:rPr>
-        <w:t xml:space="preserve">Actual output of sql/03_reconciliation.sql against MySQL 8.0, and of the independent row-by-row check.</w:t>
+        <w:t xml:space="preserve">Actual output of sql/03_reconciliation.sql on MariaDB 10.11, and of the independent row-by-row check.</w:t>
       </w:r>
     </w:p>
     <w:p>
@@ -11305,7 +10860,7 @@
           <w:sz w:val="20"/>
           <w:szCs w:val="20"/>
         </w:rPr>
-        <w:t xml:space="preserve">Tools used: Python 3 (standard library HTTP, plus pymysql), MySQL 8 / MariaDB for the target and control tables (the brief allows any database; this one also holds the other exercises and dbt), Postman/Newman for the API contract.</w:t>
+        <w:t xml:space="preserve">Tools used: Python 3 (standard library HTTP, plus pymysql), MariaDB (MySQL-compatible) for the target and control tables (the brief allows any database; this one also holds the other exercises and dbt), Postman/Newman for the API contract.</w:t>
       </w:r>
     </w:p>
     <w:tbl>
@@ -12726,7 +12281,7 @@
           <w:sz w:val="20"/>
           <w:szCs w:val="20"/>
         </w:rPr>
-        <w:t xml:space="preserve">Tools used: MariaDB 10.11 (MySQL 8.0.16+ syntax) for the schema, the posting procedures and the queries; Mermaid for the ERD; Python for the posting test; dbt for the reporting model.</w:t>
+        <w:t xml:space="preserve">Tools used: MariaDB 10.11 and 10.4 (XAMPP), MySQL-compatible, for the schema, the posting procedures and the queries; Mermaid for the ERD; Python for the posting test; dbt for the reporting model.</w:t>
       </w:r>
     </w:p>
     <w:tbl>
@@ -14393,7 +13948,7 @@
         <w:spacing w:after="200" w:before="400"/>
       </w:pPr>
       <w:r>
-        <w:t xml:space="preserve">4. Power BI — Reporting Data Model and Report</w:t>
+        <w:t xml:space="preserve">4. Power BI — Reporting Model and Report (optional extension)</w:t>
       </w:r>
     </w:p>
     <w:p>
@@ -16316,7 +15871,7 @@
         <w:spacing w:after="200" w:before="400"/>
       </w:pPr>
       <w:r>
-        <w:t xml:space="preserve">5. Databricks — The Same Three Exercises on Delta Lake</w:t>
+        <w:t xml:space="preserve">5. Databricks — The Three Exercises on Delta Lake (optional extension)</w:t>
       </w:r>
     </w:p>
     <w:p>

</xml_diff>